<commit_message>
docs: record slice 1 remote release gate
</commit_message>
<xml_diff>
--- a/output/doc/senatla-ops-implementation-journey.docx
+++ b/output/doc/senatla-ops-implementation-journey.docx
@@ -4743,7 +4743,7 @@
                 <w:rFonts w:ascii="Calibri" w:hAnsi="Calibri"/>
                 <w:sz w:val="18"/>
               </w:rPr>
-              <w:t>Local implementation verified; remote deployment pending clean integration, project identity verification, database execution, and real-user provisioning</w:t>
+              <w:t>Local implementation and clean integration onto current origin/dev verified at release-candidate commit 41c8e62; remote deployment and provisioning blocked by target configuration</w:t>
             </w:r>
           </w:p>
         </w:tc>
@@ -4798,7 +4798,7 @@
                 <w:rFonts w:ascii="Calibri" w:hAnsi="Calibri"/>
                 <w:sz w:val="18"/>
               </w:rPr>
-              <w:t>Generated Supabase URL and public-key project references differ; verify intended dev project before any deployment</w:t>
+              <w:t>Generated Supabase URL/key references differ; Vercel Preview Senatla values resolve empty; authenticated Supabase CLI lists no Senatla project</w:t>
             </w:r>
           </w:p>
         </w:tc>
@@ -4851,7 +4851,7 @@
                 <w:rFonts w:ascii="Calibri" w:hAnsi="Calibri"/>
                 <w:sz w:val="18"/>
               </w:rPr>
-              <w:t>Integrate Slice 0+1 onto current dev; execute and deploy against verified remote; provision five users; create controlled credential handoff; verify cross-site audit flow</w:t>
+              <w:t>Link authoritative remote dev; populate matching Preview runtime values; execute contracts/migration; deploy; invite five real users; create controlled credential handoff; verify cross-role and cross-site audit flow</w:t>
             </w:r>
           </w:p>
         </w:tc>

</xml_diff>

<commit_message>
feat: add reviewed assignment planning
</commit_message>
<xml_diff>
--- a/output/doc/senatla-ops-implementation-journey.docx
+++ b/output/doc/senatla-ops-implementation-journey.docx
@@ -227,53 +227,29 @@
         <w:spacing w:after="0"/>
       </w:pPr>
     </w:p>
-    <w:tbl>
-      <w:tblPr>
-        <w:tblW w:type="dxa" w:w="9360"/>
-        <w:jc w:val="left"/>
-        <w:tblLayout w:type="fixed"/>
-        <w:tblLook w:firstColumn="1" w:firstRow="1" w:lastColumn="0" w:lastRow="0" w:noHBand="0" w:noVBand="1" w:val="04A0"/>
-        <w:tblInd w:w="120" w:type="dxa"/>
-      </w:tblPr>
-      <w:tblGrid>
-        <w:gridCol w:w="9360"/>
-      </w:tblGrid>
-      <w:tr>
-        <w:tc>
-          <w:tcPr>
-            <w:tcW w:type="dxa" w:w="9360"/>
-            <w:vAlign w:val="center"/>
-            <w:tcMar>
-              <w:top w:w="80" w:type="dxa"/>
-              <w:start w:w="120" w:type="dxa"/>
-              <w:bottom w:w="80" w:type="dxa"/>
-              <w:end w:w="120" w:type="dxa"/>
-            </w:tcMar>
-            <w:shd w:fill="FFF8E1"/>
-          </w:tcPr>
-          <w:p>
-            <w:pPr>
-              <w:spacing w:after="0"/>
-            </w:pPr>
-            <w:r>
-              <w:rPr>
-                <w:rFonts w:ascii="Calibri" w:hAnsi="Calibri"/>
-                <w:b/>
-                <w:color w:val="17365D"/>
-              </w:rPr>
-              <w:t xml:space="preserve">Scope boundary: </w:t>
-            </w:r>
-            <w:r>
-              <w:t>This record documents enhancements to the running Senatla Ops application. It is not a plan for a replacement application. Harmony/Saaiplass material remains illustrative until contractually validated.</w:t>
-            </w:r>
-          </w:p>
-        </w:tc>
-      </w:tr>
-    </w:tbl>
     <w:p>
       <w:pPr>
-        <w:spacing w:after="0"/>
+        <w:spacing w:before="80" w:after="160"/>
+        <w:ind w:left="173" w:right="173"/>
+        <w:shd w:fill="FFF8E1"/>
+        <w:pBdr>
+          <w:top w:val="single" w:sz="6" w:color="D7DEE8"/>
+          <w:left w:val="single" w:sz="6" w:color="D7DEE8"/>
+          <w:bottom w:val="single" w:sz="6" w:color="D7DEE8"/>
+          <w:right w:val="single" w:sz="6" w:color="D7DEE8"/>
+        </w:pBdr>
       </w:pPr>
+      <w:r>
+        <w:rPr>
+          <w:rFonts w:ascii="Calibri" w:hAnsi="Calibri"/>
+          <w:b/>
+          <w:color w:val="17365D"/>
+        </w:rPr>
+        <w:t xml:space="preserve">Scope boundary: </w:t>
+      </w:r>
+      <w:r>
+        <w:t>This record documents enhancements to the running Senatla Ops application. It is not a plan for a replacement application. Harmony/Saaiplass material remains illustrative until contractually validated.</w:t>
+      </w:r>
     </w:p>
     <w:p>
       <w:r>
@@ -410,53 +386,29 @@
         <w:t>This living record connects each Senatla Ops implementation slice to the existing product, operational need, decisions, changes, verification evidence, risks, and observed outcomes. It must be updated after every meaningful implementation or verification pass.</w:t>
       </w:r>
     </w:p>
-    <w:tbl>
-      <w:tblPr>
-        <w:tblW w:type="dxa" w:w="9360"/>
-        <w:jc w:val="left"/>
-        <w:tblLayout w:type="fixed"/>
-        <w:tblLook w:firstColumn="1" w:firstRow="1" w:lastColumn="0" w:lastRow="0" w:noHBand="0" w:noVBand="1" w:val="04A0"/>
-        <w:tblInd w:w="120" w:type="dxa"/>
-      </w:tblPr>
-      <w:tblGrid>
-        <w:gridCol w:w="9360"/>
-      </w:tblGrid>
-      <w:tr>
-        <w:tc>
-          <w:tcPr>
-            <w:tcW w:type="dxa" w:w="9360"/>
-            <w:vAlign w:val="center"/>
-            <w:tcMar>
-              <w:top w:w="80" w:type="dxa"/>
-              <w:start w:w="120" w:type="dxa"/>
-              <w:bottom w:w="80" w:type="dxa"/>
-              <w:end w:w="120" w:type="dxa"/>
-            </w:tcMar>
-            <w:shd w:fill="E8EEF5"/>
-          </w:tcPr>
-          <w:p>
-            <w:pPr>
-              <w:spacing w:after="0"/>
-            </w:pPr>
-            <w:r>
-              <w:rPr>
-                <w:rFonts w:ascii="Calibri" w:hAnsi="Calibri"/>
-                <w:b/>
-                <w:color w:val="17365D"/>
-              </w:rPr>
-              <w:t xml:space="preserve">Source interpretation: </w:t>
-            </w:r>
-            <w:r>
-              <w:t>The supplied Operations Research document is a source of enhancement ideas only. Its scenario, project code, quantities, activities, and commercial assumptions are not production facts.</w:t>
-            </w:r>
-          </w:p>
-        </w:tc>
-      </w:tr>
-    </w:tbl>
     <w:p>
       <w:pPr>
-        <w:spacing w:after="0"/>
+        <w:spacing w:before="80" w:after="160"/>
+        <w:ind w:left="173" w:right="173"/>
+        <w:shd w:fill="E8EEF5"/>
+        <w:pBdr>
+          <w:top w:val="single" w:sz="6" w:color="D7DEE8"/>
+          <w:left w:val="single" w:sz="6" w:color="D7DEE8"/>
+          <w:bottom w:val="single" w:sz="6" w:color="D7DEE8"/>
+          <w:right w:val="single" w:sz="6" w:color="D7DEE8"/>
+        </w:pBdr>
       </w:pPr>
+      <w:r>
+        <w:rPr>
+          <w:rFonts w:ascii="Calibri" w:hAnsi="Calibri"/>
+          <w:b/>
+          <w:color w:val="17365D"/>
+        </w:rPr>
+        <w:t xml:space="preserve">Source interpretation: </w:t>
+      </w:r>
+      <w:r>
+        <w:t>The supplied Operations Research document is a source of enhancement ideas only. Its scenario, project code, quantities, activities, and commercial assumptions are not production facts.</w:t>
+      </w:r>
     </w:p>
     <w:p>
       <w:pPr>
@@ -1465,7 +1417,7 @@
         <w:t xml:space="preserve">Status. </w:t>
       </w:r>
       <w:r>
-        <w:t>Planned; depends on Slices 0-1</w:t>
+        <w:t>Implemented and locally verified; 30-assertion database runtime proof and remote deployment pending</w:t>
       </w:r>
     </w:p>
     <w:p>
@@ -1696,53 +1648,29 @@
         <w:t>Solver evidence decision.</w:t>
       </w:r>
     </w:p>
-    <w:tbl>
-      <w:tblPr>
-        <w:tblW w:type="dxa" w:w="9360"/>
-        <w:jc w:val="left"/>
-        <w:tblLayout w:type="fixed"/>
-        <w:tblLook w:firstColumn="1" w:firstRow="1" w:lastColumn="0" w:lastRow="0" w:noHBand="0" w:noVBand="1" w:val="04A0"/>
-        <w:tblInd w:w="120" w:type="dxa"/>
-      </w:tblPr>
-      <w:tblGrid>
-        <w:gridCol w:w="9360"/>
-      </w:tblGrid>
-      <w:tr>
-        <w:tc>
-          <w:tcPr>
-            <w:tcW w:type="dxa" w:w="9360"/>
-            <w:vAlign w:val="center"/>
-            <w:tcMar>
-              <w:top w:w="80" w:type="dxa"/>
-              <w:start w:w="120" w:type="dxa"/>
-              <w:bottom w:w="80" w:type="dxa"/>
-              <w:end w:w="120" w:type="dxa"/>
-            </w:tcMar>
-            <w:shd w:fill="FFF8E1"/>
-          </w:tcPr>
-          <w:p>
-            <w:pPr>
-              <w:spacing w:after="0"/>
-            </w:pPr>
-            <w:r>
-              <w:rPr>
-                <w:rFonts w:ascii="Calibri" w:hAnsi="Calibri"/>
-                <w:b/>
-                <w:color w:val="17365D"/>
-              </w:rPr>
-              <w:t xml:space="preserve">First milestone: </w:t>
-            </w:r>
-            <w:r>
-              <w:t>An existing Site Manager selects the current site, sees whether assigned people and assets are ready, understands every blocker, completes the existing safety and attendance workflow, and leaves an auditable readiness record.</w:t>
-            </w:r>
-          </w:p>
-        </w:tc>
-      </w:tr>
-    </w:tbl>
     <w:p>
       <w:pPr>
-        <w:spacing w:after="0"/>
+        <w:spacing w:before="80" w:after="160"/>
+        <w:ind w:left="173" w:right="173"/>
+        <w:shd w:fill="FFF8E1"/>
+        <w:pBdr>
+          <w:top w:val="single" w:sz="6" w:color="D7DEE8"/>
+          <w:left w:val="single" w:sz="6" w:color="D7DEE8"/>
+          <w:bottom w:val="single" w:sz="6" w:color="D7DEE8"/>
+          <w:right w:val="single" w:sz="6" w:color="D7DEE8"/>
+        </w:pBdr>
       </w:pPr>
+      <w:r>
+        <w:rPr>
+          <w:rFonts w:ascii="Calibri" w:hAnsi="Calibri"/>
+          <w:b/>
+          <w:color w:val="17365D"/>
+        </w:rPr>
+        <w:t xml:space="preserve">First milestone: </w:t>
+      </w:r>
+      <w:r>
+        <w:t>An existing Site Manager selects the current site, sees whether assigned people and assets are ready, understands every blocker, completes the existing safety and attendance workflow, and leaves an auditable readiness record.</w:t>
+      </w:r>
     </w:p>
     <w:p>
       <w:pPr>
@@ -4864,6 +4792,842 @@
     </w:p>
     <w:p>
       <w:pPr>
+        <w:pStyle w:val="Heading2"/>
+      </w:pPr>
+      <w:r>
+        <w:t>23 August 2026 - Slice 2 Office Admin reviewed assignments</w:t>
+      </w:r>
+    </w:p>
+    <w:tbl>
+      <w:tblPr>
+        <w:tblStyle w:val="TableGrid"/>
+        <w:tblW w:type="dxa" w:w="9360"/>
+        <w:tblLayout w:type="fixed"/>
+        <w:tblLook w:firstColumn="1" w:firstRow="1" w:lastColumn="0" w:lastRow="0" w:noHBand="0" w:noVBand="1" w:val="04A0"/>
+        <w:jc w:val="left"/>
+        <w:tblInd w:w="120" w:type="dxa"/>
+      </w:tblPr>
+      <w:tblGrid>
+        <w:gridCol w:w="4680"/>
+        <w:gridCol w:w="4680"/>
+      </w:tblGrid>
+      <w:tr>
+        <w:trPr>
+          <w:tblHeader w:val="true"/>
+        </w:trPr>
+        <w:tc>
+          <w:tcPr>
+            <w:tcW w:type="dxa" w:w="2232"/>
+            <w:vAlign w:val="center"/>
+            <w:tcMar>
+              <w:top w:w="80" w:type="dxa"/>
+              <w:start w:w="120" w:type="dxa"/>
+              <w:bottom w:w="80" w:type="dxa"/>
+              <w:end w:w="120" w:type="dxa"/>
+            </w:tcMar>
+            <w:shd w:fill="17365D"/>
+          </w:tcPr>
+          <w:p>
+            <w:r>
+              <w:rPr>
+                <w:rFonts w:ascii="Calibri" w:hAnsi="Calibri"/>
+                <w:b/>
+                <w:color w:val="FFFFFF"/>
+                <w:sz w:val="19"/>
+              </w:rPr>
+              <w:t>Field</w:t>
+            </w:r>
+          </w:p>
+        </w:tc>
+        <w:tc>
+          <w:tcPr>
+            <w:tcW w:type="dxa" w:w="7128"/>
+            <w:vAlign w:val="center"/>
+            <w:tcMar>
+              <w:top w:w="80" w:type="dxa"/>
+              <w:start w:w="120" w:type="dxa"/>
+              <w:bottom w:w="80" w:type="dxa"/>
+              <w:end w:w="120" w:type="dxa"/>
+            </w:tcMar>
+            <w:shd w:fill="17365D"/>
+          </w:tcPr>
+          <w:p>
+            <w:r>
+              <w:rPr>
+                <w:rFonts w:ascii="Calibri" w:hAnsi="Calibri"/>
+                <w:b/>
+                <w:color w:val="FFFFFF"/>
+                <w:sz w:val="19"/>
+              </w:rPr>
+              <w:t>Recorded implementation evidence</w:t>
+            </w:r>
+          </w:p>
+        </w:tc>
+      </w:tr>
+      <w:tr>
+        <w:trPr>
+          <w:cantSplit/>
+        </w:trPr>
+        <w:tc>
+          <w:tcPr>
+            <w:tcW w:type="dxa" w:w="2232"/>
+            <w:vAlign w:val="center"/>
+            <w:tcMar>
+              <w:top w:w="80" w:type="dxa"/>
+              <w:start w:w="120" w:type="dxa"/>
+              <w:bottom w:w="80" w:type="dxa"/>
+              <w:end w:w="120" w:type="dxa"/>
+            </w:tcMar>
+          </w:tcPr>
+          <w:p>
+            <w:pPr>
+              <w:spacing w:after="0"/>
+            </w:pPr>
+            <w:r>
+              <w:rPr>
+                <w:rFonts w:ascii="Calibri" w:hAnsi="Calibri"/>
+                <w:sz w:val="18"/>
+              </w:rPr>
+              <w:t>Slice</w:t>
+            </w:r>
+          </w:p>
+        </w:tc>
+        <w:tc>
+          <w:tcPr>
+            <w:tcW w:type="dxa" w:w="7128"/>
+            <w:vAlign w:val="center"/>
+            <w:tcMar>
+              <w:top w:w="80" w:type="dxa"/>
+              <w:start w:w="120" w:type="dxa"/>
+              <w:bottom w:w="80" w:type="dxa"/>
+              <w:end w:w="120" w:type="dxa"/>
+            </w:tcMar>
+          </w:tcPr>
+          <w:p>
+            <w:pPr>
+              <w:spacing w:after="0"/>
+            </w:pPr>
+            <w:r>
+              <w:rPr>
+                <w:rFonts w:ascii="Calibri" w:hAnsi="Calibri"/>
+                <w:sz w:val="18"/>
+              </w:rPr>
+              <w:t>Slice 2 - Office Admin conflicts and suggestions</w:t>
+            </w:r>
+          </w:p>
+        </w:tc>
+      </w:tr>
+      <w:tr>
+        <w:trPr>
+          <w:cantSplit/>
+        </w:trPr>
+        <w:tc>
+          <w:tcPr>
+            <w:tcW w:type="dxa" w:w="2232"/>
+            <w:shd w:fill="F2F4F7"/>
+            <w:vAlign w:val="center"/>
+            <w:tcMar>
+              <w:top w:w="80" w:type="dxa"/>
+              <w:start w:w="120" w:type="dxa"/>
+              <w:bottom w:w="80" w:type="dxa"/>
+              <w:end w:w="120" w:type="dxa"/>
+            </w:tcMar>
+          </w:tcPr>
+          <w:p>
+            <w:pPr>
+              <w:spacing w:after="0"/>
+            </w:pPr>
+            <w:r>
+              <w:rPr>
+                <w:rFonts w:ascii="Calibri" w:hAnsi="Calibri"/>
+                <w:sz w:val="18"/>
+              </w:rPr>
+              <w:t>Branch</w:t>
+            </w:r>
+          </w:p>
+        </w:tc>
+        <w:tc>
+          <w:tcPr>
+            <w:tcW w:type="dxa" w:w="7128"/>
+            <w:shd w:fill="F2F4F7"/>
+            <w:vAlign w:val="center"/>
+            <w:tcMar>
+              <w:top w:w="80" w:type="dxa"/>
+              <w:start w:w="120" w:type="dxa"/>
+              <w:bottom w:w="80" w:type="dxa"/>
+              <w:end w:w="120" w:type="dxa"/>
+            </w:tcMar>
+          </w:tcPr>
+          <w:p>
+            <w:pPr>
+              <w:spacing w:after="0"/>
+            </w:pPr>
+            <w:r>
+              <w:rPr>
+                <w:rFonts w:ascii="Calibri" w:hAnsi="Calibri"/>
+                <w:sz w:val="18"/>
+              </w:rPr>
+              <w:t>sankofa_xciv/slice-01-readiness-release</w:t>
+            </w:r>
+          </w:p>
+        </w:tc>
+      </w:tr>
+      <w:tr>
+        <w:trPr>
+          <w:cantSplit/>
+        </w:trPr>
+        <w:tc>
+          <w:tcPr>
+            <w:tcW w:type="dxa" w:w="2232"/>
+            <w:vAlign w:val="center"/>
+            <w:tcMar>
+              <w:top w:w="80" w:type="dxa"/>
+              <w:start w:w="120" w:type="dxa"/>
+              <w:bottom w:w="80" w:type="dxa"/>
+              <w:end w:w="120" w:type="dxa"/>
+            </w:tcMar>
+          </w:tcPr>
+          <w:p>
+            <w:pPr>
+              <w:spacing w:after="0"/>
+            </w:pPr>
+            <w:r>
+              <w:rPr>
+                <w:rFonts w:ascii="Calibri" w:hAnsi="Calibri"/>
+                <w:sz w:val="18"/>
+              </w:rPr>
+              <w:t>Outcome</w:t>
+            </w:r>
+          </w:p>
+        </w:tc>
+        <w:tc>
+          <w:tcPr>
+            <w:tcW w:type="dxa" w:w="7128"/>
+            <w:vAlign w:val="center"/>
+            <w:tcMar>
+              <w:top w:w="80" w:type="dxa"/>
+              <w:start w:w="120" w:type="dxa"/>
+              <w:bottom w:w="80" w:type="dxa"/>
+              <w:end w:w="120" w:type="dxa"/>
+            </w:tcMar>
+          </w:tcPr>
+          <w:p>
+            <w:pPr>
+              <w:spacing w:after="0"/>
+            </w:pPr>
+            <w:r>
+              <w:rPr>
+                <w:rFonts w:ascii="Calibri" w:hAnsi="Calibri"/>
+                <w:sz w:val="18"/>
+              </w:rPr>
+              <w:t>Existing employee bulk-site and asset custody workflows now include fail-closed reviews, ranked alternatives, controlled decisions, and atomic Supabase RPCs</w:t>
+            </w:r>
+          </w:p>
+        </w:tc>
+      </w:tr>
+      <w:tr>
+        <w:trPr>
+          <w:cantSplit/>
+        </w:trPr>
+        <w:tc>
+          <w:tcPr>
+            <w:tcW w:type="dxa" w:w="2232"/>
+            <w:shd w:fill="F2F4F7"/>
+            <w:vAlign w:val="center"/>
+            <w:tcMar>
+              <w:top w:w="80" w:type="dxa"/>
+              <w:start w:w="120" w:type="dxa"/>
+              <w:bottom w:w="80" w:type="dxa"/>
+              <w:end w:w="120" w:type="dxa"/>
+            </w:tcMar>
+          </w:tcPr>
+          <w:p>
+            <w:pPr>
+              <w:spacing w:after="0"/>
+            </w:pPr>
+            <w:r>
+              <w:rPr>
+                <w:rFonts w:ascii="Calibri" w:hAnsi="Calibri"/>
+                <w:sz w:val="18"/>
+              </w:rPr>
+              <w:t>Decision</w:t>
+            </w:r>
+          </w:p>
+        </w:tc>
+        <w:tc>
+          <w:tcPr>
+            <w:tcW w:type="dxa" w:w="7128"/>
+            <w:shd w:fill="F2F4F7"/>
+            <w:vAlign w:val="center"/>
+            <w:tcMar>
+              <w:top w:w="80" w:type="dxa"/>
+              <w:start w:w="120" w:type="dxa"/>
+              <w:bottom w:w="80" w:type="dxa"/>
+              <w:end w:w="120" w:type="dxa"/>
+            </w:tcMar>
+          </w:tcPr>
+          <w:p>
+            <w:pPr>
+              <w:spacing w:after="0"/>
+            </w:pPr>
+            <w:r>
+              <w:rPr>
+                <w:rFonts w:ascii="Calibri" w:hAnsi="Calibri"/>
+                <w:sz w:val="18"/>
+              </w:rPr>
+              <w:t>Keep browser recommendations advisory and re-evaluate role, organisation, target, resource state, readiness, compliance, and work orders inside the mutation transaction</w:t>
+            </w:r>
+          </w:p>
+        </w:tc>
+      </w:tr>
+      <w:tr>
+        <w:trPr>
+          <w:cantSplit/>
+        </w:trPr>
+        <w:tc>
+          <w:tcPr>
+            <w:tcW w:type="dxa" w:w="2232"/>
+            <w:vAlign w:val="center"/>
+            <w:tcMar>
+              <w:top w:w="80" w:type="dxa"/>
+              <w:start w:w="120" w:type="dxa"/>
+              <w:bottom w:w="80" w:type="dxa"/>
+              <w:end w:w="120" w:type="dxa"/>
+            </w:tcMar>
+          </w:tcPr>
+          <w:p>
+            <w:pPr>
+              <w:spacing w:after="0"/>
+            </w:pPr>
+            <w:r>
+              <w:rPr>
+                <w:rFonts w:ascii="Calibri" w:hAnsi="Calibri"/>
+                <w:sz w:val="18"/>
+              </w:rPr>
+              <w:t>Rejected alternative</w:t>
+            </w:r>
+          </w:p>
+        </w:tc>
+        <w:tc>
+          <w:tcPr>
+            <w:tcW w:type="dxa" w:w="7128"/>
+            <w:vAlign w:val="center"/>
+            <w:tcMar>
+              <w:top w:w="80" w:type="dxa"/>
+              <w:start w:w="120" w:type="dxa"/>
+              <w:bottom w:w="80" w:type="dxa"/>
+              <w:end w:w="120" w:type="dxa"/>
+            </w:tcMar>
+          </w:tcPr>
+          <w:p>
+            <w:pPr>
+              <w:spacing w:after="0"/>
+            </w:pPr>
+            <w:r>
+              <w:rPr>
+                <w:rFonts w:ascii="Calibri" w:hAnsi="Calibri"/>
+                <w:sz w:val="18"/>
+              </w:rPr>
+              <w:t>Client-only validation, local mutation, a new optimisation service, or an invented utilisation score without authoritative evidence</w:t>
+            </w:r>
+          </w:p>
+        </w:tc>
+      </w:tr>
+      <w:tr>
+        <w:trPr>
+          <w:cantSplit/>
+        </w:trPr>
+        <w:tc>
+          <w:tcPr>
+            <w:tcW w:type="dxa" w:w="2232"/>
+            <w:shd w:fill="F2F4F7"/>
+            <w:vAlign w:val="center"/>
+            <w:tcMar>
+              <w:top w:w="80" w:type="dxa"/>
+              <w:start w:w="120" w:type="dxa"/>
+              <w:bottom w:w="80" w:type="dxa"/>
+              <w:end w:w="120" w:type="dxa"/>
+            </w:tcMar>
+          </w:tcPr>
+          <w:p>
+            <w:pPr>
+              <w:spacing w:after="0"/>
+            </w:pPr>
+            <w:r>
+              <w:rPr>
+                <w:rFonts w:ascii="Calibri" w:hAnsi="Calibri"/>
+                <w:sz w:val="18"/>
+              </w:rPr>
+              <w:t>Changed contracts</w:t>
+            </w:r>
+          </w:p>
+        </w:tc>
+        <w:tc>
+          <w:tcPr>
+            <w:tcW w:type="dxa" w:w="7128"/>
+            <w:shd w:fill="F2F4F7"/>
+            <w:vAlign w:val="center"/>
+            <w:tcMar>
+              <w:top w:w="80" w:type="dxa"/>
+              <w:start w:w="120" w:type="dxa"/>
+              <w:bottom w:w="80" w:type="dxa"/>
+              <w:end w:w="120" w:type="dxa"/>
+            </w:tcMar>
+          </w:tcPr>
+          <w:p>
+            <w:pPr>
+              <w:spacing w:after="0"/>
+            </w:pPr>
+            <w:r>
+              <w:rPr>
+                <w:rFonts w:ascii="Calibri" w:hAnsi="Calibri"/>
+                <w:sz w:val="18"/>
+              </w:rPr>
+              <w:t>Office Admin and Asset Operations UI; OfficeAdminService; assignment planner; one migration; focused TypeScript/component tests; 30-assertion pgTAP contract</w:t>
+            </w:r>
+          </w:p>
+        </w:tc>
+      </w:tr>
+      <w:tr>
+        <w:trPr>
+          <w:cantSplit/>
+        </w:trPr>
+        <w:tc>
+          <w:tcPr>
+            <w:tcW w:type="dxa" w:w="2232"/>
+            <w:vAlign w:val="center"/>
+            <w:tcMar>
+              <w:top w:w="80" w:type="dxa"/>
+              <w:start w:w="120" w:type="dxa"/>
+              <w:bottom w:w="80" w:type="dxa"/>
+              <w:end w:w="120" w:type="dxa"/>
+            </w:tcMar>
+          </w:tcPr>
+          <w:p>
+            <w:pPr>
+              <w:spacing w:after="0"/>
+            </w:pPr>
+            <w:r>
+              <w:rPr>
+                <w:rFonts w:ascii="Calibri" w:hAnsi="Calibri"/>
+                <w:sz w:val="18"/>
+              </w:rPr>
+              <w:t>Security</w:t>
+            </w:r>
+          </w:p>
+        </w:tc>
+        <w:tc>
+          <w:tcPr>
+            <w:tcW w:type="dxa" w:w="7128"/>
+            <w:vAlign w:val="center"/>
+            <w:tcMar>
+              <w:top w:w="80" w:type="dxa"/>
+              <w:start w:w="120" w:type="dxa"/>
+              <w:bottom w:w="80" w:type="dxa"/>
+              <w:end w:w="120" w:type="dxa"/>
+            </w:tcMar>
+          </w:tcPr>
+          <w:p>
+            <w:pPr>
+              <w:spacing w:after="0"/>
+            </w:pPr>
+            <w:r>
+              <w:rPr>
+                <w:rFonts w:ascii="Calibri" w:hAnsi="Calibri"/>
+                <w:sz w:val="18"/>
+              </w:rPr>
+              <w:t>Office-only invoker RPCs call private definer implementations; hard blockers cannot be overridden; direct writes are trigger-blocked; protected details stay out of generic audit; trigger markers are cleared immediately</w:t>
+            </w:r>
+          </w:p>
+        </w:tc>
+      </w:tr>
+      <w:tr>
+        <w:trPr>
+          <w:cantSplit/>
+        </w:trPr>
+        <w:tc>
+          <w:tcPr>
+            <w:tcW w:type="dxa" w:w="2232"/>
+            <w:shd w:fill="F2F4F7"/>
+            <w:vAlign w:val="center"/>
+            <w:tcMar>
+              <w:top w:w="80" w:type="dxa"/>
+              <w:start w:w="120" w:type="dxa"/>
+              <w:bottom w:w="80" w:type="dxa"/>
+              <w:end w:w="120" w:type="dxa"/>
+            </w:tcMar>
+          </w:tcPr>
+          <w:p>
+            <w:pPr>
+              <w:spacing w:after="0"/>
+            </w:pPr>
+            <w:r>
+              <w:rPr>
+                <w:rFonts w:ascii="Calibri" w:hAnsi="Calibri"/>
+                <w:sz w:val="18"/>
+              </w:rPr>
+              <w:t>Three-pass challenge</w:t>
+            </w:r>
+          </w:p>
+        </w:tc>
+        <w:tc>
+          <w:tcPr>
+            <w:tcW w:type="dxa" w:w="7128"/>
+            <w:shd w:fill="F2F4F7"/>
+            <w:vAlign w:val="center"/>
+            <w:tcMar>
+              <w:top w:w="80" w:type="dxa"/>
+              <w:start w:w="120" w:type="dxa"/>
+              <w:bottom w:w="80" w:type="dxa"/>
+              <w:end w:w="120" w:type="dxa"/>
+            </w:tcMar>
+          </w:tcPr>
+          <w:p>
+            <w:pPr>
+              <w:spacing w:after="0"/>
+            </w:pPr>
+            <w:r>
+              <w:rPr>
+                <w:rFonts w:ascii="Calibri" w:hAnsi="Calibri"/>
+                <w:sz w:val="18"/>
+              </w:rPr>
+              <w:t>Pass 1 found false no-change warnings/custody; Pass 2 aligned browser and database decisions; Pass 3 found a reusable transaction-local trigger marker in an eight-file security diff scan</w:t>
+            </w:r>
+          </w:p>
+        </w:tc>
+      </w:tr>
+      <w:tr>
+        <w:trPr>
+          <w:cantSplit/>
+        </w:trPr>
+        <w:tc>
+          <w:tcPr>
+            <w:tcW w:type="dxa" w:w="2232"/>
+            <w:vAlign w:val="center"/>
+            <w:tcMar>
+              <w:top w:w="80" w:type="dxa"/>
+              <w:start w:w="120" w:type="dxa"/>
+              <w:bottom w:w="80" w:type="dxa"/>
+              <w:end w:w="120" w:type="dxa"/>
+            </w:tcMar>
+          </w:tcPr>
+          <w:p>
+            <w:pPr>
+              <w:spacing w:after="0"/>
+            </w:pPr>
+            <w:r>
+              <w:rPr>
+                <w:rFonts w:ascii="Calibri" w:hAnsi="Calibri"/>
+                <w:sz w:val="18"/>
+              </w:rPr>
+              <w:t>Improvements</w:t>
+            </w:r>
+          </w:p>
+        </w:tc>
+        <w:tc>
+          <w:tcPr>
+            <w:tcW w:type="dxa" w:w="7128"/>
+            <w:vAlign w:val="center"/>
+            <w:tcMar>
+              <w:top w:w="80" w:type="dxa"/>
+              <w:start w:w="120" w:type="dxa"/>
+              <w:bottom w:w="80" w:type="dxa"/>
+              <w:end w:w="120" w:type="dxa"/>
+            </w:tcMar>
+          </w:tcPr>
+          <w:p>
+            <w:pPr>
+              <w:spacing w:after="0"/>
+            </w:pPr>
+            <w:r>
+              <w:rPr>
+                <w:rFonts w:ascii="Calibri" w:hAnsi="Calibri"/>
+                <w:sz w:val="18"/>
+              </w:rPr>
+              <w:t>No-change is informational; unchanged rows are not rewritten; unchanged assets create no custody event; missing licence fails closed; marker lifetime is limited to the guarded update</w:t>
+            </w:r>
+          </w:p>
+        </w:tc>
+      </w:tr>
+      <w:tr>
+        <w:trPr>
+          <w:cantSplit/>
+        </w:trPr>
+        <w:tc>
+          <w:tcPr>
+            <w:tcW w:type="dxa" w:w="2232"/>
+            <w:shd w:fill="F2F4F7"/>
+            <w:vAlign w:val="center"/>
+            <w:tcMar>
+              <w:top w:w="80" w:type="dxa"/>
+              <w:start w:w="120" w:type="dxa"/>
+              <w:bottom w:w="80" w:type="dxa"/>
+              <w:end w:w="120" w:type="dxa"/>
+            </w:tcMar>
+          </w:tcPr>
+          <w:p>
+            <w:pPr>
+              <w:spacing w:after="0"/>
+            </w:pPr>
+            <w:r>
+              <w:rPr>
+                <w:rFonts w:ascii="Calibri" w:hAnsi="Calibri"/>
+                <w:sz w:val="18"/>
+              </w:rPr>
+              <w:t>Tests</w:t>
+            </w:r>
+          </w:p>
+        </w:tc>
+        <w:tc>
+          <w:tcPr>
+            <w:tcW w:type="dxa" w:w="7128"/>
+            <w:shd w:fill="F2F4F7"/>
+            <w:vAlign w:val="center"/>
+            <w:tcMar>
+              <w:top w:w="80" w:type="dxa"/>
+              <w:start w:w="120" w:type="dxa"/>
+              <w:bottom w:w="80" w:type="dxa"/>
+              <w:end w:w="120" w:type="dxa"/>
+            </w:tcMar>
+          </w:tcPr>
+          <w:p>
+            <w:pPr>
+              <w:spacing w:after="0"/>
+            </w:pPr>
+            <w:r>
+              <w:rPr>
+                <w:rFonts w:ascii="Calibri" w:hAnsi="Calibri"/>
+                <w:sz w:val="18"/>
+              </w:rPr>
+              <w:t>Typecheck passed; 14/14 focused Chrome Headless tests passed; 30 authorization, role, blocker, override, no-op, custody, direct-write, and leak assertions authored</w:t>
+            </w:r>
+          </w:p>
+        </w:tc>
+      </w:tr>
+      <w:tr>
+        <w:trPr>
+          <w:cantSplit/>
+        </w:trPr>
+        <w:tc>
+          <w:tcPr>
+            <w:tcW w:type="dxa" w:w="2232"/>
+            <w:vAlign w:val="center"/>
+            <w:tcMar>
+              <w:top w:w="80" w:type="dxa"/>
+              <w:start w:w="120" w:type="dxa"/>
+              <w:bottom w:w="80" w:type="dxa"/>
+              <w:end w:w="120" w:type="dxa"/>
+            </w:tcMar>
+          </w:tcPr>
+          <w:p>
+            <w:pPr>
+              <w:spacing w:after="0"/>
+            </w:pPr>
+            <w:r>
+              <w:rPr>
+                <w:rFonts w:ascii="Calibri" w:hAnsi="Calibri"/>
+                <w:sz w:val="18"/>
+              </w:rPr>
+              <w:t>Visual evidence</w:t>
+            </w:r>
+          </w:p>
+        </w:tc>
+        <w:tc>
+          <w:tcPr>
+            <w:tcW w:type="dxa" w:w="7128"/>
+            <w:vAlign w:val="center"/>
+            <w:tcMar>
+              <w:top w:w="80" w:type="dxa"/>
+              <w:start w:w="120" w:type="dxa"/>
+              <w:bottom w:w="80" w:type="dxa"/>
+              <w:end w:w="120" w:type="dxa"/>
+            </w:tcMar>
+          </w:tcPr>
+          <w:p>
+            <w:pPr>
+              <w:spacing w:after="0"/>
+            </w:pPr>
+            <w:r>
+              <w:rPr>
+                <w:rFonts w:ascii="Calibri" w:hAnsi="Calibri"/>
+                <w:sz w:val="18"/>
+              </w:rPr>
+              <w:t>Existing responsive interfaces retain 44 px decision controls; full visual regression remains scheduled after Slice 3</w:t>
+            </w:r>
+          </w:p>
+        </w:tc>
+      </w:tr>
+      <w:tr>
+        <w:trPr>
+          <w:cantSplit/>
+        </w:trPr>
+        <w:tc>
+          <w:tcPr>
+            <w:tcW w:type="dxa" w:w="2232"/>
+            <w:shd w:fill="F2F4F7"/>
+            <w:vAlign w:val="center"/>
+            <w:tcMar>
+              <w:top w:w="80" w:type="dxa"/>
+              <w:start w:w="120" w:type="dxa"/>
+              <w:bottom w:w="80" w:type="dxa"/>
+              <w:end w:w="120" w:type="dxa"/>
+            </w:tcMar>
+          </w:tcPr>
+          <w:p>
+            <w:pPr>
+              <w:spacing w:after="0"/>
+            </w:pPr>
+            <w:r>
+              <w:rPr>
+                <w:rFonts w:ascii="Calibri" w:hAnsi="Calibri"/>
+                <w:sz w:val="18"/>
+              </w:rPr>
+              <w:t>Result</w:t>
+            </w:r>
+          </w:p>
+        </w:tc>
+        <w:tc>
+          <w:tcPr>
+            <w:tcW w:type="dxa" w:w="7128"/>
+            <w:shd w:fill="F2F4F7"/>
+            <w:vAlign w:val="center"/>
+            <w:tcMar>
+              <w:top w:w="80" w:type="dxa"/>
+              <w:start w:w="120" w:type="dxa"/>
+              <w:bottom w:w="80" w:type="dxa"/>
+              <w:end w:w="120" w:type="dxa"/>
+            </w:tcMar>
+          </w:tcPr>
+          <w:p>
+            <w:pPr>
+              <w:spacing w:after="0"/>
+            </w:pPr>
+            <w:r>
+              <w:rPr>
+                <w:rFonts w:ascii="Calibri" w:hAnsi="Calibri"/>
+                <w:sz w:val="18"/>
+              </w:rPr>
+              <w:t>Partial: implementation, browser tests, and hardened security remediation pass; database execution blocked because Docker Desktop Linux engine is not running</w:t>
+            </w:r>
+          </w:p>
+        </w:tc>
+      </w:tr>
+      <w:tr>
+        <w:trPr>
+          <w:cantSplit/>
+        </w:trPr>
+        <w:tc>
+          <w:tcPr>
+            <w:tcW w:type="dxa" w:w="2232"/>
+            <w:vAlign w:val="center"/>
+            <w:tcMar>
+              <w:top w:w="80" w:type="dxa"/>
+              <w:start w:w="120" w:type="dxa"/>
+              <w:bottom w:w="80" w:type="dxa"/>
+              <w:end w:w="120" w:type="dxa"/>
+            </w:tcMar>
+          </w:tcPr>
+          <w:p>
+            <w:pPr>
+              <w:spacing w:after="0"/>
+            </w:pPr>
+            <w:r>
+              <w:rPr>
+                <w:rFonts w:ascii="Calibri" w:hAnsi="Calibri"/>
+                <w:sz w:val="18"/>
+              </w:rPr>
+              <w:t>Known gap</w:t>
+            </w:r>
+          </w:p>
+        </w:tc>
+        <w:tc>
+          <w:tcPr>
+            <w:tcW w:type="dxa" w:w="7128"/>
+            <w:vAlign w:val="center"/>
+            <w:tcMar>
+              <w:top w:w="80" w:type="dxa"/>
+              <w:start w:w="120" w:type="dxa"/>
+              <w:bottom w:w="80" w:type="dxa"/>
+              <w:end w:w="120" w:type="dxa"/>
+            </w:tcMar>
+          </w:tcPr>
+          <w:p>
+            <w:pPr>
+              <w:spacing w:after="0"/>
+            </w:pPr>
+            <w:r>
+              <w:rPr>
+                <w:rFonts w:ascii="Calibri" w:hAnsi="Calibri"/>
+                <w:sz w:val="18"/>
+              </w:rPr>
+              <w:t>Recent utilisation is excluded until an authoritative metric exists; remote deployment and five-user provisioning await a verified Senatla remote-dev target</w:t>
+            </w:r>
+          </w:p>
+        </w:tc>
+      </w:tr>
+      <w:tr>
+        <w:trPr>
+          <w:cantSplit/>
+        </w:trPr>
+        <w:tc>
+          <w:tcPr>
+            <w:tcW w:type="dxa" w:w="2232"/>
+            <w:shd w:fill="F2F4F7"/>
+            <w:vAlign w:val="center"/>
+            <w:tcMar>
+              <w:top w:w="80" w:type="dxa"/>
+              <w:start w:w="120" w:type="dxa"/>
+              <w:bottom w:w="80" w:type="dxa"/>
+              <w:end w:w="120" w:type="dxa"/>
+            </w:tcMar>
+          </w:tcPr>
+          <w:p>
+            <w:pPr>
+              <w:spacing w:after="0"/>
+            </w:pPr>
+            <w:r>
+              <w:rPr>
+                <w:rFonts w:ascii="Calibri" w:hAnsi="Calibri"/>
+                <w:sz w:val="18"/>
+              </w:rPr>
+              <w:t>Next action</w:t>
+            </w:r>
+          </w:p>
+        </w:tc>
+        <w:tc>
+          <w:tcPr>
+            <w:tcW w:type="dxa" w:w="7128"/>
+            <w:shd w:fill="F2F4F7"/>
+            <w:vAlign w:val="center"/>
+            <w:tcMar>
+              <w:top w:w="80" w:type="dxa"/>
+              <w:start w:w="120" w:type="dxa"/>
+              <w:bottom w:w="80" w:type="dxa"/>
+              <w:end w:w="120" w:type="dxa"/>
+            </w:tcMar>
+          </w:tcPr>
+          <w:p>
+            <w:pPr>
+              <w:spacing w:after="0"/>
+            </w:pPr>
+            <w:r>
+              <w:rPr>
+                <w:rFonts w:ascii="Calibri" w:hAnsi="Calibri"/>
+                <w:sz w:val="18"/>
+              </w:rPr>
+              <w:t>Commit the clean candidate; execute pgTAP and deploy only after remote target verification; then provision five real users and create the ignored credential handoff</w:t>
+            </w:r>
+          </w:p>
+        </w:tc>
+      </w:tr>
+    </w:tbl>
+    <w:p>
+      <w:pPr>
+        <w:spacing w:after="0"/>
+      </w:pPr>
+    </w:p>
+    <w:p>
+      <w:pPr>
         <w:pStyle w:val="Heading1"/>
       </w:pPr>
       <w:r>
@@ -6156,6 +6920,136 @@
           </w:p>
         </w:tc>
       </w:tr>
+      <w:tr>
+        <w:trPr>
+          <w:cantSplit/>
+        </w:trPr>
+        <w:tc>
+          <w:tcPr>
+            <w:tcW w:type="dxa" w:w="864"/>
+            <w:shd w:fill="F2F4F7"/>
+            <w:vAlign w:val="center"/>
+            <w:tcMar>
+              <w:top w:w="80" w:type="dxa"/>
+              <w:start w:w="120" w:type="dxa"/>
+              <w:bottom w:w="80" w:type="dxa"/>
+              <w:end w:w="120" w:type="dxa"/>
+            </w:tcMar>
+          </w:tcPr>
+          <w:p>
+            <w:pPr>
+              <w:spacing w:after="0"/>
+            </w:pPr>
+            <w:r>
+              <w:rPr>
+                <w:rFonts w:ascii="Calibri" w:hAnsi="Calibri"/>
+                <w:sz w:val="18"/>
+              </w:rPr>
+              <w:t>D-010</w:t>
+            </w:r>
+          </w:p>
+        </w:tc>
+        <w:tc>
+          <w:tcPr>
+            <w:tcW w:type="dxa" w:w="1296"/>
+            <w:shd w:fill="F2F4F7"/>
+            <w:vAlign w:val="center"/>
+            <w:tcMar>
+              <w:top w:w="80" w:type="dxa"/>
+              <w:start w:w="120" w:type="dxa"/>
+              <w:bottom w:w="80" w:type="dxa"/>
+              <w:end w:w="120" w:type="dxa"/>
+            </w:tcMar>
+          </w:tcPr>
+          <w:p>
+            <w:pPr>
+              <w:spacing w:after="0"/>
+            </w:pPr>
+            <w:r>
+              <w:rPr>
+                <w:rFonts w:ascii="Calibri" w:hAnsi="Calibri"/>
+                <w:sz w:val="18"/>
+              </w:rPr>
+              <w:t>23 Aug 2026</w:t>
+            </w:r>
+          </w:p>
+        </w:tc>
+        <w:tc>
+          <w:tcPr>
+            <w:tcW w:type="dxa" w:w="2304"/>
+            <w:shd w:fill="F2F4F7"/>
+            <w:vAlign w:val="center"/>
+            <w:tcMar>
+              <w:top w:w="80" w:type="dxa"/>
+              <w:start w:w="120" w:type="dxa"/>
+              <w:bottom w:w="80" w:type="dxa"/>
+              <w:end w:w="120" w:type="dxa"/>
+            </w:tcMar>
+          </w:tcPr>
+          <w:p>
+            <w:pPr>
+              <w:spacing w:after="0"/>
+            </w:pPr>
+            <w:r>
+              <w:rPr>
+                <w:rFonts w:ascii="Calibri" w:hAnsi="Calibri"/>
+                <w:sz w:val="18"/>
+              </w:rPr>
+              <w:t>Atomic assignment re-evaluation and short-lived trigger marker</w:t>
+            </w:r>
+          </w:p>
+        </w:tc>
+        <w:tc>
+          <w:tcPr>
+            <w:tcW w:type="dxa" w:w="3528"/>
+            <w:shd w:fill="F2F4F7"/>
+            <w:vAlign w:val="center"/>
+            <w:tcMar>
+              <w:top w:w="80" w:type="dxa"/>
+              <w:start w:w="120" w:type="dxa"/>
+              <w:bottom w:w="80" w:type="dxa"/>
+              <w:end w:w="120" w:type="dxa"/>
+            </w:tcMar>
+          </w:tcPr>
+          <w:p>
+            <w:pPr>
+              <w:spacing w:after="0"/>
+            </w:pPr>
+            <w:r>
+              <w:rPr>
+                <w:rFonts w:ascii="Calibri" w:hAnsi="Calibri"/>
+                <w:sz w:val="18"/>
+              </w:rPr>
+              <w:t>Prevent stale decisions and direct-write bypass</w:t>
+            </w:r>
+          </w:p>
+        </w:tc>
+        <w:tc>
+          <w:tcPr>
+            <w:tcW w:type="dxa" w:w="1368"/>
+            <w:shd w:fill="F2F4F7"/>
+            <w:vAlign w:val="center"/>
+            <w:tcMar>
+              <w:top w:w="80" w:type="dxa"/>
+              <w:start w:w="120" w:type="dxa"/>
+              <w:bottom w:w="80" w:type="dxa"/>
+              <w:end w:w="120" w:type="dxa"/>
+            </w:tcMar>
+          </w:tcPr>
+          <w:p>
+            <w:pPr>
+              <w:spacing w:after="0"/>
+            </w:pPr>
+            <w:r>
+              <w:rPr>
+                <w:rFonts w:ascii="Calibri" w:hAnsi="Calibri"/>
+                <w:sz w:val="18"/>
+              </w:rPr>
+              <w:t>Accepted</w:t>
+            </w:r>
+          </w:p>
+        </w:tc>
+      </w:tr>
     </w:tbl>
     <w:p>
       <w:pPr>
@@ -6662,7 +7556,7 @@
                 <w:rFonts w:ascii="Calibri" w:hAnsi="Calibri"/>
                 <w:sz w:val="18"/>
               </w:rPr>
-              <w:t>Pending</w:t>
+              <w:t>Partial</w:t>
             </w:r>
           </w:p>
         </w:tc>
@@ -6686,7 +7580,7 @@
                 <w:rFonts w:ascii="Calibri" w:hAnsi="Calibri"/>
                 <w:sz w:val="18"/>
               </w:rPr>
-              <w:t>To be recorded</w:t>
+              <w:t>14/14 focused tests and security remediation pass; 30 pgTAP assertions await execution</w:t>
             </w:r>
           </w:p>
         </w:tc>

</xml_diff>

<commit_message>
docs: record OCR native foundation journey
</commit_message>
<xml_diff>
--- a/output/doc/senatla-ops-implementation-journey.docx
+++ b/output/doc/senatla-ops-implementation-journey.docx
@@ -192,7 +192,7 @@
                 <w:rFonts w:ascii="Calibri" w:hAnsi="Calibri"/>
                 <w:sz w:val="18"/>
               </w:rPr>
-              <w:t>23 August 2026</w:t>
+              <w:t>24 August 2026</w:t>
             </w:r>
           </w:p>
         </w:tc>
@@ -216,7 +216,7 @@
                 <w:rFonts w:ascii="Calibri" w:hAnsi="Calibri"/>
                 <w:sz w:val="18"/>
               </w:rPr>
-              <w:t>sankofa_xciv/admin-grouping-vendor-invoices</w:t>
+              <w:t>sankofa_xciv/authoritative-slices-0-2</w:t>
             </w:r>
           </w:p>
         </w:tc>
@@ -5628,6 +5628,895 @@
     </w:p>
     <w:p>
       <w:pPr>
+        <w:pStyle w:val="Heading2"/>
+      </w:pPr>
+      <w:r>
+        <w:t>24 August 2026 - OCR-0 native platform foundation</w:t>
+      </w:r>
+    </w:p>
+    <w:tbl>
+      <w:tblPr>
+        <w:tblStyle w:val="TableGrid"/>
+        <w:tblW w:type="dxa" w:w="9360"/>
+        <w:tblLayout w:type="fixed"/>
+        <w:tblLook w:firstColumn="1" w:firstRow="1" w:lastColumn="0" w:lastRow="0" w:noHBand="0" w:noVBand="1" w:val="04A0"/>
+        <w:jc w:val="left"/>
+        <w:tblInd w:w="120" w:type="dxa"/>
+      </w:tblPr>
+      <w:tblGrid>
+        <w:gridCol w:w="4680"/>
+        <w:gridCol w:w="4680"/>
+      </w:tblGrid>
+      <w:tr>
+        <w:trPr>
+          <w:tblHeader w:val="true"/>
+        </w:trPr>
+        <w:tc>
+          <w:tcPr>
+            <w:tcW w:type="dxa" w:w="2232"/>
+            <w:vAlign w:val="center"/>
+            <w:tcMar>
+              <w:top w:w="80" w:type="dxa"/>
+              <w:start w:w="120" w:type="dxa"/>
+              <w:bottom w:w="80" w:type="dxa"/>
+              <w:end w:w="120" w:type="dxa"/>
+            </w:tcMar>
+            <w:shd w:fill="17365D"/>
+          </w:tcPr>
+          <w:p>
+            <w:r>
+              <w:rPr>
+                <w:rFonts w:ascii="Calibri" w:hAnsi="Calibri"/>
+                <w:b/>
+                <w:color w:val="FFFFFF"/>
+                <w:sz w:val="19"/>
+              </w:rPr>
+              <w:t>Field</w:t>
+            </w:r>
+          </w:p>
+        </w:tc>
+        <w:tc>
+          <w:tcPr>
+            <w:tcW w:type="dxa" w:w="7128"/>
+            <w:vAlign w:val="center"/>
+            <w:tcMar>
+              <w:top w:w="80" w:type="dxa"/>
+              <w:start w:w="120" w:type="dxa"/>
+              <w:bottom w:w="80" w:type="dxa"/>
+              <w:end w:w="120" w:type="dxa"/>
+            </w:tcMar>
+            <w:shd w:fill="17365D"/>
+          </w:tcPr>
+          <w:p>
+            <w:r>
+              <w:rPr>
+                <w:rFonts w:ascii="Calibri" w:hAnsi="Calibri"/>
+                <w:b/>
+                <w:color w:val="FFFFFF"/>
+                <w:sz w:val="19"/>
+              </w:rPr>
+              <w:t>Recorded implementation evidence</w:t>
+            </w:r>
+          </w:p>
+        </w:tc>
+      </w:tr>
+      <w:tr>
+        <w:trPr>
+          <w:cantSplit/>
+        </w:trPr>
+        <w:tc>
+          <w:tcPr>
+            <w:tcW w:type="dxa" w:w="2232"/>
+            <w:vAlign w:val="center"/>
+            <w:tcMar>
+              <w:top w:w="80" w:type="dxa"/>
+              <w:start w:w="120" w:type="dxa"/>
+              <w:bottom w:w="80" w:type="dxa"/>
+              <w:end w:w="120" w:type="dxa"/>
+            </w:tcMar>
+          </w:tcPr>
+          <w:p>
+            <w:pPr>
+              <w:spacing w:after="0"/>
+            </w:pPr>
+            <w:r>
+              <w:rPr>
+                <w:rFonts w:ascii="Calibri" w:hAnsi="Calibri"/>
+                <w:sz w:val="18"/>
+              </w:rPr>
+              <w:t>Slice</w:t>
+            </w:r>
+          </w:p>
+        </w:tc>
+        <w:tc>
+          <w:tcPr>
+            <w:tcW w:type="dxa" w:w="7128"/>
+            <w:vAlign w:val="center"/>
+            <w:tcMar>
+              <w:top w:w="80" w:type="dxa"/>
+              <w:start w:w="120" w:type="dxa"/>
+              <w:bottom w:w="80" w:type="dxa"/>
+              <w:end w:w="120" w:type="dxa"/>
+            </w:tcMar>
+          </w:tcPr>
+          <w:p>
+            <w:pPr>
+              <w:spacing w:after="0"/>
+            </w:pPr>
+            <w:r>
+              <w:rPr>
+                <w:rFonts w:ascii="Calibri" w:hAnsi="Calibri"/>
+                <w:sz w:val="18"/>
+              </w:rPr>
+              <w:t>OCR-0 - production native backbone before OCR logic</w:t>
+            </w:r>
+          </w:p>
+        </w:tc>
+      </w:tr>
+      <w:tr>
+        <w:trPr>
+          <w:cantSplit/>
+        </w:trPr>
+        <w:tc>
+          <w:tcPr>
+            <w:tcW w:type="dxa" w:w="2232"/>
+            <w:shd w:fill="F2F4F7"/>
+            <w:vAlign w:val="center"/>
+            <w:tcMar>
+              <w:top w:w="80" w:type="dxa"/>
+              <w:start w:w="120" w:type="dxa"/>
+              <w:bottom w:w="80" w:type="dxa"/>
+              <w:end w:w="120" w:type="dxa"/>
+            </w:tcMar>
+          </w:tcPr>
+          <w:p>
+            <w:pPr>
+              <w:spacing w:after="0"/>
+            </w:pPr>
+            <w:r>
+              <w:rPr>
+                <w:rFonts w:ascii="Calibri" w:hAnsi="Calibri"/>
+                <w:sz w:val="18"/>
+              </w:rPr>
+              <w:t>Branch / PR</w:t>
+            </w:r>
+          </w:p>
+        </w:tc>
+        <w:tc>
+          <w:tcPr>
+            <w:tcW w:type="dxa" w:w="7128"/>
+            <w:shd w:fill="F2F4F7"/>
+            <w:vAlign w:val="center"/>
+            <w:tcMar>
+              <w:top w:w="80" w:type="dxa"/>
+              <w:start w:w="120" w:type="dxa"/>
+              <w:bottom w:w="80" w:type="dxa"/>
+              <w:end w:w="120" w:type="dxa"/>
+            </w:tcMar>
+          </w:tcPr>
+          <w:p>
+            <w:pPr>
+              <w:spacing w:after="0"/>
+            </w:pPr>
+            <w:r>
+              <w:rPr>
+                <w:rFonts w:ascii="Calibri" w:hAnsi="Calibri"/>
+                <w:sz w:val="18"/>
+              </w:rPr>
+              <w:t>sankofa_xciv/authoritative-slices-0-2; PR #53 into dev</w:t>
+            </w:r>
+          </w:p>
+        </w:tc>
+      </w:tr>
+      <w:tr>
+        <w:trPr>
+          <w:cantSplit/>
+        </w:trPr>
+        <w:tc>
+          <w:tcPr>
+            <w:tcW w:type="dxa" w:w="2232"/>
+            <w:vAlign w:val="center"/>
+            <w:tcMar>
+              <w:top w:w="80" w:type="dxa"/>
+              <w:start w:w="120" w:type="dxa"/>
+              <w:bottom w:w="80" w:type="dxa"/>
+              <w:end w:w="120" w:type="dxa"/>
+            </w:tcMar>
+          </w:tcPr>
+          <w:p>
+            <w:pPr>
+              <w:spacing w:after="0"/>
+            </w:pPr>
+            <w:r>
+              <w:rPr>
+                <w:rFonts w:ascii="Calibri" w:hAnsi="Calibri"/>
+                <w:sz w:val="18"/>
+              </w:rPr>
+              <w:t>Outcome</w:t>
+            </w:r>
+          </w:p>
+        </w:tc>
+        <w:tc>
+          <w:tcPr>
+            <w:tcW w:type="dxa" w:w="7128"/>
+            <w:vAlign w:val="center"/>
+            <w:tcMar>
+              <w:top w:w="80" w:type="dxa"/>
+              <w:start w:w="120" w:type="dxa"/>
+              <w:bottom w:w="80" w:type="dxa"/>
+              <w:end w:w="120" w:type="dxa"/>
+            </w:tcMar>
+          </w:tcPr>
+          <w:p>
+            <w:pPr>
+              <w:spacing w:after="0"/>
+            </w:pPr>
+            <w:r>
+              <w:rPr>
+                <w:rFonts w:ascii="Calibri" w:hAnsi="Calibri"/>
+                <w:sz w:val="18"/>
+              </w:rPr>
+              <w:t>Committed Android and iOS Capacitor projects under za.co.senatlatrading.ops, exact install-script approvals, unsigned native gates, and native privacy controls; no OCR SDK or replacement app</w:t>
+            </w:r>
+          </w:p>
+        </w:tc>
+      </w:tr>
+      <w:tr>
+        <w:trPr>
+          <w:cantSplit/>
+        </w:trPr>
+        <w:tc>
+          <w:tcPr>
+            <w:tcW w:type="dxa" w:w="2232"/>
+            <w:shd w:fill="F2F4F7"/>
+            <w:vAlign w:val="center"/>
+            <w:tcMar>
+              <w:top w:w="80" w:type="dxa"/>
+              <w:start w:w="120" w:type="dxa"/>
+              <w:bottom w:w="80" w:type="dxa"/>
+              <w:end w:w="120" w:type="dxa"/>
+            </w:tcMar>
+          </w:tcPr>
+          <w:p>
+            <w:pPr>
+              <w:spacing w:after="0"/>
+            </w:pPr>
+            <w:r>
+              <w:rPr>
+                <w:rFonts w:ascii="Calibri" w:hAnsi="Calibri"/>
+                <w:sz w:val="18"/>
+              </w:rPr>
+              <w:t>Decision</w:t>
+            </w:r>
+          </w:p>
+        </w:tc>
+        <w:tc>
+          <w:tcPr>
+            <w:tcW w:type="dxa" w:w="7128"/>
+            <w:shd w:fill="F2F4F7"/>
+            <w:vAlign w:val="center"/>
+            <w:tcMar>
+              <w:top w:w="80" w:type="dxa"/>
+              <w:start w:w="120" w:type="dxa"/>
+              <w:bottom w:w="80" w:type="dxa"/>
+              <w:end w:w="120" w:type="dxa"/>
+            </w:tcMar>
+          </w:tcPr>
+          <w:p>
+            <w:pPr>
+              <w:spacing w:after="0"/>
+            </w:pPr>
+            <w:r>
+              <w:rPr>
+                <w:rFonts w:ascii="Calibri" w:hAnsi="Calibri"/>
+                <w:sz w:val="18"/>
+              </w:rPr>
+              <w:t>Prove the native security and build boundary before scanning contracts or Android ML Kit and Apple Vision/VisionKit adapters</w:t>
+            </w:r>
+          </w:p>
+        </w:tc>
+      </w:tr>
+      <w:tr>
+        <w:trPr>
+          <w:cantSplit/>
+        </w:trPr>
+        <w:tc>
+          <w:tcPr>
+            <w:tcW w:type="dxa" w:w="2232"/>
+            <w:vAlign w:val="center"/>
+            <w:tcMar>
+              <w:top w:w="80" w:type="dxa"/>
+              <w:start w:w="120" w:type="dxa"/>
+              <w:bottom w:w="80" w:type="dxa"/>
+              <w:end w:w="120" w:type="dxa"/>
+            </w:tcMar>
+          </w:tcPr>
+          <w:p>
+            <w:pPr>
+              <w:spacing w:after="0"/>
+            </w:pPr>
+            <w:r>
+              <w:rPr>
+                <w:rFonts w:ascii="Calibri" w:hAnsi="Calibri"/>
+                <w:sz w:val="18"/>
+              </w:rPr>
+              <w:t>Rejected alternative</w:t>
+            </w:r>
+          </w:p>
+        </w:tc>
+        <w:tc>
+          <w:tcPr>
+            <w:tcW w:type="dxa" w:w="7128"/>
+            <w:vAlign w:val="center"/>
+            <w:tcMar>
+              <w:top w:w="80" w:type="dxa"/>
+              <w:start w:w="120" w:type="dxa"/>
+              <w:bottom w:w="80" w:type="dxa"/>
+              <w:end w:w="120" w:type="dxa"/>
+            </w:tcMar>
+          </w:tcPr>
+          <w:p>
+            <w:pPr>
+              <w:spacing w:after="0"/>
+            </w:pPr>
+            <w:r>
+              <w:rPr>
+                <w:rFonts w:ascii="Calibri" w:hAnsi="Calibri"/>
+                <w:sz w:val="18"/>
+              </w:rPr>
+              <w:t>Browser-only capture or an immediate cross-platform OCR dependency that would weaken native quality, offline behavior, privacy control, and platform ownership</w:t>
+            </w:r>
+          </w:p>
+        </w:tc>
+      </w:tr>
+      <w:tr>
+        <w:trPr>
+          <w:cantSplit/>
+        </w:trPr>
+        <w:tc>
+          <w:tcPr>
+            <w:tcW w:type="dxa" w:w="2232"/>
+            <w:shd w:fill="F2F4F7"/>
+            <w:vAlign w:val="center"/>
+            <w:tcMar>
+              <w:top w:w="80" w:type="dxa"/>
+              <w:start w:w="120" w:type="dxa"/>
+              <w:bottom w:w="80" w:type="dxa"/>
+              <w:end w:w="120" w:type="dxa"/>
+            </w:tcMar>
+          </w:tcPr>
+          <w:p>
+            <w:pPr>
+              <w:spacing w:after="0"/>
+            </w:pPr>
+            <w:r>
+              <w:rPr>
+                <w:rFonts w:ascii="Calibri" w:hAnsi="Calibri"/>
+                <w:sz w:val="18"/>
+              </w:rPr>
+              <w:t>Changed contracts</w:t>
+            </w:r>
+          </w:p>
+        </w:tc>
+        <w:tc>
+          <w:tcPr>
+            <w:tcW w:type="dxa" w:w="7128"/>
+            <w:shd w:fill="F2F4F7"/>
+            <w:vAlign w:val="center"/>
+            <w:tcMar>
+              <w:top w:w="80" w:type="dxa"/>
+              <w:start w:w="120" w:type="dxa"/>
+              <w:bottom w:w="80" w:type="dxa"/>
+              <w:end w:w="120" w:type="dxa"/>
+            </w:tcMar>
+          </w:tcPr>
+          <w:p>
+            <w:pPr>
+              <w:spacing w:after="0"/>
+            </w:pPr>
+            <w:r>
+              <w:rPr>
+                <w:rFonts w:ascii="Calibri" w:hAnsi="Calibri"/>
+                <w:sz w:val="18"/>
+              </w:rPr>
+              <w:t>Capacitor identity/dependencies; android and ios projects; native CI; Swift path normalizer; browser baseline; signing exclusions; native guide</w:t>
+            </w:r>
+          </w:p>
+        </w:tc>
+      </w:tr>
+      <w:tr>
+        <w:trPr>
+          <w:cantSplit/>
+        </w:trPr>
+        <w:tc>
+          <w:tcPr>
+            <w:tcW w:type="dxa" w:w="2232"/>
+            <w:vAlign w:val="center"/>
+            <w:tcMar>
+              <w:top w:w="80" w:type="dxa"/>
+              <w:start w:w="120" w:type="dxa"/>
+              <w:bottom w:w="80" w:type="dxa"/>
+              <w:end w:w="120" w:type="dxa"/>
+            </w:tcMar>
+          </w:tcPr>
+          <w:p>
+            <w:pPr>
+              <w:spacing w:after="0"/>
+            </w:pPr>
+            <w:r>
+              <w:rPr>
+                <w:rFonts w:ascii="Calibri" w:hAnsi="Calibri"/>
+                <w:sz w:val="18"/>
+              </w:rPr>
+              <w:t>Security</w:t>
+            </w:r>
+          </w:p>
+        </w:tc>
+        <w:tc>
+          <w:tcPr>
+            <w:tcW w:type="dxa" w:w="7128"/>
+            <w:vAlign w:val="center"/>
+            <w:tcMar>
+              <w:top w:w="80" w:type="dxa"/>
+              <w:start w:w="120" w:type="dxa"/>
+              <w:bottom w:w="80" w:type="dxa"/>
+              <w:end w:w="120" w:type="dxa"/>
+            </w:tcMar>
+          </w:tcPr>
+          <w:p>
+            <w:pPr>
+              <w:spacing w:after="0"/>
+            </w:pPr>
+            <w:r>
+              <w:rPr>
+                <w:rFonts w:ascii="Calibri" w:hAnsi="Calibri"/>
+                <w:sz w:val="18"/>
+              </w:rPr>
+              <w:t>Android backup disabled; FileProvider restricted to a dedicated evidence cache; iOS purposes explicit; signing/API keys ignored; no secret stored in Git or this document</w:t>
+            </w:r>
+          </w:p>
+        </w:tc>
+      </w:tr>
+      <w:tr>
+        <w:trPr>
+          <w:cantSplit/>
+        </w:trPr>
+        <w:tc>
+          <w:tcPr>
+            <w:tcW w:type="dxa" w:w="2232"/>
+            <w:shd w:fill="F2F4F7"/>
+            <w:vAlign w:val="center"/>
+            <w:tcMar>
+              <w:top w:w="80" w:type="dxa"/>
+              <w:start w:w="120" w:type="dxa"/>
+              <w:bottom w:w="80" w:type="dxa"/>
+              <w:end w:w="120" w:type="dxa"/>
+            </w:tcMar>
+          </w:tcPr>
+          <w:p>
+            <w:pPr>
+              <w:spacing w:after="0"/>
+            </w:pPr>
+            <w:r>
+              <w:rPr>
+                <w:rFonts w:ascii="Calibri" w:hAnsi="Calibri"/>
+                <w:sz w:val="18"/>
+              </w:rPr>
+              <w:t>Three-pass challenge</w:t>
+            </w:r>
+          </w:p>
+        </w:tc>
+        <w:tc>
+          <w:tcPr>
+            <w:tcW w:type="dxa" w:w="7128"/>
+            <w:shd w:fill="F2F4F7"/>
+            <w:vAlign w:val="center"/>
+            <w:tcMar>
+              <w:top w:w="80" w:type="dxa"/>
+              <w:start w:w="120" w:type="dxa"/>
+              <w:bottom w:w="80" w:type="dxa"/>
+              <w:end w:w="120" w:type="dxa"/>
+            </w:tcMar>
+          </w:tcPr>
+          <w:p>
+            <w:pPr>
+              <w:spacing w:after="0"/>
+            </w:pPr>
+            <w:r>
+              <w:rPr>
+                <w:rFonts w:ascii="Calibri" w:hAnsi="Calibri"/>
+                <w:sz w:val="18"/>
+              </w:rPr>
+              <w:t>Pass 1 aligned IDs, versions, browsers, permissions, and sync; Pass 2 found backup/file-sharing leaks, stale test identities, secret exclusions, trigger gaps, and silent normalization; Pass 3 ran executable and remote gates</w:t>
+            </w:r>
+          </w:p>
+        </w:tc>
+      </w:tr>
+      <w:tr>
+        <w:trPr>
+          <w:cantSplit/>
+        </w:trPr>
+        <w:tc>
+          <w:tcPr>
+            <w:tcW w:type="dxa" w:w="2232"/>
+            <w:vAlign w:val="center"/>
+            <w:tcMar>
+              <w:top w:w="80" w:type="dxa"/>
+              <w:start w:w="120" w:type="dxa"/>
+              <w:bottom w:w="80" w:type="dxa"/>
+              <w:end w:w="120" w:type="dxa"/>
+            </w:tcMar>
+          </w:tcPr>
+          <w:p>
+            <w:pPr>
+              <w:spacing w:after="0"/>
+            </w:pPr>
+            <w:r>
+              <w:rPr>
+                <w:rFonts w:ascii="Calibri" w:hAnsi="Calibri"/>
+                <w:sz w:val="18"/>
+              </w:rPr>
+              <w:t>Improvements</w:t>
+            </w:r>
+          </w:p>
+        </w:tc>
+        <w:tc>
+          <w:tcPr>
+            <w:tcW w:type="dxa" w:w="7128"/>
+            <w:vAlign w:val="center"/>
+            <w:tcMar>
+              <w:top w:w="80" w:type="dxa"/>
+              <w:start w:w="120" w:type="dxa"/>
+              <w:bottom w:w="80" w:type="dxa"/>
+              <w:end w:w="120" w:type="dxa"/>
+            </w:tcMar>
+          </w:tcPr>
+          <w:p>
+            <w:pPr>
+              <w:spacing w:after="0"/>
+            </w:pPr>
+            <w:r>
+              <w:rPr>
+                <w:rFonts w:ascii="Calibri" w:hAnsi="Calibri"/>
+                <w:sz w:val="18"/>
+              </w:rPr>
+              <w:t>Disabled backups; narrowed sharing; corrected native test packages; compiled Android tests in CI; expanded triggers; made iOS normalization fail closed; documented install-script trust and release gates</w:t>
+            </w:r>
+          </w:p>
+        </w:tc>
+      </w:tr>
+      <w:tr>
+        <w:trPr>
+          <w:cantSplit/>
+        </w:trPr>
+        <w:tc>
+          <w:tcPr>
+            <w:tcW w:type="dxa" w:w="2232"/>
+            <w:shd w:fill="F2F4F7"/>
+            <w:vAlign w:val="center"/>
+            <w:tcMar>
+              <w:top w:w="80" w:type="dxa"/>
+              <w:start w:w="120" w:type="dxa"/>
+              <w:bottom w:w="80" w:type="dxa"/>
+              <w:end w:w="120" w:type="dxa"/>
+            </w:tcMar>
+          </w:tcPr>
+          <w:p>
+            <w:pPr>
+              <w:spacing w:after="0"/>
+            </w:pPr>
+            <w:r>
+              <w:rPr>
+                <w:rFonts w:ascii="Calibri" w:hAnsi="Calibri"/>
+                <w:sz w:val="18"/>
+              </w:rPr>
+              <w:t>Tests</w:t>
+            </w:r>
+          </w:p>
+        </w:tc>
+        <w:tc>
+          <w:tcPr>
+            <w:tcW w:type="dxa" w:w="7128"/>
+            <w:shd w:fill="F2F4F7"/>
+            <w:vAlign w:val="center"/>
+            <w:tcMar>
+              <w:top w:w="80" w:type="dxa"/>
+              <w:start w:w="120" w:type="dxa"/>
+              <w:bottom w:w="80" w:type="dxa"/>
+              <w:end w:w="120" w:type="dxa"/>
+            </w:tcMar>
+          </w:tcPr>
+          <w:p>
+            <w:pPr>
+              <w:spacing w:after="0"/>
+            </w:pPr>
+            <w:r>
+              <w:rPr>
+                <w:rFonts w:ascii="Calibri" w:hAnsi="Calibri"/>
+                <w:sz w:val="18"/>
+              </w:rPr>
+              <w:t>Runtime-config 3/3, lint, typecheck, production build, and 80/80 browser tests passed; repeated Android/iOS sync passed; production dependency audit found zero vulnerabilities</w:t>
+            </w:r>
+          </w:p>
+        </w:tc>
+      </w:tr>
+      <w:tr>
+        <w:trPr>
+          <w:cantSplit/>
+        </w:trPr>
+        <w:tc>
+          <w:tcPr>
+            <w:tcW w:type="dxa" w:w="2232"/>
+            <w:vAlign w:val="center"/>
+            <w:tcMar>
+              <w:top w:w="80" w:type="dxa"/>
+              <w:start w:w="120" w:type="dxa"/>
+              <w:bottom w:w="80" w:type="dxa"/>
+              <w:end w:w="120" w:type="dxa"/>
+            </w:tcMar>
+          </w:tcPr>
+          <w:p>
+            <w:pPr>
+              <w:spacing w:after="0"/>
+            </w:pPr>
+            <w:r>
+              <w:rPr>
+                <w:rFonts w:ascii="Calibri" w:hAnsi="Calibri"/>
+                <w:sz w:val="18"/>
+              </w:rPr>
+              <w:t>Native evidence</w:t>
+            </w:r>
+          </w:p>
+        </w:tc>
+        <w:tc>
+          <w:tcPr>
+            <w:tcW w:type="dxa" w:w="7128"/>
+            <w:vAlign w:val="center"/>
+            <w:tcMar>
+              <w:top w:w="80" w:type="dxa"/>
+              <w:start w:w="120" w:type="dxa"/>
+              <w:bottom w:w="80" w:type="dxa"/>
+              <w:end w:w="120" w:type="dxa"/>
+            </w:tcMar>
+          </w:tcPr>
+          <w:p>
+            <w:pPr>
+              <w:spacing w:after="0"/>
+            </w:pPr>
+            <w:r>
+              <w:rPr>
+                <w:rFonts w:ascii="Calibri" w:hAnsi="Calibri"/>
+                <w:sz w:val="18"/>
+              </w:rPr>
+              <w:t>GitHub Actions run 32676423136 passed: Android app lint, unit tests, instrumentation-test APK compilation, and unsigned debug APK built on Linux in 3m54s; the unsigned iOS simulator app built on macOS in 2m14s. https://github.com/Sankofa-Digital-Studio/senatla-ops/actions/runs/32676423136</w:t>
+            </w:r>
+          </w:p>
+        </w:tc>
+      </w:tr>
+      <w:tr>
+        <w:trPr>
+          <w:cantSplit/>
+        </w:trPr>
+        <w:tc>
+          <w:tcPr>
+            <w:tcW w:type="dxa" w:w="2232"/>
+            <w:shd w:fill="F2F4F7"/>
+            <w:vAlign w:val="center"/>
+            <w:tcMar>
+              <w:top w:w="80" w:type="dxa"/>
+              <w:start w:w="120" w:type="dxa"/>
+              <w:bottom w:w="80" w:type="dxa"/>
+              <w:end w:w="120" w:type="dxa"/>
+            </w:tcMar>
+          </w:tcPr>
+          <w:p>
+            <w:pPr>
+              <w:spacing w:after="0"/>
+            </w:pPr>
+            <w:r>
+              <w:rPr>
+                <w:rFonts w:ascii="Calibri" w:hAnsi="Calibri"/>
+                <w:sz w:val="18"/>
+              </w:rPr>
+              <w:t>Visual evidence</w:t>
+            </w:r>
+          </w:p>
+        </w:tc>
+        <w:tc>
+          <w:tcPr>
+            <w:tcW w:type="dxa" w:w="7128"/>
+            <w:shd w:fill="F2F4F7"/>
+            <w:vAlign w:val="center"/>
+            <w:tcMar>
+              <w:top w:w="80" w:type="dxa"/>
+              <w:start w:w="120" w:type="dxa"/>
+              <w:bottom w:w="80" w:type="dxa"/>
+              <w:end w:w="120" w:type="dxa"/>
+            </w:tcMar>
+          </w:tcPr>
+          <w:p>
+            <w:pPr>
+              <w:spacing w:after="0"/>
+            </w:pPr>
+            <w:r>
+              <w:rPr>
+                <w:rFonts w:ascii="Calibri" w:hAnsi="Calibri"/>
+                <w:sz w:val="18"/>
+              </w:rPr>
+              <w:t>No rendered app UI changed; full regression remains after Slice 3 and scanner visual evidence begins with the first rendered OCR slice</w:t>
+            </w:r>
+          </w:p>
+        </w:tc>
+      </w:tr>
+      <w:tr>
+        <w:trPr>
+          <w:cantSplit/>
+        </w:trPr>
+        <w:tc>
+          <w:tcPr>
+            <w:tcW w:type="dxa" w:w="2232"/>
+            <w:vAlign w:val="center"/>
+            <w:tcMar>
+              <w:top w:w="80" w:type="dxa"/>
+              <w:start w:w="120" w:type="dxa"/>
+              <w:bottom w:w="80" w:type="dxa"/>
+              <w:end w:w="120" w:type="dxa"/>
+            </w:tcMar>
+          </w:tcPr>
+          <w:p>
+            <w:pPr>
+              <w:spacing w:after="0"/>
+            </w:pPr>
+            <w:r>
+              <w:rPr>
+                <w:rFonts w:ascii="Calibri" w:hAnsi="Calibri"/>
+                <w:sz w:val="18"/>
+              </w:rPr>
+              <w:t>Result</w:t>
+            </w:r>
+          </w:p>
+        </w:tc>
+        <w:tc>
+          <w:tcPr>
+            <w:tcW w:type="dxa" w:w="7128"/>
+            <w:vAlign w:val="center"/>
+            <w:tcMar>
+              <w:top w:w="80" w:type="dxa"/>
+              <w:start w:w="120" w:type="dxa"/>
+              <w:bottom w:w="80" w:type="dxa"/>
+              <w:end w:w="120" w:type="dxa"/>
+            </w:tcMar>
+          </w:tcPr>
+          <w:p>
+            <w:pPr>
+              <w:spacing w:after="0"/>
+            </w:pPr>
+            <w:r>
+              <w:rPr>
+                <w:rFonts w:ascii="Calibri" w:hAnsi="Calibri"/>
+                <w:sz w:val="18"/>
+              </w:rPr>
+              <w:t>Verified native foundation, subject to recorded release-stage gates</w:t>
+            </w:r>
+          </w:p>
+        </w:tc>
+      </w:tr>
+      <w:tr>
+        <w:trPr>
+          <w:cantSplit/>
+        </w:trPr>
+        <w:tc>
+          <w:tcPr>
+            <w:tcW w:type="dxa" w:w="2232"/>
+            <w:shd w:fill="F2F4F7"/>
+            <w:vAlign w:val="center"/>
+            <w:tcMar>
+              <w:top w:w="80" w:type="dxa"/>
+              <w:start w:w="120" w:type="dxa"/>
+              <w:bottom w:w="80" w:type="dxa"/>
+              <w:end w:w="120" w:type="dxa"/>
+            </w:tcMar>
+          </w:tcPr>
+          <w:p>
+            <w:pPr>
+              <w:spacing w:after="0"/>
+            </w:pPr>
+            <w:r>
+              <w:rPr>
+                <w:rFonts w:ascii="Calibri" w:hAnsi="Calibri"/>
+                <w:sz w:val="18"/>
+              </w:rPr>
+              <w:t>Known gaps</w:t>
+            </w:r>
+          </w:p>
+        </w:tc>
+        <w:tc>
+          <w:tcPr>
+            <w:tcW w:type="dxa" w:w="7128"/>
+            <w:shd w:fill="F2F4F7"/>
+            <w:vAlign w:val="center"/>
+            <w:tcMar>
+              <w:top w:w="80" w:type="dxa"/>
+              <w:start w:w="120" w:type="dxa"/>
+              <w:bottom w:w="80" w:type="dxa"/>
+              <w:end w:w="120" w:type="dxa"/>
+            </w:tcMar>
+          </w:tcPr>
+          <w:p>
+            <w:pPr>
+              <w:spacing w:after="0"/>
+            </w:pPr>
+            <w:r>
+              <w:rPr>
+                <w:rFonts w:ascii="Calibri" w:hAnsi="Calibri"/>
+                <w:sz w:val="18"/>
+              </w:rPr>
+              <w:t>Local Android compile unavailable without JDK/SDK; iOS requires macOS; release signing, shrinking/version allocation, store identity, and Swift dependency lock remain release-stage work</w:t>
+            </w:r>
+          </w:p>
+        </w:tc>
+      </w:tr>
+      <w:tr>
+        <w:trPr>
+          <w:cantSplit/>
+        </w:trPr>
+        <w:tc>
+          <w:tcPr>
+            <w:tcW w:type="dxa" w:w="2232"/>
+            <w:vAlign w:val="center"/>
+            <w:tcMar>
+              <w:top w:w="80" w:type="dxa"/>
+              <w:start w:w="120" w:type="dxa"/>
+              <w:bottom w:w="80" w:type="dxa"/>
+              <w:end w:w="120" w:type="dxa"/>
+            </w:tcMar>
+          </w:tcPr>
+          <w:p>
+            <w:pPr>
+              <w:spacing w:after="0"/>
+            </w:pPr>
+            <w:r>
+              <w:rPr>
+                <w:rFonts w:ascii="Calibri" w:hAnsi="Calibri"/>
+                <w:sz w:val="18"/>
+              </w:rPr>
+              <w:t>Next action</w:t>
+            </w:r>
+          </w:p>
+        </w:tc>
+        <w:tc>
+          <w:tcPr>
+            <w:tcW w:type="dxa" w:w="7128"/>
+            <w:vAlign w:val="center"/>
+            <w:tcMar>
+              <w:top w:w="80" w:type="dxa"/>
+              <w:start w:w="120" w:type="dxa"/>
+              <w:bottom w:w="80" w:type="dxa"/>
+              <w:end w:w="120" w:type="dxa"/>
+            </w:tcMar>
+          </w:tcPr>
+          <w:p>
+            <w:pPr>
+              <w:spacing w:after="0"/>
+            </w:pPr>
+            <w:r>
+              <w:rPr>
+                <w:rFonts w:ascii="Calibri" w:hAnsi="Calibri"/>
+                <w:sz w:val="18"/>
+              </w:rPr>
+              <w:t>OCR-1 adds the stable TypeScript scanning contract and privacy lifecycle before native OCR adapters</w:t>
+            </w:r>
+          </w:p>
+        </w:tc>
+      </w:tr>
+    </w:tbl>
+    <w:p>
+      <w:pPr>
+        <w:spacing w:after="0"/>
+      </w:pPr>
+    </w:p>
+    <w:p>
+      <w:pPr>
         <w:pStyle w:val="Heading1"/>
       </w:pPr>
       <w:r>
@@ -7028,6 +7917,131 @@
           <w:tcPr>
             <w:tcW w:type="dxa" w:w="1368"/>
             <w:shd w:fill="F2F4F7"/>
+            <w:vAlign w:val="center"/>
+            <w:tcMar>
+              <w:top w:w="80" w:type="dxa"/>
+              <w:start w:w="120" w:type="dxa"/>
+              <w:bottom w:w="80" w:type="dxa"/>
+              <w:end w:w="120" w:type="dxa"/>
+            </w:tcMar>
+          </w:tcPr>
+          <w:p>
+            <w:pPr>
+              <w:spacing w:after="0"/>
+            </w:pPr>
+            <w:r>
+              <w:rPr>
+                <w:rFonts w:ascii="Calibri" w:hAnsi="Calibri"/>
+                <w:sz w:val="18"/>
+              </w:rPr>
+              <w:t>Accepted</w:t>
+            </w:r>
+          </w:p>
+        </w:tc>
+      </w:tr>
+      <w:tr>
+        <w:trPr>
+          <w:cantSplit/>
+        </w:trPr>
+        <w:tc>
+          <w:tcPr>
+            <w:tcW w:type="dxa" w:w="864"/>
+            <w:vAlign w:val="center"/>
+            <w:tcMar>
+              <w:top w:w="80" w:type="dxa"/>
+              <w:start w:w="120" w:type="dxa"/>
+              <w:bottom w:w="80" w:type="dxa"/>
+              <w:end w:w="120" w:type="dxa"/>
+            </w:tcMar>
+          </w:tcPr>
+          <w:p>
+            <w:pPr>
+              <w:spacing w:after="0"/>
+            </w:pPr>
+            <w:r>
+              <w:rPr>
+                <w:rFonts w:ascii="Calibri" w:hAnsi="Calibri"/>
+                <w:sz w:val="18"/>
+              </w:rPr>
+              <w:t>D-011</w:t>
+            </w:r>
+          </w:p>
+        </w:tc>
+        <w:tc>
+          <w:tcPr>
+            <w:tcW w:type="dxa" w:w="1296"/>
+            <w:vAlign w:val="center"/>
+            <w:tcMar>
+              <w:top w:w="80" w:type="dxa"/>
+              <w:start w:w="120" w:type="dxa"/>
+              <w:bottom w:w="80" w:type="dxa"/>
+              <w:end w:w="120" w:type="dxa"/>
+            </w:tcMar>
+          </w:tcPr>
+          <w:p>
+            <w:pPr>
+              <w:spacing w:after="0"/>
+            </w:pPr>
+            <w:r>
+              <w:rPr>
+                <w:rFonts w:ascii="Calibri" w:hAnsi="Calibri"/>
+                <w:sz w:val="18"/>
+              </w:rPr>
+              <w:t>24 Aug 2026</w:t>
+            </w:r>
+          </w:p>
+        </w:tc>
+        <w:tc>
+          <w:tcPr>
+            <w:tcW w:type="dxa" w:w="2304"/>
+            <w:vAlign w:val="center"/>
+            <w:tcMar>
+              <w:top w:w="80" w:type="dxa"/>
+              <w:start w:w="120" w:type="dxa"/>
+              <w:bottom w:w="80" w:type="dxa"/>
+              <w:end w:w="120" w:type="dxa"/>
+            </w:tcMar>
+          </w:tcPr>
+          <w:p>
+            <w:pPr>
+              <w:spacing w:after="0"/>
+            </w:pPr>
+            <w:r>
+              <w:rPr>
+                <w:rFonts w:ascii="Calibri" w:hAnsi="Calibri"/>
+                <w:sz w:val="18"/>
+              </w:rPr>
+              <w:t>Native foundation before OCR logic</w:t>
+            </w:r>
+          </w:p>
+        </w:tc>
+        <w:tc>
+          <w:tcPr>
+            <w:tcW w:type="dxa" w:w="3528"/>
+            <w:vAlign w:val="center"/>
+            <w:tcMar>
+              <w:top w:w="80" w:type="dxa"/>
+              <w:start w:w="120" w:type="dxa"/>
+              <w:bottom w:w="80" w:type="dxa"/>
+              <w:end w:w="120" w:type="dxa"/>
+            </w:tcMar>
+          </w:tcPr>
+          <w:p>
+            <w:pPr>
+              <w:spacing w:after="0"/>
+            </w:pPr>
+            <w:r>
+              <w:rPr>
+                <w:rFonts w:ascii="Calibri" w:hAnsi="Calibri"/>
+                <w:sz w:val="18"/>
+              </w:rPr>
+              <w:t>Control identity, privacy, and build evidence first</w:t>
+            </w:r>
+          </w:p>
+        </w:tc>
+        <w:tc>
+          <w:tcPr>
+            <w:tcW w:type="dxa" w:w="1368"/>
             <w:vAlign w:val="center"/>
             <w:tcMar>
               <w:top w:w="80" w:type="dxa"/>
@@ -8091,6 +9105,278 @@
                 <w:sz w:val="18"/>
               </w:rPr>
               <w:t>To be recorded</w:t>
+            </w:r>
+          </w:p>
+        </w:tc>
+      </w:tr>
+    </w:tbl>
+    <w:p>
+      <w:pPr>
+        <w:spacing w:after="0"/>
+      </w:pPr>
+    </w:p>
+    <w:tbl>
+      <w:tblPr>
+        <w:tblStyle w:val="TableGrid"/>
+        <w:tblW w:type="dxa" w:w="9360"/>
+        <w:tblLayout w:type="fixed"/>
+        <w:tblLook w:firstColumn="1" w:firstRow="1" w:lastColumn="0" w:lastRow="0" w:noHBand="0" w:noVBand="1" w:val="04A0"/>
+        <w:jc w:val="left"/>
+        <w:tblInd w:w="120" w:type="dxa"/>
+      </w:tblPr>
+      <w:tblGrid>
+        <w:gridCol w:w="1872"/>
+        <w:gridCol w:w="1872"/>
+        <w:gridCol w:w="1872"/>
+        <w:gridCol w:w="1872"/>
+        <w:gridCol w:w="1872"/>
+      </w:tblGrid>
+      <w:tr>
+        <w:trPr>
+          <w:tblHeader w:val="true"/>
+        </w:trPr>
+        <w:tc>
+          <w:tcPr>
+            <w:tcW w:type="dxa" w:w="1008"/>
+            <w:vAlign w:val="center"/>
+            <w:tcMar>
+              <w:top w:w="80" w:type="dxa"/>
+              <w:start w:w="120" w:type="dxa"/>
+              <w:bottom w:w="80" w:type="dxa"/>
+              <w:end w:w="120" w:type="dxa"/>
+            </w:tcMar>
+            <w:shd w:fill="17365D"/>
+          </w:tcPr>
+          <w:p>
+            <w:r>
+              <w:rPr>
+                <w:rFonts w:ascii="Calibri" w:hAnsi="Calibri"/>
+                <w:b/>
+                <w:color w:val="FFFFFF"/>
+                <w:sz w:val="19"/>
+              </w:rPr>
+              <w:t>ID</w:t>
+            </w:r>
+          </w:p>
+        </w:tc>
+        <w:tc>
+          <w:tcPr>
+            <w:tcW w:type="dxa" w:w="1080"/>
+            <w:vAlign w:val="center"/>
+            <w:tcMar>
+              <w:top w:w="80" w:type="dxa"/>
+              <w:start w:w="120" w:type="dxa"/>
+              <w:bottom w:w="80" w:type="dxa"/>
+              <w:end w:w="120" w:type="dxa"/>
+            </w:tcMar>
+            <w:shd w:fill="17365D"/>
+          </w:tcPr>
+          <w:p>
+            <w:r>
+              <w:rPr>
+                <w:rFonts w:ascii="Calibri" w:hAnsi="Calibri"/>
+                <w:b/>
+                <w:color w:val="FFFFFF"/>
+                <w:sz w:val="19"/>
+              </w:rPr>
+              <w:t>Slice</w:t>
+            </w:r>
+          </w:p>
+        </w:tc>
+        <w:tc>
+          <w:tcPr>
+            <w:tcW w:type="dxa" w:w="3960"/>
+            <w:vAlign w:val="center"/>
+            <w:tcMar>
+              <w:top w:w="80" w:type="dxa"/>
+              <w:start w:w="120" w:type="dxa"/>
+              <w:bottom w:w="80" w:type="dxa"/>
+              <w:end w:w="120" w:type="dxa"/>
+            </w:tcMar>
+            <w:shd w:fill="17365D"/>
+          </w:tcPr>
+          <w:p>
+            <w:r>
+              <w:rPr>
+                <w:rFonts w:ascii="Calibri" w:hAnsi="Calibri"/>
+                <w:b/>
+                <w:color w:val="FFFFFF"/>
+                <w:sz w:val="19"/>
+              </w:rPr>
+              <w:t>Evidence</w:t>
+            </w:r>
+          </w:p>
+        </w:tc>
+        <w:tc>
+          <w:tcPr>
+            <w:tcW w:type="dxa" w:w="1224"/>
+            <w:vAlign w:val="center"/>
+            <w:tcMar>
+              <w:top w:w="80" w:type="dxa"/>
+              <w:start w:w="120" w:type="dxa"/>
+              <w:bottom w:w="80" w:type="dxa"/>
+              <w:end w:w="120" w:type="dxa"/>
+            </w:tcMar>
+            <w:shd w:fill="17365D"/>
+          </w:tcPr>
+          <w:p>
+            <w:r>
+              <w:rPr>
+                <w:rFonts w:ascii="Calibri" w:hAnsi="Calibri"/>
+                <w:b/>
+                <w:color w:val="FFFFFF"/>
+                <w:sz w:val="19"/>
+              </w:rPr>
+              <w:t>Status</w:t>
+            </w:r>
+          </w:p>
+        </w:tc>
+        <w:tc>
+          <w:tcPr>
+            <w:tcW w:type="dxa" w:w="2088"/>
+            <w:vAlign w:val="center"/>
+            <w:tcMar>
+              <w:top w:w="80" w:type="dxa"/>
+              <w:start w:w="120" w:type="dxa"/>
+              <w:bottom w:w="80" w:type="dxa"/>
+              <w:end w:w="120" w:type="dxa"/>
+            </w:tcMar>
+            <w:shd w:fill="17365D"/>
+          </w:tcPr>
+          <w:p>
+            <w:r>
+              <w:rPr>
+                <w:rFonts w:ascii="Calibri" w:hAnsi="Calibri"/>
+                <w:b/>
+                <w:color w:val="FFFFFF"/>
+                <w:sz w:val="19"/>
+              </w:rPr>
+              <w:t>Reference</w:t>
+            </w:r>
+          </w:p>
+        </w:tc>
+      </w:tr>
+      <w:tr>
+        <w:trPr>
+          <w:cantSplit/>
+        </w:trPr>
+        <w:tc>
+          <w:tcPr>
+            <w:tcW w:type="dxa" w:w="1008"/>
+            <w:vAlign w:val="center"/>
+            <w:tcMar>
+              <w:top w:w="80" w:type="dxa"/>
+              <w:start w:w="120" w:type="dxa"/>
+              <w:bottom w:w="80" w:type="dxa"/>
+              <w:end w:w="120" w:type="dxa"/>
+            </w:tcMar>
+          </w:tcPr>
+          <w:p>
+            <w:pPr>
+              <w:spacing w:after="0"/>
+            </w:pPr>
+            <w:r>
+              <w:rPr>
+                <w:rFonts w:ascii="Calibri" w:hAnsi="Calibri"/>
+                <w:sz w:val="18"/>
+              </w:rPr>
+              <w:t>E-008</w:t>
+            </w:r>
+          </w:p>
+        </w:tc>
+        <w:tc>
+          <w:tcPr>
+            <w:tcW w:type="dxa" w:w="1080"/>
+            <w:vAlign w:val="center"/>
+            <w:tcMar>
+              <w:top w:w="80" w:type="dxa"/>
+              <w:start w:w="120" w:type="dxa"/>
+              <w:bottom w:w="80" w:type="dxa"/>
+              <w:end w:w="120" w:type="dxa"/>
+            </w:tcMar>
+          </w:tcPr>
+          <w:p>
+            <w:pPr>
+              <w:spacing w:after="0"/>
+            </w:pPr>
+            <w:r>
+              <w:rPr>
+                <w:rFonts w:ascii="Calibri" w:hAnsi="Calibri"/>
+                <w:sz w:val="18"/>
+              </w:rPr>
+              <w:t>OCR-0</w:t>
+            </w:r>
+          </w:p>
+        </w:tc>
+        <w:tc>
+          <w:tcPr>
+            <w:tcW w:type="dxa" w:w="3960"/>
+            <w:vAlign w:val="center"/>
+            <w:tcMar>
+              <w:top w:w="80" w:type="dxa"/>
+              <w:start w:w="120" w:type="dxa"/>
+              <w:bottom w:w="80" w:type="dxa"/>
+              <w:end w:w="120" w:type="dxa"/>
+            </w:tcMar>
+          </w:tcPr>
+          <w:p>
+            <w:pPr>
+              <w:spacing w:after="0"/>
+            </w:pPr>
+            <w:r>
+              <w:rPr>
+                <w:rFonts w:ascii="Calibri" w:hAnsi="Calibri"/>
+                <w:sz w:val="18"/>
+              </w:rPr>
+              <w:t>Android/iOS identity, sync, security, and unsigned build proof</w:t>
+            </w:r>
+          </w:p>
+        </w:tc>
+        <w:tc>
+          <w:tcPr>
+            <w:tcW w:type="dxa" w:w="1224"/>
+            <w:vAlign w:val="center"/>
+            <w:tcMar>
+              <w:top w:w="80" w:type="dxa"/>
+              <w:start w:w="120" w:type="dxa"/>
+              <w:bottom w:w="80" w:type="dxa"/>
+              <w:end w:w="120" w:type="dxa"/>
+            </w:tcMar>
+          </w:tcPr>
+          <w:p>
+            <w:pPr>
+              <w:spacing w:after="0"/>
+            </w:pPr>
+            <w:r>
+              <w:rPr>
+                <w:rFonts w:ascii="Calibri" w:hAnsi="Calibri"/>
+                <w:sz w:val="18"/>
+              </w:rPr>
+              <w:t>Verified</w:t>
+            </w:r>
+          </w:p>
+        </w:tc>
+        <w:tc>
+          <w:tcPr>
+            <w:tcW w:type="dxa" w:w="2088"/>
+            <w:vAlign w:val="center"/>
+            <w:tcMar>
+              <w:top w:w="80" w:type="dxa"/>
+              <w:start w:w="120" w:type="dxa"/>
+              <w:bottom w:w="80" w:type="dxa"/>
+              <w:end w:w="120" w:type="dxa"/>
+            </w:tcMar>
+          </w:tcPr>
+          <w:p>
+            <w:pPr>
+              <w:spacing w:after="0"/>
+            </w:pPr>
+            <w:r>
+              <w:rPr>
+                <w:rFonts w:ascii="Calibri" w:hAnsi="Calibri"/>
+                <w:sz w:val="18"/>
+              </w:rPr>
+              <w:t>PR #53 native CI recorded in journey log</w:t>
             </w:r>
           </w:p>
         </w:tc>

</xml_diff>

<commit_message>
OCR-0: establish native platform foundation (#53)
Adds the permanent Android/iOS Capacitor foundation, hardened native privacy controls, exact install-script approvals, cross-platform CI, Supabase advisor hardening, and the visually verified implementation journey.
</commit_message>
<xml_diff>
--- a/output/doc/senatla-ops-implementation-journey.docx
+++ b/output/doc/senatla-ops-implementation-journey.docx
@@ -192,7 +192,7 @@
                 <w:rFonts w:ascii="Calibri" w:hAnsi="Calibri"/>
                 <w:sz w:val="18"/>
               </w:rPr>
-              <w:t>23 August 2026</w:t>
+              <w:t>24 August 2026</w:t>
             </w:r>
           </w:p>
         </w:tc>
@@ -216,7 +216,7 @@
                 <w:rFonts w:ascii="Calibri" w:hAnsi="Calibri"/>
                 <w:sz w:val="18"/>
               </w:rPr>
-              <w:t>sankofa_xciv/admin-grouping-vendor-invoices</w:t>
+              <w:t>sankofa_xciv/authoritative-slices-0-2</w:t>
             </w:r>
           </w:p>
         </w:tc>
@@ -5628,6 +5628,895 @@
     </w:p>
     <w:p>
       <w:pPr>
+        <w:pStyle w:val="Heading2"/>
+      </w:pPr>
+      <w:r>
+        <w:t>24 August 2026 - OCR-0 native platform foundation</w:t>
+      </w:r>
+    </w:p>
+    <w:tbl>
+      <w:tblPr>
+        <w:tblStyle w:val="TableGrid"/>
+        <w:tblW w:type="dxa" w:w="9360"/>
+        <w:tblLayout w:type="fixed"/>
+        <w:tblLook w:firstColumn="1" w:firstRow="1" w:lastColumn="0" w:lastRow="0" w:noHBand="0" w:noVBand="1" w:val="04A0"/>
+        <w:jc w:val="left"/>
+        <w:tblInd w:w="120" w:type="dxa"/>
+      </w:tblPr>
+      <w:tblGrid>
+        <w:gridCol w:w="4680"/>
+        <w:gridCol w:w="4680"/>
+      </w:tblGrid>
+      <w:tr>
+        <w:trPr>
+          <w:tblHeader w:val="true"/>
+        </w:trPr>
+        <w:tc>
+          <w:tcPr>
+            <w:tcW w:type="dxa" w:w="2232"/>
+            <w:vAlign w:val="center"/>
+            <w:tcMar>
+              <w:top w:w="80" w:type="dxa"/>
+              <w:start w:w="120" w:type="dxa"/>
+              <w:bottom w:w="80" w:type="dxa"/>
+              <w:end w:w="120" w:type="dxa"/>
+            </w:tcMar>
+            <w:shd w:fill="17365D"/>
+          </w:tcPr>
+          <w:p>
+            <w:r>
+              <w:rPr>
+                <w:rFonts w:ascii="Calibri" w:hAnsi="Calibri"/>
+                <w:b/>
+                <w:color w:val="FFFFFF"/>
+                <w:sz w:val="19"/>
+              </w:rPr>
+              <w:t>Field</w:t>
+            </w:r>
+          </w:p>
+        </w:tc>
+        <w:tc>
+          <w:tcPr>
+            <w:tcW w:type="dxa" w:w="7128"/>
+            <w:vAlign w:val="center"/>
+            <w:tcMar>
+              <w:top w:w="80" w:type="dxa"/>
+              <w:start w:w="120" w:type="dxa"/>
+              <w:bottom w:w="80" w:type="dxa"/>
+              <w:end w:w="120" w:type="dxa"/>
+            </w:tcMar>
+            <w:shd w:fill="17365D"/>
+          </w:tcPr>
+          <w:p>
+            <w:r>
+              <w:rPr>
+                <w:rFonts w:ascii="Calibri" w:hAnsi="Calibri"/>
+                <w:b/>
+                <w:color w:val="FFFFFF"/>
+                <w:sz w:val="19"/>
+              </w:rPr>
+              <w:t>Recorded implementation evidence</w:t>
+            </w:r>
+          </w:p>
+        </w:tc>
+      </w:tr>
+      <w:tr>
+        <w:trPr>
+          <w:cantSplit/>
+        </w:trPr>
+        <w:tc>
+          <w:tcPr>
+            <w:tcW w:type="dxa" w:w="2232"/>
+            <w:vAlign w:val="center"/>
+            <w:tcMar>
+              <w:top w:w="80" w:type="dxa"/>
+              <w:start w:w="120" w:type="dxa"/>
+              <w:bottom w:w="80" w:type="dxa"/>
+              <w:end w:w="120" w:type="dxa"/>
+            </w:tcMar>
+          </w:tcPr>
+          <w:p>
+            <w:pPr>
+              <w:spacing w:after="0"/>
+            </w:pPr>
+            <w:r>
+              <w:rPr>
+                <w:rFonts w:ascii="Calibri" w:hAnsi="Calibri"/>
+                <w:sz w:val="18"/>
+              </w:rPr>
+              <w:t>Slice</w:t>
+            </w:r>
+          </w:p>
+        </w:tc>
+        <w:tc>
+          <w:tcPr>
+            <w:tcW w:type="dxa" w:w="7128"/>
+            <w:vAlign w:val="center"/>
+            <w:tcMar>
+              <w:top w:w="80" w:type="dxa"/>
+              <w:start w:w="120" w:type="dxa"/>
+              <w:bottom w:w="80" w:type="dxa"/>
+              <w:end w:w="120" w:type="dxa"/>
+            </w:tcMar>
+          </w:tcPr>
+          <w:p>
+            <w:pPr>
+              <w:spacing w:after="0"/>
+            </w:pPr>
+            <w:r>
+              <w:rPr>
+                <w:rFonts w:ascii="Calibri" w:hAnsi="Calibri"/>
+                <w:sz w:val="18"/>
+              </w:rPr>
+              <w:t>OCR-0 - production native backbone before OCR logic</w:t>
+            </w:r>
+          </w:p>
+        </w:tc>
+      </w:tr>
+      <w:tr>
+        <w:trPr>
+          <w:cantSplit/>
+        </w:trPr>
+        <w:tc>
+          <w:tcPr>
+            <w:tcW w:type="dxa" w:w="2232"/>
+            <w:shd w:fill="F2F4F7"/>
+            <w:vAlign w:val="center"/>
+            <w:tcMar>
+              <w:top w:w="80" w:type="dxa"/>
+              <w:start w:w="120" w:type="dxa"/>
+              <w:bottom w:w="80" w:type="dxa"/>
+              <w:end w:w="120" w:type="dxa"/>
+            </w:tcMar>
+          </w:tcPr>
+          <w:p>
+            <w:pPr>
+              <w:spacing w:after="0"/>
+            </w:pPr>
+            <w:r>
+              <w:rPr>
+                <w:rFonts w:ascii="Calibri" w:hAnsi="Calibri"/>
+                <w:sz w:val="18"/>
+              </w:rPr>
+              <w:t>Branch / PR</w:t>
+            </w:r>
+          </w:p>
+        </w:tc>
+        <w:tc>
+          <w:tcPr>
+            <w:tcW w:type="dxa" w:w="7128"/>
+            <w:shd w:fill="F2F4F7"/>
+            <w:vAlign w:val="center"/>
+            <w:tcMar>
+              <w:top w:w="80" w:type="dxa"/>
+              <w:start w:w="120" w:type="dxa"/>
+              <w:bottom w:w="80" w:type="dxa"/>
+              <w:end w:w="120" w:type="dxa"/>
+            </w:tcMar>
+          </w:tcPr>
+          <w:p>
+            <w:pPr>
+              <w:spacing w:after="0"/>
+            </w:pPr>
+            <w:r>
+              <w:rPr>
+                <w:rFonts w:ascii="Calibri" w:hAnsi="Calibri"/>
+                <w:sz w:val="18"/>
+              </w:rPr>
+              <w:t>sankofa_xciv/authoritative-slices-0-2; PR #53 into dev</w:t>
+            </w:r>
+          </w:p>
+        </w:tc>
+      </w:tr>
+      <w:tr>
+        <w:trPr>
+          <w:cantSplit/>
+        </w:trPr>
+        <w:tc>
+          <w:tcPr>
+            <w:tcW w:type="dxa" w:w="2232"/>
+            <w:vAlign w:val="center"/>
+            <w:tcMar>
+              <w:top w:w="80" w:type="dxa"/>
+              <w:start w:w="120" w:type="dxa"/>
+              <w:bottom w:w="80" w:type="dxa"/>
+              <w:end w:w="120" w:type="dxa"/>
+            </w:tcMar>
+          </w:tcPr>
+          <w:p>
+            <w:pPr>
+              <w:spacing w:after="0"/>
+            </w:pPr>
+            <w:r>
+              <w:rPr>
+                <w:rFonts w:ascii="Calibri" w:hAnsi="Calibri"/>
+                <w:sz w:val="18"/>
+              </w:rPr>
+              <w:t>Outcome</w:t>
+            </w:r>
+          </w:p>
+        </w:tc>
+        <w:tc>
+          <w:tcPr>
+            <w:tcW w:type="dxa" w:w="7128"/>
+            <w:vAlign w:val="center"/>
+            <w:tcMar>
+              <w:top w:w="80" w:type="dxa"/>
+              <w:start w:w="120" w:type="dxa"/>
+              <w:bottom w:w="80" w:type="dxa"/>
+              <w:end w:w="120" w:type="dxa"/>
+            </w:tcMar>
+          </w:tcPr>
+          <w:p>
+            <w:pPr>
+              <w:spacing w:after="0"/>
+            </w:pPr>
+            <w:r>
+              <w:rPr>
+                <w:rFonts w:ascii="Calibri" w:hAnsi="Calibri"/>
+                <w:sz w:val="18"/>
+              </w:rPr>
+              <w:t>Committed Android and iOS Capacitor projects under za.co.senatlatrading.ops, exact install-script approvals, unsigned native gates, and native privacy controls; no OCR SDK or replacement app</w:t>
+            </w:r>
+          </w:p>
+        </w:tc>
+      </w:tr>
+      <w:tr>
+        <w:trPr>
+          <w:cantSplit/>
+        </w:trPr>
+        <w:tc>
+          <w:tcPr>
+            <w:tcW w:type="dxa" w:w="2232"/>
+            <w:shd w:fill="F2F4F7"/>
+            <w:vAlign w:val="center"/>
+            <w:tcMar>
+              <w:top w:w="80" w:type="dxa"/>
+              <w:start w:w="120" w:type="dxa"/>
+              <w:bottom w:w="80" w:type="dxa"/>
+              <w:end w:w="120" w:type="dxa"/>
+            </w:tcMar>
+          </w:tcPr>
+          <w:p>
+            <w:pPr>
+              <w:spacing w:after="0"/>
+            </w:pPr>
+            <w:r>
+              <w:rPr>
+                <w:rFonts w:ascii="Calibri" w:hAnsi="Calibri"/>
+                <w:sz w:val="18"/>
+              </w:rPr>
+              <w:t>Decision</w:t>
+            </w:r>
+          </w:p>
+        </w:tc>
+        <w:tc>
+          <w:tcPr>
+            <w:tcW w:type="dxa" w:w="7128"/>
+            <w:shd w:fill="F2F4F7"/>
+            <w:vAlign w:val="center"/>
+            <w:tcMar>
+              <w:top w:w="80" w:type="dxa"/>
+              <w:start w:w="120" w:type="dxa"/>
+              <w:bottom w:w="80" w:type="dxa"/>
+              <w:end w:w="120" w:type="dxa"/>
+            </w:tcMar>
+          </w:tcPr>
+          <w:p>
+            <w:pPr>
+              <w:spacing w:after="0"/>
+            </w:pPr>
+            <w:r>
+              <w:rPr>
+                <w:rFonts w:ascii="Calibri" w:hAnsi="Calibri"/>
+                <w:sz w:val="18"/>
+              </w:rPr>
+              <w:t>Prove the native security and build boundary before scanning contracts or Android ML Kit and Apple Vision/VisionKit adapters</w:t>
+            </w:r>
+          </w:p>
+        </w:tc>
+      </w:tr>
+      <w:tr>
+        <w:trPr>
+          <w:cantSplit/>
+        </w:trPr>
+        <w:tc>
+          <w:tcPr>
+            <w:tcW w:type="dxa" w:w="2232"/>
+            <w:vAlign w:val="center"/>
+            <w:tcMar>
+              <w:top w:w="80" w:type="dxa"/>
+              <w:start w:w="120" w:type="dxa"/>
+              <w:bottom w:w="80" w:type="dxa"/>
+              <w:end w:w="120" w:type="dxa"/>
+            </w:tcMar>
+          </w:tcPr>
+          <w:p>
+            <w:pPr>
+              <w:spacing w:after="0"/>
+            </w:pPr>
+            <w:r>
+              <w:rPr>
+                <w:rFonts w:ascii="Calibri" w:hAnsi="Calibri"/>
+                <w:sz w:val="18"/>
+              </w:rPr>
+              <w:t>Rejected alternative</w:t>
+            </w:r>
+          </w:p>
+        </w:tc>
+        <w:tc>
+          <w:tcPr>
+            <w:tcW w:type="dxa" w:w="7128"/>
+            <w:vAlign w:val="center"/>
+            <w:tcMar>
+              <w:top w:w="80" w:type="dxa"/>
+              <w:start w:w="120" w:type="dxa"/>
+              <w:bottom w:w="80" w:type="dxa"/>
+              <w:end w:w="120" w:type="dxa"/>
+            </w:tcMar>
+          </w:tcPr>
+          <w:p>
+            <w:pPr>
+              <w:spacing w:after="0"/>
+            </w:pPr>
+            <w:r>
+              <w:rPr>
+                <w:rFonts w:ascii="Calibri" w:hAnsi="Calibri"/>
+                <w:sz w:val="18"/>
+              </w:rPr>
+              <w:t>Browser-only capture or an immediate cross-platform OCR dependency that would weaken native quality, offline behavior, privacy control, and platform ownership</w:t>
+            </w:r>
+          </w:p>
+        </w:tc>
+      </w:tr>
+      <w:tr>
+        <w:trPr>
+          <w:cantSplit/>
+        </w:trPr>
+        <w:tc>
+          <w:tcPr>
+            <w:tcW w:type="dxa" w:w="2232"/>
+            <w:shd w:fill="F2F4F7"/>
+            <w:vAlign w:val="center"/>
+            <w:tcMar>
+              <w:top w:w="80" w:type="dxa"/>
+              <w:start w:w="120" w:type="dxa"/>
+              <w:bottom w:w="80" w:type="dxa"/>
+              <w:end w:w="120" w:type="dxa"/>
+            </w:tcMar>
+          </w:tcPr>
+          <w:p>
+            <w:pPr>
+              <w:spacing w:after="0"/>
+            </w:pPr>
+            <w:r>
+              <w:rPr>
+                <w:rFonts w:ascii="Calibri" w:hAnsi="Calibri"/>
+                <w:sz w:val="18"/>
+              </w:rPr>
+              <w:t>Changed contracts</w:t>
+            </w:r>
+          </w:p>
+        </w:tc>
+        <w:tc>
+          <w:tcPr>
+            <w:tcW w:type="dxa" w:w="7128"/>
+            <w:shd w:fill="F2F4F7"/>
+            <w:vAlign w:val="center"/>
+            <w:tcMar>
+              <w:top w:w="80" w:type="dxa"/>
+              <w:start w:w="120" w:type="dxa"/>
+              <w:bottom w:w="80" w:type="dxa"/>
+              <w:end w:w="120" w:type="dxa"/>
+            </w:tcMar>
+          </w:tcPr>
+          <w:p>
+            <w:pPr>
+              <w:spacing w:after="0"/>
+            </w:pPr>
+            <w:r>
+              <w:rPr>
+                <w:rFonts w:ascii="Calibri" w:hAnsi="Calibri"/>
+                <w:sz w:val="18"/>
+              </w:rPr>
+              <w:t>Capacitor identity/dependencies; android and ios projects; native CI; Swift path normalizer; browser baseline; signing exclusions; native guide</w:t>
+            </w:r>
+          </w:p>
+        </w:tc>
+      </w:tr>
+      <w:tr>
+        <w:trPr>
+          <w:cantSplit/>
+        </w:trPr>
+        <w:tc>
+          <w:tcPr>
+            <w:tcW w:type="dxa" w:w="2232"/>
+            <w:vAlign w:val="center"/>
+            <w:tcMar>
+              <w:top w:w="80" w:type="dxa"/>
+              <w:start w:w="120" w:type="dxa"/>
+              <w:bottom w:w="80" w:type="dxa"/>
+              <w:end w:w="120" w:type="dxa"/>
+            </w:tcMar>
+          </w:tcPr>
+          <w:p>
+            <w:pPr>
+              <w:spacing w:after="0"/>
+            </w:pPr>
+            <w:r>
+              <w:rPr>
+                <w:rFonts w:ascii="Calibri" w:hAnsi="Calibri"/>
+                <w:sz w:val="18"/>
+              </w:rPr>
+              <w:t>Security</w:t>
+            </w:r>
+          </w:p>
+        </w:tc>
+        <w:tc>
+          <w:tcPr>
+            <w:tcW w:type="dxa" w:w="7128"/>
+            <w:vAlign w:val="center"/>
+            <w:tcMar>
+              <w:top w:w="80" w:type="dxa"/>
+              <w:start w:w="120" w:type="dxa"/>
+              <w:bottom w:w="80" w:type="dxa"/>
+              <w:end w:w="120" w:type="dxa"/>
+            </w:tcMar>
+          </w:tcPr>
+          <w:p>
+            <w:pPr>
+              <w:spacing w:after="0"/>
+            </w:pPr>
+            <w:r>
+              <w:rPr>
+                <w:rFonts w:ascii="Calibri" w:hAnsi="Calibri"/>
+                <w:sz w:val="18"/>
+              </w:rPr>
+              <w:t>Android backup disabled; FileProvider restricted to a dedicated evidence cache; iOS purposes explicit; signing/API keys ignored; no secret stored in Git or this document</w:t>
+            </w:r>
+          </w:p>
+        </w:tc>
+      </w:tr>
+      <w:tr>
+        <w:trPr>
+          <w:cantSplit/>
+        </w:trPr>
+        <w:tc>
+          <w:tcPr>
+            <w:tcW w:type="dxa" w:w="2232"/>
+            <w:shd w:fill="F2F4F7"/>
+            <w:vAlign w:val="center"/>
+            <w:tcMar>
+              <w:top w:w="80" w:type="dxa"/>
+              <w:start w:w="120" w:type="dxa"/>
+              <w:bottom w:w="80" w:type="dxa"/>
+              <w:end w:w="120" w:type="dxa"/>
+            </w:tcMar>
+          </w:tcPr>
+          <w:p>
+            <w:pPr>
+              <w:spacing w:after="0"/>
+            </w:pPr>
+            <w:r>
+              <w:rPr>
+                <w:rFonts w:ascii="Calibri" w:hAnsi="Calibri"/>
+                <w:sz w:val="18"/>
+              </w:rPr>
+              <w:t>Three-pass challenge</w:t>
+            </w:r>
+          </w:p>
+        </w:tc>
+        <w:tc>
+          <w:tcPr>
+            <w:tcW w:type="dxa" w:w="7128"/>
+            <w:shd w:fill="F2F4F7"/>
+            <w:vAlign w:val="center"/>
+            <w:tcMar>
+              <w:top w:w="80" w:type="dxa"/>
+              <w:start w:w="120" w:type="dxa"/>
+              <w:bottom w:w="80" w:type="dxa"/>
+              <w:end w:w="120" w:type="dxa"/>
+            </w:tcMar>
+          </w:tcPr>
+          <w:p>
+            <w:pPr>
+              <w:spacing w:after="0"/>
+            </w:pPr>
+            <w:r>
+              <w:rPr>
+                <w:rFonts w:ascii="Calibri" w:hAnsi="Calibri"/>
+                <w:sz w:val="18"/>
+              </w:rPr>
+              <w:t>Pass 1 aligned IDs, versions, browsers, permissions, and sync; Pass 2 found backup/file-sharing leaks, stale test identities, secret exclusions, trigger gaps, and silent normalization; Pass 3 ran executable and remote gates</w:t>
+            </w:r>
+          </w:p>
+        </w:tc>
+      </w:tr>
+      <w:tr>
+        <w:trPr>
+          <w:cantSplit/>
+        </w:trPr>
+        <w:tc>
+          <w:tcPr>
+            <w:tcW w:type="dxa" w:w="2232"/>
+            <w:vAlign w:val="center"/>
+            <w:tcMar>
+              <w:top w:w="80" w:type="dxa"/>
+              <w:start w:w="120" w:type="dxa"/>
+              <w:bottom w:w="80" w:type="dxa"/>
+              <w:end w:w="120" w:type="dxa"/>
+            </w:tcMar>
+          </w:tcPr>
+          <w:p>
+            <w:pPr>
+              <w:spacing w:after="0"/>
+            </w:pPr>
+            <w:r>
+              <w:rPr>
+                <w:rFonts w:ascii="Calibri" w:hAnsi="Calibri"/>
+                <w:sz w:val="18"/>
+              </w:rPr>
+              <w:t>Improvements</w:t>
+            </w:r>
+          </w:p>
+        </w:tc>
+        <w:tc>
+          <w:tcPr>
+            <w:tcW w:type="dxa" w:w="7128"/>
+            <w:vAlign w:val="center"/>
+            <w:tcMar>
+              <w:top w:w="80" w:type="dxa"/>
+              <w:start w:w="120" w:type="dxa"/>
+              <w:bottom w:w="80" w:type="dxa"/>
+              <w:end w:w="120" w:type="dxa"/>
+            </w:tcMar>
+          </w:tcPr>
+          <w:p>
+            <w:pPr>
+              <w:spacing w:after="0"/>
+            </w:pPr>
+            <w:r>
+              <w:rPr>
+                <w:rFonts w:ascii="Calibri" w:hAnsi="Calibri"/>
+                <w:sz w:val="18"/>
+              </w:rPr>
+              <w:t>Disabled backups; narrowed sharing; corrected native test packages; compiled Android tests in CI; expanded triggers; made iOS normalization fail closed; documented install-script trust and release gates</w:t>
+            </w:r>
+          </w:p>
+        </w:tc>
+      </w:tr>
+      <w:tr>
+        <w:trPr>
+          <w:cantSplit/>
+        </w:trPr>
+        <w:tc>
+          <w:tcPr>
+            <w:tcW w:type="dxa" w:w="2232"/>
+            <w:shd w:fill="F2F4F7"/>
+            <w:vAlign w:val="center"/>
+            <w:tcMar>
+              <w:top w:w="80" w:type="dxa"/>
+              <w:start w:w="120" w:type="dxa"/>
+              <w:bottom w:w="80" w:type="dxa"/>
+              <w:end w:w="120" w:type="dxa"/>
+            </w:tcMar>
+          </w:tcPr>
+          <w:p>
+            <w:pPr>
+              <w:spacing w:after="0"/>
+            </w:pPr>
+            <w:r>
+              <w:rPr>
+                <w:rFonts w:ascii="Calibri" w:hAnsi="Calibri"/>
+                <w:sz w:val="18"/>
+              </w:rPr>
+              <w:t>Tests</w:t>
+            </w:r>
+          </w:p>
+        </w:tc>
+        <w:tc>
+          <w:tcPr>
+            <w:tcW w:type="dxa" w:w="7128"/>
+            <w:shd w:fill="F2F4F7"/>
+            <w:vAlign w:val="center"/>
+            <w:tcMar>
+              <w:top w:w="80" w:type="dxa"/>
+              <w:start w:w="120" w:type="dxa"/>
+              <w:bottom w:w="80" w:type="dxa"/>
+              <w:end w:w="120" w:type="dxa"/>
+            </w:tcMar>
+          </w:tcPr>
+          <w:p>
+            <w:pPr>
+              <w:spacing w:after="0"/>
+            </w:pPr>
+            <w:r>
+              <w:rPr>
+                <w:rFonts w:ascii="Calibri" w:hAnsi="Calibri"/>
+                <w:sz w:val="18"/>
+              </w:rPr>
+              <w:t>Runtime-config 3/3, lint, typecheck, production build, and 80/80 browser tests passed; repeated Android/iOS sync passed; production dependency audit found zero vulnerabilities</w:t>
+            </w:r>
+          </w:p>
+        </w:tc>
+      </w:tr>
+      <w:tr>
+        <w:trPr>
+          <w:cantSplit/>
+        </w:trPr>
+        <w:tc>
+          <w:tcPr>
+            <w:tcW w:type="dxa" w:w="2232"/>
+            <w:vAlign w:val="center"/>
+            <w:tcMar>
+              <w:top w:w="80" w:type="dxa"/>
+              <w:start w:w="120" w:type="dxa"/>
+              <w:bottom w:w="80" w:type="dxa"/>
+              <w:end w:w="120" w:type="dxa"/>
+            </w:tcMar>
+          </w:tcPr>
+          <w:p>
+            <w:pPr>
+              <w:spacing w:after="0"/>
+            </w:pPr>
+            <w:r>
+              <w:rPr>
+                <w:rFonts w:ascii="Calibri" w:hAnsi="Calibri"/>
+                <w:sz w:val="18"/>
+              </w:rPr>
+              <w:t>Native evidence</w:t>
+            </w:r>
+          </w:p>
+        </w:tc>
+        <w:tc>
+          <w:tcPr>
+            <w:tcW w:type="dxa" w:w="7128"/>
+            <w:vAlign w:val="center"/>
+            <w:tcMar>
+              <w:top w:w="80" w:type="dxa"/>
+              <w:start w:w="120" w:type="dxa"/>
+              <w:bottom w:w="80" w:type="dxa"/>
+              <w:end w:w="120" w:type="dxa"/>
+            </w:tcMar>
+          </w:tcPr>
+          <w:p>
+            <w:pPr>
+              <w:spacing w:after="0"/>
+            </w:pPr>
+            <w:r>
+              <w:rPr>
+                <w:rFonts w:ascii="Calibri" w:hAnsi="Calibri"/>
+                <w:sz w:val="18"/>
+              </w:rPr>
+              <w:t>GitHub Actions run 32676423136 passed: Android app lint, unit tests, instrumentation-test APK compilation, and unsigned debug APK built on Linux in 3m54s; the unsigned iOS simulator app built on macOS in 2m14s. https://github.com/Sankofa-Digital-Studio/senatla-ops/actions/runs/32676423136</w:t>
+            </w:r>
+          </w:p>
+        </w:tc>
+      </w:tr>
+      <w:tr>
+        <w:trPr>
+          <w:cantSplit/>
+        </w:trPr>
+        <w:tc>
+          <w:tcPr>
+            <w:tcW w:type="dxa" w:w="2232"/>
+            <w:shd w:fill="F2F4F7"/>
+            <w:vAlign w:val="center"/>
+            <w:tcMar>
+              <w:top w:w="80" w:type="dxa"/>
+              <w:start w:w="120" w:type="dxa"/>
+              <w:bottom w:w="80" w:type="dxa"/>
+              <w:end w:w="120" w:type="dxa"/>
+            </w:tcMar>
+          </w:tcPr>
+          <w:p>
+            <w:pPr>
+              <w:spacing w:after="0"/>
+            </w:pPr>
+            <w:r>
+              <w:rPr>
+                <w:rFonts w:ascii="Calibri" w:hAnsi="Calibri"/>
+                <w:sz w:val="18"/>
+              </w:rPr>
+              <w:t>Visual evidence</w:t>
+            </w:r>
+          </w:p>
+        </w:tc>
+        <w:tc>
+          <w:tcPr>
+            <w:tcW w:type="dxa" w:w="7128"/>
+            <w:shd w:fill="F2F4F7"/>
+            <w:vAlign w:val="center"/>
+            <w:tcMar>
+              <w:top w:w="80" w:type="dxa"/>
+              <w:start w:w="120" w:type="dxa"/>
+              <w:bottom w:w="80" w:type="dxa"/>
+              <w:end w:w="120" w:type="dxa"/>
+            </w:tcMar>
+          </w:tcPr>
+          <w:p>
+            <w:pPr>
+              <w:spacing w:after="0"/>
+            </w:pPr>
+            <w:r>
+              <w:rPr>
+                <w:rFonts w:ascii="Calibri" w:hAnsi="Calibri"/>
+                <w:sz w:val="18"/>
+              </w:rPr>
+              <w:t>No rendered app UI changed; full regression remains after Slice 3 and scanner visual evidence begins with the first rendered OCR slice</w:t>
+            </w:r>
+          </w:p>
+        </w:tc>
+      </w:tr>
+      <w:tr>
+        <w:trPr>
+          <w:cantSplit/>
+        </w:trPr>
+        <w:tc>
+          <w:tcPr>
+            <w:tcW w:type="dxa" w:w="2232"/>
+            <w:vAlign w:val="center"/>
+            <w:tcMar>
+              <w:top w:w="80" w:type="dxa"/>
+              <w:start w:w="120" w:type="dxa"/>
+              <w:bottom w:w="80" w:type="dxa"/>
+              <w:end w:w="120" w:type="dxa"/>
+            </w:tcMar>
+          </w:tcPr>
+          <w:p>
+            <w:pPr>
+              <w:spacing w:after="0"/>
+            </w:pPr>
+            <w:r>
+              <w:rPr>
+                <w:rFonts w:ascii="Calibri" w:hAnsi="Calibri"/>
+                <w:sz w:val="18"/>
+              </w:rPr>
+              <w:t>Result</w:t>
+            </w:r>
+          </w:p>
+        </w:tc>
+        <w:tc>
+          <w:tcPr>
+            <w:tcW w:type="dxa" w:w="7128"/>
+            <w:vAlign w:val="center"/>
+            <w:tcMar>
+              <w:top w:w="80" w:type="dxa"/>
+              <w:start w:w="120" w:type="dxa"/>
+              <w:bottom w:w="80" w:type="dxa"/>
+              <w:end w:w="120" w:type="dxa"/>
+            </w:tcMar>
+          </w:tcPr>
+          <w:p>
+            <w:pPr>
+              <w:spacing w:after="0"/>
+            </w:pPr>
+            <w:r>
+              <w:rPr>
+                <w:rFonts w:ascii="Calibri" w:hAnsi="Calibri"/>
+                <w:sz w:val="18"/>
+              </w:rPr>
+              <w:t>Verified native foundation, subject to recorded release-stage gates</w:t>
+            </w:r>
+          </w:p>
+        </w:tc>
+      </w:tr>
+      <w:tr>
+        <w:trPr>
+          <w:cantSplit/>
+        </w:trPr>
+        <w:tc>
+          <w:tcPr>
+            <w:tcW w:type="dxa" w:w="2232"/>
+            <w:shd w:fill="F2F4F7"/>
+            <w:vAlign w:val="center"/>
+            <w:tcMar>
+              <w:top w:w="80" w:type="dxa"/>
+              <w:start w:w="120" w:type="dxa"/>
+              <w:bottom w:w="80" w:type="dxa"/>
+              <w:end w:w="120" w:type="dxa"/>
+            </w:tcMar>
+          </w:tcPr>
+          <w:p>
+            <w:pPr>
+              <w:spacing w:after="0"/>
+            </w:pPr>
+            <w:r>
+              <w:rPr>
+                <w:rFonts w:ascii="Calibri" w:hAnsi="Calibri"/>
+                <w:sz w:val="18"/>
+              </w:rPr>
+              <w:t>Known gaps</w:t>
+            </w:r>
+          </w:p>
+        </w:tc>
+        <w:tc>
+          <w:tcPr>
+            <w:tcW w:type="dxa" w:w="7128"/>
+            <w:shd w:fill="F2F4F7"/>
+            <w:vAlign w:val="center"/>
+            <w:tcMar>
+              <w:top w:w="80" w:type="dxa"/>
+              <w:start w:w="120" w:type="dxa"/>
+              <w:bottom w:w="80" w:type="dxa"/>
+              <w:end w:w="120" w:type="dxa"/>
+            </w:tcMar>
+          </w:tcPr>
+          <w:p>
+            <w:pPr>
+              <w:spacing w:after="0"/>
+            </w:pPr>
+            <w:r>
+              <w:rPr>
+                <w:rFonts w:ascii="Calibri" w:hAnsi="Calibri"/>
+                <w:sz w:val="18"/>
+              </w:rPr>
+              <w:t>Local Android compile unavailable without JDK/SDK; iOS requires macOS; release signing, shrinking/version allocation, store identity, and Swift dependency lock remain release-stage work</w:t>
+            </w:r>
+          </w:p>
+        </w:tc>
+      </w:tr>
+      <w:tr>
+        <w:trPr>
+          <w:cantSplit/>
+        </w:trPr>
+        <w:tc>
+          <w:tcPr>
+            <w:tcW w:type="dxa" w:w="2232"/>
+            <w:vAlign w:val="center"/>
+            <w:tcMar>
+              <w:top w:w="80" w:type="dxa"/>
+              <w:start w:w="120" w:type="dxa"/>
+              <w:bottom w:w="80" w:type="dxa"/>
+              <w:end w:w="120" w:type="dxa"/>
+            </w:tcMar>
+          </w:tcPr>
+          <w:p>
+            <w:pPr>
+              <w:spacing w:after="0"/>
+            </w:pPr>
+            <w:r>
+              <w:rPr>
+                <w:rFonts w:ascii="Calibri" w:hAnsi="Calibri"/>
+                <w:sz w:val="18"/>
+              </w:rPr>
+              <w:t>Next action</w:t>
+            </w:r>
+          </w:p>
+        </w:tc>
+        <w:tc>
+          <w:tcPr>
+            <w:tcW w:type="dxa" w:w="7128"/>
+            <w:vAlign w:val="center"/>
+            <w:tcMar>
+              <w:top w:w="80" w:type="dxa"/>
+              <w:start w:w="120" w:type="dxa"/>
+              <w:bottom w:w="80" w:type="dxa"/>
+              <w:end w:w="120" w:type="dxa"/>
+            </w:tcMar>
+          </w:tcPr>
+          <w:p>
+            <w:pPr>
+              <w:spacing w:after="0"/>
+            </w:pPr>
+            <w:r>
+              <w:rPr>
+                <w:rFonts w:ascii="Calibri" w:hAnsi="Calibri"/>
+                <w:sz w:val="18"/>
+              </w:rPr>
+              <w:t>OCR-1 adds the stable TypeScript scanning contract and privacy lifecycle before native OCR adapters</w:t>
+            </w:r>
+          </w:p>
+        </w:tc>
+      </w:tr>
+    </w:tbl>
+    <w:p>
+      <w:pPr>
+        <w:spacing w:after="0"/>
+      </w:pPr>
+    </w:p>
+    <w:p>
+      <w:pPr>
         <w:pStyle w:val="Heading1"/>
       </w:pPr>
       <w:r>
@@ -7028,6 +7917,131 @@
           <w:tcPr>
             <w:tcW w:type="dxa" w:w="1368"/>
             <w:shd w:fill="F2F4F7"/>
+            <w:vAlign w:val="center"/>
+            <w:tcMar>
+              <w:top w:w="80" w:type="dxa"/>
+              <w:start w:w="120" w:type="dxa"/>
+              <w:bottom w:w="80" w:type="dxa"/>
+              <w:end w:w="120" w:type="dxa"/>
+            </w:tcMar>
+          </w:tcPr>
+          <w:p>
+            <w:pPr>
+              <w:spacing w:after="0"/>
+            </w:pPr>
+            <w:r>
+              <w:rPr>
+                <w:rFonts w:ascii="Calibri" w:hAnsi="Calibri"/>
+                <w:sz w:val="18"/>
+              </w:rPr>
+              <w:t>Accepted</w:t>
+            </w:r>
+          </w:p>
+        </w:tc>
+      </w:tr>
+      <w:tr>
+        <w:trPr>
+          <w:cantSplit/>
+        </w:trPr>
+        <w:tc>
+          <w:tcPr>
+            <w:tcW w:type="dxa" w:w="864"/>
+            <w:vAlign w:val="center"/>
+            <w:tcMar>
+              <w:top w:w="80" w:type="dxa"/>
+              <w:start w:w="120" w:type="dxa"/>
+              <w:bottom w:w="80" w:type="dxa"/>
+              <w:end w:w="120" w:type="dxa"/>
+            </w:tcMar>
+          </w:tcPr>
+          <w:p>
+            <w:pPr>
+              <w:spacing w:after="0"/>
+            </w:pPr>
+            <w:r>
+              <w:rPr>
+                <w:rFonts w:ascii="Calibri" w:hAnsi="Calibri"/>
+                <w:sz w:val="18"/>
+              </w:rPr>
+              <w:t>D-011</w:t>
+            </w:r>
+          </w:p>
+        </w:tc>
+        <w:tc>
+          <w:tcPr>
+            <w:tcW w:type="dxa" w:w="1296"/>
+            <w:vAlign w:val="center"/>
+            <w:tcMar>
+              <w:top w:w="80" w:type="dxa"/>
+              <w:start w:w="120" w:type="dxa"/>
+              <w:bottom w:w="80" w:type="dxa"/>
+              <w:end w:w="120" w:type="dxa"/>
+            </w:tcMar>
+          </w:tcPr>
+          <w:p>
+            <w:pPr>
+              <w:spacing w:after="0"/>
+            </w:pPr>
+            <w:r>
+              <w:rPr>
+                <w:rFonts w:ascii="Calibri" w:hAnsi="Calibri"/>
+                <w:sz w:val="18"/>
+              </w:rPr>
+              <w:t>24 Aug 2026</w:t>
+            </w:r>
+          </w:p>
+        </w:tc>
+        <w:tc>
+          <w:tcPr>
+            <w:tcW w:type="dxa" w:w="2304"/>
+            <w:vAlign w:val="center"/>
+            <w:tcMar>
+              <w:top w:w="80" w:type="dxa"/>
+              <w:start w:w="120" w:type="dxa"/>
+              <w:bottom w:w="80" w:type="dxa"/>
+              <w:end w:w="120" w:type="dxa"/>
+            </w:tcMar>
+          </w:tcPr>
+          <w:p>
+            <w:pPr>
+              <w:spacing w:after="0"/>
+            </w:pPr>
+            <w:r>
+              <w:rPr>
+                <w:rFonts w:ascii="Calibri" w:hAnsi="Calibri"/>
+                <w:sz w:val="18"/>
+              </w:rPr>
+              <w:t>Native foundation before OCR logic</w:t>
+            </w:r>
+          </w:p>
+        </w:tc>
+        <w:tc>
+          <w:tcPr>
+            <w:tcW w:type="dxa" w:w="3528"/>
+            <w:vAlign w:val="center"/>
+            <w:tcMar>
+              <w:top w:w="80" w:type="dxa"/>
+              <w:start w:w="120" w:type="dxa"/>
+              <w:bottom w:w="80" w:type="dxa"/>
+              <w:end w:w="120" w:type="dxa"/>
+            </w:tcMar>
+          </w:tcPr>
+          <w:p>
+            <w:pPr>
+              <w:spacing w:after="0"/>
+            </w:pPr>
+            <w:r>
+              <w:rPr>
+                <w:rFonts w:ascii="Calibri" w:hAnsi="Calibri"/>
+                <w:sz w:val="18"/>
+              </w:rPr>
+              <w:t>Control identity, privacy, and build evidence first</w:t>
+            </w:r>
+          </w:p>
+        </w:tc>
+        <w:tc>
+          <w:tcPr>
+            <w:tcW w:type="dxa" w:w="1368"/>
             <w:vAlign w:val="center"/>
             <w:tcMar>
               <w:top w:w="80" w:type="dxa"/>
@@ -8091,6 +9105,278 @@
                 <w:sz w:val="18"/>
               </w:rPr>
               <w:t>To be recorded</w:t>
+            </w:r>
+          </w:p>
+        </w:tc>
+      </w:tr>
+    </w:tbl>
+    <w:p>
+      <w:pPr>
+        <w:spacing w:after="0"/>
+      </w:pPr>
+    </w:p>
+    <w:tbl>
+      <w:tblPr>
+        <w:tblStyle w:val="TableGrid"/>
+        <w:tblW w:type="dxa" w:w="9360"/>
+        <w:tblLayout w:type="fixed"/>
+        <w:tblLook w:firstColumn="1" w:firstRow="1" w:lastColumn="0" w:lastRow="0" w:noHBand="0" w:noVBand="1" w:val="04A0"/>
+        <w:jc w:val="left"/>
+        <w:tblInd w:w="120" w:type="dxa"/>
+      </w:tblPr>
+      <w:tblGrid>
+        <w:gridCol w:w="1872"/>
+        <w:gridCol w:w="1872"/>
+        <w:gridCol w:w="1872"/>
+        <w:gridCol w:w="1872"/>
+        <w:gridCol w:w="1872"/>
+      </w:tblGrid>
+      <w:tr>
+        <w:trPr>
+          <w:tblHeader w:val="true"/>
+        </w:trPr>
+        <w:tc>
+          <w:tcPr>
+            <w:tcW w:type="dxa" w:w="1008"/>
+            <w:vAlign w:val="center"/>
+            <w:tcMar>
+              <w:top w:w="80" w:type="dxa"/>
+              <w:start w:w="120" w:type="dxa"/>
+              <w:bottom w:w="80" w:type="dxa"/>
+              <w:end w:w="120" w:type="dxa"/>
+            </w:tcMar>
+            <w:shd w:fill="17365D"/>
+          </w:tcPr>
+          <w:p>
+            <w:r>
+              <w:rPr>
+                <w:rFonts w:ascii="Calibri" w:hAnsi="Calibri"/>
+                <w:b/>
+                <w:color w:val="FFFFFF"/>
+                <w:sz w:val="19"/>
+              </w:rPr>
+              <w:t>ID</w:t>
+            </w:r>
+          </w:p>
+        </w:tc>
+        <w:tc>
+          <w:tcPr>
+            <w:tcW w:type="dxa" w:w="1080"/>
+            <w:vAlign w:val="center"/>
+            <w:tcMar>
+              <w:top w:w="80" w:type="dxa"/>
+              <w:start w:w="120" w:type="dxa"/>
+              <w:bottom w:w="80" w:type="dxa"/>
+              <w:end w:w="120" w:type="dxa"/>
+            </w:tcMar>
+            <w:shd w:fill="17365D"/>
+          </w:tcPr>
+          <w:p>
+            <w:r>
+              <w:rPr>
+                <w:rFonts w:ascii="Calibri" w:hAnsi="Calibri"/>
+                <w:b/>
+                <w:color w:val="FFFFFF"/>
+                <w:sz w:val="19"/>
+              </w:rPr>
+              <w:t>Slice</w:t>
+            </w:r>
+          </w:p>
+        </w:tc>
+        <w:tc>
+          <w:tcPr>
+            <w:tcW w:type="dxa" w:w="3960"/>
+            <w:vAlign w:val="center"/>
+            <w:tcMar>
+              <w:top w:w="80" w:type="dxa"/>
+              <w:start w:w="120" w:type="dxa"/>
+              <w:bottom w:w="80" w:type="dxa"/>
+              <w:end w:w="120" w:type="dxa"/>
+            </w:tcMar>
+            <w:shd w:fill="17365D"/>
+          </w:tcPr>
+          <w:p>
+            <w:r>
+              <w:rPr>
+                <w:rFonts w:ascii="Calibri" w:hAnsi="Calibri"/>
+                <w:b/>
+                <w:color w:val="FFFFFF"/>
+                <w:sz w:val="19"/>
+              </w:rPr>
+              <w:t>Evidence</w:t>
+            </w:r>
+          </w:p>
+        </w:tc>
+        <w:tc>
+          <w:tcPr>
+            <w:tcW w:type="dxa" w:w="1224"/>
+            <w:vAlign w:val="center"/>
+            <w:tcMar>
+              <w:top w:w="80" w:type="dxa"/>
+              <w:start w:w="120" w:type="dxa"/>
+              <w:bottom w:w="80" w:type="dxa"/>
+              <w:end w:w="120" w:type="dxa"/>
+            </w:tcMar>
+            <w:shd w:fill="17365D"/>
+          </w:tcPr>
+          <w:p>
+            <w:r>
+              <w:rPr>
+                <w:rFonts w:ascii="Calibri" w:hAnsi="Calibri"/>
+                <w:b/>
+                <w:color w:val="FFFFFF"/>
+                <w:sz w:val="19"/>
+              </w:rPr>
+              <w:t>Status</w:t>
+            </w:r>
+          </w:p>
+        </w:tc>
+        <w:tc>
+          <w:tcPr>
+            <w:tcW w:type="dxa" w:w="2088"/>
+            <w:vAlign w:val="center"/>
+            <w:tcMar>
+              <w:top w:w="80" w:type="dxa"/>
+              <w:start w:w="120" w:type="dxa"/>
+              <w:bottom w:w="80" w:type="dxa"/>
+              <w:end w:w="120" w:type="dxa"/>
+            </w:tcMar>
+            <w:shd w:fill="17365D"/>
+          </w:tcPr>
+          <w:p>
+            <w:r>
+              <w:rPr>
+                <w:rFonts w:ascii="Calibri" w:hAnsi="Calibri"/>
+                <w:b/>
+                <w:color w:val="FFFFFF"/>
+                <w:sz w:val="19"/>
+              </w:rPr>
+              <w:t>Reference</w:t>
+            </w:r>
+          </w:p>
+        </w:tc>
+      </w:tr>
+      <w:tr>
+        <w:trPr>
+          <w:cantSplit/>
+        </w:trPr>
+        <w:tc>
+          <w:tcPr>
+            <w:tcW w:type="dxa" w:w="1008"/>
+            <w:vAlign w:val="center"/>
+            <w:tcMar>
+              <w:top w:w="80" w:type="dxa"/>
+              <w:start w:w="120" w:type="dxa"/>
+              <w:bottom w:w="80" w:type="dxa"/>
+              <w:end w:w="120" w:type="dxa"/>
+            </w:tcMar>
+          </w:tcPr>
+          <w:p>
+            <w:pPr>
+              <w:spacing w:after="0"/>
+            </w:pPr>
+            <w:r>
+              <w:rPr>
+                <w:rFonts w:ascii="Calibri" w:hAnsi="Calibri"/>
+                <w:sz w:val="18"/>
+              </w:rPr>
+              <w:t>E-008</w:t>
+            </w:r>
+          </w:p>
+        </w:tc>
+        <w:tc>
+          <w:tcPr>
+            <w:tcW w:type="dxa" w:w="1080"/>
+            <w:vAlign w:val="center"/>
+            <w:tcMar>
+              <w:top w:w="80" w:type="dxa"/>
+              <w:start w:w="120" w:type="dxa"/>
+              <w:bottom w:w="80" w:type="dxa"/>
+              <w:end w:w="120" w:type="dxa"/>
+            </w:tcMar>
+          </w:tcPr>
+          <w:p>
+            <w:pPr>
+              <w:spacing w:after="0"/>
+            </w:pPr>
+            <w:r>
+              <w:rPr>
+                <w:rFonts w:ascii="Calibri" w:hAnsi="Calibri"/>
+                <w:sz w:val="18"/>
+              </w:rPr>
+              <w:t>OCR-0</w:t>
+            </w:r>
+          </w:p>
+        </w:tc>
+        <w:tc>
+          <w:tcPr>
+            <w:tcW w:type="dxa" w:w="3960"/>
+            <w:vAlign w:val="center"/>
+            <w:tcMar>
+              <w:top w:w="80" w:type="dxa"/>
+              <w:start w:w="120" w:type="dxa"/>
+              <w:bottom w:w="80" w:type="dxa"/>
+              <w:end w:w="120" w:type="dxa"/>
+            </w:tcMar>
+          </w:tcPr>
+          <w:p>
+            <w:pPr>
+              <w:spacing w:after="0"/>
+            </w:pPr>
+            <w:r>
+              <w:rPr>
+                <w:rFonts w:ascii="Calibri" w:hAnsi="Calibri"/>
+                <w:sz w:val="18"/>
+              </w:rPr>
+              <w:t>Android/iOS identity, sync, security, and unsigned build proof</w:t>
+            </w:r>
+          </w:p>
+        </w:tc>
+        <w:tc>
+          <w:tcPr>
+            <w:tcW w:type="dxa" w:w="1224"/>
+            <w:vAlign w:val="center"/>
+            <w:tcMar>
+              <w:top w:w="80" w:type="dxa"/>
+              <w:start w:w="120" w:type="dxa"/>
+              <w:bottom w:w="80" w:type="dxa"/>
+              <w:end w:w="120" w:type="dxa"/>
+            </w:tcMar>
+          </w:tcPr>
+          <w:p>
+            <w:pPr>
+              <w:spacing w:after="0"/>
+            </w:pPr>
+            <w:r>
+              <w:rPr>
+                <w:rFonts w:ascii="Calibri" w:hAnsi="Calibri"/>
+                <w:sz w:val="18"/>
+              </w:rPr>
+              <w:t>Verified</w:t>
+            </w:r>
+          </w:p>
+        </w:tc>
+        <w:tc>
+          <w:tcPr>
+            <w:tcW w:type="dxa" w:w="2088"/>
+            <w:vAlign w:val="center"/>
+            <w:tcMar>
+              <w:top w:w="80" w:type="dxa"/>
+              <w:start w:w="120" w:type="dxa"/>
+              <w:bottom w:w="80" w:type="dxa"/>
+              <w:end w:w="120" w:type="dxa"/>
+            </w:tcMar>
+          </w:tcPr>
+          <w:p>
+            <w:pPr>
+              <w:spacing w:after="0"/>
+            </w:pPr>
+            <w:r>
+              <w:rPr>
+                <w:rFonts w:ascii="Calibri" w:hAnsi="Calibri"/>
+                <w:sz w:val="18"/>
+              </w:rPr>
+              <w:t>PR #53 native CI recorded in journey log</w:t>
             </w:r>
           </w:p>
         </w:tc>

</xml_diff>

<commit_message>
feat: add production native OCR evidence capture
</commit_message>
<xml_diff>
--- a/output/doc/senatla-ops-implementation-journey.docx
+++ b/output/doc/senatla-ops-implementation-journey.docx
@@ -208,15 +208,8 @@
             </w:tcMar>
           </w:tcPr>
           <w:p>
-            <w:pPr>
-              <w:spacing w:after="0"/>
-            </w:pPr>
-            <w:r>
-              <w:rPr>
-                <w:rFonts w:ascii="Calibri" w:hAnsi="Calibri"/>
-                <w:sz w:val="18"/>
-              </w:rPr>
-              <w:t>sankofa_xciv/authoritative-slices-0-2</w:t>
+            <w:r>
+              <w:t>sankofa_xciv/ocr-1-2-native-scanning</w:t>
             </w:r>
           </w:p>
         </w:tc>
@@ -6517,6 +6510,372 @@
     </w:p>
     <w:p>
       <w:pPr>
+        <w:pStyle w:val="Heading2"/>
+      </w:pPr>
+      <w:r>
+        <w:t>24 August 2026 - OCR-1 and OCR-2 production scanning bundle</w:t>
+      </w:r>
+    </w:p>
+    <w:tbl>
+      <w:tblPr>
+        <w:tblStyle w:val="TableGrid"/>
+        <w:tblW w:type="auto" w:w="0"/>
+        <w:tblLook w:firstColumn="1" w:firstRow="1" w:lastColumn="0" w:lastRow="0" w:noHBand="0" w:noVBand="1" w:val="04A0"/>
+      </w:tblPr>
+      <w:tblGrid>
+        <w:gridCol w:w="4680"/>
+        <w:gridCol w:w="4680"/>
+      </w:tblGrid>
+      <w:tr>
+        <w:tc>
+          <w:tcPr>
+            <w:tcW w:type="dxa" w:w="4680"/>
+          </w:tcPr>
+          <w:p>
+            <w:r>
+              <w:t>Field</w:t>
+            </w:r>
+          </w:p>
+        </w:tc>
+        <w:tc>
+          <w:tcPr>
+            <w:tcW w:type="dxa" w:w="4680"/>
+          </w:tcPr>
+          <w:p>
+            <w:r>
+              <w:t>Recorded implementation evidence</w:t>
+            </w:r>
+          </w:p>
+        </w:tc>
+      </w:tr>
+      <w:tr>
+        <w:tc>
+          <w:tcPr>
+            <w:tcW w:type="dxa" w:w="4680"/>
+          </w:tcPr>
+          <w:p>
+            <w:r>
+              <w:rPr>
+                <w:b/>
+              </w:rPr>
+              <w:t>Slice</w:t>
+            </w:r>
+          </w:p>
+        </w:tc>
+        <w:tc>
+          <w:tcPr>
+            <w:tcW w:type="dxa" w:w="4680"/>
+          </w:tcPr>
+          <w:p>
+            <w:r>
+              <w:t>OCR-1 stable scan contract and OCR-2 Android/iOS native adapters.</w:t>
+            </w:r>
+          </w:p>
+        </w:tc>
+      </w:tr>
+      <w:tr>
+        <w:tc>
+          <w:tcPr>
+            <w:tcW w:type="dxa" w:w="4680"/>
+          </w:tcPr>
+          <w:p>
+            <w:r>
+              <w:rPr>
+                <w:b/>
+              </w:rPr>
+              <w:t>Branch / PR</w:t>
+            </w:r>
+          </w:p>
+        </w:tc>
+        <w:tc>
+          <w:tcPr>
+            <w:tcW w:type="dxa" w:w="4680"/>
+          </w:tcPr>
+          <w:p>
+            <w:r>
+              <w:t>sankofa_xciv/ocr-1-2-native-scanning; remote evidence will be added after the release gate.</w:t>
+            </w:r>
+          </w:p>
+        </w:tc>
+      </w:tr>
+      <w:tr>
+        <w:tc>
+          <w:tcPr>
+            <w:tcW w:type="dxa" w:w="4680"/>
+          </w:tcPr>
+          <w:p>
+            <w:r>
+              <w:rPr>
+                <w:b/>
+              </w:rPr>
+              <w:t>Outcome</w:t>
+            </w:r>
+          </w:p>
+        </w:tc>
+        <w:tc>
+          <w:tcPr>
+            <w:tcW w:type="dxa" w:w="4680"/>
+          </w:tcPr>
+          <w:p>
+            <w:r>
+              <w:t>Enhanced the existing asset-registration flow with native scanning, on-device OCR, evidence provenance, byte-integrity verification and explicit human review. Android uses ML Kit; iOS uses VisionKit and Vision.</w:t>
+            </w:r>
+          </w:p>
+        </w:tc>
+      </w:tr>
+      <w:tr>
+        <w:tc>
+          <w:tcPr>
+            <w:tcW w:type="dxa" w:w="4680"/>
+          </w:tcPr>
+          <w:p>
+            <w:r>
+              <w:rPr>
+                <w:b/>
+              </w:rPr>
+              <w:t>Decision</w:t>
+            </w:r>
+          </w:p>
+        </w:tc>
+        <w:tc>
+          <w:tcPr>
+            <w:tcW w:type="dxa" w:w="4680"/>
+          </w:tcPr>
+          <w:p>
+            <w:r>
+              <w:t>Use a strict TypeScript/native contract, private file:// JPEGs, UUID/size/dimension/SHA-256 validation, bounded OCR and native cleanup before Supabase upload.</w:t>
+            </w:r>
+          </w:p>
+        </w:tc>
+      </w:tr>
+      <w:tr>
+        <w:tc>
+          <w:tcPr>
+            <w:tcW w:type="dxa" w:w="4680"/>
+          </w:tcPr>
+          <w:p>
+            <w:r>
+              <w:rPr>
+                <w:b/>
+              </w:rPr>
+              <w:t>Alternative rejected</w:t>
+            </w:r>
+          </w:p>
+        </w:tc>
+        <w:tc>
+          <w:tcPr>
+            <w:tcW w:type="dxa" w:w="4680"/>
+          </w:tcPr>
+          <w:p>
+            <w:r>
+              <w:t>Base64 bridge payloads, shared files, cloud OCR by default, automatic application of OCR values and silent permission/cancellation fallback.</w:t>
+            </w:r>
+          </w:p>
+        </w:tc>
+      </w:tr>
+      <w:tr>
+        <w:tc>
+          <w:tcPr>
+            <w:tcW w:type="dxa" w:w="4680"/>
+          </w:tcPr>
+          <w:p>
+            <w:r>
+              <w:rPr>
+                <w:b/>
+              </w:rPr>
+              <w:t>Security and privacy</w:t>
+            </w:r>
+          </w:p>
+        </w:tc>
+        <w:tc>
+          <w:tcPr>
+            <w:tcW w:type="dxa" w:w="4680"/>
+          </w:tcPr>
+          <w:p>
+            <w:r>
+              <w:t>15 MiB and five-page native bounds; private/protected cache; no paths or raw OCR in activity logs; 8,000-character OCR cap; RLS/private Storage; human apply-and-verify.</w:t>
+            </w:r>
+          </w:p>
+        </w:tc>
+      </w:tr>
+      <w:tr>
+        <w:tc>
+          <w:tcPr>
+            <w:tcW w:type="dxa" w:w="4680"/>
+          </w:tcPr>
+          <w:p>
+            <w:r>
+              <w:rPr>
+                <w:b/>
+              </w:rPr>
+              <w:t>Three-pass critic loop</w:t>
+            </w:r>
+          </w:p>
+        </w:tc>
+        <w:tc>
+          <w:tcPr>
+            <w:tcW w:type="dxa" w:w="4680"/>
+          </w:tcPr>
+          <w:p>
+            <w:r>
+              <w:t>Pass 1 challenged contract and review semantics. Pass 2 challenged native lifecycle, cleanup, interruption and concurrency. Pass 3 reviewed every changed source file and supporting RLS/Storage controls.</w:t>
+            </w:r>
+          </w:p>
+        </w:tc>
+      </w:tr>
+      <w:tr>
+        <w:tc>
+          <w:tcPr>
+            <w:tcW w:type="dxa" w:w="4680"/>
+          </w:tcPr>
+          <w:p>
+            <w:r>
+              <w:rPr>
+                <w:b/>
+              </w:rPr>
+              <w:t>Improvements applied</w:t>
+            </w:r>
+          </w:p>
+        </w:tc>
+        <w:tc>
+          <w:tcPr>
+            <w:tcW w:type="dxa" w:w="4680"/>
+          </w:tcPr>
+          <w:p>
+            <w:r>
+              <w:t>Native stale-session startup sweeps, Android symlink rejection and complete scanner locking, whole-session malformed-result cleanup, two-phase evidence upload, immutable ready objects/provenance and checked rollback.</w:t>
+            </w:r>
+          </w:p>
+        </w:tc>
+      </w:tr>
+      <w:tr>
+        <w:tc>
+          <w:tcPr>
+            <w:tcW w:type="dxa" w:w="4680"/>
+          </w:tcPr>
+          <w:p>
+            <w:r>
+              <w:rPr>
+                <w:b/>
+              </w:rPr>
+              <w:t>Verification</w:t>
+            </w:r>
+          </w:p>
+        </w:tc>
+        <w:tc>
+          <w:tcPr>
+            <w:tcW w:type="dxa" w:w="4680"/>
+          </w:tcPr>
+          <w:p>
+            <w:r>
+              <w:t>Runtime-config, lint, typecheck, production build and 93/93 tests passed after the final persistence hardening. Linked Supabase lint and migration dry-run pass; native CI remains the remote release gate.</w:t>
+            </w:r>
+          </w:p>
+        </w:tc>
+      </w:tr>
+      <w:tr>
+        <w:tc>
+          <w:tcPr>
+            <w:tcW w:type="dxa" w:w="4680"/>
+          </w:tcPr>
+          <w:p>
+            <w:r>
+              <w:rPr>
+                <w:b/>
+              </w:rPr>
+              <w:t>Visual and device evidence</w:t>
+            </w:r>
+          </w:p>
+        </w:tc>
+        <w:tc>
+          <w:tcPr>
+            <w:tcW w:type="dxa" w:w="4680"/>
+          </w:tcPr>
+          <w:p>
+            <w:r>
+              <w:t>Capture guidance and provenance/confidence render in the existing responsive workspace. Full regression remains after Slice 3; signed-device camera and process-interruption proof remains required.</w:t>
+            </w:r>
+          </w:p>
+        </w:tc>
+      </w:tr>
+      <w:tr>
+        <w:tc>
+          <w:tcPr>
+            <w:tcW w:type="dxa" w:w="4680"/>
+          </w:tcPr>
+          <w:p>
+            <w:r>
+              <w:rPr>
+                <w:b/>
+              </w:rPr>
+              <w:t>Result</w:t>
+            </w:r>
+          </w:p>
+        </w:tc>
+        <w:tc>
+          <w:tcPr>
+            <w:tcW w:type="dxa" w:w="4680"/>
+          </w:tcPr>
+          <w:p>
+            <w:r>
+              <w:t>Implementation and local web/security gates pass. Remote migration, native CI, merge to dev, Vercel confirmation and physical-device UAT remain release gates at this entry.</w:t>
+            </w:r>
+          </w:p>
+        </w:tc>
+      </w:tr>
+      <w:tr>
+        <w:tc>
+          <w:tcPr>
+            <w:tcW w:type="dxa" w:w="4680"/>
+          </w:tcPr>
+          <w:p>
+            <w:r>
+              <w:rPr>
+                <w:b/>
+              </w:rPr>
+              <w:t>Known limitation</w:t>
+            </w:r>
+          </w:p>
+        </w:tc>
+        <w:tc>
+          <w:tcPr>
+            <w:tcW w:type="dxa" w:w="4680"/>
+          </w:tcPr>
+          <w:p>
+            <w:r>
+              <w:t>The official client recomputes SHA-256 immediately before immutable upload; capture source is client-reported and is not cryptographic device attestation.</w:t>
+            </w:r>
+          </w:p>
+        </w:tc>
+      </w:tr>
+      <w:tr>
+        <w:tc>
+          <w:tcPr>
+            <w:tcW w:type="dxa" w:w="4680"/>
+          </w:tcPr>
+          <w:p>
+            <w:r>
+              <w:rPr>
+                <w:b/>
+              </w:rPr>
+              <w:t>Next action</w:t>
+            </w:r>
+          </w:p>
+        </w:tc>
+        <w:tc>
+          <w:tcPr>
+            <w:tcW w:type="dxa" w:w="4680"/>
+          </w:tcPr>
+          <w:p>
+            <w:r>
+              <w:t>Apply migrations to btdavpeyxtirtshovjdu, push the branch, require green web/Android/iOS CI, merge to dev, confirm Vercel, then run signed-device UAT.</w:t>
+            </w:r>
+          </w:p>
+        </w:tc>
+      </w:tr>
+    </w:tbl>
+    <w:p>
+      <w:pPr>
         <w:pStyle w:val="Heading1"/>
       </w:pPr>
       <w:r>
@@ -8059,6 +8418,162 @@
                 <w:rFonts w:ascii="Calibri" w:hAnsi="Calibri"/>
                 <w:sz w:val="18"/>
               </w:rPr>
+              <w:t>Accepted</w:t>
+            </w:r>
+          </w:p>
+        </w:tc>
+      </w:tr>
+      <w:tr>
+        <w:tc>
+          <w:tcPr>
+            <w:tcW w:type="dxa" w:w="1872"/>
+          </w:tcPr>
+          <w:p>
+            <w:r>
+              <w:t>D-012</w:t>
+            </w:r>
+          </w:p>
+        </w:tc>
+        <w:tc>
+          <w:tcPr>
+            <w:tcW w:type="dxa" w:w="1872"/>
+          </w:tcPr>
+          <w:p>
+            <w:r>
+              <w:t>24 Aug 2026</w:t>
+            </w:r>
+          </w:p>
+        </w:tc>
+        <w:tc>
+          <w:tcPr>
+            <w:tcW w:type="dxa" w:w="1872"/>
+          </w:tcPr>
+          <w:p>
+            <w:r>
+              <w:t>Native on-device scanning behind a strict contract</w:t>
+            </w:r>
+          </w:p>
+        </w:tc>
+        <w:tc>
+          <w:tcPr>
+            <w:tcW w:type="dxa" w:w="1872"/>
+          </w:tcPr>
+          <w:p>
+            <w:r>
+              <w:t>Preserve privacy, offline capability, bounded resources and lifecycle ownership</w:t>
+            </w:r>
+          </w:p>
+        </w:tc>
+        <w:tc>
+          <w:tcPr>
+            <w:tcW w:type="dxa" w:w="1872"/>
+          </w:tcPr>
+          <w:p>
+            <w:r>
+              <w:t>Accepted</w:t>
+            </w:r>
+          </w:p>
+        </w:tc>
+      </w:tr>
+      <w:tr>
+        <w:tc>
+          <w:tcPr>
+            <w:tcW w:type="dxa" w:w="1872"/>
+          </w:tcPr>
+          <w:p>
+            <w:r>
+              <w:t>D-013</w:t>
+            </w:r>
+          </w:p>
+        </w:tc>
+        <w:tc>
+          <w:tcPr>
+            <w:tcW w:type="dxa" w:w="1872"/>
+          </w:tcPr>
+          <w:p>
+            <w:r>
+              <w:t>24 Aug 2026</w:t>
+            </w:r>
+          </w:p>
+        </w:tc>
+        <w:tc>
+          <w:tcPr>
+            <w:tcW w:type="dxa" w:w="1872"/>
+          </w:tcPr>
+          <w:p>
+            <w:r>
+              <w:t>OCR remains reviewable evidence</w:t>
+            </w:r>
+          </w:p>
+        </w:tc>
+        <w:tc>
+          <w:tcPr>
+            <w:tcW w:type="dxa" w:w="1872"/>
+          </w:tcPr>
+          <w:p>
+            <w:r>
+              <w:t>Recognition must not silently change authoritative asset data</w:t>
+            </w:r>
+          </w:p>
+        </w:tc>
+        <w:tc>
+          <w:tcPr>
+            <w:tcW w:type="dxa" w:w="1872"/>
+          </w:tcPr>
+          <w:p>
+            <w:r>
+              <w:t>Accepted</w:t>
+            </w:r>
+          </w:p>
+        </w:tc>
+      </w:tr>
+      <w:tr>
+        <w:tc>
+          <w:tcPr>
+            <w:tcW w:type="dxa" w:w="1872"/>
+          </w:tcPr>
+          <w:p>
+            <w:r>
+              <w:t>D-014</w:t>
+            </w:r>
+          </w:p>
+        </w:tc>
+        <w:tc>
+          <w:tcPr>
+            <w:tcW w:type="dxa" w:w="1872"/>
+          </w:tcPr>
+          <w:p>
+            <w:r>
+              <w:t>24 Aug 2026</w:t>
+            </w:r>
+          </w:p>
+        </w:tc>
+        <w:tc>
+          <w:tcPr>
+            <w:tcW w:type="dxa" w:w="1872"/>
+          </w:tcPr>
+          <w:p>
+            <w:r>
+              <w:t>Two-phase immutable evidence persistence</w:t>
+            </w:r>
+          </w:p>
+        </w:tc>
+        <w:tc>
+          <w:tcPr>
+            <w:tcW w:type="dxa" w:w="1872"/>
+          </w:tcPr>
+          <w:p>
+            <w:r>
+              <w:t>Prevent orphaned private objects and hash/provenance drift</w:t>
+            </w:r>
+          </w:p>
+        </w:tc>
+        <w:tc>
+          <w:tcPr>
+            <w:tcW w:type="dxa" w:w="1872"/>
+          </w:tcPr>
+          <w:p>
+            <w:r>
               <w:t>Accepted</w:t>
             </w:r>
           </w:p>
@@ -9381,6 +9896,110 @@
           </w:p>
         </w:tc>
       </w:tr>
+      <w:tr>
+        <w:tc>
+          <w:tcPr>
+            <w:tcW w:type="dxa" w:w="1872"/>
+          </w:tcPr>
+          <w:p>
+            <w:r>
+              <w:t>E-009</w:t>
+            </w:r>
+          </w:p>
+        </w:tc>
+        <w:tc>
+          <w:tcPr>
+            <w:tcW w:type="dxa" w:w="1872"/>
+          </w:tcPr>
+          <w:p>
+            <w:r>
+              <w:t>OCR-1</w:t>
+            </w:r>
+          </w:p>
+        </w:tc>
+        <w:tc>
+          <w:tcPr>
+            <w:tcW w:type="dxa" w:w="1872"/>
+          </w:tcPr>
+          <w:p>
+            <w:r>
+              <w:t>Contract, integrity, cleanup, fallback and human-review proof</w:t>
+            </w:r>
+          </w:p>
+        </w:tc>
+        <w:tc>
+          <w:tcPr>
+            <w:tcW w:type="dxa" w:w="1872"/>
+          </w:tcPr>
+          <w:p>
+            <w:r>
+              <w:t>Verified locally</w:t>
+            </w:r>
+          </w:p>
+        </w:tc>
+        <w:tc>
+          <w:tcPr>
+            <w:tcW w:type="dxa" w:w="1872"/>
+          </w:tcPr>
+          <w:p>
+            <w:r>
+              <w:t>Full gate passed with 93/93 browser tests; security review covered all changed source files</w:t>
+            </w:r>
+          </w:p>
+        </w:tc>
+      </w:tr>
+      <w:tr>
+        <w:tc>
+          <w:tcPr>
+            <w:tcW w:type="dxa" w:w="1872"/>
+          </w:tcPr>
+          <w:p>
+            <w:r>
+              <w:t>E-010</w:t>
+            </w:r>
+          </w:p>
+        </w:tc>
+        <w:tc>
+          <w:tcPr>
+            <w:tcW w:type="dxa" w:w="1872"/>
+          </w:tcPr>
+          <w:p>
+            <w:r>
+              <w:t>OCR-2</w:t>
+            </w:r>
+          </w:p>
+        </w:tc>
+        <w:tc>
+          <w:tcPr>
+            <w:tcW w:type="dxa" w:w="1872"/>
+          </w:tcPr>
+          <w:p>
+            <w:r>
+              <w:t>Android ML Kit and iOS VisionKit/Vision compile and device proof</w:t>
+            </w:r>
+          </w:p>
+        </w:tc>
+        <w:tc>
+          <w:tcPr>
+            <w:tcW w:type="dxa" w:w="1872"/>
+          </w:tcPr>
+          <w:p>
+            <w:r>
+              <w:t>Partial</w:t>
+            </w:r>
+          </w:p>
+        </w:tc>
+        <w:tc>
+          <w:tcPr>
+            <w:tcW w:type="dxa" w:w="1872"/>
+          </w:tcPr>
+          <w:p>
+            <w:r>
+              <w:t>Native source/lifecycle review passed; remote CI and signed-device UAT pending</w:t>
+            </w:r>
+          </w:p>
+        </w:tc>
+      </w:tr>
     </w:tbl>
     <w:p>
       <w:pPr>
@@ -10226,6 +10845,132 @@
                 <w:sz w:val="18"/>
               </w:rPr>
               <w:t>Controlled</w:t>
+            </w:r>
+          </w:p>
+        </w:tc>
+      </w:tr>
+      <w:tr>
+        <w:tc>
+          <w:tcPr>
+            <w:tcW w:type="dxa" w:w="2340"/>
+          </w:tcPr>
+          <w:p>
+            <w:r>
+              <w:t>Interrupted native scan leaves cache residue</w:t>
+            </w:r>
+          </w:p>
+        </w:tc>
+        <w:tc>
+          <w:tcPr>
+            <w:tcW w:type="dxa" w:w="2340"/>
+          </w:tcPr>
+          <w:p>
+            <w:r>
+              <w:t>Sensitive evidence remains on a device longer than intended</w:t>
+            </w:r>
+          </w:p>
+        </w:tc>
+        <w:tc>
+          <w:tcPr>
+            <w:tcW w:type="dxa" w:w="2340"/>
+          </w:tcPr>
+          <w:p>
+            <w:r>
+              <w:t>Private/protected cache, safe startup sweep, no backup and no path logging</w:t>
+            </w:r>
+          </w:p>
+        </w:tc>
+        <w:tc>
+          <w:tcPr>
+            <w:tcW w:type="dxa" w:w="2340"/>
+          </w:tcPr>
+          <w:p>
+            <w:r>
+              <w:t>Controlled; device kill-test pending</w:t>
+            </w:r>
+          </w:p>
+        </w:tc>
+      </w:tr>
+      <w:tr>
+        <w:tc>
+          <w:tcPr>
+            <w:tcW w:type="dxa" w:w="2340"/>
+          </w:tcPr>
+          <w:p>
+            <w:r>
+              <w:t>Evidence upload becomes orphaned or mutable</w:t>
+            </w:r>
+          </w:p>
+        </w:tc>
+        <w:tc>
+          <w:tcPr>
+            <w:tcW w:type="dxa" w:w="2340"/>
+          </w:tcPr>
+          <w:p>
+            <w:r>
+              <w:t>Private bytes and audit digest diverge</w:t>
+            </w:r>
+          </w:p>
+        </w:tc>
+        <w:tc>
+          <w:tcPr>
+            <w:tcW w:type="dxa" w:w="2340"/>
+          </w:tcPr>
+          <w:p>
+            <w:r>
+              <w:t>Pending row before upload, checked rollback, immutable ready objects and provenance</w:t>
+            </w:r>
+          </w:p>
+        </w:tc>
+        <w:tc>
+          <w:tcPr>
+            <w:tcW w:type="dxa" w:w="2340"/>
+          </w:tcPr>
+          <w:p>
+            <w:r>
+              <w:t>Controlled in code; remote pgTAP pending</w:t>
+            </w:r>
+          </w:p>
+        </w:tc>
+      </w:tr>
+      <w:tr>
+        <w:tc>
+          <w:tcPr>
+            <w:tcW w:type="dxa" w:w="2340"/>
+          </w:tcPr>
+          <w:p>
+            <w:r>
+              <w:t>OCR suggestion is treated as verified truth</w:t>
+            </w:r>
+          </w:p>
+        </w:tc>
+        <w:tc>
+          <w:tcPr>
+            <w:tcW w:type="dxa" w:w="2340"/>
+          </w:tcPr>
+          <w:p>
+            <w:r>
+              <w:t>Incorrect identifiers or dates enter operations</w:t>
+            </w:r>
+          </w:p>
+        </w:tc>
+        <w:tc>
+          <w:tcPr>
+            <w:tcW w:type="dxa" w:w="2340"/>
+          </w:tcPr>
+          <w:p>
+            <w:r>
+              <w:t>Apply-and-verify gate, confidence/provenance display and audit metadata</w:t>
+            </w:r>
+          </w:p>
+        </w:tc>
+        <w:tc>
+          <w:tcPr>
+            <w:tcW w:type="dxa" w:w="2340"/>
+          </w:tcPr>
+          <w:p>
+            <w:r>
+              <w:t>Controlled; UAT matrix pending</w:t>
             </w:r>
           </w:p>
         </w:tc>

</xml_diff>

<commit_message>
docs: record OCR release gate evidence
</commit_message>
<xml_diff>
--- a/output/doc/senatla-ops-implementation-journey.docx
+++ b/output/doc/senatla-ops-implementation-journey.docx
@@ -6593,7 +6593,7 @@
           </w:tcPr>
           <w:p>
             <w:r>
-              <w:t>sankofa_xciv/ocr-1-2-native-scanning; remote evidence will be added after the release gate.</w:t>
+              <w:t>sankofa_xciv/ocr-1-2-native-scanning; PR #54 into dev.</w:t>
             </w:r>
           </w:p>
         </w:tc>
@@ -6768,7 +6768,7 @@
           </w:tcPr>
           <w:p>
             <w:r>
-              <w:t>Runtime-config, lint, typecheck, production build and 93/93 tests passed after the final persistence hardening. Linked Supabase lint and migration dry-run pass; native CI remains the remote release gate.</w:t>
+              <w:t>Runtime-config, lint, typecheck, production build and 93/93 tests passed. PR #54 passed application, 208-test Supabase pgTAP, Android debug, iOS simulator and both Vercel preview checks.</w:t>
             </w:r>
           </w:p>
         </w:tc>
@@ -6818,7 +6818,7 @@
           </w:tcPr>
           <w:p>
             <w:r>
-              <w:t>Implementation and local web/security gates pass. Remote migration, native CI, merge to dev, Vercel confirmation and physical-device UAT remain release gates at this entry.</w:t>
+              <w:t>Implementation, remote migrations, native CI, Supabase pgTAP and Vercel preview gates pass. Merge to dev, post-merge Vercel confirmation and physical-device UAT remain.</w:t>
             </w:r>
           </w:p>
         </w:tc>
@@ -6868,7 +6868,7 @@
           </w:tcPr>
           <w:p>
             <w:r>
-              <w:t>Apply migrations to btdavpeyxtirtshovjdu, push the branch, require green web/Android/iOS CI, merge to dev, confirm Vercel, then run signed-device UAT.</w:t>
+              <w:t>Merge green PR #54 to dev, confirm post-merge Vercel, then run signed-device UAT across the five-role matrix.</w:t>
             </w:r>
           </w:p>
         </w:tc>

</xml_diff>

<commit_message>
OCR-1/2: production native scanning and evidence integrity (#54)
* feat: add production native OCR evidence capture

* fix: satisfy native and database CI contracts

* docs: record OCR release gate evidence
</commit_message>
<xml_diff>
--- a/output/doc/senatla-ops-implementation-journey.docx
+++ b/output/doc/senatla-ops-implementation-journey.docx
@@ -208,15 +208,8 @@
             </w:tcMar>
           </w:tcPr>
           <w:p>
-            <w:pPr>
-              <w:spacing w:after="0"/>
-            </w:pPr>
-            <w:r>
-              <w:rPr>
-                <w:rFonts w:ascii="Calibri" w:hAnsi="Calibri"/>
-                <w:sz w:val="18"/>
-              </w:rPr>
-              <w:t>sankofa_xciv/authoritative-slices-0-2</w:t>
+            <w:r>
+              <w:t>sankofa_xciv/ocr-1-2-native-scanning</w:t>
             </w:r>
           </w:p>
         </w:tc>
@@ -6517,6 +6510,372 @@
     </w:p>
     <w:p>
       <w:pPr>
+        <w:pStyle w:val="Heading2"/>
+      </w:pPr>
+      <w:r>
+        <w:t>24 August 2026 - OCR-1 and OCR-2 production scanning bundle</w:t>
+      </w:r>
+    </w:p>
+    <w:tbl>
+      <w:tblPr>
+        <w:tblStyle w:val="TableGrid"/>
+        <w:tblW w:type="auto" w:w="0"/>
+        <w:tblLook w:firstColumn="1" w:firstRow="1" w:lastColumn="0" w:lastRow="0" w:noHBand="0" w:noVBand="1" w:val="04A0"/>
+      </w:tblPr>
+      <w:tblGrid>
+        <w:gridCol w:w="4680"/>
+        <w:gridCol w:w="4680"/>
+      </w:tblGrid>
+      <w:tr>
+        <w:tc>
+          <w:tcPr>
+            <w:tcW w:type="dxa" w:w="4680"/>
+          </w:tcPr>
+          <w:p>
+            <w:r>
+              <w:t>Field</w:t>
+            </w:r>
+          </w:p>
+        </w:tc>
+        <w:tc>
+          <w:tcPr>
+            <w:tcW w:type="dxa" w:w="4680"/>
+          </w:tcPr>
+          <w:p>
+            <w:r>
+              <w:t>Recorded implementation evidence</w:t>
+            </w:r>
+          </w:p>
+        </w:tc>
+      </w:tr>
+      <w:tr>
+        <w:tc>
+          <w:tcPr>
+            <w:tcW w:type="dxa" w:w="4680"/>
+          </w:tcPr>
+          <w:p>
+            <w:r>
+              <w:rPr>
+                <w:b/>
+              </w:rPr>
+              <w:t>Slice</w:t>
+            </w:r>
+          </w:p>
+        </w:tc>
+        <w:tc>
+          <w:tcPr>
+            <w:tcW w:type="dxa" w:w="4680"/>
+          </w:tcPr>
+          <w:p>
+            <w:r>
+              <w:t>OCR-1 stable scan contract and OCR-2 Android/iOS native adapters.</w:t>
+            </w:r>
+          </w:p>
+        </w:tc>
+      </w:tr>
+      <w:tr>
+        <w:tc>
+          <w:tcPr>
+            <w:tcW w:type="dxa" w:w="4680"/>
+          </w:tcPr>
+          <w:p>
+            <w:r>
+              <w:rPr>
+                <w:b/>
+              </w:rPr>
+              <w:t>Branch / PR</w:t>
+            </w:r>
+          </w:p>
+        </w:tc>
+        <w:tc>
+          <w:tcPr>
+            <w:tcW w:type="dxa" w:w="4680"/>
+          </w:tcPr>
+          <w:p>
+            <w:r>
+              <w:t>sankofa_xciv/ocr-1-2-native-scanning; PR #54 into dev.</w:t>
+            </w:r>
+          </w:p>
+        </w:tc>
+      </w:tr>
+      <w:tr>
+        <w:tc>
+          <w:tcPr>
+            <w:tcW w:type="dxa" w:w="4680"/>
+          </w:tcPr>
+          <w:p>
+            <w:r>
+              <w:rPr>
+                <w:b/>
+              </w:rPr>
+              <w:t>Outcome</w:t>
+            </w:r>
+          </w:p>
+        </w:tc>
+        <w:tc>
+          <w:tcPr>
+            <w:tcW w:type="dxa" w:w="4680"/>
+          </w:tcPr>
+          <w:p>
+            <w:r>
+              <w:t>Enhanced the existing asset-registration flow with native scanning, on-device OCR, evidence provenance, byte-integrity verification and explicit human review. Android uses ML Kit; iOS uses VisionKit and Vision.</w:t>
+            </w:r>
+          </w:p>
+        </w:tc>
+      </w:tr>
+      <w:tr>
+        <w:tc>
+          <w:tcPr>
+            <w:tcW w:type="dxa" w:w="4680"/>
+          </w:tcPr>
+          <w:p>
+            <w:r>
+              <w:rPr>
+                <w:b/>
+              </w:rPr>
+              <w:t>Decision</w:t>
+            </w:r>
+          </w:p>
+        </w:tc>
+        <w:tc>
+          <w:tcPr>
+            <w:tcW w:type="dxa" w:w="4680"/>
+          </w:tcPr>
+          <w:p>
+            <w:r>
+              <w:t>Use a strict TypeScript/native contract, private file:// JPEGs, UUID/size/dimension/SHA-256 validation, bounded OCR and native cleanup before Supabase upload.</w:t>
+            </w:r>
+          </w:p>
+        </w:tc>
+      </w:tr>
+      <w:tr>
+        <w:tc>
+          <w:tcPr>
+            <w:tcW w:type="dxa" w:w="4680"/>
+          </w:tcPr>
+          <w:p>
+            <w:r>
+              <w:rPr>
+                <w:b/>
+              </w:rPr>
+              <w:t>Alternative rejected</w:t>
+            </w:r>
+          </w:p>
+        </w:tc>
+        <w:tc>
+          <w:tcPr>
+            <w:tcW w:type="dxa" w:w="4680"/>
+          </w:tcPr>
+          <w:p>
+            <w:r>
+              <w:t>Base64 bridge payloads, shared files, cloud OCR by default, automatic application of OCR values and silent permission/cancellation fallback.</w:t>
+            </w:r>
+          </w:p>
+        </w:tc>
+      </w:tr>
+      <w:tr>
+        <w:tc>
+          <w:tcPr>
+            <w:tcW w:type="dxa" w:w="4680"/>
+          </w:tcPr>
+          <w:p>
+            <w:r>
+              <w:rPr>
+                <w:b/>
+              </w:rPr>
+              <w:t>Security and privacy</w:t>
+            </w:r>
+          </w:p>
+        </w:tc>
+        <w:tc>
+          <w:tcPr>
+            <w:tcW w:type="dxa" w:w="4680"/>
+          </w:tcPr>
+          <w:p>
+            <w:r>
+              <w:t>15 MiB and five-page native bounds; private/protected cache; no paths or raw OCR in activity logs; 8,000-character OCR cap; RLS/private Storage; human apply-and-verify.</w:t>
+            </w:r>
+          </w:p>
+        </w:tc>
+      </w:tr>
+      <w:tr>
+        <w:tc>
+          <w:tcPr>
+            <w:tcW w:type="dxa" w:w="4680"/>
+          </w:tcPr>
+          <w:p>
+            <w:r>
+              <w:rPr>
+                <w:b/>
+              </w:rPr>
+              <w:t>Three-pass critic loop</w:t>
+            </w:r>
+          </w:p>
+        </w:tc>
+        <w:tc>
+          <w:tcPr>
+            <w:tcW w:type="dxa" w:w="4680"/>
+          </w:tcPr>
+          <w:p>
+            <w:r>
+              <w:t>Pass 1 challenged contract and review semantics. Pass 2 challenged native lifecycle, cleanup, interruption and concurrency. Pass 3 reviewed every changed source file and supporting RLS/Storage controls.</w:t>
+            </w:r>
+          </w:p>
+        </w:tc>
+      </w:tr>
+      <w:tr>
+        <w:tc>
+          <w:tcPr>
+            <w:tcW w:type="dxa" w:w="4680"/>
+          </w:tcPr>
+          <w:p>
+            <w:r>
+              <w:rPr>
+                <w:b/>
+              </w:rPr>
+              <w:t>Improvements applied</w:t>
+            </w:r>
+          </w:p>
+        </w:tc>
+        <w:tc>
+          <w:tcPr>
+            <w:tcW w:type="dxa" w:w="4680"/>
+          </w:tcPr>
+          <w:p>
+            <w:r>
+              <w:t>Native stale-session startup sweeps, Android symlink rejection and complete scanner locking, whole-session malformed-result cleanup, two-phase evidence upload, immutable ready objects/provenance and checked rollback.</w:t>
+            </w:r>
+          </w:p>
+        </w:tc>
+      </w:tr>
+      <w:tr>
+        <w:tc>
+          <w:tcPr>
+            <w:tcW w:type="dxa" w:w="4680"/>
+          </w:tcPr>
+          <w:p>
+            <w:r>
+              <w:rPr>
+                <w:b/>
+              </w:rPr>
+              <w:t>Verification</w:t>
+            </w:r>
+          </w:p>
+        </w:tc>
+        <w:tc>
+          <w:tcPr>
+            <w:tcW w:type="dxa" w:w="4680"/>
+          </w:tcPr>
+          <w:p>
+            <w:r>
+              <w:t>Runtime-config, lint, typecheck, production build and 93/93 tests passed. PR #54 passed application, 208-test Supabase pgTAP, Android debug, iOS simulator and both Vercel preview checks.</w:t>
+            </w:r>
+          </w:p>
+        </w:tc>
+      </w:tr>
+      <w:tr>
+        <w:tc>
+          <w:tcPr>
+            <w:tcW w:type="dxa" w:w="4680"/>
+          </w:tcPr>
+          <w:p>
+            <w:r>
+              <w:rPr>
+                <w:b/>
+              </w:rPr>
+              <w:t>Visual and device evidence</w:t>
+            </w:r>
+          </w:p>
+        </w:tc>
+        <w:tc>
+          <w:tcPr>
+            <w:tcW w:type="dxa" w:w="4680"/>
+          </w:tcPr>
+          <w:p>
+            <w:r>
+              <w:t>Capture guidance and provenance/confidence render in the existing responsive workspace. Full regression remains after Slice 3; signed-device camera and process-interruption proof remains required.</w:t>
+            </w:r>
+          </w:p>
+        </w:tc>
+      </w:tr>
+      <w:tr>
+        <w:tc>
+          <w:tcPr>
+            <w:tcW w:type="dxa" w:w="4680"/>
+          </w:tcPr>
+          <w:p>
+            <w:r>
+              <w:rPr>
+                <w:b/>
+              </w:rPr>
+              <w:t>Result</w:t>
+            </w:r>
+          </w:p>
+        </w:tc>
+        <w:tc>
+          <w:tcPr>
+            <w:tcW w:type="dxa" w:w="4680"/>
+          </w:tcPr>
+          <w:p>
+            <w:r>
+              <w:t>Implementation, remote migrations, native CI, Supabase pgTAP and Vercel preview gates pass. Merge to dev, post-merge Vercel confirmation and physical-device UAT remain.</w:t>
+            </w:r>
+          </w:p>
+        </w:tc>
+      </w:tr>
+      <w:tr>
+        <w:tc>
+          <w:tcPr>
+            <w:tcW w:type="dxa" w:w="4680"/>
+          </w:tcPr>
+          <w:p>
+            <w:r>
+              <w:rPr>
+                <w:b/>
+              </w:rPr>
+              <w:t>Known limitation</w:t>
+            </w:r>
+          </w:p>
+        </w:tc>
+        <w:tc>
+          <w:tcPr>
+            <w:tcW w:type="dxa" w:w="4680"/>
+          </w:tcPr>
+          <w:p>
+            <w:r>
+              <w:t>The official client recomputes SHA-256 immediately before immutable upload; capture source is client-reported and is not cryptographic device attestation.</w:t>
+            </w:r>
+          </w:p>
+        </w:tc>
+      </w:tr>
+      <w:tr>
+        <w:tc>
+          <w:tcPr>
+            <w:tcW w:type="dxa" w:w="4680"/>
+          </w:tcPr>
+          <w:p>
+            <w:r>
+              <w:rPr>
+                <w:b/>
+              </w:rPr>
+              <w:t>Next action</w:t>
+            </w:r>
+          </w:p>
+        </w:tc>
+        <w:tc>
+          <w:tcPr>
+            <w:tcW w:type="dxa" w:w="4680"/>
+          </w:tcPr>
+          <w:p>
+            <w:r>
+              <w:t>Merge green PR #54 to dev, confirm post-merge Vercel, then run signed-device UAT across the five-role matrix.</w:t>
+            </w:r>
+          </w:p>
+        </w:tc>
+      </w:tr>
+    </w:tbl>
+    <w:p>
+      <w:pPr>
         <w:pStyle w:val="Heading1"/>
       </w:pPr>
       <w:r>
@@ -8059,6 +8418,162 @@
                 <w:rFonts w:ascii="Calibri" w:hAnsi="Calibri"/>
                 <w:sz w:val="18"/>
               </w:rPr>
+              <w:t>Accepted</w:t>
+            </w:r>
+          </w:p>
+        </w:tc>
+      </w:tr>
+      <w:tr>
+        <w:tc>
+          <w:tcPr>
+            <w:tcW w:type="dxa" w:w="1872"/>
+          </w:tcPr>
+          <w:p>
+            <w:r>
+              <w:t>D-012</w:t>
+            </w:r>
+          </w:p>
+        </w:tc>
+        <w:tc>
+          <w:tcPr>
+            <w:tcW w:type="dxa" w:w="1872"/>
+          </w:tcPr>
+          <w:p>
+            <w:r>
+              <w:t>24 Aug 2026</w:t>
+            </w:r>
+          </w:p>
+        </w:tc>
+        <w:tc>
+          <w:tcPr>
+            <w:tcW w:type="dxa" w:w="1872"/>
+          </w:tcPr>
+          <w:p>
+            <w:r>
+              <w:t>Native on-device scanning behind a strict contract</w:t>
+            </w:r>
+          </w:p>
+        </w:tc>
+        <w:tc>
+          <w:tcPr>
+            <w:tcW w:type="dxa" w:w="1872"/>
+          </w:tcPr>
+          <w:p>
+            <w:r>
+              <w:t>Preserve privacy, offline capability, bounded resources and lifecycle ownership</w:t>
+            </w:r>
+          </w:p>
+        </w:tc>
+        <w:tc>
+          <w:tcPr>
+            <w:tcW w:type="dxa" w:w="1872"/>
+          </w:tcPr>
+          <w:p>
+            <w:r>
+              <w:t>Accepted</w:t>
+            </w:r>
+          </w:p>
+        </w:tc>
+      </w:tr>
+      <w:tr>
+        <w:tc>
+          <w:tcPr>
+            <w:tcW w:type="dxa" w:w="1872"/>
+          </w:tcPr>
+          <w:p>
+            <w:r>
+              <w:t>D-013</w:t>
+            </w:r>
+          </w:p>
+        </w:tc>
+        <w:tc>
+          <w:tcPr>
+            <w:tcW w:type="dxa" w:w="1872"/>
+          </w:tcPr>
+          <w:p>
+            <w:r>
+              <w:t>24 Aug 2026</w:t>
+            </w:r>
+          </w:p>
+        </w:tc>
+        <w:tc>
+          <w:tcPr>
+            <w:tcW w:type="dxa" w:w="1872"/>
+          </w:tcPr>
+          <w:p>
+            <w:r>
+              <w:t>OCR remains reviewable evidence</w:t>
+            </w:r>
+          </w:p>
+        </w:tc>
+        <w:tc>
+          <w:tcPr>
+            <w:tcW w:type="dxa" w:w="1872"/>
+          </w:tcPr>
+          <w:p>
+            <w:r>
+              <w:t>Recognition must not silently change authoritative asset data</w:t>
+            </w:r>
+          </w:p>
+        </w:tc>
+        <w:tc>
+          <w:tcPr>
+            <w:tcW w:type="dxa" w:w="1872"/>
+          </w:tcPr>
+          <w:p>
+            <w:r>
+              <w:t>Accepted</w:t>
+            </w:r>
+          </w:p>
+        </w:tc>
+      </w:tr>
+      <w:tr>
+        <w:tc>
+          <w:tcPr>
+            <w:tcW w:type="dxa" w:w="1872"/>
+          </w:tcPr>
+          <w:p>
+            <w:r>
+              <w:t>D-014</w:t>
+            </w:r>
+          </w:p>
+        </w:tc>
+        <w:tc>
+          <w:tcPr>
+            <w:tcW w:type="dxa" w:w="1872"/>
+          </w:tcPr>
+          <w:p>
+            <w:r>
+              <w:t>24 Aug 2026</w:t>
+            </w:r>
+          </w:p>
+        </w:tc>
+        <w:tc>
+          <w:tcPr>
+            <w:tcW w:type="dxa" w:w="1872"/>
+          </w:tcPr>
+          <w:p>
+            <w:r>
+              <w:t>Two-phase immutable evidence persistence</w:t>
+            </w:r>
+          </w:p>
+        </w:tc>
+        <w:tc>
+          <w:tcPr>
+            <w:tcW w:type="dxa" w:w="1872"/>
+          </w:tcPr>
+          <w:p>
+            <w:r>
+              <w:t>Prevent orphaned private objects and hash/provenance drift</w:t>
+            </w:r>
+          </w:p>
+        </w:tc>
+        <w:tc>
+          <w:tcPr>
+            <w:tcW w:type="dxa" w:w="1872"/>
+          </w:tcPr>
+          <w:p>
+            <w:r>
               <w:t>Accepted</w:t>
             </w:r>
           </w:p>
@@ -9381,6 +9896,110 @@
           </w:p>
         </w:tc>
       </w:tr>
+      <w:tr>
+        <w:tc>
+          <w:tcPr>
+            <w:tcW w:type="dxa" w:w="1872"/>
+          </w:tcPr>
+          <w:p>
+            <w:r>
+              <w:t>E-009</w:t>
+            </w:r>
+          </w:p>
+        </w:tc>
+        <w:tc>
+          <w:tcPr>
+            <w:tcW w:type="dxa" w:w="1872"/>
+          </w:tcPr>
+          <w:p>
+            <w:r>
+              <w:t>OCR-1</w:t>
+            </w:r>
+          </w:p>
+        </w:tc>
+        <w:tc>
+          <w:tcPr>
+            <w:tcW w:type="dxa" w:w="1872"/>
+          </w:tcPr>
+          <w:p>
+            <w:r>
+              <w:t>Contract, integrity, cleanup, fallback and human-review proof</w:t>
+            </w:r>
+          </w:p>
+        </w:tc>
+        <w:tc>
+          <w:tcPr>
+            <w:tcW w:type="dxa" w:w="1872"/>
+          </w:tcPr>
+          <w:p>
+            <w:r>
+              <w:t>Verified locally</w:t>
+            </w:r>
+          </w:p>
+        </w:tc>
+        <w:tc>
+          <w:tcPr>
+            <w:tcW w:type="dxa" w:w="1872"/>
+          </w:tcPr>
+          <w:p>
+            <w:r>
+              <w:t>Full gate passed with 93/93 browser tests; security review covered all changed source files</w:t>
+            </w:r>
+          </w:p>
+        </w:tc>
+      </w:tr>
+      <w:tr>
+        <w:tc>
+          <w:tcPr>
+            <w:tcW w:type="dxa" w:w="1872"/>
+          </w:tcPr>
+          <w:p>
+            <w:r>
+              <w:t>E-010</w:t>
+            </w:r>
+          </w:p>
+        </w:tc>
+        <w:tc>
+          <w:tcPr>
+            <w:tcW w:type="dxa" w:w="1872"/>
+          </w:tcPr>
+          <w:p>
+            <w:r>
+              <w:t>OCR-2</w:t>
+            </w:r>
+          </w:p>
+        </w:tc>
+        <w:tc>
+          <w:tcPr>
+            <w:tcW w:type="dxa" w:w="1872"/>
+          </w:tcPr>
+          <w:p>
+            <w:r>
+              <w:t>Android ML Kit and iOS VisionKit/Vision compile and device proof</w:t>
+            </w:r>
+          </w:p>
+        </w:tc>
+        <w:tc>
+          <w:tcPr>
+            <w:tcW w:type="dxa" w:w="1872"/>
+          </w:tcPr>
+          <w:p>
+            <w:r>
+              <w:t>Partial</w:t>
+            </w:r>
+          </w:p>
+        </w:tc>
+        <w:tc>
+          <w:tcPr>
+            <w:tcW w:type="dxa" w:w="1872"/>
+          </w:tcPr>
+          <w:p>
+            <w:r>
+              <w:t>Native source/lifecycle review passed; remote CI and signed-device UAT pending</w:t>
+            </w:r>
+          </w:p>
+        </w:tc>
+      </w:tr>
     </w:tbl>
     <w:p>
       <w:pPr>
@@ -10226,6 +10845,132 @@
                 <w:sz w:val="18"/>
               </w:rPr>
               <w:t>Controlled</w:t>
+            </w:r>
+          </w:p>
+        </w:tc>
+      </w:tr>
+      <w:tr>
+        <w:tc>
+          <w:tcPr>
+            <w:tcW w:type="dxa" w:w="2340"/>
+          </w:tcPr>
+          <w:p>
+            <w:r>
+              <w:t>Interrupted native scan leaves cache residue</w:t>
+            </w:r>
+          </w:p>
+        </w:tc>
+        <w:tc>
+          <w:tcPr>
+            <w:tcW w:type="dxa" w:w="2340"/>
+          </w:tcPr>
+          <w:p>
+            <w:r>
+              <w:t>Sensitive evidence remains on a device longer than intended</w:t>
+            </w:r>
+          </w:p>
+        </w:tc>
+        <w:tc>
+          <w:tcPr>
+            <w:tcW w:type="dxa" w:w="2340"/>
+          </w:tcPr>
+          <w:p>
+            <w:r>
+              <w:t>Private/protected cache, safe startup sweep, no backup and no path logging</w:t>
+            </w:r>
+          </w:p>
+        </w:tc>
+        <w:tc>
+          <w:tcPr>
+            <w:tcW w:type="dxa" w:w="2340"/>
+          </w:tcPr>
+          <w:p>
+            <w:r>
+              <w:t>Controlled; device kill-test pending</w:t>
+            </w:r>
+          </w:p>
+        </w:tc>
+      </w:tr>
+      <w:tr>
+        <w:tc>
+          <w:tcPr>
+            <w:tcW w:type="dxa" w:w="2340"/>
+          </w:tcPr>
+          <w:p>
+            <w:r>
+              <w:t>Evidence upload becomes orphaned or mutable</w:t>
+            </w:r>
+          </w:p>
+        </w:tc>
+        <w:tc>
+          <w:tcPr>
+            <w:tcW w:type="dxa" w:w="2340"/>
+          </w:tcPr>
+          <w:p>
+            <w:r>
+              <w:t>Private bytes and audit digest diverge</w:t>
+            </w:r>
+          </w:p>
+        </w:tc>
+        <w:tc>
+          <w:tcPr>
+            <w:tcW w:type="dxa" w:w="2340"/>
+          </w:tcPr>
+          <w:p>
+            <w:r>
+              <w:t>Pending row before upload, checked rollback, immutable ready objects and provenance</w:t>
+            </w:r>
+          </w:p>
+        </w:tc>
+        <w:tc>
+          <w:tcPr>
+            <w:tcW w:type="dxa" w:w="2340"/>
+          </w:tcPr>
+          <w:p>
+            <w:r>
+              <w:t>Controlled in code; remote pgTAP pending</w:t>
+            </w:r>
+          </w:p>
+        </w:tc>
+      </w:tr>
+      <w:tr>
+        <w:tc>
+          <w:tcPr>
+            <w:tcW w:type="dxa" w:w="2340"/>
+          </w:tcPr>
+          <w:p>
+            <w:r>
+              <w:t>OCR suggestion is treated as verified truth</w:t>
+            </w:r>
+          </w:p>
+        </w:tc>
+        <w:tc>
+          <w:tcPr>
+            <w:tcW w:type="dxa" w:w="2340"/>
+          </w:tcPr>
+          <w:p>
+            <w:r>
+              <w:t>Incorrect identifiers or dates enter operations</w:t>
+            </w:r>
+          </w:p>
+        </w:tc>
+        <w:tc>
+          <w:tcPr>
+            <w:tcW w:type="dxa" w:w="2340"/>
+          </w:tcPr>
+          <w:p>
+            <w:r>
+              <w:t>Apply-and-verify gate, confidence/provenance display and audit metadata</w:t>
+            </w:r>
+          </w:p>
+        </w:tc>
+        <w:tc>
+          <w:tcPr>
+            <w:tcW w:type="dxa" w:w="2340"/>
+          </w:tcPr>
+          <w:p>
+            <w:r>
+              <w:t>Controlled; UAT matrix pending</w:t>
             </w:r>
           </w:p>
         </w:tc>

</xml_diff>

<commit_message>
docs: close OCR deployment journey
</commit_message>
<xml_diff>
--- a/output/doc/senatla-ops-implementation-journey.docx
+++ b/output/doc/senatla-ops-implementation-journey.docx
@@ -6593,7 +6593,7 @@
           </w:tcPr>
           <w:p>
             <w:r>
-              <w:t>sankofa_xciv/ocr-1-2-native-scanning; PR #54 into dev.</w:t>
+              <w:t>sankofa_xciv/ocr-1-2-native-scanning; PR #54 merged to dev as 05df90a.</w:t>
             </w:r>
           </w:p>
         </w:tc>
@@ -6818,7 +6818,7 @@
           </w:tcPr>
           <w:p>
             <w:r>
-              <w:t>Implementation, remote migrations, native CI, Supabase pgTAP and Vercel preview gates pass. Merge to dev, post-merge Vercel confirmation and physical-device UAT remain.</w:t>
+              <w:t>Implementation, remote migrations, native CI and Supabase pgTAP pass. PR #54 merged as 05df90a; both post-merge Vercel deployments passed. Signed-device UAT remains.</w:t>
             </w:r>
           </w:p>
         </w:tc>
@@ -6868,7 +6868,7 @@
           </w:tcPr>
           <w:p>
             <w:r>
-              <w:t>Merge green PR #54 to dev, confirm post-merge Vercel, then run signed-device UAT across the five-role matrix.</w:t>
+              <w:t>Run signed-device UAT across the five-role matrix: permissions, capture, cancellation, interruption, OCR review, rollback and role access.</w:t>
             </w:r>
           </w:p>
         </w:tc>

</xml_diff>

<commit_message>
docs: close OCR deployment journey (#55)
</commit_message>
<xml_diff>
--- a/output/doc/senatla-ops-implementation-journey.docx
+++ b/output/doc/senatla-ops-implementation-journey.docx
@@ -6593,7 +6593,7 @@
           </w:tcPr>
           <w:p>
             <w:r>
-              <w:t>sankofa_xciv/ocr-1-2-native-scanning; PR #54 into dev.</w:t>
+              <w:t>sankofa_xciv/ocr-1-2-native-scanning; PR #54 merged to dev as 05df90a.</w:t>
             </w:r>
           </w:p>
         </w:tc>
@@ -6818,7 +6818,7 @@
           </w:tcPr>
           <w:p>
             <w:r>
-              <w:t>Implementation, remote migrations, native CI, Supabase pgTAP and Vercel preview gates pass. Merge to dev, post-merge Vercel confirmation and physical-device UAT remain.</w:t>
+              <w:t>Implementation, remote migrations, native CI and Supabase pgTAP pass. PR #54 merged as 05df90a; both post-merge Vercel deployments passed. Signed-device UAT remains.</w:t>
             </w:r>
           </w:p>
         </w:tc>
@@ -6868,7 +6868,7 @@
           </w:tcPr>
           <w:p>
             <w:r>
-              <w:t>Merge green PR #54 to dev, confirm post-merge Vercel, then run signed-device UAT across the five-role matrix.</w:t>
+              <w:t>Run signed-device UAT across the five-role matrix: permissions, capture, cancellation, interruption, OCR review, rollback and role access.</w:t>
             </w:r>
           </w:p>
         </w:tc>

</xml_diff>

<commit_message>
test: add OCR signed-device UAT gate
</commit_message>
<xml_diff>
--- a/output/doc/senatla-ops-implementation-journey.docx
+++ b/output/doc/senatla-ops-implementation-journey.docx
@@ -208,8 +208,15 @@
             </w:tcMar>
           </w:tcPr>
           <w:p>
-            <w:r>
-              <w:t>sankofa_xciv/ocr-1-2-native-scanning</w:t>
+            <w:pPr>
+              <w:spacing w:after="0"/>
+            </w:pPr>
+            <w:r>
+              <w:rPr>
+                <w:rFonts w:ascii="Calibri" w:hAnsi="Calibri"/>
+                <w:sz w:val="18"/>
+              </w:rPr>
+              <w:t>sankofa_xciv/ocr-3-device-uat-gate</w:t>
             </w:r>
           </w:p>
         </w:tc>
@@ -6519,44 +6526,92 @@
     <w:tbl>
       <w:tblPr>
         <w:tblStyle w:val="TableGrid"/>
-        <w:tblW w:type="auto" w:w="0"/>
+        <w:tblW w:type="dxa" w:w="9360"/>
+        <w:tblLayout w:type="fixed"/>
         <w:tblLook w:firstColumn="1" w:firstRow="1" w:lastColumn="0" w:lastRow="0" w:noHBand="0" w:noVBand="1" w:val="04A0"/>
+        <w:jc w:val="left"/>
+        <w:tblInd w:w="120" w:type="dxa"/>
       </w:tblPr>
       <w:tblGrid>
         <w:gridCol w:w="4680"/>
         <w:gridCol w:w="4680"/>
       </w:tblGrid>
       <w:tr>
-        <w:tc>
-          <w:tcPr>
-            <w:tcW w:type="dxa" w:w="4680"/>
-          </w:tcPr>
-          <w:p>
-            <w:r>
+        <w:trPr>
+          <w:tblHeader w:val="true"/>
+        </w:trPr>
+        <w:tc>
+          <w:tcPr>
+            <w:tcW w:type="dxa" w:w="2232"/>
+            <w:vAlign w:val="center"/>
+            <w:tcMar>
+              <w:top w:w="80" w:type="dxa"/>
+              <w:start w:w="120" w:type="dxa"/>
+              <w:bottom w:w="80" w:type="dxa"/>
+              <w:end w:w="120" w:type="dxa"/>
+            </w:tcMar>
+            <w:shd w:fill="17365D"/>
+          </w:tcPr>
+          <w:p>
+            <w:r>
+              <w:rPr>
+                <w:rFonts w:ascii="Calibri" w:hAnsi="Calibri"/>
+                <w:b/>
+                <w:color w:val="FFFFFF"/>
+                <w:sz w:val="19"/>
+              </w:rPr>
               <w:t>Field</w:t>
             </w:r>
           </w:p>
         </w:tc>
         <w:tc>
           <w:tcPr>
-            <w:tcW w:type="dxa" w:w="4680"/>
-          </w:tcPr>
-          <w:p>
-            <w:r>
+            <w:tcW w:type="dxa" w:w="7128"/>
+            <w:vAlign w:val="center"/>
+            <w:tcMar>
+              <w:top w:w="80" w:type="dxa"/>
+              <w:start w:w="120" w:type="dxa"/>
+              <w:bottom w:w="80" w:type="dxa"/>
+              <w:end w:w="120" w:type="dxa"/>
+            </w:tcMar>
+            <w:shd w:fill="17365D"/>
+          </w:tcPr>
+          <w:p>
+            <w:r>
+              <w:rPr>
+                <w:rFonts w:ascii="Calibri" w:hAnsi="Calibri"/>
+                <w:b/>
+                <w:color w:val="FFFFFF"/>
+                <w:sz w:val="19"/>
+              </w:rPr>
               <w:t>Recorded implementation evidence</w:t>
             </w:r>
           </w:p>
         </w:tc>
       </w:tr>
       <w:tr>
-        <w:tc>
-          <w:tcPr>
-            <w:tcW w:type="dxa" w:w="4680"/>
-          </w:tcPr>
-          <w:p>
-            <w:r>
-              <w:rPr>
-                <w:b/>
+        <w:trPr>
+          <w:cantSplit/>
+        </w:trPr>
+        <w:tc>
+          <w:tcPr>
+            <w:tcW w:type="dxa" w:w="2232"/>
+            <w:vAlign w:val="center"/>
+            <w:tcMar>
+              <w:top w:w="80" w:type="dxa"/>
+              <w:start w:w="120" w:type="dxa"/>
+              <w:bottom w:w="80" w:type="dxa"/>
+              <w:end w:w="120" w:type="dxa"/>
+            </w:tcMar>
+          </w:tcPr>
+          <w:p>
+            <w:pPr>
+              <w:spacing w:after="0"/>
+            </w:pPr>
+            <w:r>
+              <w:rPr>
+                <w:rFonts w:ascii="Calibri" w:hAnsi="Calibri"/>
+                <w:sz w:val="18"/>
               </w:rPr>
               <w:t>Slice</w:t>
             </w:r>
@@ -6564,24 +6619,53 @@
         </w:tc>
         <w:tc>
           <w:tcPr>
-            <w:tcW w:type="dxa" w:w="4680"/>
-          </w:tcPr>
-          <w:p>
-            <w:r>
-              <w:t>OCR-1 stable scan contract and OCR-2 Android/iOS native adapters.</w:t>
+            <w:tcW w:type="dxa" w:w="7128"/>
+            <w:vAlign w:val="center"/>
+            <w:tcMar>
+              <w:top w:w="80" w:type="dxa"/>
+              <w:start w:w="120" w:type="dxa"/>
+              <w:bottom w:w="80" w:type="dxa"/>
+              <w:end w:w="120" w:type="dxa"/>
+            </w:tcMar>
+          </w:tcPr>
+          <w:p>
+            <w:pPr>
+              <w:spacing w:after="0"/>
+            </w:pPr>
+            <w:r>
+              <w:rPr>
+                <w:rFonts w:ascii="Calibri" w:hAnsi="Calibri"/>
+                <w:sz w:val="18"/>
+              </w:rPr>
+              <w:t>OCR-1 stable scan contract and OCR-2 Android/iOS native adapters</w:t>
             </w:r>
           </w:p>
         </w:tc>
       </w:tr>
       <w:tr>
-        <w:tc>
-          <w:tcPr>
-            <w:tcW w:type="dxa" w:w="4680"/>
-          </w:tcPr>
-          <w:p>
-            <w:r>
-              <w:rPr>
-                <w:b/>
+        <w:trPr>
+          <w:cantSplit/>
+        </w:trPr>
+        <w:tc>
+          <w:tcPr>
+            <w:tcW w:type="dxa" w:w="2232"/>
+            <w:shd w:fill="F2F4F7"/>
+            <w:vAlign w:val="center"/>
+            <w:tcMar>
+              <w:top w:w="80" w:type="dxa"/>
+              <w:start w:w="120" w:type="dxa"/>
+              <w:bottom w:w="80" w:type="dxa"/>
+              <w:end w:w="120" w:type="dxa"/>
+            </w:tcMar>
+          </w:tcPr>
+          <w:p>
+            <w:pPr>
+              <w:spacing w:after="0"/>
+            </w:pPr>
+            <w:r>
+              <w:rPr>
+                <w:rFonts w:ascii="Calibri" w:hAnsi="Calibri"/>
+                <w:sz w:val="18"/>
               </w:rPr>
               <w:t>Branch / PR</w:t>
             </w:r>
@@ -6589,24 +6673,53 @@
         </w:tc>
         <w:tc>
           <w:tcPr>
-            <w:tcW w:type="dxa" w:w="4680"/>
-          </w:tcPr>
-          <w:p>
-            <w:r>
-              <w:t>sankofa_xciv/ocr-1-2-native-scanning; PR #54 merged to dev as 05df90a.</w:t>
+            <w:tcW w:type="dxa" w:w="7128"/>
+            <w:shd w:fill="F2F4F7"/>
+            <w:vAlign w:val="center"/>
+            <w:tcMar>
+              <w:top w:w="80" w:type="dxa"/>
+              <w:start w:w="120" w:type="dxa"/>
+              <w:bottom w:w="80" w:type="dxa"/>
+              <w:end w:w="120" w:type="dxa"/>
+            </w:tcMar>
+          </w:tcPr>
+          <w:p>
+            <w:pPr>
+              <w:spacing w:after="0"/>
+            </w:pPr>
+            <w:r>
+              <w:rPr>
+                <w:rFonts w:ascii="Calibri" w:hAnsi="Calibri"/>
+                <w:sz w:val="18"/>
+              </w:rPr>
+              <w:t>sankofa_xciv/ocr-1-2-native-scanning; PR #54 merged into dev as 05df90a</w:t>
             </w:r>
           </w:p>
         </w:tc>
       </w:tr>
       <w:tr>
-        <w:tc>
-          <w:tcPr>
-            <w:tcW w:type="dxa" w:w="4680"/>
-          </w:tcPr>
-          <w:p>
-            <w:r>
-              <w:rPr>
-                <w:b/>
+        <w:trPr>
+          <w:cantSplit/>
+        </w:trPr>
+        <w:tc>
+          <w:tcPr>
+            <w:tcW w:type="dxa" w:w="2232"/>
+            <w:vAlign w:val="center"/>
+            <w:tcMar>
+              <w:top w:w="80" w:type="dxa"/>
+              <w:start w:w="120" w:type="dxa"/>
+              <w:bottom w:w="80" w:type="dxa"/>
+              <w:end w:w="120" w:type="dxa"/>
+            </w:tcMar>
+          </w:tcPr>
+          <w:p>
+            <w:pPr>
+              <w:spacing w:after="0"/>
+            </w:pPr>
+            <w:r>
+              <w:rPr>
+                <w:rFonts w:ascii="Calibri" w:hAnsi="Calibri"/>
+                <w:sz w:val="18"/>
               </w:rPr>
               <w:t>Outcome</w:t>
             </w:r>
@@ -6614,24 +6727,53 @@
         </w:tc>
         <w:tc>
           <w:tcPr>
-            <w:tcW w:type="dxa" w:w="4680"/>
-          </w:tcPr>
-          <w:p>
-            <w:r>
-              <w:t>Enhanced the existing asset-registration flow with native scanning, on-device OCR, evidence provenance, byte-integrity verification and explicit human review. Android uses ML Kit; iOS uses VisionKit and Vision.</w:t>
+            <w:tcW w:type="dxa" w:w="7128"/>
+            <w:vAlign w:val="center"/>
+            <w:tcMar>
+              <w:top w:w="80" w:type="dxa"/>
+              <w:start w:w="120" w:type="dxa"/>
+              <w:bottom w:w="80" w:type="dxa"/>
+              <w:end w:w="120" w:type="dxa"/>
+            </w:tcMar>
+          </w:tcPr>
+          <w:p>
+            <w:pPr>
+              <w:spacing w:after="0"/>
+            </w:pPr>
+            <w:r>
+              <w:rPr>
+                <w:rFonts w:ascii="Calibri" w:hAnsi="Calibri"/>
+                <w:sz w:val="18"/>
+              </w:rPr>
+              <w:t>Existing asset registration enhanced with native scanning, on-device OCR, evidence provenance, byte-integrity verification, and explicit human review</w:t>
             </w:r>
           </w:p>
         </w:tc>
       </w:tr>
       <w:tr>
-        <w:tc>
-          <w:tcPr>
-            <w:tcW w:type="dxa" w:w="4680"/>
-          </w:tcPr>
-          <w:p>
-            <w:r>
-              <w:rPr>
-                <w:b/>
+        <w:trPr>
+          <w:cantSplit/>
+        </w:trPr>
+        <w:tc>
+          <w:tcPr>
+            <w:tcW w:type="dxa" w:w="2232"/>
+            <w:shd w:fill="F2F4F7"/>
+            <w:vAlign w:val="center"/>
+            <w:tcMar>
+              <w:top w:w="80" w:type="dxa"/>
+              <w:start w:w="120" w:type="dxa"/>
+              <w:bottom w:w="80" w:type="dxa"/>
+              <w:end w:w="120" w:type="dxa"/>
+            </w:tcMar>
+          </w:tcPr>
+          <w:p>
+            <w:pPr>
+              <w:spacing w:after="0"/>
+            </w:pPr>
+            <w:r>
+              <w:rPr>
+                <w:rFonts w:ascii="Calibri" w:hAnsi="Calibri"/>
+                <w:sz w:val="18"/>
               </w:rPr>
               <w:t>Decision</w:t>
             </w:r>
@@ -6639,224 +6781,1213 @@
         </w:tc>
         <w:tc>
           <w:tcPr>
-            <w:tcW w:type="dxa" w:w="4680"/>
-          </w:tcPr>
-          <w:p>
-            <w:r>
-              <w:t>Use a strict TypeScript/native contract, private file:// JPEGs, UUID/size/dimension/SHA-256 validation, bounded OCR and native cleanup before Supabase upload.</w:t>
+            <w:tcW w:type="dxa" w:w="7128"/>
+            <w:shd w:fill="F2F4F7"/>
+            <w:vAlign w:val="center"/>
+            <w:tcMar>
+              <w:top w:w="80" w:type="dxa"/>
+              <w:start w:w="120" w:type="dxa"/>
+              <w:bottom w:w="80" w:type="dxa"/>
+              <w:end w:w="120" w:type="dxa"/>
+            </w:tcMar>
+          </w:tcPr>
+          <w:p>
+            <w:pPr>
+              <w:spacing w:after="0"/>
+            </w:pPr>
+            <w:r>
+              <w:rPr>
+                <w:rFonts w:ascii="Calibri" w:hAnsi="Calibri"/>
+                <w:sz w:val="18"/>
+              </w:rPr>
+              <w:t>Use a strict TypeScript/native contract; private JPEG artifacts only; validate dimensions, size, UUID and SHA-256; delete native artifacts after verified JavaScript ownership</w:t>
             </w:r>
           </w:p>
         </w:tc>
       </w:tr>
       <w:tr>
-        <w:tc>
-          <w:tcPr>
-            <w:tcW w:type="dxa" w:w="4680"/>
-          </w:tcPr>
-          <w:p>
-            <w:r>
-              <w:rPr>
-                <w:b/>
-              </w:rPr>
-              <w:t>Alternative rejected</w:t>
-            </w:r>
-          </w:p>
-        </w:tc>
-        <w:tc>
-          <w:tcPr>
-            <w:tcW w:type="dxa" w:w="4680"/>
-          </w:tcPr>
-          <w:p>
-            <w:r>
-              <w:t>Base64 bridge payloads, shared files, cloud OCR by default, automatic application of OCR values and silent permission/cancellation fallback.</w:t>
+        <w:trPr>
+          <w:cantSplit/>
+        </w:trPr>
+        <w:tc>
+          <w:tcPr>
+            <w:tcW w:type="dxa" w:w="2232"/>
+            <w:vAlign w:val="center"/>
+            <w:tcMar>
+              <w:top w:w="80" w:type="dxa"/>
+              <w:start w:w="120" w:type="dxa"/>
+              <w:bottom w:w="80" w:type="dxa"/>
+              <w:end w:w="120" w:type="dxa"/>
+            </w:tcMar>
+          </w:tcPr>
+          <w:p>
+            <w:pPr>
+              <w:spacing w:after="0"/>
+            </w:pPr>
+            <w:r>
+              <w:rPr>
+                <w:rFonts w:ascii="Calibri" w:hAnsi="Calibri"/>
+                <w:sz w:val="18"/>
+              </w:rPr>
+              <w:t>Rejected alternative</w:t>
+            </w:r>
+          </w:p>
+        </w:tc>
+        <w:tc>
+          <w:tcPr>
+            <w:tcW w:type="dxa" w:w="7128"/>
+            <w:vAlign w:val="center"/>
+            <w:tcMar>
+              <w:top w:w="80" w:type="dxa"/>
+              <w:start w:w="120" w:type="dxa"/>
+              <w:bottom w:w="80" w:type="dxa"/>
+              <w:end w:w="120" w:type="dxa"/>
+            </w:tcMar>
+          </w:tcPr>
+          <w:p>
+            <w:pPr>
+              <w:spacing w:after="0"/>
+            </w:pPr>
+            <w:r>
+              <w:rPr>
+                <w:rFonts w:ascii="Calibri" w:hAnsi="Calibri"/>
+                <w:sz w:val="18"/>
+              </w:rPr>
+              <w:t>Base64 bridge payloads, public native files, default cloud OCR, automatic field application, and silent fallback after denial/cancellation</w:t>
             </w:r>
           </w:p>
         </w:tc>
       </w:tr>
       <w:tr>
-        <w:tc>
-          <w:tcPr>
-            <w:tcW w:type="dxa" w:w="4680"/>
-          </w:tcPr>
-          <w:p>
-            <w:r>
-              <w:rPr>
-                <w:b/>
-              </w:rPr>
-              <w:t>Security and privacy</w:t>
-            </w:r>
-          </w:p>
-        </w:tc>
-        <w:tc>
-          <w:tcPr>
-            <w:tcW w:type="dxa" w:w="4680"/>
-          </w:tcPr>
-          <w:p>
-            <w:r>
-              <w:t>15 MiB and five-page native bounds; private/protected cache; no paths or raw OCR in activity logs; 8,000-character OCR cap; RLS/private Storage; human apply-and-verify.</w:t>
+        <w:trPr>
+          <w:cantSplit/>
+        </w:trPr>
+        <w:tc>
+          <w:tcPr>
+            <w:tcW w:type="dxa" w:w="2232"/>
+            <w:shd w:fill="F2F4F7"/>
+            <w:vAlign w:val="center"/>
+            <w:tcMar>
+              <w:top w:w="80" w:type="dxa"/>
+              <w:start w:w="120" w:type="dxa"/>
+              <w:bottom w:w="80" w:type="dxa"/>
+              <w:end w:w="120" w:type="dxa"/>
+            </w:tcMar>
+          </w:tcPr>
+          <w:p>
+            <w:pPr>
+              <w:spacing w:after="0"/>
+            </w:pPr>
+            <w:r>
+              <w:rPr>
+                <w:rFonts w:ascii="Calibri" w:hAnsi="Calibri"/>
+                <w:sz w:val="18"/>
+              </w:rPr>
+              <w:t>Security</w:t>
+            </w:r>
+          </w:p>
+        </w:tc>
+        <w:tc>
+          <w:tcPr>
+            <w:tcW w:type="dxa" w:w="7128"/>
+            <w:shd w:fill="F2F4F7"/>
+            <w:vAlign w:val="center"/>
+            <w:tcMar>
+              <w:top w:w="80" w:type="dxa"/>
+              <w:start w:w="120" w:type="dxa"/>
+              <w:bottom w:w="80" w:type="dxa"/>
+              <w:end w:w="120" w:type="dxa"/>
+            </w:tcMar>
+          </w:tcPr>
+          <w:p>
+            <w:pPr>
+              <w:spacing w:after="0"/>
+            </w:pPr>
+            <w:r>
+              <w:rPr>
+                <w:rFonts w:ascii="Calibri" w:hAnsi="Calibri"/>
+                <w:sz w:val="18"/>
+              </w:rPr>
+              <w:t>Bounded evidence and OCR text; no native paths or raw OCR in logs; private Storage/RLS authoritative; human apply-and-verify required</w:t>
             </w:r>
           </w:p>
         </w:tc>
       </w:tr>
       <w:tr>
-        <w:tc>
-          <w:tcPr>
-            <w:tcW w:type="dxa" w:w="4680"/>
-          </w:tcPr>
-          <w:p>
-            <w:r>
-              <w:rPr>
-                <w:b/>
-              </w:rPr>
-              <w:t>Three-pass critic loop</w:t>
-            </w:r>
-          </w:p>
-        </w:tc>
-        <w:tc>
-          <w:tcPr>
-            <w:tcW w:type="dxa" w:w="4680"/>
-          </w:tcPr>
-          <w:p>
-            <w:r>
-              <w:t>Pass 1 challenged contract and review semantics. Pass 2 challenged native lifecycle, cleanup, interruption and concurrency. Pass 3 reviewed every changed source file and supporting RLS/Storage controls.</w:t>
+        <w:trPr>
+          <w:cantSplit/>
+        </w:trPr>
+        <w:tc>
+          <w:tcPr>
+            <w:tcW w:type="dxa" w:w="2232"/>
+            <w:vAlign w:val="center"/>
+            <w:tcMar>
+              <w:top w:w="80" w:type="dxa"/>
+              <w:start w:w="120" w:type="dxa"/>
+              <w:bottom w:w="80" w:type="dxa"/>
+              <w:end w:w="120" w:type="dxa"/>
+            </w:tcMar>
+          </w:tcPr>
+          <w:p>
+            <w:pPr>
+              <w:spacing w:after="0"/>
+            </w:pPr>
+            <w:r>
+              <w:rPr>
+                <w:rFonts w:ascii="Calibri" w:hAnsi="Calibri"/>
+                <w:sz w:val="18"/>
+              </w:rPr>
+              <w:t>Three-pass challenge</w:t>
+            </w:r>
+          </w:p>
+        </w:tc>
+        <w:tc>
+          <w:tcPr>
+            <w:tcW w:type="dxa" w:w="7128"/>
+            <w:vAlign w:val="center"/>
+            <w:tcMar>
+              <w:top w:w="80" w:type="dxa"/>
+              <w:start w:w="120" w:type="dxa"/>
+              <w:bottom w:w="80" w:type="dxa"/>
+              <w:end w:w="120" w:type="dxa"/>
+            </w:tcMar>
+          </w:tcPr>
+          <w:p>
+            <w:pPr>
+              <w:spacing w:after="0"/>
+            </w:pPr>
+            <w:r>
+              <w:rPr>
+                <w:rFonts w:ascii="Calibri" w:hAnsi="Calibri"/>
+                <w:sz w:val="18"/>
+              </w:rPr>
+              <w:t>Challenged contract/fallback/integrity, native lifecycle and cleanup, then all changed source and RLS/Storage controls; persistence findings were remediated before closure</w:t>
             </w:r>
           </w:p>
         </w:tc>
       </w:tr>
       <w:tr>
-        <w:tc>
-          <w:tcPr>
-            <w:tcW w:type="dxa" w:w="4680"/>
-          </w:tcPr>
-          <w:p>
-            <w:r>
-              <w:rPr>
-                <w:b/>
-              </w:rPr>
-              <w:t>Improvements applied</w:t>
-            </w:r>
-          </w:p>
-        </w:tc>
-        <w:tc>
-          <w:tcPr>
-            <w:tcW w:type="dxa" w:w="4680"/>
-          </w:tcPr>
-          <w:p>
-            <w:r>
-              <w:t>Native stale-session startup sweeps, Android symlink rejection and complete scanner locking, whole-session malformed-result cleanup, two-phase evidence upload, immutable ready objects/provenance and checked rollback.</w:t>
+        <w:trPr>
+          <w:cantSplit/>
+        </w:trPr>
+        <w:tc>
+          <w:tcPr>
+            <w:tcW w:type="dxa" w:w="2232"/>
+            <w:shd w:fill="F2F4F7"/>
+            <w:vAlign w:val="center"/>
+            <w:tcMar>
+              <w:top w:w="80" w:type="dxa"/>
+              <w:start w:w="120" w:type="dxa"/>
+              <w:bottom w:w="80" w:type="dxa"/>
+              <w:end w:w="120" w:type="dxa"/>
+            </w:tcMar>
+          </w:tcPr>
+          <w:p>
+            <w:pPr>
+              <w:spacing w:after="0"/>
+            </w:pPr>
+            <w:r>
+              <w:rPr>
+                <w:rFonts w:ascii="Calibri" w:hAnsi="Calibri"/>
+                <w:sz w:val="18"/>
+              </w:rPr>
+              <w:t>Improvements</w:t>
+            </w:r>
+          </w:p>
+        </w:tc>
+        <w:tc>
+          <w:tcPr>
+            <w:tcW w:type="dxa" w:w="7128"/>
+            <w:shd w:fill="F2F4F7"/>
+            <w:vAlign w:val="center"/>
+            <w:tcMar>
+              <w:top w:w="80" w:type="dxa"/>
+              <w:start w:w="120" w:type="dxa"/>
+              <w:bottom w:w="80" w:type="dxa"/>
+              <w:end w:w="120" w:type="dxa"/>
+            </w:tcMar>
+          </w:tcPr>
+          <w:p>
+            <w:pPr>
+              <w:spacing w:after="0"/>
+            </w:pPr>
+            <w:r>
+              <w:rPr>
+                <w:rFonts w:ascii="Calibri" w:hAnsi="Calibri"/>
+                <w:sz w:val="18"/>
+              </w:rPr>
+              <w:t>Held Android guard through finalisation; safe startup sweeps; symlink rejection; main-thread bridge resolution; whole-session cleanup; checked rollback; immutable ready evidence</w:t>
             </w:r>
           </w:p>
         </w:tc>
       </w:tr>
       <w:tr>
-        <w:tc>
-          <w:tcPr>
-            <w:tcW w:type="dxa" w:w="4680"/>
-          </w:tcPr>
-          <w:p>
-            <w:r>
-              <w:rPr>
-                <w:b/>
-              </w:rPr>
-              <w:t>Verification</w:t>
-            </w:r>
-          </w:p>
-        </w:tc>
-        <w:tc>
-          <w:tcPr>
-            <w:tcW w:type="dxa" w:w="4680"/>
-          </w:tcPr>
-          <w:p>
-            <w:r>
-              <w:t>Runtime-config, lint, typecheck, production build and 93/93 tests passed. PR #54 passed application, 208-test Supabase pgTAP, Android debug, iOS simulator and both Vercel preview checks.</w:t>
+        <w:trPr>
+          <w:cantSplit/>
+        </w:trPr>
+        <w:tc>
+          <w:tcPr>
+            <w:tcW w:type="dxa" w:w="2232"/>
+            <w:vAlign w:val="center"/>
+            <w:tcMar>
+              <w:top w:w="80" w:type="dxa"/>
+              <w:start w:w="120" w:type="dxa"/>
+              <w:bottom w:w="80" w:type="dxa"/>
+              <w:end w:w="120" w:type="dxa"/>
+            </w:tcMar>
+          </w:tcPr>
+          <w:p>
+            <w:pPr>
+              <w:spacing w:after="0"/>
+            </w:pPr>
+            <w:r>
+              <w:rPr>
+                <w:rFonts w:ascii="Calibri" w:hAnsi="Calibri"/>
+                <w:sz w:val="18"/>
+              </w:rPr>
+              <w:t>Tests</w:t>
+            </w:r>
+          </w:p>
+        </w:tc>
+        <w:tc>
+          <w:tcPr>
+            <w:tcW w:type="dxa" w:w="7128"/>
+            <w:vAlign w:val="center"/>
+            <w:tcMar>
+              <w:top w:w="80" w:type="dxa"/>
+              <w:start w:w="120" w:type="dxa"/>
+              <w:bottom w:w="80" w:type="dxa"/>
+              <w:end w:w="120" w:type="dxa"/>
+            </w:tcMar>
+          </w:tcPr>
+          <w:p>
+            <w:pPr>
+              <w:spacing w:after="0"/>
+            </w:pPr>
+            <w:r>
+              <w:rPr>
+                <w:rFonts w:ascii="Calibri" w:hAnsi="Calibri"/>
+                <w:sz w:val="18"/>
+              </w:rPr>
+              <w:t>Local release gate and 93/93 browser tests passed; PR #54 passed app, 208 pgTAP tests, Android, iOS and Vercel checks</w:t>
             </w:r>
           </w:p>
         </w:tc>
       </w:tr>
       <w:tr>
-        <w:tc>
-          <w:tcPr>
-            <w:tcW w:type="dxa" w:w="4680"/>
-          </w:tcPr>
-          <w:p>
-            <w:r>
-              <w:rPr>
-                <w:b/>
-              </w:rPr>
-              <w:t>Visual and device evidence</w:t>
-            </w:r>
-          </w:p>
-        </w:tc>
-        <w:tc>
-          <w:tcPr>
-            <w:tcW w:type="dxa" w:w="4680"/>
-          </w:tcPr>
-          <w:p>
-            <w:r>
-              <w:t>Capture guidance and provenance/confidence render in the existing responsive workspace. Full regression remains after Slice 3; signed-device camera and process-interruption proof remains required.</w:t>
+        <w:trPr>
+          <w:cantSplit/>
+        </w:trPr>
+        <w:tc>
+          <w:tcPr>
+            <w:tcW w:type="dxa" w:w="2232"/>
+            <w:shd w:fill="F2F4F7"/>
+            <w:vAlign w:val="center"/>
+            <w:tcMar>
+              <w:top w:w="80" w:type="dxa"/>
+              <w:start w:w="120" w:type="dxa"/>
+              <w:bottom w:w="80" w:type="dxa"/>
+              <w:end w:w="120" w:type="dxa"/>
+            </w:tcMar>
+          </w:tcPr>
+          <w:p>
+            <w:pPr>
+              <w:spacing w:after="0"/>
+            </w:pPr>
+            <w:r>
+              <w:rPr>
+                <w:rFonts w:ascii="Calibri" w:hAnsi="Calibri"/>
+                <w:sz w:val="18"/>
+              </w:rPr>
+              <w:t>Result</w:t>
+            </w:r>
+          </w:p>
+        </w:tc>
+        <w:tc>
+          <w:tcPr>
+            <w:tcW w:type="dxa" w:w="7128"/>
+            <w:shd w:fill="F2F4F7"/>
+            <w:vAlign w:val="center"/>
+            <w:tcMar>
+              <w:top w:w="80" w:type="dxa"/>
+              <w:start w:w="120" w:type="dxa"/>
+              <w:bottom w:w="80" w:type="dxa"/>
+              <w:end w:w="120" w:type="dxa"/>
+            </w:tcMar>
+          </w:tcPr>
+          <w:p>
+            <w:pPr>
+              <w:spacing w:after="0"/>
+            </w:pPr>
+            <w:r>
+              <w:rPr>
+                <w:rFonts w:ascii="Calibri" w:hAnsi="Calibri"/>
+                <w:sz w:val="18"/>
+              </w:rPr>
+              <w:t>Implementation, migrations, native CI and deployments passed; signed physical-device proof remains the store-release gate</w:t>
             </w:r>
           </w:p>
         </w:tc>
       </w:tr>
       <w:tr>
-        <w:tc>
-          <w:tcPr>
-            <w:tcW w:type="dxa" w:w="4680"/>
-          </w:tcPr>
-          <w:p>
-            <w:r>
-              <w:rPr>
-                <w:b/>
-              </w:rPr>
-              <w:t>Result</w:t>
-            </w:r>
-          </w:p>
-        </w:tc>
-        <w:tc>
-          <w:tcPr>
-            <w:tcW w:type="dxa" w:w="4680"/>
-          </w:tcPr>
-          <w:p>
-            <w:r>
-              <w:t>Implementation, remote migrations, native CI and Supabase pgTAP pass. PR #54 merged as 05df90a; both post-merge Vercel deployments passed. Signed-device UAT remains.</w:t>
+        <w:trPr>
+          <w:cantSplit/>
+        </w:trPr>
+        <w:tc>
+          <w:tcPr>
+            <w:tcW w:type="dxa" w:w="2232"/>
+            <w:vAlign w:val="center"/>
+            <w:tcMar>
+              <w:top w:w="80" w:type="dxa"/>
+              <w:start w:w="120" w:type="dxa"/>
+              <w:bottom w:w="80" w:type="dxa"/>
+              <w:end w:w="120" w:type="dxa"/>
+            </w:tcMar>
+          </w:tcPr>
+          <w:p>
+            <w:pPr>
+              <w:spacing w:after="0"/>
+            </w:pPr>
+            <w:r>
+              <w:rPr>
+                <w:rFonts w:ascii="Calibri" w:hAnsi="Calibri"/>
+                <w:sz w:val="18"/>
+              </w:rPr>
+              <w:t>Known gaps</w:t>
+            </w:r>
+          </w:p>
+        </w:tc>
+        <w:tc>
+          <w:tcPr>
+            <w:tcW w:type="dxa" w:w="7128"/>
+            <w:vAlign w:val="center"/>
+            <w:tcMar>
+              <w:top w:w="80" w:type="dxa"/>
+              <w:start w:w="120" w:type="dxa"/>
+              <w:bottom w:w="80" w:type="dxa"/>
+              <w:end w:w="120" w:type="dxa"/>
+            </w:tcMar>
+          </w:tcPr>
+          <w:p>
+            <w:pPr>
+              <w:spacing w:after="0"/>
+            </w:pPr>
+            <w:r>
+              <w:rPr>
+                <w:rFonts w:ascii="Calibri" w:hAnsi="Calibri"/>
+                <w:sz w:val="18"/>
+              </w:rPr>
+              <w:t>OCR accuracy and permission/lifecycle behavior on representative physical devices require the five-role signed-device UAT matrix</w:t>
             </w:r>
           </w:p>
         </w:tc>
       </w:tr>
       <w:tr>
-        <w:tc>
-          <w:tcPr>
-            <w:tcW w:type="dxa" w:w="4680"/>
-          </w:tcPr>
-          <w:p>
-            <w:r>
-              <w:rPr>
+        <w:trPr>
+          <w:cantSplit/>
+        </w:trPr>
+        <w:tc>
+          <w:tcPr>
+            <w:tcW w:type="dxa" w:w="2232"/>
+            <w:shd w:fill="F2F4F7"/>
+            <w:vAlign w:val="center"/>
+            <w:tcMar>
+              <w:top w:w="80" w:type="dxa"/>
+              <w:start w:w="120" w:type="dxa"/>
+              <w:bottom w:w="80" w:type="dxa"/>
+              <w:end w:w="120" w:type="dxa"/>
+            </w:tcMar>
+          </w:tcPr>
+          <w:p>
+            <w:pPr>
+              <w:spacing w:after="0"/>
+            </w:pPr>
+            <w:r>
+              <w:rPr>
+                <w:rFonts w:ascii="Calibri" w:hAnsi="Calibri"/>
+                <w:sz w:val="18"/>
+              </w:rPr>
+              <w:t>Next action</w:t>
+            </w:r>
+          </w:p>
+        </w:tc>
+        <w:tc>
+          <w:tcPr>
+            <w:tcW w:type="dxa" w:w="7128"/>
+            <w:shd w:fill="F2F4F7"/>
+            <w:vAlign w:val="center"/>
+            <w:tcMar>
+              <w:top w:w="80" w:type="dxa"/>
+              <w:start w:w="120" w:type="dxa"/>
+              <w:bottom w:w="80" w:type="dxa"/>
+              <w:end w:w="120" w:type="dxa"/>
+            </w:tcMar>
+          </w:tcPr>
+          <w:p>
+            <w:pPr>
+              <w:spacing w:after="0"/>
+            </w:pPr>
+            <w:r>
+              <w:rPr>
+                <w:rFonts w:ascii="Calibri" w:hAnsi="Calibri"/>
+                <w:sz w:val="18"/>
+              </w:rPr>
+              <w:t>Execute OCR-3 private signed-device UAT without placing credentials or direct identifiers in Git or this document</w:t>
+            </w:r>
+          </w:p>
+        </w:tc>
+      </w:tr>
+    </w:tbl>
+    <w:p>
+      <w:pPr>
+        <w:spacing w:after="0"/>
+      </w:pPr>
+    </w:p>
+    <w:p>
+      <w:pPr>
+        <w:pStyle w:val="Heading2"/>
+      </w:pPr>
+      <w:r>
+        <w:t>24 August 2026 - OCR-3 signed-device UAT gate</w:t>
+      </w:r>
+    </w:p>
+    <w:tbl>
+      <w:tblPr>
+        <w:tblStyle w:val="TableGrid"/>
+        <w:tblW w:type="dxa" w:w="9360"/>
+        <w:tblLayout w:type="fixed"/>
+        <w:tblLook w:firstColumn="1" w:firstRow="1" w:lastColumn="0" w:lastRow="0" w:noHBand="0" w:noVBand="1" w:val="04A0"/>
+        <w:jc w:val="left"/>
+        <w:tblInd w:w="120" w:type="dxa"/>
+      </w:tblPr>
+      <w:tblGrid>
+        <w:gridCol w:w="4680"/>
+        <w:gridCol w:w="4680"/>
+      </w:tblGrid>
+      <w:tr>
+        <w:trPr>
+          <w:tblHeader w:val="true"/>
+        </w:trPr>
+        <w:tc>
+          <w:tcPr>
+            <w:tcW w:type="dxa" w:w="2232"/>
+            <w:vAlign w:val="center"/>
+            <w:tcMar>
+              <w:top w:w="80" w:type="dxa"/>
+              <w:start w:w="120" w:type="dxa"/>
+              <w:bottom w:w="80" w:type="dxa"/>
+              <w:end w:w="120" w:type="dxa"/>
+            </w:tcMar>
+            <w:shd w:fill="17365D"/>
+          </w:tcPr>
+          <w:p>
+            <w:r>
+              <w:rPr>
+                <w:rFonts w:ascii="Calibri" w:hAnsi="Calibri"/>
                 <w:b/>
-              </w:rPr>
-              <w:t>Known limitation</w:t>
-            </w:r>
-          </w:p>
-        </w:tc>
-        <w:tc>
-          <w:tcPr>
-            <w:tcW w:type="dxa" w:w="4680"/>
-          </w:tcPr>
-          <w:p>
-            <w:r>
-              <w:t>The official client recomputes SHA-256 immediately before immutable upload; capture source is client-reported and is not cryptographic device attestation.</w:t>
+                <w:color w:val="FFFFFF"/>
+                <w:sz w:val="19"/>
+              </w:rPr>
+              <w:t>Field</w:t>
+            </w:r>
+          </w:p>
+        </w:tc>
+        <w:tc>
+          <w:tcPr>
+            <w:tcW w:type="dxa" w:w="7128"/>
+            <w:vAlign w:val="center"/>
+            <w:tcMar>
+              <w:top w:w="80" w:type="dxa"/>
+              <w:start w:w="120" w:type="dxa"/>
+              <w:bottom w:w="80" w:type="dxa"/>
+              <w:end w:w="120" w:type="dxa"/>
+            </w:tcMar>
+            <w:shd w:fill="17365D"/>
+          </w:tcPr>
+          <w:p>
+            <w:r>
+              <w:rPr>
+                <w:rFonts w:ascii="Calibri" w:hAnsi="Calibri"/>
+                <w:b/>
+                <w:color w:val="FFFFFF"/>
+                <w:sz w:val="19"/>
+              </w:rPr>
+              <w:t>Recorded implementation evidence</w:t>
             </w:r>
           </w:p>
         </w:tc>
       </w:tr>
       <w:tr>
-        <w:tc>
-          <w:tcPr>
-            <w:tcW w:type="dxa" w:w="4680"/>
-          </w:tcPr>
-          <w:p>
-            <w:r>
-              <w:rPr>
-                <w:b/>
+        <w:trPr>
+          <w:cantSplit/>
+        </w:trPr>
+        <w:tc>
+          <w:tcPr>
+            <w:tcW w:type="dxa" w:w="2232"/>
+            <w:vAlign w:val="center"/>
+            <w:tcMar>
+              <w:top w:w="80" w:type="dxa"/>
+              <w:start w:w="120" w:type="dxa"/>
+              <w:bottom w:w="80" w:type="dxa"/>
+              <w:end w:w="120" w:type="dxa"/>
+            </w:tcMar>
+          </w:tcPr>
+          <w:p>
+            <w:pPr>
+              <w:spacing w:after="0"/>
+            </w:pPr>
+            <w:r>
+              <w:rPr>
+                <w:rFonts w:ascii="Calibri" w:hAnsi="Calibri"/>
+                <w:sz w:val="18"/>
+              </w:rPr>
+              <w:t>Slice</w:t>
+            </w:r>
+          </w:p>
+        </w:tc>
+        <w:tc>
+          <w:tcPr>
+            <w:tcW w:type="dxa" w:w="7128"/>
+            <w:vAlign w:val="center"/>
+            <w:tcMar>
+              <w:top w:w="80" w:type="dxa"/>
+              <w:start w:w="120" w:type="dxa"/>
+              <w:bottom w:w="80" w:type="dxa"/>
+              <w:end w:w="120" w:type="dxa"/>
+            </w:tcMar>
+          </w:tcPr>
+          <w:p>
+            <w:pPr>
+              <w:spacing w:after="0"/>
+            </w:pPr>
+            <w:r>
+              <w:rPr>
+                <w:rFonts w:ascii="Calibri" w:hAnsi="Calibri"/>
+                <w:sz w:val="18"/>
+              </w:rPr>
+              <w:t>OCR-3 - five-role signed-device release gate</w:t>
+            </w:r>
+          </w:p>
+        </w:tc>
+      </w:tr>
+      <w:tr>
+        <w:trPr>
+          <w:cantSplit/>
+        </w:trPr>
+        <w:tc>
+          <w:tcPr>
+            <w:tcW w:type="dxa" w:w="2232"/>
+            <w:shd w:fill="F2F4F7"/>
+            <w:vAlign w:val="center"/>
+            <w:tcMar>
+              <w:top w:w="80" w:type="dxa"/>
+              <w:start w:w="120" w:type="dxa"/>
+              <w:bottom w:w="80" w:type="dxa"/>
+              <w:end w:w="120" w:type="dxa"/>
+            </w:tcMar>
+          </w:tcPr>
+          <w:p>
+            <w:pPr>
+              <w:spacing w:after="0"/>
+            </w:pPr>
+            <w:r>
+              <w:rPr>
+                <w:rFonts w:ascii="Calibri" w:hAnsi="Calibri"/>
+                <w:sz w:val="18"/>
+              </w:rPr>
+              <w:t>Branch</w:t>
+            </w:r>
+          </w:p>
+        </w:tc>
+        <w:tc>
+          <w:tcPr>
+            <w:tcW w:type="dxa" w:w="7128"/>
+            <w:shd w:fill="F2F4F7"/>
+            <w:vAlign w:val="center"/>
+            <w:tcMar>
+              <w:top w:w="80" w:type="dxa"/>
+              <w:start w:w="120" w:type="dxa"/>
+              <w:bottom w:w="80" w:type="dxa"/>
+              <w:end w:w="120" w:type="dxa"/>
+            </w:tcMar>
+          </w:tcPr>
+          <w:p>
+            <w:pPr>
+              <w:spacing w:after="0"/>
+            </w:pPr>
+            <w:r>
+              <w:rPr>
+                <w:rFonts w:ascii="Calibri" w:hAnsi="Calibri"/>
+                <w:sz w:val="18"/>
+              </w:rPr>
+              <w:t>sankofa_xciv/ocr-3-device-uat-gate</w:t>
+            </w:r>
+          </w:p>
+        </w:tc>
+      </w:tr>
+      <w:tr>
+        <w:trPr>
+          <w:cantSplit/>
+        </w:trPr>
+        <w:tc>
+          <w:tcPr>
+            <w:tcW w:type="dxa" w:w="2232"/>
+            <w:vAlign w:val="center"/>
+            <w:tcMar>
+              <w:top w:w="80" w:type="dxa"/>
+              <w:start w:w="120" w:type="dxa"/>
+              <w:bottom w:w="80" w:type="dxa"/>
+              <w:end w:w="120" w:type="dxa"/>
+            </w:tcMar>
+          </w:tcPr>
+          <w:p>
+            <w:pPr>
+              <w:spacing w:after="0"/>
+            </w:pPr>
+            <w:r>
+              <w:rPr>
+                <w:rFonts w:ascii="Calibri" w:hAnsi="Calibri"/>
+                <w:sz w:val="18"/>
+              </w:rPr>
+              <w:t>Outcome</w:t>
+            </w:r>
+          </w:p>
+        </w:tc>
+        <w:tc>
+          <w:tcPr>
+            <w:tcW w:type="dxa" w:w="7128"/>
+            <w:vAlign w:val="center"/>
+            <w:tcMar>
+              <w:top w:w="80" w:type="dxa"/>
+              <w:start w:w="120" w:type="dxa"/>
+              <w:bottom w:w="80" w:type="dxa"/>
+              <w:end w:w="120" w:type="dxa"/>
+            </w:tcMar>
+          </w:tcPr>
+          <w:p>
+            <w:pPr>
+              <w:spacing w:after="0"/>
+            </w:pPr>
+            <w:r>
+              <w:rPr>
+                <w:rFonts w:ascii="Calibri" w:hAnsi="Calibri"/>
+                <w:sz w:val="18"/>
+              </w:rPr>
+              <w:t>Executable contract for five real access variants, signed Android/iOS devices, and 25 required results; private ignored evidence boundary and responsive guide</w:t>
+            </w:r>
+          </w:p>
+        </w:tc>
+      </w:tr>
+      <w:tr>
+        <w:trPr>
+          <w:cantSplit/>
+        </w:trPr>
+        <w:tc>
+          <w:tcPr>
+            <w:tcW w:type="dxa" w:w="2232"/>
+            <w:shd w:fill="F2F4F7"/>
+            <w:vAlign w:val="center"/>
+            <w:tcMar>
+              <w:top w:w="80" w:type="dxa"/>
+              <w:start w:w="120" w:type="dxa"/>
+              <w:bottom w:w="80" w:type="dxa"/>
+              <w:end w:w="120" w:type="dxa"/>
+            </w:tcMar>
+          </w:tcPr>
+          <w:p>
+            <w:pPr>
+              <w:spacing w:after="0"/>
+            </w:pPr>
+            <w:r>
+              <w:rPr>
+                <w:rFonts w:ascii="Calibri" w:hAnsi="Calibri"/>
+                <w:sz w:val="18"/>
+              </w:rPr>
+              <w:t>Decision</w:t>
+            </w:r>
+          </w:p>
+        </w:tc>
+        <w:tc>
+          <w:tcPr>
+            <w:tcW w:type="dxa" w:w="7128"/>
+            <w:shd w:fill="F2F4F7"/>
+            <w:vAlign w:val="center"/>
+            <w:tcMar>
+              <w:top w:w="80" w:type="dxa"/>
+              <w:start w:w="120" w:type="dxa"/>
+              <w:bottom w:w="80" w:type="dxa"/>
+              <w:end w:w="120" w:type="dxa"/>
+            </w:tcMar>
+          </w:tcPr>
+          <w:p>
+            <w:pPr>
+              <w:spacing w:after="0"/>
+            </w:pPr>
+            <w:r>
+              <w:rPr>
+                <w:rFonts w:ascii="Calibri" w:hAnsi="Calibri"/>
+                <w:sz w:val="18"/>
+              </w:rPr>
+              <w:t>Treat physical UAT as release evidence, not seed data; retain aliases and safe evidence references only; bind proof to exact remote target and deployed commit</w:t>
+            </w:r>
+          </w:p>
+        </w:tc>
+      </w:tr>
+      <w:tr>
+        <w:trPr>
+          <w:cantSplit/>
+        </w:trPr>
+        <w:tc>
+          <w:tcPr>
+            <w:tcW w:type="dxa" w:w="2232"/>
+            <w:vAlign w:val="center"/>
+            <w:tcMar>
+              <w:top w:w="80" w:type="dxa"/>
+              <w:start w:w="120" w:type="dxa"/>
+              <w:bottom w:w="80" w:type="dxa"/>
+              <w:end w:w="120" w:type="dxa"/>
+            </w:tcMar>
+          </w:tcPr>
+          <w:p>
+            <w:pPr>
+              <w:spacing w:after="0"/>
+            </w:pPr>
+            <w:r>
+              <w:rPr>
+                <w:rFonts w:ascii="Calibri" w:hAnsi="Calibri"/>
+                <w:sz w:val="18"/>
+              </w:rPr>
+              <w:t>Rejected alternative</w:t>
+            </w:r>
+          </w:p>
+        </w:tc>
+        <w:tc>
+          <w:tcPr>
+            <w:tcW w:type="dxa" w:w="7128"/>
+            <w:vAlign w:val="center"/>
+            <w:tcMar>
+              <w:top w:w="80" w:type="dxa"/>
+              <w:start w:w="120" w:type="dxa"/>
+              <w:bottom w:w="80" w:type="dxa"/>
+              <w:end w:w="120" w:type="dxa"/>
+            </w:tcMar>
+          </w:tcPr>
+          <w:p>
+            <w:pPr>
+              <w:spacing w:after="0"/>
+            </w:pPr>
+            <w:r>
+              <w:rPr>
+                <w:rFonts w:ascii="Calibri" w:hAnsi="Calibri"/>
+                <w:sz w:val="18"/>
+              </w:rPr>
+              <w:t>Committed credentials/results, document-only attestation, synthetic users presented as UAT, or a single happy-path account</w:t>
+            </w:r>
+          </w:p>
+        </w:tc>
+      </w:tr>
+      <w:tr>
+        <w:trPr>
+          <w:cantSplit/>
+        </w:trPr>
+        <w:tc>
+          <w:tcPr>
+            <w:tcW w:type="dxa" w:w="2232"/>
+            <w:shd w:fill="F2F4F7"/>
+            <w:vAlign w:val="center"/>
+            <w:tcMar>
+              <w:top w:w="80" w:type="dxa"/>
+              <w:start w:w="120" w:type="dxa"/>
+              <w:bottom w:w="80" w:type="dxa"/>
+              <w:end w:w="120" w:type="dxa"/>
+            </w:tcMar>
+          </w:tcPr>
+          <w:p>
+            <w:pPr>
+              <w:spacing w:after="0"/>
+            </w:pPr>
+            <w:r>
+              <w:rPr>
+                <w:rFonts w:ascii="Calibri" w:hAnsi="Calibri"/>
+                <w:sz w:val="18"/>
+              </w:rPr>
+              <w:t>Security</w:t>
+            </w:r>
+          </w:p>
+        </w:tc>
+        <w:tc>
+          <w:tcPr>
+            <w:tcW w:type="dxa" w:w="7128"/>
+            <w:shd w:fill="F2F4F7"/>
+            <w:vAlign w:val="center"/>
+            <w:tcMar>
+              <w:top w:w="80" w:type="dxa"/>
+              <w:start w:w="120" w:type="dxa"/>
+              <w:bottom w:w="80" w:type="dxa"/>
+              <w:end w:w="120" w:type="dxa"/>
+            </w:tcMar>
+          </w:tcPr>
+          <w:p>
+            <w:pPr>
+              <w:spacing w:after="0"/>
+            </w:pPr>
+            <w:r>
+              <w:rPr>
+                <w:rFonts w:ascii="Calibri" w:hAnsi="Calibri"/>
+                <w:sz w:val="18"/>
+              </w:rPr>
+              <w:t>Reject credentials, direct identifiers, raw OCR, native/private paths and device identifiers recursively; output summary/issues only, never the submitted payload or caller path</w:t>
+            </w:r>
+          </w:p>
+        </w:tc>
+      </w:tr>
+      <w:tr>
+        <w:trPr>
+          <w:cantSplit/>
+        </w:trPr>
+        <w:tc>
+          <w:tcPr>
+            <w:tcW w:type="dxa" w:w="2232"/>
+            <w:vAlign w:val="center"/>
+            <w:tcMar>
+              <w:top w:w="80" w:type="dxa"/>
+              <w:start w:w="120" w:type="dxa"/>
+              <w:bottom w:w="80" w:type="dxa"/>
+              <w:end w:w="120" w:type="dxa"/>
+            </w:tcMar>
+          </w:tcPr>
+          <w:p>
+            <w:pPr>
+              <w:spacing w:after="0"/>
+            </w:pPr>
+            <w:r>
+              <w:rPr>
+                <w:rFonts w:ascii="Calibri" w:hAnsi="Calibri"/>
+                <w:sz w:val="18"/>
+              </w:rPr>
+              <w:t>Three-pass challenge</w:t>
+            </w:r>
+          </w:p>
+        </w:tc>
+        <w:tc>
+          <w:tcPr>
+            <w:tcW w:type="dxa" w:w="7128"/>
+            <w:vAlign w:val="center"/>
+            <w:tcMar>
+              <w:top w:w="80" w:type="dxa"/>
+              <w:start w:w="120" w:type="dxa"/>
+              <w:bottom w:w="80" w:type="dxa"/>
+              <w:end w:w="120" w:type="dxa"/>
+            </w:tcMar>
+          </w:tcPr>
+          <w:p>
+            <w:pPr>
+              <w:spacing w:after="0"/>
+            </w:pPr>
+            <w:r>
+              <w:rPr>
+                <w:rFonts w:ascii="Calibri" w:hAnsi="Calibri"/>
+                <w:sz w:val="18"/>
+              </w:rPr>
+              <w:t>Pass 1 reconciled 16 scenarios to 25 results; Pass 2 challenged leakage, evidence traversal and unknown additions; Pass 3 challenged signed-build, commit and release semantics</w:t>
+            </w:r>
+          </w:p>
+        </w:tc>
+      </w:tr>
+      <w:tr>
+        <w:trPr>
+          <w:cantSplit/>
+        </w:trPr>
+        <w:tc>
+          <w:tcPr>
+            <w:tcW w:type="dxa" w:w="2232"/>
+            <w:shd w:fill="F2F4F7"/>
+            <w:vAlign w:val="center"/>
+            <w:tcMar>
+              <w:top w:w="80" w:type="dxa"/>
+              <w:start w:w="120" w:type="dxa"/>
+              <w:bottom w:w="80" w:type="dxa"/>
+              <w:end w:w="120" w:type="dxa"/>
+            </w:tcMar>
+          </w:tcPr>
+          <w:p>
+            <w:pPr>
+              <w:spacing w:after="0"/>
+            </w:pPr>
+            <w:r>
+              <w:rPr>
+                <w:rFonts w:ascii="Calibri" w:hAnsi="Calibri"/>
+                <w:sz w:val="18"/>
+              </w:rPr>
+              <w:t>Improvements</w:t>
+            </w:r>
+          </w:p>
+        </w:tc>
+        <w:tc>
+          <w:tcPr>
+            <w:tcW w:type="dxa" w:w="7128"/>
+            <w:shd w:fill="F2F4F7"/>
+            <w:vAlign w:val="center"/>
+            <w:tcMar>
+              <w:top w:w="80" w:type="dxa"/>
+              <w:start w:w="120" w:type="dxa"/>
+              <w:bottom w:w="80" w:type="dxa"/>
+              <w:end w:w="120" w:type="dxa"/>
+            </w:tcMar>
+          </w:tcPr>
+          <w:p>
+            <w:pPr>
+              <w:spacing w:after="0"/>
+            </w:pPr>
+            <w:r>
+              <w:rPr>
+                <w:rFonts w:ascii="Calibri" w:hAnsi="Calibri"/>
+                <w:sz w:val="18"/>
+              </w:rPr>
+              <w:t>Corrected result count; reject unknown platforms/cases; isolate private JSON; incomplete mode can validate structure but cannot mark release ready</w:t>
+            </w:r>
+          </w:p>
+        </w:tc>
+      </w:tr>
+      <w:tr>
+        <w:trPr>
+          <w:cantSplit/>
+        </w:trPr>
+        <w:tc>
+          <w:tcPr>
+            <w:tcW w:type="dxa" w:w="2232"/>
+            <w:vAlign w:val="center"/>
+            <w:tcMar>
+              <w:top w:w="80" w:type="dxa"/>
+              <w:start w:w="120" w:type="dxa"/>
+              <w:bottom w:w="80" w:type="dxa"/>
+              <w:end w:w="120" w:type="dxa"/>
+            </w:tcMar>
+          </w:tcPr>
+          <w:p>
+            <w:pPr>
+              <w:spacing w:after="0"/>
+            </w:pPr>
+            <w:r>
+              <w:rPr>
+                <w:rFonts w:ascii="Calibri" w:hAnsi="Calibri"/>
+                <w:sz w:val="18"/>
+              </w:rPr>
+              <w:t>Tests</w:t>
+            </w:r>
+          </w:p>
+        </w:tc>
+        <w:tc>
+          <w:tcPr>
+            <w:tcW w:type="dxa" w:w="7128"/>
+            <w:vAlign w:val="center"/>
+            <w:tcMar>
+              <w:top w:w="80" w:type="dxa"/>
+              <w:start w:w="120" w:type="dxa"/>
+              <w:bottom w:w="80" w:type="dxa"/>
+              <w:end w:w="120" w:type="dxa"/>
+            </w:tcMar>
+          </w:tcPr>
+          <w:p>
+            <w:pPr>
+              <w:spacing w:after="0"/>
+            </w:pPr>
+            <w:r>
+              <w:rPr>
+                <w:rFonts w:ascii="Calibri" w:hAnsi="Calibri"/>
+                <w:sz w:val="18"/>
+              </w:rPr>
+              <w:t>6/6 contract tests pass: complete matrix, unknown additions, leakage, missing/failed evidence, and in-progress behavior</w:t>
+            </w:r>
+          </w:p>
+        </w:tc>
+      </w:tr>
+      <w:tr>
+        <w:trPr>
+          <w:cantSplit/>
+        </w:trPr>
+        <w:tc>
+          <w:tcPr>
+            <w:tcW w:type="dxa" w:w="2232"/>
+            <w:shd w:fill="F2F4F7"/>
+            <w:vAlign w:val="center"/>
+            <w:tcMar>
+              <w:top w:w="80" w:type="dxa"/>
+              <w:start w:w="120" w:type="dxa"/>
+              <w:bottom w:w="80" w:type="dxa"/>
+              <w:end w:w="120" w:type="dxa"/>
+            </w:tcMar>
+          </w:tcPr>
+          <w:p>
+            <w:pPr>
+              <w:spacing w:after="0"/>
+            </w:pPr>
+            <w:r>
+              <w:rPr>
+                <w:rFonts w:ascii="Calibri" w:hAnsi="Calibri"/>
+                <w:sz w:val="18"/>
+              </w:rPr>
+              <w:t>Visual evidence</w:t>
+            </w:r>
+          </w:p>
+        </w:tc>
+        <w:tc>
+          <w:tcPr>
+            <w:tcW w:type="dxa" w:w="7128"/>
+            <w:shd w:fill="F2F4F7"/>
+            <w:vAlign w:val="center"/>
+            <w:tcMar>
+              <w:top w:w="80" w:type="dxa"/>
+              <w:start w:w="120" w:type="dxa"/>
+              <w:bottom w:w="80" w:type="dxa"/>
+              <w:end w:w="120" w:type="dxa"/>
+            </w:tcMar>
+          </w:tcPr>
+          <w:p>
+            <w:pPr>
+              <w:spacing w:after="0"/>
+            </w:pPr>
+            <w:r>
+              <w:rPr>
+                <w:rFonts w:ascii="Calibri" w:hAnsi="Calibri"/>
+                <w:sz w:val="18"/>
+              </w:rPr>
+              <w:t>Responsive guide supports Android/iOS viewing; application UI is unchanged; physical scanner proof remains pending</w:t>
+            </w:r>
+          </w:p>
+        </w:tc>
+      </w:tr>
+      <w:tr>
+        <w:trPr>
+          <w:cantSplit/>
+        </w:trPr>
+        <w:tc>
+          <w:tcPr>
+            <w:tcW w:type="dxa" w:w="2232"/>
+            <w:vAlign w:val="center"/>
+            <w:tcMar>
+              <w:top w:w="80" w:type="dxa"/>
+              <w:start w:w="120" w:type="dxa"/>
+              <w:bottom w:w="80" w:type="dxa"/>
+              <w:end w:w="120" w:type="dxa"/>
+            </w:tcMar>
+          </w:tcPr>
+          <w:p>
+            <w:pPr>
+              <w:spacing w:after="0"/>
+            </w:pPr>
+            <w:r>
+              <w:rPr>
+                <w:rFonts w:ascii="Calibri" w:hAnsi="Calibri"/>
+                <w:sz w:val="18"/>
+              </w:rPr>
+              <w:t>Result</w:t>
+            </w:r>
+          </w:p>
+        </w:tc>
+        <w:tc>
+          <w:tcPr>
+            <w:tcW w:type="dxa" w:w="7128"/>
+            <w:vAlign w:val="center"/>
+            <w:tcMar>
+              <w:top w:w="80" w:type="dxa"/>
+              <w:start w:w="120" w:type="dxa"/>
+              <w:bottom w:w="80" w:type="dxa"/>
+              <w:end w:w="120" w:type="dxa"/>
+            </w:tcMar>
+          </w:tcPr>
+          <w:p>
+            <w:pPr>
+              <w:spacing w:after="0"/>
+            </w:pPr>
+            <w:r>
+              <w:rPr>
+                <w:rFonts w:ascii="Calibri" w:hAnsi="Calibri"/>
+                <w:sz w:val="18"/>
+              </w:rPr>
+              <w:t>Gate verified locally; no UAT outcome fabricated and OCR is not yet device-certified</w:t>
+            </w:r>
+          </w:p>
+        </w:tc>
+      </w:tr>
+      <w:tr>
+        <w:trPr>
+          <w:cantSplit/>
+        </w:trPr>
+        <w:tc>
+          <w:tcPr>
+            <w:tcW w:type="dxa" w:w="2232"/>
+            <w:shd w:fill="F2F4F7"/>
+            <w:vAlign w:val="center"/>
+            <w:tcMar>
+              <w:top w:w="80" w:type="dxa"/>
+              <w:start w:w="120" w:type="dxa"/>
+              <w:bottom w:w="80" w:type="dxa"/>
+              <w:end w:w="120" w:type="dxa"/>
+            </w:tcMar>
+          </w:tcPr>
+          <w:p>
+            <w:pPr>
+              <w:spacing w:after="0"/>
+            </w:pPr>
+            <w:r>
+              <w:rPr>
+                <w:rFonts w:ascii="Calibri" w:hAnsi="Calibri"/>
+                <w:sz w:val="18"/>
+              </w:rPr>
+              <w:t>Known gaps</w:t>
+            </w:r>
+          </w:p>
+        </w:tc>
+        <w:tc>
+          <w:tcPr>
+            <w:tcW w:type="dxa" w:w="7128"/>
+            <w:shd w:fill="F2F4F7"/>
+            <w:vAlign w:val="center"/>
+            <w:tcMar>
+              <w:top w:w="80" w:type="dxa"/>
+              <w:start w:w="120" w:type="dxa"/>
+              <w:bottom w:w="80" w:type="dxa"/>
+              <w:end w:w="120" w:type="dxa"/>
+            </w:tcMar>
+          </w:tcPr>
+          <w:p>
+            <w:pPr>
+              <w:spacing w:after="0"/>
+            </w:pPr>
+            <w:r>
+              <w:rPr>
+                <w:rFonts w:ascii="Calibri" w:hAnsi="Calibri"/>
+                <w:sz w:val="18"/>
+              </w:rPr>
+              <w:t>Signed builds, five real assignments, controlled credential handoff, and physical evidence require authorised operators</w:t>
+            </w:r>
+          </w:p>
+        </w:tc>
+      </w:tr>
+      <w:tr>
+        <w:trPr>
+          <w:cantSplit/>
+        </w:trPr>
+        <w:tc>
+          <w:tcPr>
+            <w:tcW w:type="dxa" w:w="2232"/>
+            <w:vAlign w:val="center"/>
+            <w:tcMar>
+              <w:top w:w="80" w:type="dxa"/>
+              <w:start w:w="120" w:type="dxa"/>
+              <w:bottom w:w="80" w:type="dxa"/>
+              <w:end w:w="120" w:type="dxa"/>
+            </w:tcMar>
+          </w:tcPr>
+          <w:p>
+            <w:pPr>
+              <w:spacing w:after="0"/>
+            </w:pPr>
+            <w:r>
+              <w:rPr>
+                <w:rFonts w:ascii="Calibri" w:hAnsi="Calibri"/>
+                <w:sz w:val="18"/>
               </w:rPr>
               <w:t>Next action</w:t>
             </w:r>
@@ -6864,16 +7995,35 @@
         </w:tc>
         <w:tc>
           <w:tcPr>
-            <w:tcW w:type="dxa" w:w="4680"/>
-          </w:tcPr>
-          <w:p>
-            <w:r>
-              <w:t>Run signed-device UAT across the five-role matrix: permissions, capture, cancellation, interruption, OCR review, rollback and role access.</w:t>
+            <w:tcW w:type="dxa" w:w="7128"/>
+            <w:vAlign w:val="center"/>
+            <w:tcMar>
+              <w:top w:w="80" w:type="dxa"/>
+              <w:start w:w="120" w:type="dxa"/>
+              <w:bottom w:w="80" w:type="dxa"/>
+              <w:end w:w="120" w:type="dxa"/>
+            </w:tcMar>
+          </w:tcPr>
+          <w:p>
+            <w:pPr>
+              <w:spacing w:after="0"/>
+            </w:pPr>
+            <w:r>
+              <w:rPr>
+                <w:rFonts w:ascii="Calibri" w:hAnsi="Calibri"/>
+                <w:sz w:val="18"/>
+              </w:rPr>
+              <w:t>Deploy after full CI, execute controlled physical UAT, and validate the ignored private record</w:t>
             </w:r>
           </w:p>
         </w:tc>
       </w:tr>
     </w:tbl>
+    <w:p>
+      <w:pPr>
+        <w:spacing w:after="0"/>
+      </w:pPr>
+    </w:p>
     <w:p>
       <w:pPr>
         <w:pStyle w:val="Heading1"/>
@@ -8424,156 +9574,385 @@
         </w:tc>
       </w:tr>
       <w:tr>
-        <w:tc>
-          <w:tcPr>
-            <w:tcW w:type="dxa" w:w="1872"/>
-          </w:tcPr>
-          <w:p>
-            <w:r>
+        <w:trPr>
+          <w:cantSplit/>
+        </w:trPr>
+        <w:tc>
+          <w:tcPr>
+            <w:tcW w:type="dxa" w:w="864"/>
+            <w:shd w:fill="F2F4F7"/>
+            <w:vAlign w:val="center"/>
+            <w:tcMar>
+              <w:top w:w="80" w:type="dxa"/>
+              <w:start w:w="120" w:type="dxa"/>
+              <w:bottom w:w="80" w:type="dxa"/>
+              <w:end w:w="120" w:type="dxa"/>
+            </w:tcMar>
+          </w:tcPr>
+          <w:p>
+            <w:pPr>
+              <w:spacing w:after="0"/>
+            </w:pPr>
+            <w:r>
+              <w:rPr>
+                <w:rFonts w:ascii="Calibri" w:hAnsi="Calibri"/>
+                <w:sz w:val="18"/>
+              </w:rPr>
               <w:t>D-012</w:t>
             </w:r>
           </w:p>
         </w:tc>
         <w:tc>
           <w:tcPr>
-            <w:tcW w:type="dxa" w:w="1872"/>
-          </w:tcPr>
-          <w:p>
-            <w:r>
+            <w:tcW w:type="dxa" w:w="1296"/>
+            <w:shd w:fill="F2F4F7"/>
+            <w:vAlign w:val="center"/>
+            <w:tcMar>
+              <w:top w:w="80" w:type="dxa"/>
+              <w:start w:w="120" w:type="dxa"/>
+              <w:bottom w:w="80" w:type="dxa"/>
+              <w:end w:w="120" w:type="dxa"/>
+            </w:tcMar>
+          </w:tcPr>
+          <w:p>
+            <w:pPr>
+              <w:spacing w:after="0"/>
+            </w:pPr>
+            <w:r>
+              <w:rPr>
+                <w:rFonts w:ascii="Calibri" w:hAnsi="Calibri"/>
+                <w:sz w:val="18"/>
+              </w:rPr>
               <w:t>24 Aug 2026</w:t>
             </w:r>
           </w:p>
         </w:tc>
         <w:tc>
           <w:tcPr>
-            <w:tcW w:type="dxa" w:w="1872"/>
-          </w:tcPr>
-          <w:p>
-            <w:r>
-              <w:t>Native on-device scanning behind a strict contract</w:t>
-            </w:r>
-          </w:p>
-        </w:tc>
-        <w:tc>
-          <w:tcPr>
-            <w:tcW w:type="dxa" w:w="1872"/>
-          </w:tcPr>
-          <w:p>
-            <w:r>
-              <w:t>Preserve privacy, offline capability, bounded resources and lifecycle ownership</w:t>
-            </w:r>
-          </w:p>
-        </w:tc>
-        <w:tc>
-          <w:tcPr>
-            <w:tcW w:type="dxa" w:w="1872"/>
-          </w:tcPr>
-          <w:p>
-            <w:r>
+            <w:tcW w:type="dxa" w:w="2304"/>
+            <w:shd w:fill="F2F4F7"/>
+            <w:vAlign w:val="center"/>
+            <w:tcMar>
+              <w:top w:w="80" w:type="dxa"/>
+              <w:start w:w="120" w:type="dxa"/>
+              <w:bottom w:w="80" w:type="dxa"/>
+              <w:end w:w="120" w:type="dxa"/>
+            </w:tcMar>
+          </w:tcPr>
+          <w:p>
+            <w:pPr>
+              <w:spacing w:after="0"/>
+            </w:pPr>
+            <w:r>
+              <w:rPr>
+                <w:rFonts w:ascii="Calibri" w:hAnsi="Calibri"/>
+                <w:sz w:val="18"/>
+              </w:rPr>
+              <w:t>Native on-device OCR behind strict contract</w:t>
+            </w:r>
+          </w:p>
+        </w:tc>
+        <w:tc>
+          <w:tcPr>
+            <w:tcW w:type="dxa" w:w="3528"/>
+            <w:shd w:fill="F2F4F7"/>
+            <w:vAlign w:val="center"/>
+            <w:tcMar>
+              <w:top w:w="80" w:type="dxa"/>
+              <w:start w:w="120" w:type="dxa"/>
+              <w:bottom w:w="80" w:type="dxa"/>
+              <w:end w:w="120" w:type="dxa"/>
+            </w:tcMar>
+          </w:tcPr>
+          <w:p>
+            <w:pPr>
+              <w:spacing w:after="0"/>
+            </w:pPr>
+            <w:r>
+              <w:rPr>
+                <w:rFonts w:ascii="Calibri" w:hAnsi="Calibri"/>
+                <w:sz w:val="18"/>
+              </w:rPr>
+              <w:t>Private bounded evidence and offline capability</w:t>
+            </w:r>
+          </w:p>
+        </w:tc>
+        <w:tc>
+          <w:tcPr>
+            <w:tcW w:type="dxa" w:w="1368"/>
+            <w:shd w:fill="F2F4F7"/>
+            <w:vAlign w:val="center"/>
+            <w:tcMar>
+              <w:top w:w="80" w:type="dxa"/>
+              <w:start w:w="120" w:type="dxa"/>
+              <w:bottom w:w="80" w:type="dxa"/>
+              <w:end w:w="120" w:type="dxa"/>
+            </w:tcMar>
+          </w:tcPr>
+          <w:p>
+            <w:pPr>
+              <w:spacing w:after="0"/>
+            </w:pPr>
+            <w:r>
+              <w:rPr>
+                <w:rFonts w:ascii="Calibri" w:hAnsi="Calibri"/>
+                <w:sz w:val="18"/>
+              </w:rPr>
               <w:t>Accepted</w:t>
             </w:r>
           </w:p>
         </w:tc>
       </w:tr>
       <w:tr>
-        <w:tc>
-          <w:tcPr>
-            <w:tcW w:type="dxa" w:w="1872"/>
-          </w:tcPr>
-          <w:p>
-            <w:r>
+        <w:trPr>
+          <w:cantSplit/>
+        </w:trPr>
+        <w:tc>
+          <w:tcPr>
+            <w:tcW w:type="dxa" w:w="864"/>
+            <w:vAlign w:val="center"/>
+            <w:tcMar>
+              <w:top w:w="80" w:type="dxa"/>
+              <w:start w:w="120" w:type="dxa"/>
+              <w:bottom w:w="80" w:type="dxa"/>
+              <w:end w:w="120" w:type="dxa"/>
+            </w:tcMar>
+          </w:tcPr>
+          <w:p>
+            <w:pPr>
+              <w:spacing w:after="0"/>
+            </w:pPr>
+            <w:r>
+              <w:rPr>
+                <w:rFonts w:ascii="Calibri" w:hAnsi="Calibri"/>
+                <w:sz w:val="18"/>
+              </w:rPr>
               <w:t>D-013</w:t>
             </w:r>
           </w:p>
         </w:tc>
         <w:tc>
           <w:tcPr>
-            <w:tcW w:type="dxa" w:w="1872"/>
-          </w:tcPr>
-          <w:p>
-            <w:r>
+            <w:tcW w:type="dxa" w:w="1296"/>
+            <w:vAlign w:val="center"/>
+            <w:tcMar>
+              <w:top w:w="80" w:type="dxa"/>
+              <w:start w:w="120" w:type="dxa"/>
+              <w:bottom w:w="80" w:type="dxa"/>
+              <w:end w:w="120" w:type="dxa"/>
+            </w:tcMar>
+          </w:tcPr>
+          <w:p>
+            <w:pPr>
+              <w:spacing w:after="0"/>
+            </w:pPr>
+            <w:r>
+              <w:rPr>
+                <w:rFonts w:ascii="Calibri" w:hAnsi="Calibri"/>
+                <w:sz w:val="18"/>
+              </w:rPr>
               <w:t>24 Aug 2026</w:t>
             </w:r>
           </w:p>
         </w:tc>
         <w:tc>
           <w:tcPr>
-            <w:tcW w:type="dxa" w:w="1872"/>
-          </w:tcPr>
-          <w:p>
-            <w:r>
-              <w:t>OCR remains reviewable evidence</w:t>
-            </w:r>
-          </w:p>
-        </w:tc>
-        <w:tc>
-          <w:tcPr>
-            <w:tcW w:type="dxa" w:w="1872"/>
-          </w:tcPr>
-          <w:p>
-            <w:r>
-              <w:t>Recognition must not silently change authoritative asset data</w:t>
-            </w:r>
-          </w:p>
-        </w:tc>
-        <w:tc>
-          <w:tcPr>
-            <w:tcW w:type="dxa" w:w="1872"/>
-          </w:tcPr>
-          <w:p>
-            <w:r>
+            <w:tcW w:type="dxa" w:w="2304"/>
+            <w:vAlign w:val="center"/>
+            <w:tcMar>
+              <w:top w:w="80" w:type="dxa"/>
+              <w:start w:w="120" w:type="dxa"/>
+              <w:bottom w:w="80" w:type="dxa"/>
+              <w:end w:w="120" w:type="dxa"/>
+            </w:tcMar>
+          </w:tcPr>
+          <w:p>
+            <w:pPr>
+              <w:spacing w:after="0"/>
+            </w:pPr>
+            <w:r>
+              <w:rPr>
+                <w:rFonts w:ascii="Calibri" w:hAnsi="Calibri"/>
+                <w:sz w:val="18"/>
+              </w:rPr>
+              <w:t>OCR remains human-reviewed evidence</w:t>
+            </w:r>
+          </w:p>
+        </w:tc>
+        <w:tc>
+          <w:tcPr>
+            <w:tcW w:type="dxa" w:w="3528"/>
+            <w:vAlign w:val="center"/>
+            <w:tcMar>
+              <w:top w:w="80" w:type="dxa"/>
+              <w:start w:w="120" w:type="dxa"/>
+              <w:bottom w:w="80" w:type="dxa"/>
+              <w:end w:w="120" w:type="dxa"/>
+            </w:tcMar>
+          </w:tcPr>
+          <w:p>
+            <w:pPr>
+              <w:spacing w:after="0"/>
+            </w:pPr>
+            <w:r>
+              <w:rPr>
+                <w:rFonts w:ascii="Calibri" w:hAnsi="Calibri"/>
+                <w:sz w:val="18"/>
+              </w:rPr>
+              <w:t>Prevent recognition errors becoming authoritative data</w:t>
+            </w:r>
+          </w:p>
+        </w:tc>
+        <w:tc>
+          <w:tcPr>
+            <w:tcW w:type="dxa" w:w="1368"/>
+            <w:vAlign w:val="center"/>
+            <w:tcMar>
+              <w:top w:w="80" w:type="dxa"/>
+              <w:start w:w="120" w:type="dxa"/>
+              <w:bottom w:w="80" w:type="dxa"/>
+              <w:end w:w="120" w:type="dxa"/>
+            </w:tcMar>
+          </w:tcPr>
+          <w:p>
+            <w:pPr>
+              <w:spacing w:after="0"/>
+            </w:pPr>
+            <w:r>
+              <w:rPr>
+                <w:rFonts w:ascii="Calibri" w:hAnsi="Calibri"/>
+                <w:sz w:val="18"/>
+              </w:rPr>
               <w:t>Accepted</w:t>
             </w:r>
           </w:p>
         </w:tc>
       </w:tr>
       <w:tr>
-        <w:tc>
-          <w:tcPr>
-            <w:tcW w:type="dxa" w:w="1872"/>
-          </w:tcPr>
-          <w:p>
-            <w:r>
+        <w:trPr>
+          <w:cantSplit/>
+        </w:trPr>
+        <w:tc>
+          <w:tcPr>
+            <w:tcW w:type="dxa" w:w="864"/>
+            <w:shd w:fill="F2F4F7"/>
+            <w:vAlign w:val="center"/>
+            <w:tcMar>
+              <w:top w:w="80" w:type="dxa"/>
+              <w:start w:w="120" w:type="dxa"/>
+              <w:bottom w:w="80" w:type="dxa"/>
+              <w:end w:w="120" w:type="dxa"/>
+            </w:tcMar>
+          </w:tcPr>
+          <w:p>
+            <w:pPr>
+              <w:spacing w:after="0"/>
+            </w:pPr>
+            <w:r>
+              <w:rPr>
+                <w:rFonts w:ascii="Calibri" w:hAnsi="Calibri"/>
+                <w:sz w:val="18"/>
+              </w:rPr>
               <w:t>D-014</w:t>
             </w:r>
           </w:p>
         </w:tc>
         <w:tc>
           <w:tcPr>
-            <w:tcW w:type="dxa" w:w="1872"/>
-          </w:tcPr>
-          <w:p>
-            <w:r>
+            <w:tcW w:type="dxa" w:w="1296"/>
+            <w:shd w:fill="F2F4F7"/>
+            <w:vAlign w:val="center"/>
+            <w:tcMar>
+              <w:top w:w="80" w:type="dxa"/>
+              <w:start w:w="120" w:type="dxa"/>
+              <w:bottom w:w="80" w:type="dxa"/>
+              <w:end w:w="120" w:type="dxa"/>
+            </w:tcMar>
+          </w:tcPr>
+          <w:p>
+            <w:pPr>
+              <w:spacing w:after="0"/>
+            </w:pPr>
+            <w:r>
+              <w:rPr>
+                <w:rFonts w:ascii="Calibri" w:hAnsi="Calibri"/>
+                <w:sz w:val="18"/>
+              </w:rPr>
               <w:t>24 Aug 2026</w:t>
             </w:r>
           </w:p>
         </w:tc>
         <w:tc>
           <w:tcPr>
-            <w:tcW w:type="dxa" w:w="1872"/>
-          </w:tcPr>
-          <w:p>
-            <w:r>
-              <w:t>Two-phase immutable evidence persistence</w:t>
-            </w:r>
-          </w:p>
-        </w:tc>
-        <w:tc>
-          <w:tcPr>
-            <w:tcW w:type="dxa" w:w="1872"/>
-          </w:tcPr>
-          <w:p>
-            <w:r>
-              <w:t>Prevent orphaned private objects and hash/provenance drift</w:t>
-            </w:r>
-          </w:p>
-        </w:tc>
-        <w:tc>
-          <w:tcPr>
-            <w:tcW w:type="dxa" w:w="1872"/>
-          </w:tcPr>
-          <w:p>
-            <w:r>
+            <w:tcW w:type="dxa" w:w="2304"/>
+            <w:shd w:fill="F2F4F7"/>
+            <w:vAlign w:val="center"/>
+            <w:tcMar>
+              <w:top w:w="80" w:type="dxa"/>
+              <w:start w:w="120" w:type="dxa"/>
+              <w:bottom w:w="80" w:type="dxa"/>
+              <w:end w:w="120" w:type="dxa"/>
+            </w:tcMar>
+          </w:tcPr>
+          <w:p>
+            <w:pPr>
+              <w:spacing w:after="0"/>
+            </w:pPr>
+            <w:r>
+              <w:rPr>
+                <w:rFonts w:ascii="Calibri" w:hAnsi="Calibri"/>
+                <w:sz w:val="18"/>
+              </w:rPr>
+              <w:t>Private alias-only executable physical UAT</w:t>
+            </w:r>
+          </w:p>
+        </w:tc>
+        <w:tc>
+          <w:tcPr>
+            <w:tcW w:type="dxa" w:w="3528"/>
+            <w:shd w:fill="F2F4F7"/>
+            <w:vAlign w:val="center"/>
+            <w:tcMar>
+              <w:top w:w="80" w:type="dxa"/>
+              <w:start w:w="120" w:type="dxa"/>
+              <w:bottom w:w="80" w:type="dxa"/>
+              <w:end w:w="120" w:type="dxa"/>
+            </w:tcMar>
+          </w:tcPr>
+          <w:p>
+            <w:pPr>
+              <w:spacing w:after="0"/>
+            </w:pPr>
+            <w:r>
+              <w:rPr>
+                <w:rFonts w:ascii="Calibri" w:hAnsi="Calibri"/>
+                <w:sz w:val="18"/>
+              </w:rPr>
+              <w:t>Prevent false certification and sensitive-data leakage</w:t>
+            </w:r>
+          </w:p>
+        </w:tc>
+        <w:tc>
+          <w:tcPr>
+            <w:tcW w:type="dxa" w:w="1368"/>
+            <w:shd w:fill="F2F4F7"/>
+            <w:vAlign w:val="center"/>
+            <w:tcMar>
+              <w:top w:w="80" w:type="dxa"/>
+              <w:start w:w="120" w:type="dxa"/>
+              <w:bottom w:w="80" w:type="dxa"/>
+              <w:end w:w="120" w:type="dxa"/>
+            </w:tcMar>
+          </w:tcPr>
+          <w:p>
+            <w:pPr>
+              <w:spacing w:after="0"/>
+            </w:pPr>
+            <w:r>
+              <w:rPr>
+                <w:rFonts w:ascii="Calibri" w:hAnsi="Calibri"/>
+                <w:sz w:val="18"/>
+              </w:rPr>
               <w:t>Accepted</w:t>
             </w:r>
           </w:p>
@@ -9897,105 +11276,386 @@
         </w:tc>
       </w:tr>
       <w:tr>
-        <w:tc>
-          <w:tcPr>
-            <w:tcW w:type="dxa" w:w="1872"/>
-          </w:tcPr>
-          <w:p>
-            <w:r>
+        <w:trPr>
+          <w:cantSplit/>
+        </w:trPr>
+        <w:tc>
+          <w:tcPr>
+            <w:tcW w:type="dxa" w:w="1008"/>
+            <w:shd w:fill="F2F4F7"/>
+            <w:vAlign w:val="center"/>
+            <w:tcMar>
+              <w:top w:w="80" w:type="dxa"/>
+              <w:start w:w="120" w:type="dxa"/>
+              <w:bottom w:w="80" w:type="dxa"/>
+              <w:end w:w="120" w:type="dxa"/>
+            </w:tcMar>
+          </w:tcPr>
+          <w:p>
+            <w:pPr>
+              <w:spacing w:after="0"/>
+            </w:pPr>
+            <w:r>
+              <w:rPr>
+                <w:rFonts w:ascii="Calibri" w:hAnsi="Calibri"/>
+                <w:sz w:val="18"/>
+              </w:rPr>
               <w:t>E-009</w:t>
             </w:r>
           </w:p>
         </w:tc>
         <w:tc>
           <w:tcPr>
-            <w:tcW w:type="dxa" w:w="1872"/>
-          </w:tcPr>
-          <w:p>
-            <w:r>
+            <w:tcW w:type="dxa" w:w="1080"/>
+            <w:shd w:fill="F2F4F7"/>
+            <w:vAlign w:val="center"/>
+            <w:tcMar>
+              <w:top w:w="80" w:type="dxa"/>
+              <w:start w:w="120" w:type="dxa"/>
+              <w:bottom w:w="80" w:type="dxa"/>
+              <w:end w:w="120" w:type="dxa"/>
+            </w:tcMar>
+          </w:tcPr>
+          <w:p>
+            <w:pPr>
+              <w:spacing w:after="0"/>
+            </w:pPr>
+            <w:r>
+              <w:rPr>
+                <w:rFonts w:ascii="Calibri" w:hAnsi="Calibri"/>
+                <w:sz w:val="18"/>
+              </w:rPr>
               <w:t>OCR-1</w:t>
             </w:r>
           </w:p>
         </w:tc>
         <w:tc>
           <w:tcPr>
-            <w:tcW w:type="dxa" w:w="1872"/>
-          </w:tcPr>
-          <w:p>
-            <w:r>
-              <w:t>Contract, integrity, cleanup, fallback and human-review proof</w:t>
-            </w:r>
-          </w:p>
-        </w:tc>
-        <w:tc>
-          <w:tcPr>
-            <w:tcW w:type="dxa" w:w="1872"/>
-          </w:tcPr>
-          <w:p>
-            <w:r>
-              <w:t>Verified locally</w:t>
-            </w:r>
-          </w:p>
-        </w:tc>
-        <w:tc>
-          <w:tcPr>
-            <w:tcW w:type="dxa" w:w="1872"/>
-          </w:tcPr>
-          <w:p>
-            <w:r>
-              <w:t>Full gate passed with 93/93 browser tests; security review covered all changed source files</w:t>
+            <w:tcW w:type="dxa" w:w="3960"/>
+            <w:shd w:fill="F2F4F7"/>
+            <w:vAlign w:val="center"/>
+            <w:tcMar>
+              <w:top w:w="80" w:type="dxa"/>
+              <w:start w:w="120" w:type="dxa"/>
+              <w:bottom w:w="80" w:type="dxa"/>
+              <w:end w:w="120" w:type="dxa"/>
+            </w:tcMar>
+          </w:tcPr>
+          <w:p>
+            <w:pPr>
+              <w:spacing w:after="0"/>
+            </w:pPr>
+            <w:r>
+              <w:rPr>
+                <w:rFonts w:ascii="Calibri" w:hAnsi="Calibri"/>
+                <w:sz w:val="18"/>
+              </w:rPr>
+              <w:t>Contract, integrity, cleanup, fallback, and review proof</w:t>
+            </w:r>
+          </w:p>
+        </w:tc>
+        <w:tc>
+          <w:tcPr>
+            <w:tcW w:type="dxa" w:w="1224"/>
+            <w:shd w:fill="F2F4F7"/>
+            <w:vAlign w:val="center"/>
+            <w:tcMar>
+              <w:top w:w="80" w:type="dxa"/>
+              <w:start w:w="120" w:type="dxa"/>
+              <w:bottom w:w="80" w:type="dxa"/>
+              <w:end w:w="120" w:type="dxa"/>
+            </w:tcMar>
+          </w:tcPr>
+          <w:p>
+            <w:pPr>
+              <w:spacing w:after="0"/>
+            </w:pPr>
+            <w:r>
+              <w:rPr>
+                <w:rFonts w:ascii="Calibri" w:hAnsi="Calibri"/>
+                <w:sz w:val="18"/>
+              </w:rPr>
+              <w:t>Verified</w:t>
+            </w:r>
+          </w:p>
+        </w:tc>
+        <w:tc>
+          <w:tcPr>
+            <w:tcW w:type="dxa" w:w="2088"/>
+            <w:shd w:fill="F2F4F7"/>
+            <w:vAlign w:val="center"/>
+            <w:tcMar>
+              <w:top w:w="80" w:type="dxa"/>
+              <w:start w:w="120" w:type="dxa"/>
+              <w:bottom w:w="80" w:type="dxa"/>
+              <w:end w:w="120" w:type="dxa"/>
+            </w:tcMar>
+          </w:tcPr>
+          <w:p>
+            <w:pPr>
+              <w:spacing w:after="0"/>
+            </w:pPr>
+            <w:r>
+              <w:rPr>
+                <w:rFonts w:ascii="Calibri" w:hAnsi="Calibri"/>
+                <w:sz w:val="18"/>
+              </w:rPr>
+              <w:t>Release gate, security scan, and browser tests passed</w:t>
             </w:r>
           </w:p>
         </w:tc>
       </w:tr>
       <w:tr>
-        <w:tc>
-          <w:tcPr>
-            <w:tcW w:type="dxa" w:w="1872"/>
-          </w:tcPr>
-          <w:p>
-            <w:r>
+        <w:trPr>
+          <w:cantSplit/>
+        </w:trPr>
+        <w:tc>
+          <w:tcPr>
+            <w:tcW w:type="dxa" w:w="1008"/>
+            <w:vAlign w:val="center"/>
+            <w:tcMar>
+              <w:top w:w="80" w:type="dxa"/>
+              <w:start w:w="120" w:type="dxa"/>
+              <w:bottom w:w="80" w:type="dxa"/>
+              <w:end w:w="120" w:type="dxa"/>
+            </w:tcMar>
+          </w:tcPr>
+          <w:p>
+            <w:pPr>
+              <w:spacing w:after="0"/>
+            </w:pPr>
+            <w:r>
+              <w:rPr>
+                <w:rFonts w:ascii="Calibri" w:hAnsi="Calibri"/>
+                <w:sz w:val="18"/>
+              </w:rPr>
               <w:t>E-010</w:t>
             </w:r>
           </w:p>
         </w:tc>
         <w:tc>
           <w:tcPr>
-            <w:tcW w:type="dxa" w:w="1872"/>
-          </w:tcPr>
-          <w:p>
-            <w:r>
+            <w:tcW w:type="dxa" w:w="1080"/>
+            <w:vAlign w:val="center"/>
+            <w:tcMar>
+              <w:top w:w="80" w:type="dxa"/>
+              <w:start w:w="120" w:type="dxa"/>
+              <w:bottom w:w="80" w:type="dxa"/>
+              <w:end w:w="120" w:type="dxa"/>
+            </w:tcMar>
+          </w:tcPr>
+          <w:p>
+            <w:pPr>
+              <w:spacing w:after="0"/>
+            </w:pPr>
+            <w:r>
+              <w:rPr>
+                <w:rFonts w:ascii="Calibri" w:hAnsi="Calibri"/>
+                <w:sz w:val="18"/>
+              </w:rPr>
               <w:t>OCR-2</w:t>
             </w:r>
           </w:p>
         </w:tc>
         <w:tc>
           <w:tcPr>
-            <w:tcW w:type="dxa" w:w="1872"/>
-          </w:tcPr>
-          <w:p>
-            <w:r>
+            <w:tcW w:type="dxa" w:w="3960"/>
+            <w:vAlign w:val="center"/>
+            <w:tcMar>
+              <w:top w:w="80" w:type="dxa"/>
+              <w:start w:w="120" w:type="dxa"/>
+              <w:bottom w:w="80" w:type="dxa"/>
+              <w:end w:w="120" w:type="dxa"/>
+            </w:tcMar>
+          </w:tcPr>
+          <w:p>
+            <w:pPr>
+              <w:spacing w:after="0"/>
+            </w:pPr>
+            <w:r>
+              <w:rPr>
+                <w:rFonts w:ascii="Calibri" w:hAnsi="Calibri"/>
+                <w:sz w:val="18"/>
+              </w:rPr>
               <w:t>Android ML Kit and iOS VisionKit/Vision compile and device proof</w:t>
             </w:r>
           </w:p>
         </w:tc>
         <w:tc>
           <w:tcPr>
-            <w:tcW w:type="dxa" w:w="1872"/>
-          </w:tcPr>
-          <w:p>
-            <w:r>
+            <w:tcW w:type="dxa" w:w="1224"/>
+            <w:vAlign w:val="center"/>
+            <w:tcMar>
+              <w:top w:w="80" w:type="dxa"/>
+              <w:start w:w="120" w:type="dxa"/>
+              <w:bottom w:w="80" w:type="dxa"/>
+              <w:end w:w="120" w:type="dxa"/>
+            </w:tcMar>
+          </w:tcPr>
+          <w:p>
+            <w:pPr>
+              <w:spacing w:after="0"/>
+            </w:pPr>
+            <w:r>
+              <w:rPr>
+                <w:rFonts w:ascii="Calibri" w:hAnsi="Calibri"/>
+                <w:sz w:val="18"/>
+              </w:rPr>
               <w:t>Partial</w:t>
             </w:r>
           </w:p>
         </w:tc>
         <w:tc>
           <w:tcPr>
-            <w:tcW w:type="dxa" w:w="1872"/>
-          </w:tcPr>
-          <w:p>
-            <w:r>
-              <w:t>Native source/lifecycle review passed; remote CI and signed-device UAT pending</w:t>
+            <w:tcW w:type="dxa" w:w="2088"/>
+            <w:vAlign w:val="center"/>
+            <w:tcMar>
+              <w:top w:w="80" w:type="dxa"/>
+              <w:start w:w="120" w:type="dxa"/>
+              <w:bottom w:w="80" w:type="dxa"/>
+              <w:end w:w="120" w:type="dxa"/>
+            </w:tcMar>
+          </w:tcPr>
+          <w:p>
+            <w:pPr>
+              <w:spacing w:after="0"/>
+            </w:pPr>
+            <w:r>
+              <w:rPr>
+                <w:rFonts w:ascii="Calibri" w:hAnsi="Calibri"/>
+                <w:sz w:val="18"/>
+              </w:rPr>
+              <w:t>Remote native CI passed; signed physical-device UAT pending</w:t>
+            </w:r>
+          </w:p>
+        </w:tc>
+      </w:tr>
+      <w:tr>
+        <w:trPr>
+          <w:cantSplit/>
+        </w:trPr>
+        <w:tc>
+          <w:tcPr>
+            <w:tcW w:type="dxa" w:w="1008"/>
+            <w:shd w:fill="F2F4F7"/>
+            <w:vAlign w:val="center"/>
+            <w:tcMar>
+              <w:top w:w="80" w:type="dxa"/>
+              <w:start w:w="120" w:type="dxa"/>
+              <w:bottom w:w="80" w:type="dxa"/>
+              <w:end w:w="120" w:type="dxa"/>
+            </w:tcMar>
+          </w:tcPr>
+          <w:p>
+            <w:pPr>
+              <w:spacing w:after="0"/>
+            </w:pPr>
+            <w:r>
+              <w:rPr>
+                <w:rFonts w:ascii="Calibri" w:hAnsi="Calibri"/>
+                <w:sz w:val="18"/>
+              </w:rPr>
+              <w:t>E-011</w:t>
+            </w:r>
+          </w:p>
+        </w:tc>
+        <w:tc>
+          <w:tcPr>
+            <w:tcW w:type="dxa" w:w="1080"/>
+            <w:shd w:fill="F2F4F7"/>
+            <w:vAlign w:val="center"/>
+            <w:tcMar>
+              <w:top w:w="80" w:type="dxa"/>
+              <w:start w:w="120" w:type="dxa"/>
+              <w:bottom w:w="80" w:type="dxa"/>
+              <w:end w:w="120" w:type="dxa"/>
+            </w:tcMar>
+          </w:tcPr>
+          <w:p>
+            <w:pPr>
+              <w:spacing w:after="0"/>
+            </w:pPr>
+            <w:r>
+              <w:rPr>
+                <w:rFonts w:ascii="Calibri" w:hAnsi="Calibri"/>
+                <w:sz w:val="18"/>
+              </w:rPr>
+              <w:t>OCR-3</w:t>
+            </w:r>
+          </w:p>
+        </w:tc>
+        <w:tc>
+          <w:tcPr>
+            <w:tcW w:type="dxa" w:w="3960"/>
+            <w:shd w:fill="F2F4F7"/>
+            <w:vAlign w:val="center"/>
+            <w:tcMar>
+              <w:top w:w="80" w:type="dxa"/>
+              <w:start w:w="120" w:type="dxa"/>
+              <w:bottom w:w="80" w:type="dxa"/>
+              <w:end w:w="120" w:type="dxa"/>
+            </w:tcMar>
+          </w:tcPr>
+          <w:p>
+            <w:pPr>
+              <w:spacing w:after="0"/>
+            </w:pPr>
+            <w:r>
+              <w:rPr>
+                <w:rFonts w:ascii="Calibri" w:hAnsi="Calibri"/>
+                <w:sz w:val="18"/>
+              </w:rPr>
+              <w:t>Five-role UAT contract, privacy gate, and execution guide</w:t>
+            </w:r>
+          </w:p>
+        </w:tc>
+        <w:tc>
+          <w:tcPr>
+            <w:tcW w:type="dxa" w:w="1224"/>
+            <w:shd w:fill="F2F4F7"/>
+            <w:vAlign w:val="center"/>
+            <w:tcMar>
+              <w:top w:w="80" w:type="dxa"/>
+              <w:start w:w="120" w:type="dxa"/>
+              <w:bottom w:w="80" w:type="dxa"/>
+              <w:end w:w="120" w:type="dxa"/>
+            </w:tcMar>
+          </w:tcPr>
+          <w:p>
+            <w:pPr>
+              <w:spacing w:after="0"/>
+            </w:pPr>
+            <w:r>
+              <w:rPr>
+                <w:rFonts w:ascii="Calibri" w:hAnsi="Calibri"/>
+                <w:sz w:val="18"/>
+              </w:rPr>
+              <w:t>Verified locally</w:t>
+            </w:r>
+          </w:p>
+        </w:tc>
+        <w:tc>
+          <w:tcPr>
+            <w:tcW w:type="dxa" w:w="2088"/>
+            <w:shd w:fill="F2F4F7"/>
+            <w:vAlign w:val="center"/>
+            <w:tcMar>
+              <w:top w:w="80" w:type="dxa"/>
+              <w:start w:w="120" w:type="dxa"/>
+              <w:bottom w:w="80" w:type="dxa"/>
+              <w:end w:w="120" w:type="dxa"/>
+            </w:tcMar>
+          </w:tcPr>
+          <w:p>
+            <w:pPr>
+              <w:spacing w:after="0"/>
+            </w:pPr>
+            <w:r>
+              <w:rPr>
+                <w:rFonts w:ascii="Calibri" w:hAnsi="Calibri"/>
+                <w:sz w:val="18"/>
+              </w:rPr>
+              <w:t>6/6 contract tests pass; physical results pending</w:t>
             </w:r>
           </w:p>
         </w:tc>
@@ -10850,127 +12510,207 @@
         </w:tc>
       </w:tr>
       <w:tr>
-        <w:tc>
-          <w:tcPr>
-            <w:tcW w:type="dxa" w:w="2340"/>
-          </w:tcPr>
-          <w:p>
-            <w:r>
-              <w:t>Interrupted native scan leaves cache residue</w:t>
-            </w:r>
-          </w:p>
-        </w:tc>
-        <w:tc>
-          <w:tcPr>
-            <w:tcW w:type="dxa" w:w="2340"/>
-          </w:tcPr>
-          <w:p>
-            <w:r>
-              <w:t>Sensitive evidence remains on a device longer than intended</w:t>
-            </w:r>
-          </w:p>
-        </w:tc>
-        <w:tc>
-          <w:tcPr>
-            <w:tcW w:type="dxa" w:w="2340"/>
-          </w:tcPr>
-          <w:p>
-            <w:r>
-              <w:t>Private/protected cache, safe startup sweep, no backup and no path logging</w:t>
-            </w:r>
-          </w:p>
-        </w:tc>
-        <w:tc>
-          <w:tcPr>
-            <w:tcW w:type="dxa" w:w="2340"/>
-          </w:tcPr>
-          <w:p>
-            <w:r>
-              <w:t>Controlled; device kill-test pending</w:t>
+        <w:trPr>
+          <w:cantSplit/>
+        </w:trPr>
+        <w:tc>
+          <w:tcPr>
+            <w:tcW w:type="dxa" w:w="2376"/>
+            <w:shd w:fill="F2F4F7"/>
+            <w:vAlign w:val="center"/>
+            <w:tcMar>
+              <w:top w:w="80" w:type="dxa"/>
+              <w:start w:w="120" w:type="dxa"/>
+              <w:bottom w:w="80" w:type="dxa"/>
+              <w:end w:w="120" w:type="dxa"/>
+            </w:tcMar>
+          </w:tcPr>
+          <w:p>
+            <w:pPr>
+              <w:spacing w:after="0"/>
+            </w:pPr>
+            <w:r>
+              <w:rPr>
+                <w:rFonts w:ascii="Calibri" w:hAnsi="Calibri"/>
+                <w:sz w:val="18"/>
+              </w:rPr>
+              <w:t>Interrupted scan leaves cache residue</w:t>
+            </w:r>
+          </w:p>
+        </w:tc>
+        <w:tc>
+          <w:tcPr>
+            <w:tcW w:type="dxa" w:w="2088"/>
+            <w:shd w:fill="F2F4F7"/>
+            <w:vAlign w:val="center"/>
+            <w:tcMar>
+              <w:top w:w="80" w:type="dxa"/>
+              <w:start w:w="120" w:type="dxa"/>
+              <w:bottom w:w="80" w:type="dxa"/>
+              <w:end w:w="120" w:type="dxa"/>
+            </w:tcMar>
+          </w:tcPr>
+          <w:p>
+            <w:pPr>
+              <w:spacing w:after="0"/>
+            </w:pPr>
+            <w:r>
+              <w:rPr>
+                <w:rFonts w:ascii="Calibri" w:hAnsi="Calibri"/>
+                <w:sz w:val="18"/>
+              </w:rPr>
+              <w:t>Private evidence persists</w:t>
+            </w:r>
+          </w:p>
+        </w:tc>
+        <w:tc>
+          <w:tcPr>
+            <w:tcW w:type="dxa" w:w="3528"/>
+            <w:shd w:fill="F2F4F7"/>
+            <w:vAlign w:val="center"/>
+            <w:tcMar>
+              <w:top w:w="80" w:type="dxa"/>
+              <w:start w:w="120" w:type="dxa"/>
+              <w:bottom w:w="80" w:type="dxa"/>
+              <w:end w:w="120" w:type="dxa"/>
+            </w:tcMar>
+          </w:tcPr>
+          <w:p>
+            <w:pPr>
+              <w:spacing w:after="0"/>
+            </w:pPr>
+            <w:r>
+              <w:rPr>
+                <w:rFonts w:ascii="Calibri" w:hAnsi="Calibri"/>
+                <w:sz w:val="18"/>
+              </w:rPr>
+              <w:t>Private cache, cleanup and startup sweep</w:t>
+            </w:r>
+          </w:p>
+        </w:tc>
+        <w:tc>
+          <w:tcPr>
+            <w:tcW w:type="dxa" w:w="1368"/>
+            <w:shd w:fill="F2F4F7"/>
+            <w:vAlign w:val="center"/>
+            <w:tcMar>
+              <w:top w:w="80" w:type="dxa"/>
+              <w:start w:w="120" w:type="dxa"/>
+              <w:bottom w:w="80" w:type="dxa"/>
+              <w:end w:w="120" w:type="dxa"/>
+            </w:tcMar>
+          </w:tcPr>
+          <w:p>
+            <w:pPr>
+              <w:spacing w:after="0"/>
+            </w:pPr>
+            <w:r>
+              <w:rPr>
+                <w:rFonts w:ascii="Calibri" w:hAnsi="Calibri"/>
+                <w:sz w:val="18"/>
+              </w:rPr>
+              <w:t>Code controlled; device test pending</w:t>
             </w:r>
           </w:p>
         </w:tc>
       </w:tr>
       <w:tr>
-        <w:tc>
-          <w:tcPr>
-            <w:tcW w:type="dxa" w:w="2340"/>
-          </w:tcPr>
-          <w:p>
-            <w:r>
-              <w:t>Evidence upload becomes orphaned or mutable</w:t>
-            </w:r>
-          </w:p>
-        </w:tc>
-        <w:tc>
-          <w:tcPr>
-            <w:tcW w:type="dxa" w:w="2340"/>
-          </w:tcPr>
-          <w:p>
-            <w:r>
-              <w:t>Private bytes and audit digest diverge</w:t>
-            </w:r>
-          </w:p>
-        </w:tc>
-        <w:tc>
-          <w:tcPr>
-            <w:tcW w:type="dxa" w:w="2340"/>
-          </w:tcPr>
-          <w:p>
-            <w:r>
-              <w:t>Pending row before upload, checked rollback, immutable ready objects and provenance</w:t>
-            </w:r>
-          </w:p>
-        </w:tc>
-        <w:tc>
-          <w:tcPr>
-            <w:tcW w:type="dxa" w:w="2340"/>
-          </w:tcPr>
-          <w:p>
-            <w:r>
-              <w:t>Controlled in code; remote pgTAP pending</w:t>
-            </w:r>
-          </w:p>
-        </w:tc>
-      </w:tr>
-      <w:tr>
-        <w:tc>
-          <w:tcPr>
-            <w:tcW w:type="dxa" w:w="2340"/>
-          </w:tcPr>
-          <w:p>
-            <w:r>
-              <w:t>OCR suggestion is treated as verified truth</w:t>
-            </w:r>
-          </w:p>
-        </w:tc>
-        <w:tc>
-          <w:tcPr>
-            <w:tcW w:type="dxa" w:w="2340"/>
-          </w:tcPr>
-          <w:p>
-            <w:r>
-              <w:t>Incorrect identifiers or dates enter operations</w:t>
-            </w:r>
-          </w:p>
-        </w:tc>
-        <w:tc>
-          <w:tcPr>
-            <w:tcW w:type="dxa" w:w="2340"/>
-          </w:tcPr>
-          <w:p>
-            <w:r>
-              <w:t>Apply-and-verify gate, confidence/provenance display and audit metadata</w:t>
-            </w:r>
-          </w:p>
-        </w:tc>
-        <w:tc>
-          <w:tcPr>
-            <w:tcW w:type="dxa" w:w="2340"/>
-          </w:tcPr>
-          <w:p>
-            <w:r>
-              <w:t>Controlled; UAT matrix pending</w:t>
+        <w:trPr>
+          <w:cantSplit/>
+        </w:trPr>
+        <w:tc>
+          <w:tcPr>
+            <w:tcW w:type="dxa" w:w="2376"/>
+            <w:vAlign w:val="center"/>
+            <w:tcMar>
+              <w:top w:w="80" w:type="dxa"/>
+              <w:start w:w="120" w:type="dxa"/>
+              <w:bottom w:w="80" w:type="dxa"/>
+              <w:end w:w="120" w:type="dxa"/>
+            </w:tcMar>
+          </w:tcPr>
+          <w:p>
+            <w:pPr>
+              <w:spacing w:after="0"/>
+            </w:pPr>
+            <w:r>
+              <w:rPr>
+                <w:rFonts w:ascii="Calibri" w:hAnsi="Calibri"/>
+                <w:sz w:val="18"/>
+              </w:rPr>
+              <w:t>OCR suggestion treated as truth</w:t>
+            </w:r>
+          </w:p>
+        </w:tc>
+        <w:tc>
+          <w:tcPr>
+            <w:tcW w:type="dxa" w:w="2088"/>
+            <w:vAlign w:val="center"/>
+            <w:tcMar>
+              <w:top w:w="80" w:type="dxa"/>
+              <w:start w:w="120" w:type="dxa"/>
+              <w:bottom w:w="80" w:type="dxa"/>
+              <w:end w:w="120" w:type="dxa"/>
+            </w:tcMar>
+          </w:tcPr>
+          <w:p>
+            <w:pPr>
+              <w:spacing w:after="0"/>
+            </w:pPr>
+            <w:r>
+              <w:rPr>
+                <w:rFonts w:ascii="Calibri" w:hAnsi="Calibri"/>
+                <w:sz w:val="18"/>
+              </w:rPr>
+              <w:t>Incorrect asset data</w:t>
+            </w:r>
+          </w:p>
+        </w:tc>
+        <w:tc>
+          <w:tcPr>
+            <w:tcW w:type="dxa" w:w="3528"/>
+            <w:vAlign w:val="center"/>
+            <w:tcMar>
+              <w:top w:w="80" w:type="dxa"/>
+              <w:start w:w="120" w:type="dxa"/>
+              <w:bottom w:w="80" w:type="dxa"/>
+              <w:end w:w="120" w:type="dxa"/>
+            </w:tcMar>
+          </w:tcPr>
+          <w:p>
+            <w:pPr>
+              <w:spacing w:after="0"/>
+            </w:pPr>
+            <w:r>
+              <w:rPr>
+                <w:rFonts w:ascii="Calibri" w:hAnsi="Calibri"/>
+                <w:sz w:val="18"/>
+              </w:rPr>
+              <w:t>Human apply/verify and immutable provenance</w:t>
+            </w:r>
+          </w:p>
+        </w:tc>
+        <w:tc>
+          <w:tcPr>
+            <w:tcW w:type="dxa" w:w="1368"/>
+            <w:vAlign w:val="center"/>
+            <w:tcMar>
+              <w:top w:w="80" w:type="dxa"/>
+              <w:start w:w="120" w:type="dxa"/>
+              <w:bottom w:w="80" w:type="dxa"/>
+              <w:end w:w="120" w:type="dxa"/>
+            </w:tcMar>
+          </w:tcPr>
+          <w:p>
+            <w:pPr>
+              <w:spacing w:after="0"/>
+            </w:pPr>
+            <w:r>
+              <w:rPr>
+                <w:rFonts w:ascii="Calibri" w:hAnsi="Calibri"/>
+                <w:sz w:val="18"/>
+              </w:rPr>
+              <w:t>Code controlled; UAT pending</w:t>
             </w:r>
           </w:p>
         </w:tc>

</xml_diff>

<commit_message>
OCR-3: add signed-device UAT release gate (#56)
Adds the executable five-role, 25-result signed-device UAT contract, privacy-safe validator, release-gate integration, responsive operator guidance, and journey artifacts. Physical signed-device UAT remains required before device certification.
</commit_message>
<xml_diff>
--- a/output/doc/senatla-ops-implementation-journey.docx
+++ b/output/doc/senatla-ops-implementation-journey.docx
@@ -208,8 +208,15 @@
             </w:tcMar>
           </w:tcPr>
           <w:p>
-            <w:r>
-              <w:t>sankofa_xciv/ocr-1-2-native-scanning</w:t>
+            <w:pPr>
+              <w:spacing w:after="0"/>
+            </w:pPr>
+            <w:r>
+              <w:rPr>
+                <w:rFonts w:ascii="Calibri" w:hAnsi="Calibri"/>
+                <w:sz w:val="18"/>
+              </w:rPr>
+              <w:t>sankofa_xciv/ocr-3-device-uat-gate</w:t>
             </w:r>
           </w:p>
         </w:tc>
@@ -6519,44 +6526,92 @@
     <w:tbl>
       <w:tblPr>
         <w:tblStyle w:val="TableGrid"/>
-        <w:tblW w:type="auto" w:w="0"/>
+        <w:tblW w:type="dxa" w:w="9360"/>
+        <w:tblLayout w:type="fixed"/>
         <w:tblLook w:firstColumn="1" w:firstRow="1" w:lastColumn="0" w:lastRow="0" w:noHBand="0" w:noVBand="1" w:val="04A0"/>
+        <w:jc w:val="left"/>
+        <w:tblInd w:w="120" w:type="dxa"/>
       </w:tblPr>
       <w:tblGrid>
         <w:gridCol w:w="4680"/>
         <w:gridCol w:w="4680"/>
       </w:tblGrid>
       <w:tr>
-        <w:tc>
-          <w:tcPr>
-            <w:tcW w:type="dxa" w:w="4680"/>
-          </w:tcPr>
-          <w:p>
-            <w:r>
+        <w:trPr>
+          <w:tblHeader w:val="true"/>
+        </w:trPr>
+        <w:tc>
+          <w:tcPr>
+            <w:tcW w:type="dxa" w:w="2232"/>
+            <w:vAlign w:val="center"/>
+            <w:tcMar>
+              <w:top w:w="80" w:type="dxa"/>
+              <w:start w:w="120" w:type="dxa"/>
+              <w:bottom w:w="80" w:type="dxa"/>
+              <w:end w:w="120" w:type="dxa"/>
+            </w:tcMar>
+            <w:shd w:fill="17365D"/>
+          </w:tcPr>
+          <w:p>
+            <w:r>
+              <w:rPr>
+                <w:rFonts w:ascii="Calibri" w:hAnsi="Calibri"/>
+                <w:b/>
+                <w:color w:val="FFFFFF"/>
+                <w:sz w:val="19"/>
+              </w:rPr>
               <w:t>Field</w:t>
             </w:r>
           </w:p>
         </w:tc>
         <w:tc>
           <w:tcPr>
-            <w:tcW w:type="dxa" w:w="4680"/>
-          </w:tcPr>
-          <w:p>
-            <w:r>
+            <w:tcW w:type="dxa" w:w="7128"/>
+            <w:vAlign w:val="center"/>
+            <w:tcMar>
+              <w:top w:w="80" w:type="dxa"/>
+              <w:start w:w="120" w:type="dxa"/>
+              <w:bottom w:w="80" w:type="dxa"/>
+              <w:end w:w="120" w:type="dxa"/>
+            </w:tcMar>
+            <w:shd w:fill="17365D"/>
+          </w:tcPr>
+          <w:p>
+            <w:r>
+              <w:rPr>
+                <w:rFonts w:ascii="Calibri" w:hAnsi="Calibri"/>
+                <w:b/>
+                <w:color w:val="FFFFFF"/>
+                <w:sz w:val="19"/>
+              </w:rPr>
               <w:t>Recorded implementation evidence</w:t>
             </w:r>
           </w:p>
         </w:tc>
       </w:tr>
       <w:tr>
-        <w:tc>
-          <w:tcPr>
-            <w:tcW w:type="dxa" w:w="4680"/>
-          </w:tcPr>
-          <w:p>
-            <w:r>
-              <w:rPr>
-                <w:b/>
+        <w:trPr>
+          <w:cantSplit/>
+        </w:trPr>
+        <w:tc>
+          <w:tcPr>
+            <w:tcW w:type="dxa" w:w="2232"/>
+            <w:vAlign w:val="center"/>
+            <w:tcMar>
+              <w:top w:w="80" w:type="dxa"/>
+              <w:start w:w="120" w:type="dxa"/>
+              <w:bottom w:w="80" w:type="dxa"/>
+              <w:end w:w="120" w:type="dxa"/>
+            </w:tcMar>
+          </w:tcPr>
+          <w:p>
+            <w:pPr>
+              <w:spacing w:after="0"/>
+            </w:pPr>
+            <w:r>
+              <w:rPr>
+                <w:rFonts w:ascii="Calibri" w:hAnsi="Calibri"/>
+                <w:sz w:val="18"/>
               </w:rPr>
               <w:t>Slice</w:t>
             </w:r>
@@ -6564,24 +6619,53 @@
         </w:tc>
         <w:tc>
           <w:tcPr>
-            <w:tcW w:type="dxa" w:w="4680"/>
-          </w:tcPr>
-          <w:p>
-            <w:r>
-              <w:t>OCR-1 stable scan contract and OCR-2 Android/iOS native adapters.</w:t>
+            <w:tcW w:type="dxa" w:w="7128"/>
+            <w:vAlign w:val="center"/>
+            <w:tcMar>
+              <w:top w:w="80" w:type="dxa"/>
+              <w:start w:w="120" w:type="dxa"/>
+              <w:bottom w:w="80" w:type="dxa"/>
+              <w:end w:w="120" w:type="dxa"/>
+            </w:tcMar>
+          </w:tcPr>
+          <w:p>
+            <w:pPr>
+              <w:spacing w:after="0"/>
+            </w:pPr>
+            <w:r>
+              <w:rPr>
+                <w:rFonts w:ascii="Calibri" w:hAnsi="Calibri"/>
+                <w:sz w:val="18"/>
+              </w:rPr>
+              <w:t>OCR-1 stable scan contract and OCR-2 Android/iOS native adapters</w:t>
             </w:r>
           </w:p>
         </w:tc>
       </w:tr>
       <w:tr>
-        <w:tc>
-          <w:tcPr>
-            <w:tcW w:type="dxa" w:w="4680"/>
-          </w:tcPr>
-          <w:p>
-            <w:r>
-              <w:rPr>
-                <w:b/>
+        <w:trPr>
+          <w:cantSplit/>
+        </w:trPr>
+        <w:tc>
+          <w:tcPr>
+            <w:tcW w:type="dxa" w:w="2232"/>
+            <w:shd w:fill="F2F4F7"/>
+            <w:vAlign w:val="center"/>
+            <w:tcMar>
+              <w:top w:w="80" w:type="dxa"/>
+              <w:start w:w="120" w:type="dxa"/>
+              <w:bottom w:w="80" w:type="dxa"/>
+              <w:end w:w="120" w:type="dxa"/>
+            </w:tcMar>
+          </w:tcPr>
+          <w:p>
+            <w:pPr>
+              <w:spacing w:after="0"/>
+            </w:pPr>
+            <w:r>
+              <w:rPr>
+                <w:rFonts w:ascii="Calibri" w:hAnsi="Calibri"/>
+                <w:sz w:val="18"/>
               </w:rPr>
               <w:t>Branch / PR</w:t>
             </w:r>
@@ -6589,24 +6673,53 @@
         </w:tc>
         <w:tc>
           <w:tcPr>
-            <w:tcW w:type="dxa" w:w="4680"/>
-          </w:tcPr>
-          <w:p>
-            <w:r>
-              <w:t>sankofa_xciv/ocr-1-2-native-scanning; PR #54 merged to dev as 05df90a.</w:t>
+            <w:tcW w:type="dxa" w:w="7128"/>
+            <w:shd w:fill="F2F4F7"/>
+            <w:vAlign w:val="center"/>
+            <w:tcMar>
+              <w:top w:w="80" w:type="dxa"/>
+              <w:start w:w="120" w:type="dxa"/>
+              <w:bottom w:w="80" w:type="dxa"/>
+              <w:end w:w="120" w:type="dxa"/>
+            </w:tcMar>
+          </w:tcPr>
+          <w:p>
+            <w:pPr>
+              <w:spacing w:after="0"/>
+            </w:pPr>
+            <w:r>
+              <w:rPr>
+                <w:rFonts w:ascii="Calibri" w:hAnsi="Calibri"/>
+                <w:sz w:val="18"/>
+              </w:rPr>
+              <w:t>sankofa_xciv/ocr-1-2-native-scanning; PR #54 merged into dev as 05df90a</w:t>
             </w:r>
           </w:p>
         </w:tc>
       </w:tr>
       <w:tr>
-        <w:tc>
-          <w:tcPr>
-            <w:tcW w:type="dxa" w:w="4680"/>
-          </w:tcPr>
-          <w:p>
-            <w:r>
-              <w:rPr>
-                <w:b/>
+        <w:trPr>
+          <w:cantSplit/>
+        </w:trPr>
+        <w:tc>
+          <w:tcPr>
+            <w:tcW w:type="dxa" w:w="2232"/>
+            <w:vAlign w:val="center"/>
+            <w:tcMar>
+              <w:top w:w="80" w:type="dxa"/>
+              <w:start w:w="120" w:type="dxa"/>
+              <w:bottom w:w="80" w:type="dxa"/>
+              <w:end w:w="120" w:type="dxa"/>
+            </w:tcMar>
+          </w:tcPr>
+          <w:p>
+            <w:pPr>
+              <w:spacing w:after="0"/>
+            </w:pPr>
+            <w:r>
+              <w:rPr>
+                <w:rFonts w:ascii="Calibri" w:hAnsi="Calibri"/>
+                <w:sz w:val="18"/>
               </w:rPr>
               <w:t>Outcome</w:t>
             </w:r>
@@ -6614,24 +6727,53 @@
         </w:tc>
         <w:tc>
           <w:tcPr>
-            <w:tcW w:type="dxa" w:w="4680"/>
-          </w:tcPr>
-          <w:p>
-            <w:r>
-              <w:t>Enhanced the existing asset-registration flow with native scanning, on-device OCR, evidence provenance, byte-integrity verification and explicit human review. Android uses ML Kit; iOS uses VisionKit and Vision.</w:t>
+            <w:tcW w:type="dxa" w:w="7128"/>
+            <w:vAlign w:val="center"/>
+            <w:tcMar>
+              <w:top w:w="80" w:type="dxa"/>
+              <w:start w:w="120" w:type="dxa"/>
+              <w:bottom w:w="80" w:type="dxa"/>
+              <w:end w:w="120" w:type="dxa"/>
+            </w:tcMar>
+          </w:tcPr>
+          <w:p>
+            <w:pPr>
+              <w:spacing w:after="0"/>
+            </w:pPr>
+            <w:r>
+              <w:rPr>
+                <w:rFonts w:ascii="Calibri" w:hAnsi="Calibri"/>
+                <w:sz w:val="18"/>
+              </w:rPr>
+              <w:t>Existing asset registration enhanced with native scanning, on-device OCR, evidence provenance, byte-integrity verification, and explicit human review</w:t>
             </w:r>
           </w:p>
         </w:tc>
       </w:tr>
       <w:tr>
-        <w:tc>
-          <w:tcPr>
-            <w:tcW w:type="dxa" w:w="4680"/>
-          </w:tcPr>
-          <w:p>
-            <w:r>
-              <w:rPr>
-                <w:b/>
+        <w:trPr>
+          <w:cantSplit/>
+        </w:trPr>
+        <w:tc>
+          <w:tcPr>
+            <w:tcW w:type="dxa" w:w="2232"/>
+            <w:shd w:fill="F2F4F7"/>
+            <w:vAlign w:val="center"/>
+            <w:tcMar>
+              <w:top w:w="80" w:type="dxa"/>
+              <w:start w:w="120" w:type="dxa"/>
+              <w:bottom w:w="80" w:type="dxa"/>
+              <w:end w:w="120" w:type="dxa"/>
+            </w:tcMar>
+          </w:tcPr>
+          <w:p>
+            <w:pPr>
+              <w:spacing w:after="0"/>
+            </w:pPr>
+            <w:r>
+              <w:rPr>
+                <w:rFonts w:ascii="Calibri" w:hAnsi="Calibri"/>
+                <w:sz w:val="18"/>
               </w:rPr>
               <w:t>Decision</w:t>
             </w:r>
@@ -6639,224 +6781,1213 @@
         </w:tc>
         <w:tc>
           <w:tcPr>
-            <w:tcW w:type="dxa" w:w="4680"/>
-          </w:tcPr>
-          <w:p>
-            <w:r>
-              <w:t>Use a strict TypeScript/native contract, private file:// JPEGs, UUID/size/dimension/SHA-256 validation, bounded OCR and native cleanup before Supabase upload.</w:t>
+            <w:tcW w:type="dxa" w:w="7128"/>
+            <w:shd w:fill="F2F4F7"/>
+            <w:vAlign w:val="center"/>
+            <w:tcMar>
+              <w:top w:w="80" w:type="dxa"/>
+              <w:start w:w="120" w:type="dxa"/>
+              <w:bottom w:w="80" w:type="dxa"/>
+              <w:end w:w="120" w:type="dxa"/>
+            </w:tcMar>
+          </w:tcPr>
+          <w:p>
+            <w:pPr>
+              <w:spacing w:after="0"/>
+            </w:pPr>
+            <w:r>
+              <w:rPr>
+                <w:rFonts w:ascii="Calibri" w:hAnsi="Calibri"/>
+                <w:sz w:val="18"/>
+              </w:rPr>
+              <w:t>Use a strict TypeScript/native contract; private JPEG artifacts only; validate dimensions, size, UUID and SHA-256; delete native artifacts after verified JavaScript ownership</w:t>
             </w:r>
           </w:p>
         </w:tc>
       </w:tr>
       <w:tr>
-        <w:tc>
-          <w:tcPr>
-            <w:tcW w:type="dxa" w:w="4680"/>
-          </w:tcPr>
-          <w:p>
-            <w:r>
-              <w:rPr>
-                <w:b/>
-              </w:rPr>
-              <w:t>Alternative rejected</w:t>
-            </w:r>
-          </w:p>
-        </w:tc>
-        <w:tc>
-          <w:tcPr>
-            <w:tcW w:type="dxa" w:w="4680"/>
-          </w:tcPr>
-          <w:p>
-            <w:r>
-              <w:t>Base64 bridge payloads, shared files, cloud OCR by default, automatic application of OCR values and silent permission/cancellation fallback.</w:t>
+        <w:trPr>
+          <w:cantSplit/>
+        </w:trPr>
+        <w:tc>
+          <w:tcPr>
+            <w:tcW w:type="dxa" w:w="2232"/>
+            <w:vAlign w:val="center"/>
+            <w:tcMar>
+              <w:top w:w="80" w:type="dxa"/>
+              <w:start w:w="120" w:type="dxa"/>
+              <w:bottom w:w="80" w:type="dxa"/>
+              <w:end w:w="120" w:type="dxa"/>
+            </w:tcMar>
+          </w:tcPr>
+          <w:p>
+            <w:pPr>
+              <w:spacing w:after="0"/>
+            </w:pPr>
+            <w:r>
+              <w:rPr>
+                <w:rFonts w:ascii="Calibri" w:hAnsi="Calibri"/>
+                <w:sz w:val="18"/>
+              </w:rPr>
+              <w:t>Rejected alternative</w:t>
+            </w:r>
+          </w:p>
+        </w:tc>
+        <w:tc>
+          <w:tcPr>
+            <w:tcW w:type="dxa" w:w="7128"/>
+            <w:vAlign w:val="center"/>
+            <w:tcMar>
+              <w:top w:w="80" w:type="dxa"/>
+              <w:start w:w="120" w:type="dxa"/>
+              <w:bottom w:w="80" w:type="dxa"/>
+              <w:end w:w="120" w:type="dxa"/>
+            </w:tcMar>
+          </w:tcPr>
+          <w:p>
+            <w:pPr>
+              <w:spacing w:after="0"/>
+            </w:pPr>
+            <w:r>
+              <w:rPr>
+                <w:rFonts w:ascii="Calibri" w:hAnsi="Calibri"/>
+                <w:sz w:val="18"/>
+              </w:rPr>
+              <w:t>Base64 bridge payloads, public native files, default cloud OCR, automatic field application, and silent fallback after denial/cancellation</w:t>
             </w:r>
           </w:p>
         </w:tc>
       </w:tr>
       <w:tr>
-        <w:tc>
-          <w:tcPr>
-            <w:tcW w:type="dxa" w:w="4680"/>
-          </w:tcPr>
-          <w:p>
-            <w:r>
-              <w:rPr>
-                <w:b/>
-              </w:rPr>
-              <w:t>Security and privacy</w:t>
-            </w:r>
-          </w:p>
-        </w:tc>
-        <w:tc>
-          <w:tcPr>
-            <w:tcW w:type="dxa" w:w="4680"/>
-          </w:tcPr>
-          <w:p>
-            <w:r>
-              <w:t>15 MiB and five-page native bounds; private/protected cache; no paths or raw OCR in activity logs; 8,000-character OCR cap; RLS/private Storage; human apply-and-verify.</w:t>
+        <w:trPr>
+          <w:cantSplit/>
+        </w:trPr>
+        <w:tc>
+          <w:tcPr>
+            <w:tcW w:type="dxa" w:w="2232"/>
+            <w:shd w:fill="F2F4F7"/>
+            <w:vAlign w:val="center"/>
+            <w:tcMar>
+              <w:top w:w="80" w:type="dxa"/>
+              <w:start w:w="120" w:type="dxa"/>
+              <w:bottom w:w="80" w:type="dxa"/>
+              <w:end w:w="120" w:type="dxa"/>
+            </w:tcMar>
+          </w:tcPr>
+          <w:p>
+            <w:pPr>
+              <w:spacing w:after="0"/>
+            </w:pPr>
+            <w:r>
+              <w:rPr>
+                <w:rFonts w:ascii="Calibri" w:hAnsi="Calibri"/>
+                <w:sz w:val="18"/>
+              </w:rPr>
+              <w:t>Security</w:t>
+            </w:r>
+          </w:p>
+        </w:tc>
+        <w:tc>
+          <w:tcPr>
+            <w:tcW w:type="dxa" w:w="7128"/>
+            <w:shd w:fill="F2F4F7"/>
+            <w:vAlign w:val="center"/>
+            <w:tcMar>
+              <w:top w:w="80" w:type="dxa"/>
+              <w:start w:w="120" w:type="dxa"/>
+              <w:bottom w:w="80" w:type="dxa"/>
+              <w:end w:w="120" w:type="dxa"/>
+            </w:tcMar>
+          </w:tcPr>
+          <w:p>
+            <w:pPr>
+              <w:spacing w:after="0"/>
+            </w:pPr>
+            <w:r>
+              <w:rPr>
+                <w:rFonts w:ascii="Calibri" w:hAnsi="Calibri"/>
+                <w:sz w:val="18"/>
+              </w:rPr>
+              <w:t>Bounded evidence and OCR text; no native paths or raw OCR in logs; private Storage/RLS authoritative; human apply-and-verify required</w:t>
             </w:r>
           </w:p>
         </w:tc>
       </w:tr>
       <w:tr>
-        <w:tc>
-          <w:tcPr>
-            <w:tcW w:type="dxa" w:w="4680"/>
-          </w:tcPr>
-          <w:p>
-            <w:r>
-              <w:rPr>
-                <w:b/>
-              </w:rPr>
-              <w:t>Three-pass critic loop</w:t>
-            </w:r>
-          </w:p>
-        </w:tc>
-        <w:tc>
-          <w:tcPr>
-            <w:tcW w:type="dxa" w:w="4680"/>
-          </w:tcPr>
-          <w:p>
-            <w:r>
-              <w:t>Pass 1 challenged contract and review semantics. Pass 2 challenged native lifecycle, cleanup, interruption and concurrency. Pass 3 reviewed every changed source file and supporting RLS/Storage controls.</w:t>
+        <w:trPr>
+          <w:cantSplit/>
+        </w:trPr>
+        <w:tc>
+          <w:tcPr>
+            <w:tcW w:type="dxa" w:w="2232"/>
+            <w:vAlign w:val="center"/>
+            <w:tcMar>
+              <w:top w:w="80" w:type="dxa"/>
+              <w:start w:w="120" w:type="dxa"/>
+              <w:bottom w:w="80" w:type="dxa"/>
+              <w:end w:w="120" w:type="dxa"/>
+            </w:tcMar>
+          </w:tcPr>
+          <w:p>
+            <w:pPr>
+              <w:spacing w:after="0"/>
+            </w:pPr>
+            <w:r>
+              <w:rPr>
+                <w:rFonts w:ascii="Calibri" w:hAnsi="Calibri"/>
+                <w:sz w:val="18"/>
+              </w:rPr>
+              <w:t>Three-pass challenge</w:t>
+            </w:r>
+          </w:p>
+        </w:tc>
+        <w:tc>
+          <w:tcPr>
+            <w:tcW w:type="dxa" w:w="7128"/>
+            <w:vAlign w:val="center"/>
+            <w:tcMar>
+              <w:top w:w="80" w:type="dxa"/>
+              <w:start w:w="120" w:type="dxa"/>
+              <w:bottom w:w="80" w:type="dxa"/>
+              <w:end w:w="120" w:type="dxa"/>
+            </w:tcMar>
+          </w:tcPr>
+          <w:p>
+            <w:pPr>
+              <w:spacing w:after="0"/>
+            </w:pPr>
+            <w:r>
+              <w:rPr>
+                <w:rFonts w:ascii="Calibri" w:hAnsi="Calibri"/>
+                <w:sz w:val="18"/>
+              </w:rPr>
+              <w:t>Challenged contract/fallback/integrity, native lifecycle and cleanup, then all changed source and RLS/Storage controls; persistence findings were remediated before closure</w:t>
             </w:r>
           </w:p>
         </w:tc>
       </w:tr>
       <w:tr>
-        <w:tc>
-          <w:tcPr>
-            <w:tcW w:type="dxa" w:w="4680"/>
-          </w:tcPr>
-          <w:p>
-            <w:r>
-              <w:rPr>
-                <w:b/>
-              </w:rPr>
-              <w:t>Improvements applied</w:t>
-            </w:r>
-          </w:p>
-        </w:tc>
-        <w:tc>
-          <w:tcPr>
-            <w:tcW w:type="dxa" w:w="4680"/>
-          </w:tcPr>
-          <w:p>
-            <w:r>
-              <w:t>Native stale-session startup sweeps, Android symlink rejection and complete scanner locking, whole-session malformed-result cleanup, two-phase evidence upload, immutable ready objects/provenance and checked rollback.</w:t>
+        <w:trPr>
+          <w:cantSplit/>
+        </w:trPr>
+        <w:tc>
+          <w:tcPr>
+            <w:tcW w:type="dxa" w:w="2232"/>
+            <w:shd w:fill="F2F4F7"/>
+            <w:vAlign w:val="center"/>
+            <w:tcMar>
+              <w:top w:w="80" w:type="dxa"/>
+              <w:start w:w="120" w:type="dxa"/>
+              <w:bottom w:w="80" w:type="dxa"/>
+              <w:end w:w="120" w:type="dxa"/>
+            </w:tcMar>
+          </w:tcPr>
+          <w:p>
+            <w:pPr>
+              <w:spacing w:after="0"/>
+            </w:pPr>
+            <w:r>
+              <w:rPr>
+                <w:rFonts w:ascii="Calibri" w:hAnsi="Calibri"/>
+                <w:sz w:val="18"/>
+              </w:rPr>
+              <w:t>Improvements</w:t>
+            </w:r>
+          </w:p>
+        </w:tc>
+        <w:tc>
+          <w:tcPr>
+            <w:tcW w:type="dxa" w:w="7128"/>
+            <w:shd w:fill="F2F4F7"/>
+            <w:vAlign w:val="center"/>
+            <w:tcMar>
+              <w:top w:w="80" w:type="dxa"/>
+              <w:start w:w="120" w:type="dxa"/>
+              <w:bottom w:w="80" w:type="dxa"/>
+              <w:end w:w="120" w:type="dxa"/>
+            </w:tcMar>
+          </w:tcPr>
+          <w:p>
+            <w:pPr>
+              <w:spacing w:after="0"/>
+            </w:pPr>
+            <w:r>
+              <w:rPr>
+                <w:rFonts w:ascii="Calibri" w:hAnsi="Calibri"/>
+                <w:sz w:val="18"/>
+              </w:rPr>
+              <w:t>Held Android guard through finalisation; safe startup sweeps; symlink rejection; main-thread bridge resolution; whole-session cleanup; checked rollback; immutable ready evidence</w:t>
             </w:r>
           </w:p>
         </w:tc>
       </w:tr>
       <w:tr>
-        <w:tc>
-          <w:tcPr>
-            <w:tcW w:type="dxa" w:w="4680"/>
-          </w:tcPr>
-          <w:p>
-            <w:r>
-              <w:rPr>
-                <w:b/>
-              </w:rPr>
-              <w:t>Verification</w:t>
-            </w:r>
-          </w:p>
-        </w:tc>
-        <w:tc>
-          <w:tcPr>
-            <w:tcW w:type="dxa" w:w="4680"/>
-          </w:tcPr>
-          <w:p>
-            <w:r>
-              <w:t>Runtime-config, lint, typecheck, production build and 93/93 tests passed. PR #54 passed application, 208-test Supabase pgTAP, Android debug, iOS simulator and both Vercel preview checks.</w:t>
+        <w:trPr>
+          <w:cantSplit/>
+        </w:trPr>
+        <w:tc>
+          <w:tcPr>
+            <w:tcW w:type="dxa" w:w="2232"/>
+            <w:vAlign w:val="center"/>
+            <w:tcMar>
+              <w:top w:w="80" w:type="dxa"/>
+              <w:start w:w="120" w:type="dxa"/>
+              <w:bottom w:w="80" w:type="dxa"/>
+              <w:end w:w="120" w:type="dxa"/>
+            </w:tcMar>
+          </w:tcPr>
+          <w:p>
+            <w:pPr>
+              <w:spacing w:after="0"/>
+            </w:pPr>
+            <w:r>
+              <w:rPr>
+                <w:rFonts w:ascii="Calibri" w:hAnsi="Calibri"/>
+                <w:sz w:val="18"/>
+              </w:rPr>
+              <w:t>Tests</w:t>
+            </w:r>
+          </w:p>
+        </w:tc>
+        <w:tc>
+          <w:tcPr>
+            <w:tcW w:type="dxa" w:w="7128"/>
+            <w:vAlign w:val="center"/>
+            <w:tcMar>
+              <w:top w:w="80" w:type="dxa"/>
+              <w:start w:w="120" w:type="dxa"/>
+              <w:bottom w:w="80" w:type="dxa"/>
+              <w:end w:w="120" w:type="dxa"/>
+            </w:tcMar>
+          </w:tcPr>
+          <w:p>
+            <w:pPr>
+              <w:spacing w:after="0"/>
+            </w:pPr>
+            <w:r>
+              <w:rPr>
+                <w:rFonts w:ascii="Calibri" w:hAnsi="Calibri"/>
+                <w:sz w:val="18"/>
+              </w:rPr>
+              <w:t>Local release gate and 93/93 browser tests passed; PR #54 passed app, 208 pgTAP tests, Android, iOS and Vercel checks</w:t>
             </w:r>
           </w:p>
         </w:tc>
       </w:tr>
       <w:tr>
-        <w:tc>
-          <w:tcPr>
-            <w:tcW w:type="dxa" w:w="4680"/>
-          </w:tcPr>
-          <w:p>
-            <w:r>
-              <w:rPr>
-                <w:b/>
-              </w:rPr>
-              <w:t>Visual and device evidence</w:t>
-            </w:r>
-          </w:p>
-        </w:tc>
-        <w:tc>
-          <w:tcPr>
-            <w:tcW w:type="dxa" w:w="4680"/>
-          </w:tcPr>
-          <w:p>
-            <w:r>
-              <w:t>Capture guidance and provenance/confidence render in the existing responsive workspace. Full regression remains after Slice 3; signed-device camera and process-interruption proof remains required.</w:t>
+        <w:trPr>
+          <w:cantSplit/>
+        </w:trPr>
+        <w:tc>
+          <w:tcPr>
+            <w:tcW w:type="dxa" w:w="2232"/>
+            <w:shd w:fill="F2F4F7"/>
+            <w:vAlign w:val="center"/>
+            <w:tcMar>
+              <w:top w:w="80" w:type="dxa"/>
+              <w:start w:w="120" w:type="dxa"/>
+              <w:bottom w:w="80" w:type="dxa"/>
+              <w:end w:w="120" w:type="dxa"/>
+            </w:tcMar>
+          </w:tcPr>
+          <w:p>
+            <w:pPr>
+              <w:spacing w:after="0"/>
+            </w:pPr>
+            <w:r>
+              <w:rPr>
+                <w:rFonts w:ascii="Calibri" w:hAnsi="Calibri"/>
+                <w:sz w:val="18"/>
+              </w:rPr>
+              <w:t>Result</w:t>
+            </w:r>
+          </w:p>
+        </w:tc>
+        <w:tc>
+          <w:tcPr>
+            <w:tcW w:type="dxa" w:w="7128"/>
+            <w:shd w:fill="F2F4F7"/>
+            <w:vAlign w:val="center"/>
+            <w:tcMar>
+              <w:top w:w="80" w:type="dxa"/>
+              <w:start w:w="120" w:type="dxa"/>
+              <w:bottom w:w="80" w:type="dxa"/>
+              <w:end w:w="120" w:type="dxa"/>
+            </w:tcMar>
+          </w:tcPr>
+          <w:p>
+            <w:pPr>
+              <w:spacing w:after="0"/>
+            </w:pPr>
+            <w:r>
+              <w:rPr>
+                <w:rFonts w:ascii="Calibri" w:hAnsi="Calibri"/>
+                <w:sz w:val="18"/>
+              </w:rPr>
+              <w:t>Implementation, migrations, native CI and deployments passed; signed physical-device proof remains the store-release gate</w:t>
             </w:r>
           </w:p>
         </w:tc>
       </w:tr>
       <w:tr>
-        <w:tc>
-          <w:tcPr>
-            <w:tcW w:type="dxa" w:w="4680"/>
-          </w:tcPr>
-          <w:p>
-            <w:r>
-              <w:rPr>
-                <w:b/>
-              </w:rPr>
-              <w:t>Result</w:t>
-            </w:r>
-          </w:p>
-        </w:tc>
-        <w:tc>
-          <w:tcPr>
-            <w:tcW w:type="dxa" w:w="4680"/>
-          </w:tcPr>
-          <w:p>
-            <w:r>
-              <w:t>Implementation, remote migrations, native CI and Supabase pgTAP pass. PR #54 merged as 05df90a; both post-merge Vercel deployments passed. Signed-device UAT remains.</w:t>
+        <w:trPr>
+          <w:cantSplit/>
+        </w:trPr>
+        <w:tc>
+          <w:tcPr>
+            <w:tcW w:type="dxa" w:w="2232"/>
+            <w:vAlign w:val="center"/>
+            <w:tcMar>
+              <w:top w:w="80" w:type="dxa"/>
+              <w:start w:w="120" w:type="dxa"/>
+              <w:bottom w:w="80" w:type="dxa"/>
+              <w:end w:w="120" w:type="dxa"/>
+            </w:tcMar>
+          </w:tcPr>
+          <w:p>
+            <w:pPr>
+              <w:spacing w:after="0"/>
+            </w:pPr>
+            <w:r>
+              <w:rPr>
+                <w:rFonts w:ascii="Calibri" w:hAnsi="Calibri"/>
+                <w:sz w:val="18"/>
+              </w:rPr>
+              <w:t>Known gaps</w:t>
+            </w:r>
+          </w:p>
+        </w:tc>
+        <w:tc>
+          <w:tcPr>
+            <w:tcW w:type="dxa" w:w="7128"/>
+            <w:vAlign w:val="center"/>
+            <w:tcMar>
+              <w:top w:w="80" w:type="dxa"/>
+              <w:start w:w="120" w:type="dxa"/>
+              <w:bottom w:w="80" w:type="dxa"/>
+              <w:end w:w="120" w:type="dxa"/>
+            </w:tcMar>
+          </w:tcPr>
+          <w:p>
+            <w:pPr>
+              <w:spacing w:after="0"/>
+            </w:pPr>
+            <w:r>
+              <w:rPr>
+                <w:rFonts w:ascii="Calibri" w:hAnsi="Calibri"/>
+                <w:sz w:val="18"/>
+              </w:rPr>
+              <w:t>OCR accuracy and permission/lifecycle behavior on representative physical devices require the five-role signed-device UAT matrix</w:t>
             </w:r>
           </w:p>
         </w:tc>
       </w:tr>
       <w:tr>
-        <w:tc>
-          <w:tcPr>
-            <w:tcW w:type="dxa" w:w="4680"/>
-          </w:tcPr>
-          <w:p>
-            <w:r>
-              <w:rPr>
+        <w:trPr>
+          <w:cantSplit/>
+        </w:trPr>
+        <w:tc>
+          <w:tcPr>
+            <w:tcW w:type="dxa" w:w="2232"/>
+            <w:shd w:fill="F2F4F7"/>
+            <w:vAlign w:val="center"/>
+            <w:tcMar>
+              <w:top w:w="80" w:type="dxa"/>
+              <w:start w:w="120" w:type="dxa"/>
+              <w:bottom w:w="80" w:type="dxa"/>
+              <w:end w:w="120" w:type="dxa"/>
+            </w:tcMar>
+          </w:tcPr>
+          <w:p>
+            <w:pPr>
+              <w:spacing w:after="0"/>
+            </w:pPr>
+            <w:r>
+              <w:rPr>
+                <w:rFonts w:ascii="Calibri" w:hAnsi="Calibri"/>
+                <w:sz w:val="18"/>
+              </w:rPr>
+              <w:t>Next action</w:t>
+            </w:r>
+          </w:p>
+        </w:tc>
+        <w:tc>
+          <w:tcPr>
+            <w:tcW w:type="dxa" w:w="7128"/>
+            <w:shd w:fill="F2F4F7"/>
+            <w:vAlign w:val="center"/>
+            <w:tcMar>
+              <w:top w:w="80" w:type="dxa"/>
+              <w:start w:w="120" w:type="dxa"/>
+              <w:bottom w:w="80" w:type="dxa"/>
+              <w:end w:w="120" w:type="dxa"/>
+            </w:tcMar>
+          </w:tcPr>
+          <w:p>
+            <w:pPr>
+              <w:spacing w:after="0"/>
+            </w:pPr>
+            <w:r>
+              <w:rPr>
+                <w:rFonts w:ascii="Calibri" w:hAnsi="Calibri"/>
+                <w:sz w:val="18"/>
+              </w:rPr>
+              <w:t>Execute OCR-3 private signed-device UAT without placing credentials or direct identifiers in Git or this document</w:t>
+            </w:r>
+          </w:p>
+        </w:tc>
+      </w:tr>
+    </w:tbl>
+    <w:p>
+      <w:pPr>
+        <w:spacing w:after="0"/>
+      </w:pPr>
+    </w:p>
+    <w:p>
+      <w:pPr>
+        <w:pStyle w:val="Heading2"/>
+      </w:pPr>
+      <w:r>
+        <w:t>24 August 2026 - OCR-3 signed-device UAT gate</w:t>
+      </w:r>
+    </w:p>
+    <w:tbl>
+      <w:tblPr>
+        <w:tblStyle w:val="TableGrid"/>
+        <w:tblW w:type="dxa" w:w="9360"/>
+        <w:tblLayout w:type="fixed"/>
+        <w:tblLook w:firstColumn="1" w:firstRow="1" w:lastColumn="0" w:lastRow="0" w:noHBand="0" w:noVBand="1" w:val="04A0"/>
+        <w:jc w:val="left"/>
+        <w:tblInd w:w="120" w:type="dxa"/>
+      </w:tblPr>
+      <w:tblGrid>
+        <w:gridCol w:w="4680"/>
+        <w:gridCol w:w="4680"/>
+      </w:tblGrid>
+      <w:tr>
+        <w:trPr>
+          <w:tblHeader w:val="true"/>
+        </w:trPr>
+        <w:tc>
+          <w:tcPr>
+            <w:tcW w:type="dxa" w:w="2232"/>
+            <w:vAlign w:val="center"/>
+            <w:tcMar>
+              <w:top w:w="80" w:type="dxa"/>
+              <w:start w:w="120" w:type="dxa"/>
+              <w:bottom w:w="80" w:type="dxa"/>
+              <w:end w:w="120" w:type="dxa"/>
+            </w:tcMar>
+            <w:shd w:fill="17365D"/>
+          </w:tcPr>
+          <w:p>
+            <w:r>
+              <w:rPr>
+                <w:rFonts w:ascii="Calibri" w:hAnsi="Calibri"/>
                 <w:b/>
-              </w:rPr>
-              <w:t>Known limitation</w:t>
-            </w:r>
-          </w:p>
-        </w:tc>
-        <w:tc>
-          <w:tcPr>
-            <w:tcW w:type="dxa" w:w="4680"/>
-          </w:tcPr>
-          <w:p>
-            <w:r>
-              <w:t>The official client recomputes SHA-256 immediately before immutable upload; capture source is client-reported and is not cryptographic device attestation.</w:t>
+                <w:color w:val="FFFFFF"/>
+                <w:sz w:val="19"/>
+              </w:rPr>
+              <w:t>Field</w:t>
+            </w:r>
+          </w:p>
+        </w:tc>
+        <w:tc>
+          <w:tcPr>
+            <w:tcW w:type="dxa" w:w="7128"/>
+            <w:vAlign w:val="center"/>
+            <w:tcMar>
+              <w:top w:w="80" w:type="dxa"/>
+              <w:start w:w="120" w:type="dxa"/>
+              <w:bottom w:w="80" w:type="dxa"/>
+              <w:end w:w="120" w:type="dxa"/>
+            </w:tcMar>
+            <w:shd w:fill="17365D"/>
+          </w:tcPr>
+          <w:p>
+            <w:r>
+              <w:rPr>
+                <w:rFonts w:ascii="Calibri" w:hAnsi="Calibri"/>
+                <w:b/>
+                <w:color w:val="FFFFFF"/>
+                <w:sz w:val="19"/>
+              </w:rPr>
+              <w:t>Recorded implementation evidence</w:t>
             </w:r>
           </w:p>
         </w:tc>
       </w:tr>
       <w:tr>
-        <w:tc>
-          <w:tcPr>
-            <w:tcW w:type="dxa" w:w="4680"/>
-          </w:tcPr>
-          <w:p>
-            <w:r>
-              <w:rPr>
-                <w:b/>
+        <w:trPr>
+          <w:cantSplit/>
+        </w:trPr>
+        <w:tc>
+          <w:tcPr>
+            <w:tcW w:type="dxa" w:w="2232"/>
+            <w:vAlign w:val="center"/>
+            <w:tcMar>
+              <w:top w:w="80" w:type="dxa"/>
+              <w:start w:w="120" w:type="dxa"/>
+              <w:bottom w:w="80" w:type="dxa"/>
+              <w:end w:w="120" w:type="dxa"/>
+            </w:tcMar>
+          </w:tcPr>
+          <w:p>
+            <w:pPr>
+              <w:spacing w:after="0"/>
+            </w:pPr>
+            <w:r>
+              <w:rPr>
+                <w:rFonts w:ascii="Calibri" w:hAnsi="Calibri"/>
+                <w:sz w:val="18"/>
+              </w:rPr>
+              <w:t>Slice</w:t>
+            </w:r>
+          </w:p>
+        </w:tc>
+        <w:tc>
+          <w:tcPr>
+            <w:tcW w:type="dxa" w:w="7128"/>
+            <w:vAlign w:val="center"/>
+            <w:tcMar>
+              <w:top w:w="80" w:type="dxa"/>
+              <w:start w:w="120" w:type="dxa"/>
+              <w:bottom w:w="80" w:type="dxa"/>
+              <w:end w:w="120" w:type="dxa"/>
+            </w:tcMar>
+          </w:tcPr>
+          <w:p>
+            <w:pPr>
+              <w:spacing w:after="0"/>
+            </w:pPr>
+            <w:r>
+              <w:rPr>
+                <w:rFonts w:ascii="Calibri" w:hAnsi="Calibri"/>
+                <w:sz w:val="18"/>
+              </w:rPr>
+              <w:t>OCR-3 - five-role signed-device release gate</w:t>
+            </w:r>
+          </w:p>
+        </w:tc>
+      </w:tr>
+      <w:tr>
+        <w:trPr>
+          <w:cantSplit/>
+        </w:trPr>
+        <w:tc>
+          <w:tcPr>
+            <w:tcW w:type="dxa" w:w="2232"/>
+            <w:shd w:fill="F2F4F7"/>
+            <w:vAlign w:val="center"/>
+            <w:tcMar>
+              <w:top w:w="80" w:type="dxa"/>
+              <w:start w:w="120" w:type="dxa"/>
+              <w:bottom w:w="80" w:type="dxa"/>
+              <w:end w:w="120" w:type="dxa"/>
+            </w:tcMar>
+          </w:tcPr>
+          <w:p>
+            <w:pPr>
+              <w:spacing w:after="0"/>
+            </w:pPr>
+            <w:r>
+              <w:rPr>
+                <w:rFonts w:ascii="Calibri" w:hAnsi="Calibri"/>
+                <w:sz w:val="18"/>
+              </w:rPr>
+              <w:t>Branch</w:t>
+            </w:r>
+          </w:p>
+        </w:tc>
+        <w:tc>
+          <w:tcPr>
+            <w:tcW w:type="dxa" w:w="7128"/>
+            <w:shd w:fill="F2F4F7"/>
+            <w:vAlign w:val="center"/>
+            <w:tcMar>
+              <w:top w:w="80" w:type="dxa"/>
+              <w:start w:w="120" w:type="dxa"/>
+              <w:bottom w:w="80" w:type="dxa"/>
+              <w:end w:w="120" w:type="dxa"/>
+            </w:tcMar>
+          </w:tcPr>
+          <w:p>
+            <w:pPr>
+              <w:spacing w:after="0"/>
+            </w:pPr>
+            <w:r>
+              <w:rPr>
+                <w:rFonts w:ascii="Calibri" w:hAnsi="Calibri"/>
+                <w:sz w:val="18"/>
+              </w:rPr>
+              <w:t>sankofa_xciv/ocr-3-device-uat-gate</w:t>
+            </w:r>
+          </w:p>
+        </w:tc>
+      </w:tr>
+      <w:tr>
+        <w:trPr>
+          <w:cantSplit/>
+        </w:trPr>
+        <w:tc>
+          <w:tcPr>
+            <w:tcW w:type="dxa" w:w="2232"/>
+            <w:vAlign w:val="center"/>
+            <w:tcMar>
+              <w:top w:w="80" w:type="dxa"/>
+              <w:start w:w="120" w:type="dxa"/>
+              <w:bottom w:w="80" w:type="dxa"/>
+              <w:end w:w="120" w:type="dxa"/>
+            </w:tcMar>
+          </w:tcPr>
+          <w:p>
+            <w:pPr>
+              <w:spacing w:after="0"/>
+            </w:pPr>
+            <w:r>
+              <w:rPr>
+                <w:rFonts w:ascii="Calibri" w:hAnsi="Calibri"/>
+                <w:sz w:val="18"/>
+              </w:rPr>
+              <w:t>Outcome</w:t>
+            </w:r>
+          </w:p>
+        </w:tc>
+        <w:tc>
+          <w:tcPr>
+            <w:tcW w:type="dxa" w:w="7128"/>
+            <w:vAlign w:val="center"/>
+            <w:tcMar>
+              <w:top w:w="80" w:type="dxa"/>
+              <w:start w:w="120" w:type="dxa"/>
+              <w:bottom w:w="80" w:type="dxa"/>
+              <w:end w:w="120" w:type="dxa"/>
+            </w:tcMar>
+          </w:tcPr>
+          <w:p>
+            <w:pPr>
+              <w:spacing w:after="0"/>
+            </w:pPr>
+            <w:r>
+              <w:rPr>
+                <w:rFonts w:ascii="Calibri" w:hAnsi="Calibri"/>
+                <w:sz w:val="18"/>
+              </w:rPr>
+              <w:t>Executable contract for five real access variants, signed Android/iOS devices, and 25 required results; private ignored evidence boundary and responsive guide</w:t>
+            </w:r>
+          </w:p>
+        </w:tc>
+      </w:tr>
+      <w:tr>
+        <w:trPr>
+          <w:cantSplit/>
+        </w:trPr>
+        <w:tc>
+          <w:tcPr>
+            <w:tcW w:type="dxa" w:w="2232"/>
+            <w:shd w:fill="F2F4F7"/>
+            <w:vAlign w:val="center"/>
+            <w:tcMar>
+              <w:top w:w="80" w:type="dxa"/>
+              <w:start w:w="120" w:type="dxa"/>
+              <w:bottom w:w="80" w:type="dxa"/>
+              <w:end w:w="120" w:type="dxa"/>
+            </w:tcMar>
+          </w:tcPr>
+          <w:p>
+            <w:pPr>
+              <w:spacing w:after="0"/>
+            </w:pPr>
+            <w:r>
+              <w:rPr>
+                <w:rFonts w:ascii="Calibri" w:hAnsi="Calibri"/>
+                <w:sz w:val="18"/>
+              </w:rPr>
+              <w:t>Decision</w:t>
+            </w:r>
+          </w:p>
+        </w:tc>
+        <w:tc>
+          <w:tcPr>
+            <w:tcW w:type="dxa" w:w="7128"/>
+            <w:shd w:fill="F2F4F7"/>
+            <w:vAlign w:val="center"/>
+            <w:tcMar>
+              <w:top w:w="80" w:type="dxa"/>
+              <w:start w:w="120" w:type="dxa"/>
+              <w:bottom w:w="80" w:type="dxa"/>
+              <w:end w:w="120" w:type="dxa"/>
+            </w:tcMar>
+          </w:tcPr>
+          <w:p>
+            <w:pPr>
+              <w:spacing w:after="0"/>
+            </w:pPr>
+            <w:r>
+              <w:rPr>
+                <w:rFonts w:ascii="Calibri" w:hAnsi="Calibri"/>
+                <w:sz w:val="18"/>
+              </w:rPr>
+              <w:t>Treat physical UAT as release evidence, not seed data; retain aliases and safe evidence references only; bind proof to exact remote target and deployed commit</w:t>
+            </w:r>
+          </w:p>
+        </w:tc>
+      </w:tr>
+      <w:tr>
+        <w:trPr>
+          <w:cantSplit/>
+        </w:trPr>
+        <w:tc>
+          <w:tcPr>
+            <w:tcW w:type="dxa" w:w="2232"/>
+            <w:vAlign w:val="center"/>
+            <w:tcMar>
+              <w:top w:w="80" w:type="dxa"/>
+              <w:start w:w="120" w:type="dxa"/>
+              <w:bottom w:w="80" w:type="dxa"/>
+              <w:end w:w="120" w:type="dxa"/>
+            </w:tcMar>
+          </w:tcPr>
+          <w:p>
+            <w:pPr>
+              <w:spacing w:after="0"/>
+            </w:pPr>
+            <w:r>
+              <w:rPr>
+                <w:rFonts w:ascii="Calibri" w:hAnsi="Calibri"/>
+                <w:sz w:val="18"/>
+              </w:rPr>
+              <w:t>Rejected alternative</w:t>
+            </w:r>
+          </w:p>
+        </w:tc>
+        <w:tc>
+          <w:tcPr>
+            <w:tcW w:type="dxa" w:w="7128"/>
+            <w:vAlign w:val="center"/>
+            <w:tcMar>
+              <w:top w:w="80" w:type="dxa"/>
+              <w:start w:w="120" w:type="dxa"/>
+              <w:bottom w:w="80" w:type="dxa"/>
+              <w:end w:w="120" w:type="dxa"/>
+            </w:tcMar>
+          </w:tcPr>
+          <w:p>
+            <w:pPr>
+              <w:spacing w:after="0"/>
+            </w:pPr>
+            <w:r>
+              <w:rPr>
+                <w:rFonts w:ascii="Calibri" w:hAnsi="Calibri"/>
+                <w:sz w:val="18"/>
+              </w:rPr>
+              <w:t>Committed credentials/results, document-only attestation, synthetic users presented as UAT, or a single happy-path account</w:t>
+            </w:r>
+          </w:p>
+        </w:tc>
+      </w:tr>
+      <w:tr>
+        <w:trPr>
+          <w:cantSplit/>
+        </w:trPr>
+        <w:tc>
+          <w:tcPr>
+            <w:tcW w:type="dxa" w:w="2232"/>
+            <w:shd w:fill="F2F4F7"/>
+            <w:vAlign w:val="center"/>
+            <w:tcMar>
+              <w:top w:w="80" w:type="dxa"/>
+              <w:start w:w="120" w:type="dxa"/>
+              <w:bottom w:w="80" w:type="dxa"/>
+              <w:end w:w="120" w:type="dxa"/>
+            </w:tcMar>
+          </w:tcPr>
+          <w:p>
+            <w:pPr>
+              <w:spacing w:after="0"/>
+            </w:pPr>
+            <w:r>
+              <w:rPr>
+                <w:rFonts w:ascii="Calibri" w:hAnsi="Calibri"/>
+                <w:sz w:val="18"/>
+              </w:rPr>
+              <w:t>Security</w:t>
+            </w:r>
+          </w:p>
+        </w:tc>
+        <w:tc>
+          <w:tcPr>
+            <w:tcW w:type="dxa" w:w="7128"/>
+            <w:shd w:fill="F2F4F7"/>
+            <w:vAlign w:val="center"/>
+            <w:tcMar>
+              <w:top w:w="80" w:type="dxa"/>
+              <w:start w:w="120" w:type="dxa"/>
+              <w:bottom w:w="80" w:type="dxa"/>
+              <w:end w:w="120" w:type="dxa"/>
+            </w:tcMar>
+          </w:tcPr>
+          <w:p>
+            <w:pPr>
+              <w:spacing w:after="0"/>
+            </w:pPr>
+            <w:r>
+              <w:rPr>
+                <w:rFonts w:ascii="Calibri" w:hAnsi="Calibri"/>
+                <w:sz w:val="18"/>
+              </w:rPr>
+              <w:t>Reject credentials, direct identifiers, raw OCR, native/private paths and device identifiers recursively; output summary/issues only, never the submitted payload or caller path</w:t>
+            </w:r>
+          </w:p>
+        </w:tc>
+      </w:tr>
+      <w:tr>
+        <w:trPr>
+          <w:cantSplit/>
+        </w:trPr>
+        <w:tc>
+          <w:tcPr>
+            <w:tcW w:type="dxa" w:w="2232"/>
+            <w:vAlign w:val="center"/>
+            <w:tcMar>
+              <w:top w:w="80" w:type="dxa"/>
+              <w:start w:w="120" w:type="dxa"/>
+              <w:bottom w:w="80" w:type="dxa"/>
+              <w:end w:w="120" w:type="dxa"/>
+            </w:tcMar>
+          </w:tcPr>
+          <w:p>
+            <w:pPr>
+              <w:spacing w:after="0"/>
+            </w:pPr>
+            <w:r>
+              <w:rPr>
+                <w:rFonts w:ascii="Calibri" w:hAnsi="Calibri"/>
+                <w:sz w:val="18"/>
+              </w:rPr>
+              <w:t>Three-pass challenge</w:t>
+            </w:r>
+          </w:p>
+        </w:tc>
+        <w:tc>
+          <w:tcPr>
+            <w:tcW w:type="dxa" w:w="7128"/>
+            <w:vAlign w:val="center"/>
+            <w:tcMar>
+              <w:top w:w="80" w:type="dxa"/>
+              <w:start w:w="120" w:type="dxa"/>
+              <w:bottom w:w="80" w:type="dxa"/>
+              <w:end w:w="120" w:type="dxa"/>
+            </w:tcMar>
+          </w:tcPr>
+          <w:p>
+            <w:pPr>
+              <w:spacing w:after="0"/>
+            </w:pPr>
+            <w:r>
+              <w:rPr>
+                <w:rFonts w:ascii="Calibri" w:hAnsi="Calibri"/>
+                <w:sz w:val="18"/>
+              </w:rPr>
+              <w:t>Pass 1 reconciled 16 scenarios to 25 results; Pass 2 challenged leakage, evidence traversal and unknown additions; Pass 3 challenged signed-build, commit and release semantics</w:t>
+            </w:r>
+          </w:p>
+        </w:tc>
+      </w:tr>
+      <w:tr>
+        <w:trPr>
+          <w:cantSplit/>
+        </w:trPr>
+        <w:tc>
+          <w:tcPr>
+            <w:tcW w:type="dxa" w:w="2232"/>
+            <w:shd w:fill="F2F4F7"/>
+            <w:vAlign w:val="center"/>
+            <w:tcMar>
+              <w:top w:w="80" w:type="dxa"/>
+              <w:start w:w="120" w:type="dxa"/>
+              <w:bottom w:w="80" w:type="dxa"/>
+              <w:end w:w="120" w:type="dxa"/>
+            </w:tcMar>
+          </w:tcPr>
+          <w:p>
+            <w:pPr>
+              <w:spacing w:after="0"/>
+            </w:pPr>
+            <w:r>
+              <w:rPr>
+                <w:rFonts w:ascii="Calibri" w:hAnsi="Calibri"/>
+                <w:sz w:val="18"/>
+              </w:rPr>
+              <w:t>Improvements</w:t>
+            </w:r>
+          </w:p>
+        </w:tc>
+        <w:tc>
+          <w:tcPr>
+            <w:tcW w:type="dxa" w:w="7128"/>
+            <w:shd w:fill="F2F4F7"/>
+            <w:vAlign w:val="center"/>
+            <w:tcMar>
+              <w:top w:w="80" w:type="dxa"/>
+              <w:start w:w="120" w:type="dxa"/>
+              <w:bottom w:w="80" w:type="dxa"/>
+              <w:end w:w="120" w:type="dxa"/>
+            </w:tcMar>
+          </w:tcPr>
+          <w:p>
+            <w:pPr>
+              <w:spacing w:after="0"/>
+            </w:pPr>
+            <w:r>
+              <w:rPr>
+                <w:rFonts w:ascii="Calibri" w:hAnsi="Calibri"/>
+                <w:sz w:val="18"/>
+              </w:rPr>
+              <w:t>Corrected result count; reject unknown platforms/cases; isolate private JSON; incomplete mode can validate structure but cannot mark release ready</w:t>
+            </w:r>
+          </w:p>
+        </w:tc>
+      </w:tr>
+      <w:tr>
+        <w:trPr>
+          <w:cantSplit/>
+        </w:trPr>
+        <w:tc>
+          <w:tcPr>
+            <w:tcW w:type="dxa" w:w="2232"/>
+            <w:vAlign w:val="center"/>
+            <w:tcMar>
+              <w:top w:w="80" w:type="dxa"/>
+              <w:start w:w="120" w:type="dxa"/>
+              <w:bottom w:w="80" w:type="dxa"/>
+              <w:end w:w="120" w:type="dxa"/>
+            </w:tcMar>
+          </w:tcPr>
+          <w:p>
+            <w:pPr>
+              <w:spacing w:after="0"/>
+            </w:pPr>
+            <w:r>
+              <w:rPr>
+                <w:rFonts w:ascii="Calibri" w:hAnsi="Calibri"/>
+                <w:sz w:val="18"/>
+              </w:rPr>
+              <w:t>Tests</w:t>
+            </w:r>
+          </w:p>
+        </w:tc>
+        <w:tc>
+          <w:tcPr>
+            <w:tcW w:type="dxa" w:w="7128"/>
+            <w:vAlign w:val="center"/>
+            <w:tcMar>
+              <w:top w:w="80" w:type="dxa"/>
+              <w:start w:w="120" w:type="dxa"/>
+              <w:bottom w:w="80" w:type="dxa"/>
+              <w:end w:w="120" w:type="dxa"/>
+            </w:tcMar>
+          </w:tcPr>
+          <w:p>
+            <w:pPr>
+              <w:spacing w:after="0"/>
+            </w:pPr>
+            <w:r>
+              <w:rPr>
+                <w:rFonts w:ascii="Calibri" w:hAnsi="Calibri"/>
+                <w:sz w:val="18"/>
+              </w:rPr>
+              <w:t>6/6 contract tests pass: complete matrix, unknown additions, leakage, missing/failed evidence, and in-progress behavior</w:t>
+            </w:r>
+          </w:p>
+        </w:tc>
+      </w:tr>
+      <w:tr>
+        <w:trPr>
+          <w:cantSplit/>
+        </w:trPr>
+        <w:tc>
+          <w:tcPr>
+            <w:tcW w:type="dxa" w:w="2232"/>
+            <w:shd w:fill="F2F4F7"/>
+            <w:vAlign w:val="center"/>
+            <w:tcMar>
+              <w:top w:w="80" w:type="dxa"/>
+              <w:start w:w="120" w:type="dxa"/>
+              <w:bottom w:w="80" w:type="dxa"/>
+              <w:end w:w="120" w:type="dxa"/>
+            </w:tcMar>
+          </w:tcPr>
+          <w:p>
+            <w:pPr>
+              <w:spacing w:after="0"/>
+            </w:pPr>
+            <w:r>
+              <w:rPr>
+                <w:rFonts w:ascii="Calibri" w:hAnsi="Calibri"/>
+                <w:sz w:val="18"/>
+              </w:rPr>
+              <w:t>Visual evidence</w:t>
+            </w:r>
+          </w:p>
+        </w:tc>
+        <w:tc>
+          <w:tcPr>
+            <w:tcW w:type="dxa" w:w="7128"/>
+            <w:shd w:fill="F2F4F7"/>
+            <w:vAlign w:val="center"/>
+            <w:tcMar>
+              <w:top w:w="80" w:type="dxa"/>
+              <w:start w:w="120" w:type="dxa"/>
+              <w:bottom w:w="80" w:type="dxa"/>
+              <w:end w:w="120" w:type="dxa"/>
+            </w:tcMar>
+          </w:tcPr>
+          <w:p>
+            <w:pPr>
+              <w:spacing w:after="0"/>
+            </w:pPr>
+            <w:r>
+              <w:rPr>
+                <w:rFonts w:ascii="Calibri" w:hAnsi="Calibri"/>
+                <w:sz w:val="18"/>
+              </w:rPr>
+              <w:t>Responsive guide supports Android/iOS viewing; application UI is unchanged; physical scanner proof remains pending</w:t>
+            </w:r>
+          </w:p>
+        </w:tc>
+      </w:tr>
+      <w:tr>
+        <w:trPr>
+          <w:cantSplit/>
+        </w:trPr>
+        <w:tc>
+          <w:tcPr>
+            <w:tcW w:type="dxa" w:w="2232"/>
+            <w:vAlign w:val="center"/>
+            <w:tcMar>
+              <w:top w:w="80" w:type="dxa"/>
+              <w:start w:w="120" w:type="dxa"/>
+              <w:bottom w:w="80" w:type="dxa"/>
+              <w:end w:w="120" w:type="dxa"/>
+            </w:tcMar>
+          </w:tcPr>
+          <w:p>
+            <w:pPr>
+              <w:spacing w:after="0"/>
+            </w:pPr>
+            <w:r>
+              <w:rPr>
+                <w:rFonts w:ascii="Calibri" w:hAnsi="Calibri"/>
+                <w:sz w:val="18"/>
+              </w:rPr>
+              <w:t>Result</w:t>
+            </w:r>
+          </w:p>
+        </w:tc>
+        <w:tc>
+          <w:tcPr>
+            <w:tcW w:type="dxa" w:w="7128"/>
+            <w:vAlign w:val="center"/>
+            <w:tcMar>
+              <w:top w:w="80" w:type="dxa"/>
+              <w:start w:w="120" w:type="dxa"/>
+              <w:bottom w:w="80" w:type="dxa"/>
+              <w:end w:w="120" w:type="dxa"/>
+            </w:tcMar>
+          </w:tcPr>
+          <w:p>
+            <w:pPr>
+              <w:spacing w:after="0"/>
+            </w:pPr>
+            <w:r>
+              <w:rPr>
+                <w:rFonts w:ascii="Calibri" w:hAnsi="Calibri"/>
+                <w:sz w:val="18"/>
+              </w:rPr>
+              <w:t>Gate verified locally; no UAT outcome fabricated and OCR is not yet device-certified</w:t>
+            </w:r>
+          </w:p>
+        </w:tc>
+      </w:tr>
+      <w:tr>
+        <w:trPr>
+          <w:cantSplit/>
+        </w:trPr>
+        <w:tc>
+          <w:tcPr>
+            <w:tcW w:type="dxa" w:w="2232"/>
+            <w:shd w:fill="F2F4F7"/>
+            <w:vAlign w:val="center"/>
+            <w:tcMar>
+              <w:top w:w="80" w:type="dxa"/>
+              <w:start w:w="120" w:type="dxa"/>
+              <w:bottom w:w="80" w:type="dxa"/>
+              <w:end w:w="120" w:type="dxa"/>
+            </w:tcMar>
+          </w:tcPr>
+          <w:p>
+            <w:pPr>
+              <w:spacing w:after="0"/>
+            </w:pPr>
+            <w:r>
+              <w:rPr>
+                <w:rFonts w:ascii="Calibri" w:hAnsi="Calibri"/>
+                <w:sz w:val="18"/>
+              </w:rPr>
+              <w:t>Known gaps</w:t>
+            </w:r>
+          </w:p>
+        </w:tc>
+        <w:tc>
+          <w:tcPr>
+            <w:tcW w:type="dxa" w:w="7128"/>
+            <w:shd w:fill="F2F4F7"/>
+            <w:vAlign w:val="center"/>
+            <w:tcMar>
+              <w:top w:w="80" w:type="dxa"/>
+              <w:start w:w="120" w:type="dxa"/>
+              <w:bottom w:w="80" w:type="dxa"/>
+              <w:end w:w="120" w:type="dxa"/>
+            </w:tcMar>
+          </w:tcPr>
+          <w:p>
+            <w:pPr>
+              <w:spacing w:after="0"/>
+            </w:pPr>
+            <w:r>
+              <w:rPr>
+                <w:rFonts w:ascii="Calibri" w:hAnsi="Calibri"/>
+                <w:sz w:val="18"/>
+              </w:rPr>
+              <w:t>Signed builds, five real assignments, controlled credential handoff, and physical evidence require authorised operators</w:t>
+            </w:r>
+          </w:p>
+        </w:tc>
+      </w:tr>
+      <w:tr>
+        <w:trPr>
+          <w:cantSplit/>
+        </w:trPr>
+        <w:tc>
+          <w:tcPr>
+            <w:tcW w:type="dxa" w:w="2232"/>
+            <w:vAlign w:val="center"/>
+            <w:tcMar>
+              <w:top w:w="80" w:type="dxa"/>
+              <w:start w:w="120" w:type="dxa"/>
+              <w:bottom w:w="80" w:type="dxa"/>
+              <w:end w:w="120" w:type="dxa"/>
+            </w:tcMar>
+          </w:tcPr>
+          <w:p>
+            <w:pPr>
+              <w:spacing w:after="0"/>
+            </w:pPr>
+            <w:r>
+              <w:rPr>
+                <w:rFonts w:ascii="Calibri" w:hAnsi="Calibri"/>
+                <w:sz w:val="18"/>
               </w:rPr>
               <w:t>Next action</w:t>
             </w:r>
@@ -6864,16 +7995,35 @@
         </w:tc>
         <w:tc>
           <w:tcPr>
-            <w:tcW w:type="dxa" w:w="4680"/>
-          </w:tcPr>
-          <w:p>
-            <w:r>
-              <w:t>Run signed-device UAT across the five-role matrix: permissions, capture, cancellation, interruption, OCR review, rollback and role access.</w:t>
+            <w:tcW w:type="dxa" w:w="7128"/>
+            <w:vAlign w:val="center"/>
+            <w:tcMar>
+              <w:top w:w="80" w:type="dxa"/>
+              <w:start w:w="120" w:type="dxa"/>
+              <w:bottom w:w="80" w:type="dxa"/>
+              <w:end w:w="120" w:type="dxa"/>
+            </w:tcMar>
+          </w:tcPr>
+          <w:p>
+            <w:pPr>
+              <w:spacing w:after="0"/>
+            </w:pPr>
+            <w:r>
+              <w:rPr>
+                <w:rFonts w:ascii="Calibri" w:hAnsi="Calibri"/>
+                <w:sz w:val="18"/>
+              </w:rPr>
+              <w:t>Deploy after full CI, execute controlled physical UAT, and validate the ignored private record</w:t>
             </w:r>
           </w:p>
         </w:tc>
       </w:tr>
     </w:tbl>
+    <w:p>
+      <w:pPr>
+        <w:spacing w:after="0"/>
+      </w:pPr>
+    </w:p>
     <w:p>
       <w:pPr>
         <w:pStyle w:val="Heading1"/>
@@ -8424,156 +9574,385 @@
         </w:tc>
       </w:tr>
       <w:tr>
-        <w:tc>
-          <w:tcPr>
-            <w:tcW w:type="dxa" w:w="1872"/>
-          </w:tcPr>
-          <w:p>
-            <w:r>
+        <w:trPr>
+          <w:cantSplit/>
+        </w:trPr>
+        <w:tc>
+          <w:tcPr>
+            <w:tcW w:type="dxa" w:w="864"/>
+            <w:shd w:fill="F2F4F7"/>
+            <w:vAlign w:val="center"/>
+            <w:tcMar>
+              <w:top w:w="80" w:type="dxa"/>
+              <w:start w:w="120" w:type="dxa"/>
+              <w:bottom w:w="80" w:type="dxa"/>
+              <w:end w:w="120" w:type="dxa"/>
+            </w:tcMar>
+          </w:tcPr>
+          <w:p>
+            <w:pPr>
+              <w:spacing w:after="0"/>
+            </w:pPr>
+            <w:r>
+              <w:rPr>
+                <w:rFonts w:ascii="Calibri" w:hAnsi="Calibri"/>
+                <w:sz w:val="18"/>
+              </w:rPr>
               <w:t>D-012</w:t>
             </w:r>
           </w:p>
         </w:tc>
         <w:tc>
           <w:tcPr>
-            <w:tcW w:type="dxa" w:w="1872"/>
-          </w:tcPr>
-          <w:p>
-            <w:r>
+            <w:tcW w:type="dxa" w:w="1296"/>
+            <w:shd w:fill="F2F4F7"/>
+            <w:vAlign w:val="center"/>
+            <w:tcMar>
+              <w:top w:w="80" w:type="dxa"/>
+              <w:start w:w="120" w:type="dxa"/>
+              <w:bottom w:w="80" w:type="dxa"/>
+              <w:end w:w="120" w:type="dxa"/>
+            </w:tcMar>
+          </w:tcPr>
+          <w:p>
+            <w:pPr>
+              <w:spacing w:after="0"/>
+            </w:pPr>
+            <w:r>
+              <w:rPr>
+                <w:rFonts w:ascii="Calibri" w:hAnsi="Calibri"/>
+                <w:sz w:val="18"/>
+              </w:rPr>
               <w:t>24 Aug 2026</w:t>
             </w:r>
           </w:p>
         </w:tc>
         <w:tc>
           <w:tcPr>
-            <w:tcW w:type="dxa" w:w="1872"/>
-          </w:tcPr>
-          <w:p>
-            <w:r>
-              <w:t>Native on-device scanning behind a strict contract</w:t>
-            </w:r>
-          </w:p>
-        </w:tc>
-        <w:tc>
-          <w:tcPr>
-            <w:tcW w:type="dxa" w:w="1872"/>
-          </w:tcPr>
-          <w:p>
-            <w:r>
-              <w:t>Preserve privacy, offline capability, bounded resources and lifecycle ownership</w:t>
-            </w:r>
-          </w:p>
-        </w:tc>
-        <w:tc>
-          <w:tcPr>
-            <w:tcW w:type="dxa" w:w="1872"/>
-          </w:tcPr>
-          <w:p>
-            <w:r>
+            <w:tcW w:type="dxa" w:w="2304"/>
+            <w:shd w:fill="F2F4F7"/>
+            <w:vAlign w:val="center"/>
+            <w:tcMar>
+              <w:top w:w="80" w:type="dxa"/>
+              <w:start w:w="120" w:type="dxa"/>
+              <w:bottom w:w="80" w:type="dxa"/>
+              <w:end w:w="120" w:type="dxa"/>
+            </w:tcMar>
+          </w:tcPr>
+          <w:p>
+            <w:pPr>
+              <w:spacing w:after="0"/>
+            </w:pPr>
+            <w:r>
+              <w:rPr>
+                <w:rFonts w:ascii="Calibri" w:hAnsi="Calibri"/>
+                <w:sz w:val="18"/>
+              </w:rPr>
+              <w:t>Native on-device OCR behind strict contract</w:t>
+            </w:r>
+          </w:p>
+        </w:tc>
+        <w:tc>
+          <w:tcPr>
+            <w:tcW w:type="dxa" w:w="3528"/>
+            <w:shd w:fill="F2F4F7"/>
+            <w:vAlign w:val="center"/>
+            <w:tcMar>
+              <w:top w:w="80" w:type="dxa"/>
+              <w:start w:w="120" w:type="dxa"/>
+              <w:bottom w:w="80" w:type="dxa"/>
+              <w:end w:w="120" w:type="dxa"/>
+            </w:tcMar>
+          </w:tcPr>
+          <w:p>
+            <w:pPr>
+              <w:spacing w:after="0"/>
+            </w:pPr>
+            <w:r>
+              <w:rPr>
+                <w:rFonts w:ascii="Calibri" w:hAnsi="Calibri"/>
+                <w:sz w:val="18"/>
+              </w:rPr>
+              <w:t>Private bounded evidence and offline capability</w:t>
+            </w:r>
+          </w:p>
+        </w:tc>
+        <w:tc>
+          <w:tcPr>
+            <w:tcW w:type="dxa" w:w="1368"/>
+            <w:shd w:fill="F2F4F7"/>
+            <w:vAlign w:val="center"/>
+            <w:tcMar>
+              <w:top w:w="80" w:type="dxa"/>
+              <w:start w:w="120" w:type="dxa"/>
+              <w:bottom w:w="80" w:type="dxa"/>
+              <w:end w:w="120" w:type="dxa"/>
+            </w:tcMar>
+          </w:tcPr>
+          <w:p>
+            <w:pPr>
+              <w:spacing w:after="0"/>
+            </w:pPr>
+            <w:r>
+              <w:rPr>
+                <w:rFonts w:ascii="Calibri" w:hAnsi="Calibri"/>
+                <w:sz w:val="18"/>
+              </w:rPr>
               <w:t>Accepted</w:t>
             </w:r>
           </w:p>
         </w:tc>
       </w:tr>
       <w:tr>
-        <w:tc>
-          <w:tcPr>
-            <w:tcW w:type="dxa" w:w="1872"/>
-          </w:tcPr>
-          <w:p>
-            <w:r>
+        <w:trPr>
+          <w:cantSplit/>
+        </w:trPr>
+        <w:tc>
+          <w:tcPr>
+            <w:tcW w:type="dxa" w:w="864"/>
+            <w:vAlign w:val="center"/>
+            <w:tcMar>
+              <w:top w:w="80" w:type="dxa"/>
+              <w:start w:w="120" w:type="dxa"/>
+              <w:bottom w:w="80" w:type="dxa"/>
+              <w:end w:w="120" w:type="dxa"/>
+            </w:tcMar>
+          </w:tcPr>
+          <w:p>
+            <w:pPr>
+              <w:spacing w:after="0"/>
+            </w:pPr>
+            <w:r>
+              <w:rPr>
+                <w:rFonts w:ascii="Calibri" w:hAnsi="Calibri"/>
+                <w:sz w:val="18"/>
+              </w:rPr>
               <w:t>D-013</w:t>
             </w:r>
           </w:p>
         </w:tc>
         <w:tc>
           <w:tcPr>
-            <w:tcW w:type="dxa" w:w="1872"/>
-          </w:tcPr>
-          <w:p>
-            <w:r>
+            <w:tcW w:type="dxa" w:w="1296"/>
+            <w:vAlign w:val="center"/>
+            <w:tcMar>
+              <w:top w:w="80" w:type="dxa"/>
+              <w:start w:w="120" w:type="dxa"/>
+              <w:bottom w:w="80" w:type="dxa"/>
+              <w:end w:w="120" w:type="dxa"/>
+            </w:tcMar>
+          </w:tcPr>
+          <w:p>
+            <w:pPr>
+              <w:spacing w:after="0"/>
+            </w:pPr>
+            <w:r>
+              <w:rPr>
+                <w:rFonts w:ascii="Calibri" w:hAnsi="Calibri"/>
+                <w:sz w:val="18"/>
+              </w:rPr>
               <w:t>24 Aug 2026</w:t>
             </w:r>
           </w:p>
         </w:tc>
         <w:tc>
           <w:tcPr>
-            <w:tcW w:type="dxa" w:w="1872"/>
-          </w:tcPr>
-          <w:p>
-            <w:r>
-              <w:t>OCR remains reviewable evidence</w:t>
-            </w:r>
-          </w:p>
-        </w:tc>
-        <w:tc>
-          <w:tcPr>
-            <w:tcW w:type="dxa" w:w="1872"/>
-          </w:tcPr>
-          <w:p>
-            <w:r>
-              <w:t>Recognition must not silently change authoritative asset data</w:t>
-            </w:r>
-          </w:p>
-        </w:tc>
-        <w:tc>
-          <w:tcPr>
-            <w:tcW w:type="dxa" w:w="1872"/>
-          </w:tcPr>
-          <w:p>
-            <w:r>
+            <w:tcW w:type="dxa" w:w="2304"/>
+            <w:vAlign w:val="center"/>
+            <w:tcMar>
+              <w:top w:w="80" w:type="dxa"/>
+              <w:start w:w="120" w:type="dxa"/>
+              <w:bottom w:w="80" w:type="dxa"/>
+              <w:end w:w="120" w:type="dxa"/>
+            </w:tcMar>
+          </w:tcPr>
+          <w:p>
+            <w:pPr>
+              <w:spacing w:after="0"/>
+            </w:pPr>
+            <w:r>
+              <w:rPr>
+                <w:rFonts w:ascii="Calibri" w:hAnsi="Calibri"/>
+                <w:sz w:val="18"/>
+              </w:rPr>
+              <w:t>OCR remains human-reviewed evidence</w:t>
+            </w:r>
+          </w:p>
+        </w:tc>
+        <w:tc>
+          <w:tcPr>
+            <w:tcW w:type="dxa" w:w="3528"/>
+            <w:vAlign w:val="center"/>
+            <w:tcMar>
+              <w:top w:w="80" w:type="dxa"/>
+              <w:start w:w="120" w:type="dxa"/>
+              <w:bottom w:w="80" w:type="dxa"/>
+              <w:end w:w="120" w:type="dxa"/>
+            </w:tcMar>
+          </w:tcPr>
+          <w:p>
+            <w:pPr>
+              <w:spacing w:after="0"/>
+            </w:pPr>
+            <w:r>
+              <w:rPr>
+                <w:rFonts w:ascii="Calibri" w:hAnsi="Calibri"/>
+                <w:sz w:val="18"/>
+              </w:rPr>
+              <w:t>Prevent recognition errors becoming authoritative data</w:t>
+            </w:r>
+          </w:p>
+        </w:tc>
+        <w:tc>
+          <w:tcPr>
+            <w:tcW w:type="dxa" w:w="1368"/>
+            <w:vAlign w:val="center"/>
+            <w:tcMar>
+              <w:top w:w="80" w:type="dxa"/>
+              <w:start w:w="120" w:type="dxa"/>
+              <w:bottom w:w="80" w:type="dxa"/>
+              <w:end w:w="120" w:type="dxa"/>
+            </w:tcMar>
+          </w:tcPr>
+          <w:p>
+            <w:pPr>
+              <w:spacing w:after="0"/>
+            </w:pPr>
+            <w:r>
+              <w:rPr>
+                <w:rFonts w:ascii="Calibri" w:hAnsi="Calibri"/>
+                <w:sz w:val="18"/>
+              </w:rPr>
               <w:t>Accepted</w:t>
             </w:r>
           </w:p>
         </w:tc>
       </w:tr>
       <w:tr>
-        <w:tc>
-          <w:tcPr>
-            <w:tcW w:type="dxa" w:w="1872"/>
-          </w:tcPr>
-          <w:p>
-            <w:r>
+        <w:trPr>
+          <w:cantSplit/>
+        </w:trPr>
+        <w:tc>
+          <w:tcPr>
+            <w:tcW w:type="dxa" w:w="864"/>
+            <w:shd w:fill="F2F4F7"/>
+            <w:vAlign w:val="center"/>
+            <w:tcMar>
+              <w:top w:w="80" w:type="dxa"/>
+              <w:start w:w="120" w:type="dxa"/>
+              <w:bottom w:w="80" w:type="dxa"/>
+              <w:end w:w="120" w:type="dxa"/>
+            </w:tcMar>
+          </w:tcPr>
+          <w:p>
+            <w:pPr>
+              <w:spacing w:after="0"/>
+            </w:pPr>
+            <w:r>
+              <w:rPr>
+                <w:rFonts w:ascii="Calibri" w:hAnsi="Calibri"/>
+                <w:sz w:val="18"/>
+              </w:rPr>
               <w:t>D-014</w:t>
             </w:r>
           </w:p>
         </w:tc>
         <w:tc>
           <w:tcPr>
-            <w:tcW w:type="dxa" w:w="1872"/>
-          </w:tcPr>
-          <w:p>
-            <w:r>
+            <w:tcW w:type="dxa" w:w="1296"/>
+            <w:shd w:fill="F2F4F7"/>
+            <w:vAlign w:val="center"/>
+            <w:tcMar>
+              <w:top w:w="80" w:type="dxa"/>
+              <w:start w:w="120" w:type="dxa"/>
+              <w:bottom w:w="80" w:type="dxa"/>
+              <w:end w:w="120" w:type="dxa"/>
+            </w:tcMar>
+          </w:tcPr>
+          <w:p>
+            <w:pPr>
+              <w:spacing w:after="0"/>
+            </w:pPr>
+            <w:r>
+              <w:rPr>
+                <w:rFonts w:ascii="Calibri" w:hAnsi="Calibri"/>
+                <w:sz w:val="18"/>
+              </w:rPr>
               <w:t>24 Aug 2026</w:t>
             </w:r>
           </w:p>
         </w:tc>
         <w:tc>
           <w:tcPr>
-            <w:tcW w:type="dxa" w:w="1872"/>
-          </w:tcPr>
-          <w:p>
-            <w:r>
-              <w:t>Two-phase immutable evidence persistence</w:t>
-            </w:r>
-          </w:p>
-        </w:tc>
-        <w:tc>
-          <w:tcPr>
-            <w:tcW w:type="dxa" w:w="1872"/>
-          </w:tcPr>
-          <w:p>
-            <w:r>
-              <w:t>Prevent orphaned private objects and hash/provenance drift</w:t>
-            </w:r>
-          </w:p>
-        </w:tc>
-        <w:tc>
-          <w:tcPr>
-            <w:tcW w:type="dxa" w:w="1872"/>
-          </w:tcPr>
-          <w:p>
-            <w:r>
+            <w:tcW w:type="dxa" w:w="2304"/>
+            <w:shd w:fill="F2F4F7"/>
+            <w:vAlign w:val="center"/>
+            <w:tcMar>
+              <w:top w:w="80" w:type="dxa"/>
+              <w:start w:w="120" w:type="dxa"/>
+              <w:bottom w:w="80" w:type="dxa"/>
+              <w:end w:w="120" w:type="dxa"/>
+            </w:tcMar>
+          </w:tcPr>
+          <w:p>
+            <w:pPr>
+              <w:spacing w:after="0"/>
+            </w:pPr>
+            <w:r>
+              <w:rPr>
+                <w:rFonts w:ascii="Calibri" w:hAnsi="Calibri"/>
+                <w:sz w:val="18"/>
+              </w:rPr>
+              <w:t>Private alias-only executable physical UAT</w:t>
+            </w:r>
+          </w:p>
+        </w:tc>
+        <w:tc>
+          <w:tcPr>
+            <w:tcW w:type="dxa" w:w="3528"/>
+            <w:shd w:fill="F2F4F7"/>
+            <w:vAlign w:val="center"/>
+            <w:tcMar>
+              <w:top w:w="80" w:type="dxa"/>
+              <w:start w:w="120" w:type="dxa"/>
+              <w:bottom w:w="80" w:type="dxa"/>
+              <w:end w:w="120" w:type="dxa"/>
+            </w:tcMar>
+          </w:tcPr>
+          <w:p>
+            <w:pPr>
+              <w:spacing w:after="0"/>
+            </w:pPr>
+            <w:r>
+              <w:rPr>
+                <w:rFonts w:ascii="Calibri" w:hAnsi="Calibri"/>
+                <w:sz w:val="18"/>
+              </w:rPr>
+              <w:t>Prevent false certification and sensitive-data leakage</w:t>
+            </w:r>
+          </w:p>
+        </w:tc>
+        <w:tc>
+          <w:tcPr>
+            <w:tcW w:type="dxa" w:w="1368"/>
+            <w:shd w:fill="F2F4F7"/>
+            <w:vAlign w:val="center"/>
+            <w:tcMar>
+              <w:top w:w="80" w:type="dxa"/>
+              <w:start w:w="120" w:type="dxa"/>
+              <w:bottom w:w="80" w:type="dxa"/>
+              <w:end w:w="120" w:type="dxa"/>
+            </w:tcMar>
+          </w:tcPr>
+          <w:p>
+            <w:pPr>
+              <w:spacing w:after="0"/>
+            </w:pPr>
+            <w:r>
+              <w:rPr>
+                <w:rFonts w:ascii="Calibri" w:hAnsi="Calibri"/>
+                <w:sz w:val="18"/>
+              </w:rPr>
               <w:t>Accepted</w:t>
             </w:r>
           </w:p>
@@ -9897,105 +11276,386 @@
         </w:tc>
       </w:tr>
       <w:tr>
-        <w:tc>
-          <w:tcPr>
-            <w:tcW w:type="dxa" w:w="1872"/>
-          </w:tcPr>
-          <w:p>
-            <w:r>
+        <w:trPr>
+          <w:cantSplit/>
+        </w:trPr>
+        <w:tc>
+          <w:tcPr>
+            <w:tcW w:type="dxa" w:w="1008"/>
+            <w:shd w:fill="F2F4F7"/>
+            <w:vAlign w:val="center"/>
+            <w:tcMar>
+              <w:top w:w="80" w:type="dxa"/>
+              <w:start w:w="120" w:type="dxa"/>
+              <w:bottom w:w="80" w:type="dxa"/>
+              <w:end w:w="120" w:type="dxa"/>
+            </w:tcMar>
+          </w:tcPr>
+          <w:p>
+            <w:pPr>
+              <w:spacing w:after="0"/>
+            </w:pPr>
+            <w:r>
+              <w:rPr>
+                <w:rFonts w:ascii="Calibri" w:hAnsi="Calibri"/>
+                <w:sz w:val="18"/>
+              </w:rPr>
               <w:t>E-009</w:t>
             </w:r>
           </w:p>
         </w:tc>
         <w:tc>
           <w:tcPr>
-            <w:tcW w:type="dxa" w:w="1872"/>
-          </w:tcPr>
-          <w:p>
-            <w:r>
+            <w:tcW w:type="dxa" w:w="1080"/>
+            <w:shd w:fill="F2F4F7"/>
+            <w:vAlign w:val="center"/>
+            <w:tcMar>
+              <w:top w:w="80" w:type="dxa"/>
+              <w:start w:w="120" w:type="dxa"/>
+              <w:bottom w:w="80" w:type="dxa"/>
+              <w:end w:w="120" w:type="dxa"/>
+            </w:tcMar>
+          </w:tcPr>
+          <w:p>
+            <w:pPr>
+              <w:spacing w:after="0"/>
+            </w:pPr>
+            <w:r>
+              <w:rPr>
+                <w:rFonts w:ascii="Calibri" w:hAnsi="Calibri"/>
+                <w:sz w:val="18"/>
+              </w:rPr>
               <w:t>OCR-1</w:t>
             </w:r>
           </w:p>
         </w:tc>
         <w:tc>
           <w:tcPr>
-            <w:tcW w:type="dxa" w:w="1872"/>
-          </w:tcPr>
-          <w:p>
-            <w:r>
-              <w:t>Contract, integrity, cleanup, fallback and human-review proof</w:t>
-            </w:r>
-          </w:p>
-        </w:tc>
-        <w:tc>
-          <w:tcPr>
-            <w:tcW w:type="dxa" w:w="1872"/>
-          </w:tcPr>
-          <w:p>
-            <w:r>
-              <w:t>Verified locally</w:t>
-            </w:r>
-          </w:p>
-        </w:tc>
-        <w:tc>
-          <w:tcPr>
-            <w:tcW w:type="dxa" w:w="1872"/>
-          </w:tcPr>
-          <w:p>
-            <w:r>
-              <w:t>Full gate passed with 93/93 browser tests; security review covered all changed source files</w:t>
+            <w:tcW w:type="dxa" w:w="3960"/>
+            <w:shd w:fill="F2F4F7"/>
+            <w:vAlign w:val="center"/>
+            <w:tcMar>
+              <w:top w:w="80" w:type="dxa"/>
+              <w:start w:w="120" w:type="dxa"/>
+              <w:bottom w:w="80" w:type="dxa"/>
+              <w:end w:w="120" w:type="dxa"/>
+            </w:tcMar>
+          </w:tcPr>
+          <w:p>
+            <w:pPr>
+              <w:spacing w:after="0"/>
+            </w:pPr>
+            <w:r>
+              <w:rPr>
+                <w:rFonts w:ascii="Calibri" w:hAnsi="Calibri"/>
+                <w:sz w:val="18"/>
+              </w:rPr>
+              <w:t>Contract, integrity, cleanup, fallback, and review proof</w:t>
+            </w:r>
+          </w:p>
+        </w:tc>
+        <w:tc>
+          <w:tcPr>
+            <w:tcW w:type="dxa" w:w="1224"/>
+            <w:shd w:fill="F2F4F7"/>
+            <w:vAlign w:val="center"/>
+            <w:tcMar>
+              <w:top w:w="80" w:type="dxa"/>
+              <w:start w:w="120" w:type="dxa"/>
+              <w:bottom w:w="80" w:type="dxa"/>
+              <w:end w:w="120" w:type="dxa"/>
+            </w:tcMar>
+          </w:tcPr>
+          <w:p>
+            <w:pPr>
+              <w:spacing w:after="0"/>
+            </w:pPr>
+            <w:r>
+              <w:rPr>
+                <w:rFonts w:ascii="Calibri" w:hAnsi="Calibri"/>
+                <w:sz w:val="18"/>
+              </w:rPr>
+              <w:t>Verified</w:t>
+            </w:r>
+          </w:p>
+        </w:tc>
+        <w:tc>
+          <w:tcPr>
+            <w:tcW w:type="dxa" w:w="2088"/>
+            <w:shd w:fill="F2F4F7"/>
+            <w:vAlign w:val="center"/>
+            <w:tcMar>
+              <w:top w:w="80" w:type="dxa"/>
+              <w:start w:w="120" w:type="dxa"/>
+              <w:bottom w:w="80" w:type="dxa"/>
+              <w:end w:w="120" w:type="dxa"/>
+            </w:tcMar>
+          </w:tcPr>
+          <w:p>
+            <w:pPr>
+              <w:spacing w:after="0"/>
+            </w:pPr>
+            <w:r>
+              <w:rPr>
+                <w:rFonts w:ascii="Calibri" w:hAnsi="Calibri"/>
+                <w:sz w:val="18"/>
+              </w:rPr>
+              <w:t>Release gate, security scan, and browser tests passed</w:t>
             </w:r>
           </w:p>
         </w:tc>
       </w:tr>
       <w:tr>
-        <w:tc>
-          <w:tcPr>
-            <w:tcW w:type="dxa" w:w="1872"/>
-          </w:tcPr>
-          <w:p>
-            <w:r>
+        <w:trPr>
+          <w:cantSplit/>
+        </w:trPr>
+        <w:tc>
+          <w:tcPr>
+            <w:tcW w:type="dxa" w:w="1008"/>
+            <w:vAlign w:val="center"/>
+            <w:tcMar>
+              <w:top w:w="80" w:type="dxa"/>
+              <w:start w:w="120" w:type="dxa"/>
+              <w:bottom w:w="80" w:type="dxa"/>
+              <w:end w:w="120" w:type="dxa"/>
+            </w:tcMar>
+          </w:tcPr>
+          <w:p>
+            <w:pPr>
+              <w:spacing w:after="0"/>
+            </w:pPr>
+            <w:r>
+              <w:rPr>
+                <w:rFonts w:ascii="Calibri" w:hAnsi="Calibri"/>
+                <w:sz w:val="18"/>
+              </w:rPr>
               <w:t>E-010</w:t>
             </w:r>
           </w:p>
         </w:tc>
         <w:tc>
           <w:tcPr>
-            <w:tcW w:type="dxa" w:w="1872"/>
-          </w:tcPr>
-          <w:p>
-            <w:r>
+            <w:tcW w:type="dxa" w:w="1080"/>
+            <w:vAlign w:val="center"/>
+            <w:tcMar>
+              <w:top w:w="80" w:type="dxa"/>
+              <w:start w:w="120" w:type="dxa"/>
+              <w:bottom w:w="80" w:type="dxa"/>
+              <w:end w:w="120" w:type="dxa"/>
+            </w:tcMar>
+          </w:tcPr>
+          <w:p>
+            <w:pPr>
+              <w:spacing w:after="0"/>
+            </w:pPr>
+            <w:r>
+              <w:rPr>
+                <w:rFonts w:ascii="Calibri" w:hAnsi="Calibri"/>
+                <w:sz w:val="18"/>
+              </w:rPr>
               <w:t>OCR-2</w:t>
             </w:r>
           </w:p>
         </w:tc>
         <w:tc>
           <w:tcPr>
-            <w:tcW w:type="dxa" w:w="1872"/>
-          </w:tcPr>
-          <w:p>
-            <w:r>
+            <w:tcW w:type="dxa" w:w="3960"/>
+            <w:vAlign w:val="center"/>
+            <w:tcMar>
+              <w:top w:w="80" w:type="dxa"/>
+              <w:start w:w="120" w:type="dxa"/>
+              <w:bottom w:w="80" w:type="dxa"/>
+              <w:end w:w="120" w:type="dxa"/>
+            </w:tcMar>
+          </w:tcPr>
+          <w:p>
+            <w:pPr>
+              <w:spacing w:after="0"/>
+            </w:pPr>
+            <w:r>
+              <w:rPr>
+                <w:rFonts w:ascii="Calibri" w:hAnsi="Calibri"/>
+                <w:sz w:val="18"/>
+              </w:rPr>
               <w:t>Android ML Kit and iOS VisionKit/Vision compile and device proof</w:t>
             </w:r>
           </w:p>
         </w:tc>
         <w:tc>
           <w:tcPr>
-            <w:tcW w:type="dxa" w:w="1872"/>
-          </w:tcPr>
-          <w:p>
-            <w:r>
+            <w:tcW w:type="dxa" w:w="1224"/>
+            <w:vAlign w:val="center"/>
+            <w:tcMar>
+              <w:top w:w="80" w:type="dxa"/>
+              <w:start w:w="120" w:type="dxa"/>
+              <w:bottom w:w="80" w:type="dxa"/>
+              <w:end w:w="120" w:type="dxa"/>
+            </w:tcMar>
+          </w:tcPr>
+          <w:p>
+            <w:pPr>
+              <w:spacing w:after="0"/>
+            </w:pPr>
+            <w:r>
+              <w:rPr>
+                <w:rFonts w:ascii="Calibri" w:hAnsi="Calibri"/>
+                <w:sz w:val="18"/>
+              </w:rPr>
               <w:t>Partial</w:t>
             </w:r>
           </w:p>
         </w:tc>
         <w:tc>
           <w:tcPr>
-            <w:tcW w:type="dxa" w:w="1872"/>
-          </w:tcPr>
-          <w:p>
-            <w:r>
-              <w:t>Native source/lifecycle review passed; remote CI and signed-device UAT pending</w:t>
+            <w:tcW w:type="dxa" w:w="2088"/>
+            <w:vAlign w:val="center"/>
+            <w:tcMar>
+              <w:top w:w="80" w:type="dxa"/>
+              <w:start w:w="120" w:type="dxa"/>
+              <w:bottom w:w="80" w:type="dxa"/>
+              <w:end w:w="120" w:type="dxa"/>
+            </w:tcMar>
+          </w:tcPr>
+          <w:p>
+            <w:pPr>
+              <w:spacing w:after="0"/>
+            </w:pPr>
+            <w:r>
+              <w:rPr>
+                <w:rFonts w:ascii="Calibri" w:hAnsi="Calibri"/>
+                <w:sz w:val="18"/>
+              </w:rPr>
+              <w:t>Remote native CI passed; signed physical-device UAT pending</w:t>
+            </w:r>
+          </w:p>
+        </w:tc>
+      </w:tr>
+      <w:tr>
+        <w:trPr>
+          <w:cantSplit/>
+        </w:trPr>
+        <w:tc>
+          <w:tcPr>
+            <w:tcW w:type="dxa" w:w="1008"/>
+            <w:shd w:fill="F2F4F7"/>
+            <w:vAlign w:val="center"/>
+            <w:tcMar>
+              <w:top w:w="80" w:type="dxa"/>
+              <w:start w:w="120" w:type="dxa"/>
+              <w:bottom w:w="80" w:type="dxa"/>
+              <w:end w:w="120" w:type="dxa"/>
+            </w:tcMar>
+          </w:tcPr>
+          <w:p>
+            <w:pPr>
+              <w:spacing w:after="0"/>
+            </w:pPr>
+            <w:r>
+              <w:rPr>
+                <w:rFonts w:ascii="Calibri" w:hAnsi="Calibri"/>
+                <w:sz w:val="18"/>
+              </w:rPr>
+              <w:t>E-011</w:t>
+            </w:r>
+          </w:p>
+        </w:tc>
+        <w:tc>
+          <w:tcPr>
+            <w:tcW w:type="dxa" w:w="1080"/>
+            <w:shd w:fill="F2F4F7"/>
+            <w:vAlign w:val="center"/>
+            <w:tcMar>
+              <w:top w:w="80" w:type="dxa"/>
+              <w:start w:w="120" w:type="dxa"/>
+              <w:bottom w:w="80" w:type="dxa"/>
+              <w:end w:w="120" w:type="dxa"/>
+            </w:tcMar>
+          </w:tcPr>
+          <w:p>
+            <w:pPr>
+              <w:spacing w:after="0"/>
+            </w:pPr>
+            <w:r>
+              <w:rPr>
+                <w:rFonts w:ascii="Calibri" w:hAnsi="Calibri"/>
+                <w:sz w:val="18"/>
+              </w:rPr>
+              <w:t>OCR-3</w:t>
+            </w:r>
+          </w:p>
+        </w:tc>
+        <w:tc>
+          <w:tcPr>
+            <w:tcW w:type="dxa" w:w="3960"/>
+            <w:shd w:fill="F2F4F7"/>
+            <w:vAlign w:val="center"/>
+            <w:tcMar>
+              <w:top w:w="80" w:type="dxa"/>
+              <w:start w:w="120" w:type="dxa"/>
+              <w:bottom w:w="80" w:type="dxa"/>
+              <w:end w:w="120" w:type="dxa"/>
+            </w:tcMar>
+          </w:tcPr>
+          <w:p>
+            <w:pPr>
+              <w:spacing w:after="0"/>
+            </w:pPr>
+            <w:r>
+              <w:rPr>
+                <w:rFonts w:ascii="Calibri" w:hAnsi="Calibri"/>
+                <w:sz w:val="18"/>
+              </w:rPr>
+              <w:t>Five-role UAT contract, privacy gate, and execution guide</w:t>
+            </w:r>
+          </w:p>
+        </w:tc>
+        <w:tc>
+          <w:tcPr>
+            <w:tcW w:type="dxa" w:w="1224"/>
+            <w:shd w:fill="F2F4F7"/>
+            <w:vAlign w:val="center"/>
+            <w:tcMar>
+              <w:top w:w="80" w:type="dxa"/>
+              <w:start w:w="120" w:type="dxa"/>
+              <w:bottom w:w="80" w:type="dxa"/>
+              <w:end w:w="120" w:type="dxa"/>
+            </w:tcMar>
+          </w:tcPr>
+          <w:p>
+            <w:pPr>
+              <w:spacing w:after="0"/>
+            </w:pPr>
+            <w:r>
+              <w:rPr>
+                <w:rFonts w:ascii="Calibri" w:hAnsi="Calibri"/>
+                <w:sz w:val="18"/>
+              </w:rPr>
+              <w:t>Verified locally</w:t>
+            </w:r>
+          </w:p>
+        </w:tc>
+        <w:tc>
+          <w:tcPr>
+            <w:tcW w:type="dxa" w:w="2088"/>
+            <w:shd w:fill="F2F4F7"/>
+            <w:vAlign w:val="center"/>
+            <w:tcMar>
+              <w:top w:w="80" w:type="dxa"/>
+              <w:start w:w="120" w:type="dxa"/>
+              <w:bottom w:w="80" w:type="dxa"/>
+              <w:end w:w="120" w:type="dxa"/>
+            </w:tcMar>
+          </w:tcPr>
+          <w:p>
+            <w:pPr>
+              <w:spacing w:after="0"/>
+            </w:pPr>
+            <w:r>
+              <w:rPr>
+                <w:rFonts w:ascii="Calibri" w:hAnsi="Calibri"/>
+                <w:sz w:val="18"/>
+              </w:rPr>
+              <w:t>6/6 contract tests pass; physical results pending</w:t>
             </w:r>
           </w:p>
         </w:tc>
@@ -10850,127 +12510,207 @@
         </w:tc>
       </w:tr>
       <w:tr>
-        <w:tc>
-          <w:tcPr>
-            <w:tcW w:type="dxa" w:w="2340"/>
-          </w:tcPr>
-          <w:p>
-            <w:r>
-              <w:t>Interrupted native scan leaves cache residue</w:t>
-            </w:r>
-          </w:p>
-        </w:tc>
-        <w:tc>
-          <w:tcPr>
-            <w:tcW w:type="dxa" w:w="2340"/>
-          </w:tcPr>
-          <w:p>
-            <w:r>
-              <w:t>Sensitive evidence remains on a device longer than intended</w:t>
-            </w:r>
-          </w:p>
-        </w:tc>
-        <w:tc>
-          <w:tcPr>
-            <w:tcW w:type="dxa" w:w="2340"/>
-          </w:tcPr>
-          <w:p>
-            <w:r>
-              <w:t>Private/protected cache, safe startup sweep, no backup and no path logging</w:t>
-            </w:r>
-          </w:p>
-        </w:tc>
-        <w:tc>
-          <w:tcPr>
-            <w:tcW w:type="dxa" w:w="2340"/>
-          </w:tcPr>
-          <w:p>
-            <w:r>
-              <w:t>Controlled; device kill-test pending</w:t>
+        <w:trPr>
+          <w:cantSplit/>
+        </w:trPr>
+        <w:tc>
+          <w:tcPr>
+            <w:tcW w:type="dxa" w:w="2376"/>
+            <w:shd w:fill="F2F4F7"/>
+            <w:vAlign w:val="center"/>
+            <w:tcMar>
+              <w:top w:w="80" w:type="dxa"/>
+              <w:start w:w="120" w:type="dxa"/>
+              <w:bottom w:w="80" w:type="dxa"/>
+              <w:end w:w="120" w:type="dxa"/>
+            </w:tcMar>
+          </w:tcPr>
+          <w:p>
+            <w:pPr>
+              <w:spacing w:after="0"/>
+            </w:pPr>
+            <w:r>
+              <w:rPr>
+                <w:rFonts w:ascii="Calibri" w:hAnsi="Calibri"/>
+                <w:sz w:val="18"/>
+              </w:rPr>
+              <w:t>Interrupted scan leaves cache residue</w:t>
+            </w:r>
+          </w:p>
+        </w:tc>
+        <w:tc>
+          <w:tcPr>
+            <w:tcW w:type="dxa" w:w="2088"/>
+            <w:shd w:fill="F2F4F7"/>
+            <w:vAlign w:val="center"/>
+            <w:tcMar>
+              <w:top w:w="80" w:type="dxa"/>
+              <w:start w:w="120" w:type="dxa"/>
+              <w:bottom w:w="80" w:type="dxa"/>
+              <w:end w:w="120" w:type="dxa"/>
+            </w:tcMar>
+          </w:tcPr>
+          <w:p>
+            <w:pPr>
+              <w:spacing w:after="0"/>
+            </w:pPr>
+            <w:r>
+              <w:rPr>
+                <w:rFonts w:ascii="Calibri" w:hAnsi="Calibri"/>
+                <w:sz w:val="18"/>
+              </w:rPr>
+              <w:t>Private evidence persists</w:t>
+            </w:r>
+          </w:p>
+        </w:tc>
+        <w:tc>
+          <w:tcPr>
+            <w:tcW w:type="dxa" w:w="3528"/>
+            <w:shd w:fill="F2F4F7"/>
+            <w:vAlign w:val="center"/>
+            <w:tcMar>
+              <w:top w:w="80" w:type="dxa"/>
+              <w:start w:w="120" w:type="dxa"/>
+              <w:bottom w:w="80" w:type="dxa"/>
+              <w:end w:w="120" w:type="dxa"/>
+            </w:tcMar>
+          </w:tcPr>
+          <w:p>
+            <w:pPr>
+              <w:spacing w:after="0"/>
+            </w:pPr>
+            <w:r>
+              <w:rPr>
+                <w:rFonts w:ascii="Calibri" w:hAnsi="Calibri"/>
+                <w:sz w:val="18"/>
+              </w:rPr>
+              <w:t>Private cache, cleanup and startup sweep</w:t>
+            </w:r>
+          </w:p>
+        </w:tc>
+        <w:tc>
+          <w:tcPr>
+            <w:tcW w:type="dxa" w:w="1368"/>
+            <w:shd w:fill="F2F4F7"/>
+            <w:vAlign w:val="center"/>
+            <w:tcMar>
+              <w:top w:w="80" w:type="dxa"/>
+              <w:start w:w="120" w:type="dxa"/>
+              <w:bottom w:w="80" w:type="dxa"/>
+              <w:end w:w="120" w:type="dxa"/>
+            </w:tcMar>
+          </w:tcPr>
+          <w:p>
+            <w:pPr>
+              <w:spacing w:after="0"/>
+            </w:pPr>
+            <w:r>
+              <w:rPr>
+                <w:rFonts w:ascii="Calibri" w:hAnsi="Calibri"/>
+                <w:sz w:val="18"/>
+              </w:rPr>
+              <w:t>Code controlled; device test pending</w:t>
             </w:r>
           </w:p>
         </w:tc>
       </w:tr>
       <w:tr>
-        <w:tc>
-          <w:tcPr>
-            <w:tcW w:type="dxa" w:w="2340"/>
-          </w:tcPr>
-          <w:p>
-            <w:r>
-              <w:t>Evidence upload becomes orphaned or mutable</w:t>
-            </w:r>
-          </w:p>
-        </w:tc>
-        <w:tc>
-          <w:tcPr>
-            <w:tcW w:type="dxa" w:w="2340"/>
-          </w:tcPr>
-          <w:p>
-            <w:r>
-              <w:t>Private bytes and audit digest diverge</w:t>
-            </w:r>
-          </w:p>
-        </w:tc>
-        <w:tc>
-          <w:tcPr>
-            <w:tcW w:type="dxa" w:w="2340"/>
-          </w:tcPr>
-          <w:p>
-            <w:r>
-              <w:t>Pending row before upload, checked rollback, immutable ready objects and provenance</w:t>
-            </w:r>
-          </w:p>
-        </w:tc>
-        <w:tc>
-          <w:tcPr>
-            <w:tcW w:type="dxa" w:w="2340"/>
-          </w:tcPr>
-          <w:p>
-            <w:r>
-              <w:t>Controlled in code; remote pgTAP pending</w:t>
-            </w:r>
-          </w:p>
-        </w:tc>
-      </w:tr>
-      <w:tr>
-        <w:tc>
-          <w:tcPr>
-            <w:tcW w:type="dxa" w:w="2340"/>
-          </w:tcPr>
-          <w:p>
-            <w:r>
-              <w:t>OCR suggestion is treated as verified truth</w:t>
-            </w:r>
-          </w:p>
-        </w:tc>
-        <w:tc>
-          <w:tcPr>
-            <w:tcW w:type="dxa" w:w="2340"/>
-          </w:tcPr>
-          <w:p>
-            <w:r>
-              <w:t>Incorrect identifiers or dates enter operations</w:t>
-            </w:r>
-          </w:p>
-        </w:tc>
-        <w:tc>
-          <w:tcPr>
-            <w:tcW w:type="dxa" w:w="2340"/>
-          </w:tcPr>
-          <w:p>
-            <w:r>
-              <w:t>Apply-and-verify gate, confidence/provenance display and audit metadata</w:t>
-            </w:r>
-          </w:p>
-        </w:tc>
-        <w:tc>
-          <w:tcPr>
-            <w:tcW w:type="dxa" w:w="2340"/>
-          </w:tcPr>
-          <w:p>
-            <w:r>
-              <w:t>Controlled; UAT matrix pending</w:t>
+        <w:trPr>
+          <w:cantSplit/>
+        </w:trPr>
+        <w:tc>
+          <w:tcPr>
+            <w:tcW w:type="dxa" w:w="2376"/>
+            <w:vAlign w:val="center"/>
+            <w:tcMar>
+              <w:top w:w="80" w:type="dxa"/>
+              <w:start w:w="120" w:type="dxa"/>
+              <w:bottom w:w="80" w:type="dxa"/>
+              <w:end w:w="120" w:type="dxa"/>
+            </w:tcMar>
+          </w:tcPr>
+          <w:p>
+            <w:pPr>
+              <w:spacing w:after="0"/>
+            </w:pPr>
+            <w:r>
+              <w:rPr>
+                <w:rFonts w:ascii="Calibri" w:hAnsi="Calibri"/>
+                <w:sz w:val="18"/>
+              </w:rPr>
+              <w:t>OCR suggestion treated as truth</w:t>
+            </w:r>
+          </w:p>
+        </w:tc>
+        <w:tc>
+          <w:tcPr>
+            <w:tcW w:type="dxa" w:w="2088"/>
+            <w:vAlign w:val="center"/>
+            <w:tcMar>
+              <w:top w:w="80" w:type="dxa"/>
+              <w:start w:w="120" w:type="dxa"/>
+              <w:bottom w:w="80" w:type="dxa"/>
+              <w:end w:w="120" w:type="dxa"/>
+            </w:tcMar>
+          </w:tcPr>
+          <w:p>
+            <w:pPr>
+              <w:spacing w:after="0"/>
+            </w:pPr>
+            <w:r>
+              <w:rPr>
+                <w:rFonts w:ascii="Calibri" w:hAnsi="Calibri"/>
+                <w:sz w:val="18"/>
+              </w:rPr>
+              <w:t>Incorrect asset data</w:t>
+            </w:r>
+          </w:p>
+        </w:tc>
+        <w:tc>
+          <w:tcPr>
+            <w:tcW w:type="dxa" w:w="3528"/>
+            <w:vAlign w:val="center"/>
+            <w:tcMar>
+              <w:top w:w="80" w:type="dxa"/>
+              <w:start w:w="120" w:type="dxa"/>
+              <w:bottom w:w="80" w:type="dxa"/>
+              <w:end w:w="120" w:type="dxa"/>
+            </w:tcMar>
+          </w:tcPr>
+          <w:p>
+            <w:pPr>
+              <w:spacing w:after="0"/>
+            </w:pPr>
+            <w:r>
+              <w:rPr>
+                <w:rFonts w:ascii="Calibri" w:hAnsi="Calibri"/>
+                <w:sz w:val="18"/>
+              </w:rPr>
+              <w:t>Human apply/verify and immutable provenance</w:t>
+            </w:r>
+          </w:p>
+        </w:tc>
+        <w:tc>
+          <w:tcPr>
+            <w:tcW w:type="dxa" w:w="1368"/>
+            <w:vAlign w:val="center"/>
+            <w:tcMar>
+              <w:top w:w="80" w:type="dxa"/>
+              <w:start w:w="120" w:type="dxa"/>
+              <w:bottom w:w="80" w:type="dxa"/>
+              <w:end w:w="120" w:type="dxa"/>
+            </w:tcMar>
+          </w:tcPr>
+          <w:p>
+            <w:pPr>
+              <w:spacing w:after="0"/>
+            </w:pPr>
+            <w:r>
+              <w:rPr>
+                <w:rFonts w:ascii="Calibri" w:hAnsi="Calibri"/>
+                <w:sz w:val="18"/>
+              </w:rPr>
+              <w:t>Code controlled; UAT pending</w:t>
             </w:r>
           </w:p>
         </w:tc>

</xml_diff>